<commit_message>
fix: streamline component setup and testing workflow
</commit_message>
<xml_diff>
--- a/docs/guides/Delphi App Translation Studio Complete Test Guide.docx
+++ b/docs/guides/Delphi App Translation Studio Complete Test Guide.docx
@@ -13,7 +13,7 @@
           <w:noProof/>
         </w:rPr>
         <w:drawing>
-          <wp:inline distT="0" distB="0" distL="0" distR="0" wp14:anchorId="34B21A9A" wp14:editId="2FB34556">
+          <wp:inline distT="0" distB="0" distL="0" distR="0" wp14:anchorId="22309C9D" wp14:editId="3DF4E7EF">
             <wp:extent cx="1325880" cy="1325880"/>
             <wp:effectExtent l="0" t="0" r="0" b="0"/>
             <wp:docPr id="1" name="Picture 1"/>
@@ -178,13 +178,7 @@
           <w:tab w:val="right" w:leader="dot" w:pos="9350"/>
         </w:tabs>
         <w:rPr>
-          <w:rFonts w:asciiTheme="minorHAnsi" w:hAnsiTheme="minorHAnsi"/>
           <w:noProof/>
-          <w:color w:val="auto"/>
-          <w:kern w:val="2"/>
-          <w:sz w:val="24"/>
-          <w:szCs w:val="24"/>
-          <w14:ligatures w14:val="standardContextual"/>
         </w:rPr>
       </w:pPr>
       <w:r>
@@ -196,7 +190,7 @@
       <w:r>
         <w:fldChar w:fldCharType="separate"/>
       </w:r>
-      <w:hyperlink w:anchor="_Toc237100924" w:history="1">
+      <w:hyperlink w:anchor="_Toc237115560" w:history="1">
         <w:r>
           <w:rPr>
             <w:rStyle w:val="Hyperlink"/>
@@ -223,7 +217,7 @@
             <w:noProof/>
             <w:webHidden/>
           </w:rPr>
-          <w:instrText xml:space="preserve"> PAGEREF _Toc237100924 \h </w:instrText>
+          <w:instrText xml:space="preserve"> PAGEREF _Toc237115560 \h </w:instrText>
         </w:r>
         <w:r>
           <w:rPr>
@@ -261,16 +255,10 @@
           <w:tab w:val="right" w:leader="dot" w:pos="9350"/>
         </w:tabs>
         <w:rPr>
-          <w:rFonts w:asciiTheme="minorHAnsi" w:hAnsiTheme="minorHAnsi"/>
           <w:noProof/>
-          <w:color w:val="auto"/>
-          <w:kern w:val="2"/>
-          <w:sz w:val="24"/>
-          <w:szCs w:val="24"/>
-          <w14:ligatures w14:val="standardContextual"/>
         </w:rPr>
       </w:pPr>
-      <w:hyperlink w:anchor="_Toc237100925" w:history="1">
+      <w:hyperlink w:anchor="_Toc237115561" w:history="1">
         <w:r>
           <w:rPr>
             <w:rStyle w:val="Hyperlink"/>
@@ -297,7 +285,7 @@
             <w:noProof/>
             <w:webHidden/>
           </w:rPr>
-          <w:instrText xml:space="preserve"> PAGEREF _Toc237100925 \h </w:instrText>
+          <w:instrText xml:space="preserve"> PAGEREF _Toc237115561 \h </w:instrText>
         </w:r>
         <w:r>
           <w:rPr>
@@ -335,16 +323,10 @@
           <w:tab w:val="right" w:leader="dot" w:pos="9350"/>
         </w:tabs>
         <w:rPr>
-          <w:rFonts w:asciiTheme="minorHAnsi" w:hAnsiTheme="minorHAnsi"/>
           <w:noProof/>
-          <w:color w:val="auto"/>
-          <w:kern w:val="2"/>
-          <w:sz w:val="24"/>
-          <w:szCs w:val="24"/>
-          <w14:ligatures w14:val="standardContextual"/>
         </w:rPr>
       </w:pPr>
-      <w:hyperlink w:anchor="_Toc237100926" w:history="1">
+      <w:hyperlink w:anchor="_Toc237115562" w:history="1">
         <w:r>
           <w:rPr>
             <w:rStyle w:val="Hyperlink"/>
@@ -371,7 +353,7 @@
             <w:noProof/>
             <w:webHidden/>
           </w:rPr>
-          <w:instrText xml:space="preserve"> PAGEREF _Toc237100926 \h </w:instrText>
+          <w:instrText xml:space="preserve"> PAGEREF _Toc237115562 \h </w:instrText>
         </w:r>
         <w:r>
           <w:rPr>
@@ -409,16 +391,10 @@
           <w:tab w:val="right" w:leader="dot" w:pos="9350"/>
         </w:tabs>
         <w:rPr>
-          <w:rFonts w:asciiTheme="minorHAnsi" w:hAnsiTheme="minorHAnsi"/>
           <w:noProof/>
-          <w:color w:val="auto"/>
-          <w:kern w:val="2"/>
-          <w:sz w:val="24"/>
-          <w:szCs w:val="24"/>
-          <w14:ligatures w14:val="standardContextual"/>
         </w:rPr>
       </w:pPr>
-      <w:hyperlink w:anchor="_Toc237100927" w:history="1">
+      <w:hyperlink w:anchor="_Toc237115563" w:history="1">
         <w:r>
           <w:rPr>
             <w:rStyle w:val="Hyperlink"/>
@@ -445,7 +421,7 @@
             <w:noProof/>
             <w:webHidden/>
           </w:rPr>
-          <w:instrText xml:space="preserve"> PAGEREF _Toc237100927 \h </w:instrText>
+          <w:instrText xml:space="preserve"> PAGEREF _Toc237115563 \h </w:instrText>
         </w:r>
         <w:r>
           <w:rPr>
@@ -483,16 +459,10 @@
           <w:tab w:val="right" w:leader="dot" w:pos="9350"/>
         </w:tabs>
         <w:rPr>
-          <w:rFonts w:asciiTheme="minorHAnsi" w:hAnsiTheme="minorHAnsi"/>
           <w:noProof/>
-          <w:color w:val="auto"/>
-          <w:kern w:val="2"/>
-          <w:sz w:val="24"/>
-          <w:szCs w:val="24"/>
-          <w14:ligatures w14:val="standardContextual"/>
         </w:rPr>
       </w:pPr>
-      <w:hyperlink w:anchor="_Toc237100928" w:history="1">
+      <w:hyperlink w:anchor="_Toc237115564" w:history="1">
         <w:r>
           <w:rPr>
             <w:rStyle w:val="Hyperlink"/>
@@ -519,7 +489,7 @@
             <w:noProof/>
             <w:webHidden/>
           </w:rPr>
-          <w:instrText xml:space="preserve"> PAGEREF _Toc237100928 \h </w:instrText>
+          <w:instrText xml:space="preserve"> PAGEREF _Toc237115564 \h </w:instrText>
         </w:r>
         <w:r>
           <w:rPr>
@@ -557,16 +527,10 @@
           <w:tab w:val="right" w:leader="dot" w:pos="9350"/>
         </w:tabs>
         <w:rPr>
-          <w:rFonts w:asciiTheme="minorHAnsi" w:hAnsiTheme="minorHAnsi"/>
           <w:noProof/>
-          <w:color w:val="auto"/>
-          <w:kern w:val="2"/>
-          <w:sz w:val="24"/>
-          <w:szCs w:val="24"/>
-          <w14:ligatures w14:val="standardContextual"/>
         </w:rPr>
       </w:pPr>
-      <w:hyperlink w:anchor="_Toc237100929" w:history="1">
+      <w:hyperlink w:anchor="_Toc237115565" w:history="1">
         <w:r>
           <w:rPr>
             <w:rStyle w:val="Hyperlink"/>
@@ -593,7 +557,7 @@
             <w:noProof/>
             <w:webHidden/>
           </w:rPr>
-          <w:instrText xml:space="preserve"> PAGEREF _Toc237100929 \h </w:instrText>
+          <w:instrText xml:space="preserve"> PAGEREF _Toc237115565 \h </w:instrText>
         </w:r>
         <w:r>
           <w:rPr>
@@ -631,16 +595,10 @@
           <w:tab w:val="right" w:leader="dot" w:pos="9350"/>
         </w:tabs>
         <w:rPr>
-          <w:rFonts w:asciiTheme="minorHAnsi" w:hAnsiTheme="minorHAnsi"/>
           <w:noProof/>
-          <w:color w:val="auto"/>
-          <w:kern w:val="2"/>
-          <w:sz w:val="24"/>
-          <w:szCs w:val="24"/>
-          <w14:ligatures w14:val="standardContextual"/>
         </w:rPr>
       </w:pPr>
-      <w:hyperlink w:anchor="_Toc237100930" w:history="1">
+      <w:hyperlink w:anchor="_Toc237115566" w:history="1">
         <w:r>
           <w:rPr>
             <w:rStyle w:val="Hyperlink"/>
@@ -667,7 +625,7 @@
             <w:noProof/>
             <w:webHidden/>
           </w:rPr>
-          <w:instrText xml:space="preserve"> PAGEREF _Toc237100930 \h </w:instrText>
+          <w:instrText xml:space="preserve"> PAGEREF _Toc237115566 \h </w:instrText>
         </w:r>
         <w:r>
           <w:rPr>
@@ -705,16 +663,10 @@
           <w:tab w:val="right" w:leader="dot" w:pos="9350"/>
         </w:tabs>
         <w:rPr>
-          <w:rFonts w:asciiTheme="minorHAnsi" w:hAnsiTheme="minorHAnsi"/>
           <w:noProof/>
-          <w:color w:val="auto"/>
-          <w:kern w:val="2"/>
-          <w:sz w:val="24"/>
-          <w:szCs w:val="24"/>
-          <w14:ligatures w14:val="standardContextual"/>
         </w:rPr>
       </w:pPr>
-      <w:hyperlink w:anchor="_Toc237100931" w:history="1">
+      <w:hyperlink w:anchor="_Toc237115567" w:history="1">
         <w:r>
           <w:rPr>
             <w:rStyle w:val="Hyperlink"/>
@@ -741,7 +693,7 @@
             <w:noProof/>
             <w:webHidden/>
           </w:rPr>
-          <w:instrText xml:space="preserve"> PAGEREF _Toc237100931 \h </w:instrText>
+          <w:instrText xml:space="preserve"> PAGEREF _Toc237115567 \h </w:instrText>
         </w:r>
         <w:r>
           <w:rPr>
@@ -779,16 +731,10 @@
           <w:tab w:val="right" w:leader="dot" w:pos="9350"/>
         </w:tabs>
         <w:rPr>
-          <w:rFonts w:asciiTheme="minorHAnsi" w:hAnsiTheme="minorHAnsi"/>
           <w:noProof/>
-          <w:color w:val="auto"/>
-          <w:kern w:val="2"/>
-          <w:sz w:val="24"/>
-          <w:szCs w:val="24"/>
-          <w14:ligatures w14:val="standardContextual"/>
         </w:rPr>
       </w:pPr>
-      <w:hyperlink w:anchor="_Toc237100932" w:history="1">
+      <w:hyperlink w:anchor="_Toc237115568" w:history="1">
         <w:r>
           <w:rPr>
             <w:rStyle w:val="Hyperlink"/>
@@ -815,7 +761,7 @@
             <w:noProof/>
             <w:webHidden/>
           </w:rPr>
-          <w:instrText xml:space="preserve"> PAGEREF _Toc237100932 \h </w:instrText>
+          <w:instrText xml:space="preserve"> PAGEREF _Toc237115568 \h </w:instrText>
         </w:r>
         <w:r>
           <w:rPr>
@@ -853,16 +799,10 @@
           <w:tab w:val="right" w:leader="dot" w:pos="9350"/>
         </w:tabs>
         <w:rPr>
-          <w:rFonts w:asciiTheme="minorHAnsi" w:hAnsiTheme="minorHAnsi"/>
           <w:noProof/>
-          <w:color w:val="auto"/>
-          <w:kern w:val="2"/>
-          <w:sz w:val="24"/>
-          <w:szCs w:val="24"/>
-          <w14:ligatures w14:val="standardContextual"/>
         </w:rPr>
       </w:pPr>
-      <w:hyperlink w:anchor="_Toc237100933" w:history="1">
+      <w:hyperlink w:anchor="_Toc237115569" w:history="1">
         <w:r>
           <w:rPr>
             <w:rStyle w:val="Hyperlink"/>
@@ -889,7 +829,7 @@
             <w:noProof/>
             <w:webHidden/>
           </w:rPr>
-          <w:instrText xml:space="preserve"> PAGEREF _Toc237100933 \h </w:instrText>
+          <w:instrText xml:space="preserve"> PAGEREF _Toc237115569 \h </w:instrText>
         </w:r>
         <w:r>
           <w:rPr>
@@ -927,16 +867,10 @@
           <w:tab w:val="right" w:leader="dot" w:pos="9350"/>
         </w:tabs>
         <w:rPr>
-          <w:rFonts w:asciiTheme="minorHAnsi" w:hAnsiTheme="minorHAnsi"/>
           <w:noProof/>
-          <w:color w:val="auto"/>
-          <w:kern w:val="2"/>
-          <w:sz w:val="24"/>
-          <w:szCs w:val="24"/>
-          <w14:ligatures w14:val="standardContextual"/>
         </w:rPr>
       </w:pPr>
-      <w:hyperlink w:anchor="_Toc237100934" w:history="1">
+      <w:hyperlink w:anchor="_Toc237115570" w:history="1">
         <w:r>
           <w:rPr>
             <w:rStyle w:val="Hyperlink"/>
@@ -963,7 +897,7 @@
             <w:noProof/>
             <w:webHidden/>
           </w:rPr>
-          <w:instrText xml:space="preserve"> PAGEREF _Toc237100934 \h </w:instrText>
+          <w:instrText xml:space="preserve"> PAGEREF _Toc237115570 \h </w:instrText>
         </w:r>
         <w:r>
           <w:rPr>
@@ -1001,16 +935,10 @@
           <w:tab w:val="right" w:leader="dot" w:pos="9350"/>
         </w:tabs>
         <w:rPr>
-          <w:rFonts w:asciiTheme="minorHAnsi" w:hAnsiTheme="minorHAnsi"/>
           <w:noProof/>
-          <w:color w:val="auto"/>
-          <w:kern w:val="2"/>
-          <w:sz w:val="24"/>
-          <w:szCs w:val="24"/>
-          <w14:ligatures w14:val="standardContextual"/>
         </w:rPr>
       </w:pPr>
-      <w:hyperlink w:anchor="_Toc237100935" w:history="1">
+      <w:hyperlink w:anchor="_Toc237115571" w:history="1">
         <w:r>
           <w:rPr>
             <w:rStyle w:val="Hyperlink"/>
@@ -1037,7 +965,7 @@
             <w:noProof/>
             <w:webHidden/>
           </w:rPr>
-          <w:instrText xml:space="preserve"> PAGEREF _Toc237100935 \h </w:instrText>
+          <w:instrText xml:space="preserve"> PAGEREF _Toc237115571 \h </w:instrText>
         </w:r>
         <w:r>
           <w:rPr>
@@ -1075,16 +1003,10 @@
           <w:tab w:val="right" w:leader="dot" w:pos="9350"/>
         </w:tabs>
         <w:rPr>
-          <w:rFonts w:asciiTheme="minorHAnsi" w:hAnsiTheme="minorHAnsi"/>
           <w:noProof/>
-          <w:color w:val="auto"/>
-          <w:kern w:val="2"/>
-          <w:sz w:val="24"/>
-          <w:szCs w:val="24"/>
-          <w14:ligatures w14:val="standardContextual"/>
         </w:rPr>
       </w:pPr>
-      <w:hyperlink w:anchor="_Toc237100936" w:history="1">
+      <w:hyperlink w:anchor="_Toc237115572" w:history="1">
         <w:r>
           <w:rPr>
             <w:rStyle w:val="Hyperlink"/>
@@ -1111,7 +1033,7 @@
             <w:noProof/>
             <w:webHidden/>
           </w:rPr>
-          <w:instrText xml:space="preserve"> PAGEREF _Toc237100936 \h </w:instrText>
+          <w:instrText xml:space="preserve"> PAGEREF _Toc237115572 \h </w:instrText>
         </w:r>
         <w:r>
           <w:rPr>
@@ -1149,16 +1071,10 @@
           <w:tab w:val="right" w:leader="dot" w:pos="9350"/>
         </w:tabs>
         <w:rPr>
-          <w:rFonts w:asciiTheme="minorHAnsi" w:hAnsiTheme="minorHAnsi"/>
           <w:noProof/>
-          <w:color w:val="auto"/>
-          <w:kern w:val="2"/>
-          <w:sz w:val="24"/>
-          <w:szCs w:val="24"/>
-          <w14:ligatures w14:val="standardContextual"/>
         </w:rPr>
       </w:pPr>
-      <w:hyperlink w:anchor="_Toc237100937" w:history="1">
+      <w:hyperlink w:anchor="_Toc237115573" w:history="1">
         <w:r>
           <w:rPr>
             <w:rStyle w:val="Hyperlink"/>
@@ -1185,7 +1101,7 @@
             <w:noProof/>
             <w:webHidden/>
           </w:rPr>
-          <w:instrText xml:space="preserve"> PAGEREF _Toc237100937 \h </w:instrText>
+          <w:instrText xml:space="preserve"> PAGEREF _Toc237115573 \h </w:instrText>
         </w:r>
         <w:r>
           <w:rPr>
@@ -1223,16 +1139,10 @@
           <w:tab w:val="right" w:leader="dot" w:pos="9350"/>
         </w:tabs>
         <w:rPr>
-          <w:rFonts w:asciiTheme="minorHAnsi" w:hAnsiTheme="minorHAnsi"/>
           <w:noProof/>
-          <w:color w:val="auto"/>
-          <w:kern w:val="2"/>
-          <w:sz w:val="24"/>
-          <w:szCs w:val="24"/>
-          <w14:ligatures w14:val="standardContextual"/>
         </w:rPr>
       </w:pPr>
-      <w:hyperlink w:anchor="_Toc237100938" w:history="1">
+      <w:hyperlink w:anchor="_Toc237115574" w:history="1">
         <w:r>
           <w:rPr>
             <w:rStyle w:val="Hyperlink"/>
@@ -1259,7 +1169,7 @@
             <w:noProof/>
             <w:webHidden/>
           </w:rPr>
-          <w:instrText xml:space="preserve"> PAGEREF _Toc237100938 \h </w:instrText>
+          <w:instrText xml:space="preserve"> PAGEREF _Toc237115574 \h </w:instrText>
         </w:r>
         <w:r>
           <w:rPr>
@@ -1297,16 +1207,10 @@
           <w:tab w:val="right" w:leader="dot" w:pos="9350"/>
         </w:tabs>
         <w:rPr>
-          <w:rFonts w:asciiTheme="minorHAnsi" w:hAnsiTheme="minorHAnsi"/>
           <w:noProof/>
-          <w:color w:val="auto"/>
-          <w:kern w:val="2"/>
-          <w:sz w:val="24"/>
-          <w:szCs w:val="24"/>
-          <w14:ligatures w14:val="standardContextual"/>
         </w:rPr>
       </w:pPr>
-      <w:hyperlink w:anchor="_Toc237100939" w:history="1">
+      <w:hyperlink w:anchor="_Toc237115575" w:history="1">
         <w:r>
           <w:rPr>
             <w:rStyle w:val="Hyperlink"/>
@@ -1333,7 +1237,7 @@
             <w:noProof/>
             <w:webHidden/>
           </w:rPr>
-          <w:instrText xml:space="preserve"> PAGEREF _Toc237100939 \h </w:instrText>
+          <w:instrText xml:space="preserve"> PAGEREF _Toc237115575 \h </w:instrText>
         </w:r>
         <w:r>
           <w:rPr>
@@ -1371,16 +1275,10 @@
           <w:tab w:val="right" w:leader="dot" w:pos="9350"/>
         </w:tabs>
         <w:rPr>
-          <w:rFonts w:asciiTheme="minorHAnsi" w:hAnsiTheme="minorHAnsi"/>
           <w:noProof/>
-          <w:color w:val="auto"/>
-          <w:kern w:val="2"/>
-          <w:sz w:val="24"/>
-          <w:szCs w:val="24"/>
-          <w14:ligatures w14:val="standardContextual"/>
         </w:rPr>
       </w:pPr>
-      <w:hyperlink w:anchor="_Toc237100940" w:history="1">
+      <w:hyperlink w:anchor="_Toc237115576" w:history="1">
         <w:r>
           <w:rPr>
             <w:rStyle w:val="Hyperlink"/>
@@ -1407,7 +1305,7 @@
             <w:noProof/>
             <w:webHidden/>
           </w:rPr>
-          <w:instrText xml:space="preserve"> PAGEREF _Toc237100940 \h </w:instrText>
+          <w:instrText xml:space="preserve"> PAGEREF _Toc237115576 \h </w:instrText>
         </w:r>
         <w:r>
           <w:rPr>
@@ -1445,16 +1343,10 @@
           <w:tab w:val="right" w:leader="dot" w:pos="9350"/>
         </w:tabs>
         <w:rPr>
-          <w:rFonts w:asciiTheme="minorHAnsi" w:hAnsiTheme="minorHAnsi"/>
           <w:noProof/>
-          <w:color w:val="auto"/>
-          <w:kern w:val="2"/>
-          <w:sz w:val="24"/>
-          <w:szCs w:val="24"/>
-          <w14:ligatures w14:val="standardContextual"/>
         </w:rPr>
       </w:pPr>
-      <w:hyperlink w:anchor="_Toc237100941" w:history="1">
+      <w:hyperlink w:anchor="_Toc237115577" w:history="1">
         <w:r>
           <w:rPr>
             <w:rStyle w:val="Hyperlink"/>
@@ -1481,7 +1373,7 @@
             <w:noProof/>
             <w:webHidden/>
           </w:rPr>
-          <w:instrText xml:space="preserve"> PAGEREF _Toc237100941 \h </w:instrText>
+          <w:instrText xml:space="preserve"> PAGEREF _Toc237115577 \h </w:instrText>
         </w:r>
         <w:r>
           <w:rPr>
@@ -1519,16 +1411,10 @@
           <w:tab w:val="right" w:leader="dot" w:pos="9350"/>
         </w:tabs>
         <w:rPr>
-          <w:rFonts w:asciiTheme="minorHAnsi" w:hAnsiTheme="minorHAnsi"/>
           <w:noProof/>
-          <w:color w:val="auto"/>
-          <w:kern w:val="2"/>
-          <w:sz w:val="24"/>
-          <w:szCs w:val="24"/>
-          <w14:ligatures w14:val="standardContextual"/>
         </w:rPr>
       </w:pPr>
-      <w:hyperlink w:anchor="_Toc237100942" w:history="1">
+      <w:hyperlink w:anchor="_Toc237115578" w:history="1">
         <w:r>
           <w:rPr>
             <w:rStyle w:val="Hyperlink"/>
@@ -1555,7 +1441,7 @@
             <w:noProof/>
             <w:webHidden/>
           </w:rPr>
-          <w:instrText xml:space="preserve"> PAGEREF _Toc237100942 \h </w:instrText>
+          <w:instrText xml:space="preserve"> PAGEREF _Toc237115578 \h </w:instrText>
         </w:r>
         <w:r>
           <w:rPr>
@@ -1593,16 +1479,10 @@
           <w:tab w:val="right" w:leader="dot" w:pos="9350"/>
         </w:tabs>
         <w:rPr>
-          <w:rFonts w:asciiTheme="minorHAnsi" w:hAnsiTheme="minorHAnsi"/>
           <w:noProof/>
-          <w:color w:val="auto"/>
-          <w:kern w:val="2"/>
-          <w:sz w:val="24"/>
-          <w:szCs w:val="24"/>
-          <w14:ligatures w14:val="standardContextual"/>
         </w:rPr>
       </w:pPr>
-      <w:hyperlink w:anchor="_Toc237100943" w:history="1">
+      <w:hyperlink w:anchor="_Toc237115579" w:history="1">
         <w:r>
           <w:rPr>
             <w:rStyle w:val="Hyperlink"/>
@@ -1629,7 +1509,7 @@
             <w:noProof/>
             <w:webHidden/>
           </w:rPr>
-          <w:instrText xml:space="preserve"> PAGEREF _Toc237100943 \h </w:instrText>
+          <w:instrText xml:space="preserve"> PAGEREF _Toc237115579 \h </w:instrText>
         </w:r>
         <w:r>
           <w:rPr>
@@ -1667,16 +1547,10 @@
           <w:tab w:val="right" w:leader="dot" w:pos="9350"/>
         </w:tabs>
         <w:rPr>
-          <w:rFonts w:asciiTheme="minorHAnsi" w:hAnsiTheme="minorHAnsi"/>
           <w:noProof/>
-          <w:color w:val="auto"/>
-          <w:kern w:val="2"/>
-          <w:sz w:val="24"/>
-          <w:szCs w:val="24"/>
-          <w14:ligatures w14:val="standardContextual"/>
         </w:rPr>
       </w:pPr>
-      <w:hyperlink w:anchor="_Toc237100944" w:history="1">
+      <w:hyperlink w:anchor="_Toc237115580" w:history="1">
         <w:r>
           <w:rPr>
             <w:rStyle w:val="Hyperlink"/>
@@ -1703,7 +1577,7 @@
             <w:noProof/>
             <w:webHidden/>
           </w:rPr>
-          <w:instrText xml:space="preserve"> PAGEREF _Toc237100944 \h </w:instrText>
+          <w:instrText xml:space="preserve"> PAGEREF _Toc237115580 \h </w:instrText>
         </w:r>
         <w:r>
           <w:rPr>
@@ -1741,16 +1615,10 @@
           <w:tab w:val="right" w:leader="dot" w:pos="9350"/>
         </w:tabs>
         <w:rPr>
-          <w:rFonts w:asciiTheme="minorHAnsi" w:hAnsiTheme="minorHAnsi"/>
           <w:noProof/>
-          <w:color w:val="auto"/>
-          <w:kern w:val="2"/>
-          <w:sz w:val="24"/>
-          <w:szCs w:val="24"/>
-          <w14:ligatures w14:val="standardContextual"/>
         </w:rPr>
       </w:pPr>
-      <w:hyperlink w:anchor="_Toc237100945" w:history="1">
+      <w:hyperlink w:anchor="_Toc237115581" w:history="1">
         <w:r>
           <w:rPr>
             <w:rStyle w:val="Hyperlink"/>
@@ -1777,7 +1645,7 @@
             <w:noProof/>
             <w:webHidden/>
           </w:rPr>
-          <w:instrText xml:space="preserve"> PAGEREF _Toc237100945 \h </w:instrText>
+          <w:instrText xml:space="preserve"> PAGEREF _Toc237115581 \h </w:instrText>
         </w:r>
         <w:r>
           <w:rPr>
@@ -1797,7 +1665,7 @@
             <w:noProof/>
             <w:webHidden/>
           </w:rPr>
-          <w:t>10</w:t>
+          <w:t>11</w:t>
         </w:r>
         <w:r>
           <w:rPr>
@@ -1815,16 +1683,10 @@
           <w:tab w:val="right" w:leader="dot" w:pos="9350"/>
         </w:tabs>
         <w:rPr>
-          <w:rFonts w:asciiTheme="minorHAnsi" w:hAnsiTheme="minorHAnsi"/>
           <w:noProof/>
-          <w:color w:val="auto"/>
-          <w:kern w:val="2"/>
-          <w:sz w:val="24"/>
-          <w:szCs w:val="24"/>
-          <w14:ligatures w14:val="standardContextual"/>
         </w:rPr>
       </w:pPr>
-      <w:hyperlink w:anchor="_Toc237100946" w:history="1">
+      <w:hyperlink w:anchor="_Toc237115582" w:history="1">
         <w:r>
           <w:rPr>
             <w:rStyle w:val="Hyperlink"/>
@@ -1851,7 +1713,7 @@
             <w:noProof/>
             <w:webHidden/>
           </w:rPr>
-          <w:instrText xml:space="preserve"> PAGEREF _Toc237100946 \h </w:instrText>
+          <w:instrText xml:space="preserve"> PAGEREF _Toc237115582 \h </w:instrText>
         </w:r>
         <w:r>
           <w:rPr>
@@ -1889,16 +1751,10 @@
           <w:tab w:val="right" w:leader="dot" w:pos="9350"/>
         </w:tabs>
         <w:rPr>
-          <w:rFonts w:asciiTheme="minorHAnsi" w:hAnsiTheme="minorHAnsi"/>
           <w:noProof/>
-          <w:color w:val="auto"/>
-          <w:kern w:val="2"/>
-          <w:sz w:val="24"/>
-          <w:szCs w:val="24"/>
-          <w14:ligatures w14:val="standardContextual"/>
         </w:rPr>
       </w:pPr>
-      <w:hyperlink w:anchor="_Toc237100947" w:history="1">
+      <w:hyperlink w:anchor="_Toc237115583" w:history="1">
         <w:r>
           <w:rPr>
             <w:rStyle w:val="Hyperlink"/>
@@ -1925,7 +1781,7 @@
             <w:noProof/>
             <w:webHidden/>
           </w:rPr>
-          <w:instrText xml:space="preserve"> PAGEREF _Toc237100947 \h </w:instrText>
+          <w:instrText xml:space="preserve"> PAGEREF _Toc237115583 \h </w:instrText>
         </w:r>
         <w:r>
           <w:rPr>
@@ -1963,16 +1819,10 @@
           <w:tab w:val="right" w:leader="dot" w:pos="9350"/>
         </w:tabs>
         <w:rPr>
-          <w:rFonts w:asciiTheme="minorHAnsi" w:hAnsiTheme="minorHAnsi"/>
           <w:noProof/>
-          <w:color w:val="auto"/>
-          <w:kern w:val="2"/>
-          <w:sz w:val="24"/>
-          <w:szCs w:val="24"/>
-          <w14:ligatures w14:val="standardContextual"/>
         </w:rPr>
       </w:pPr>
-      <w:hyperlink w:anchor="_Toc237100948" w:history="1">
+      <w:hyperlink w:anchor="_Toc237115584" w:history="1">
         <w:r>
           <w:rPr>
             <w:rStyle w:val="Hyperlink"/>
@@ -1999,7 +1849,7 @@
             <w:noProof/>
             <w:webHidden/>
           </w:rPr>
-          <w:instrText xml:space="preserve"> PAGEREF _Toc237100948 \h </w:instrText>
+          <w:instrText xml:space="preserve"> PAGEREF _Toc237115584 \h </w:instrText>
         </w:r>
         <w:r>
           <w:rPr>
@@ -2037,22 +1887,16 @@
           <w:tab w:val="right" w:leader="dot" w:pos="9350"/>
         </w:tabs>
         <w:rPr>
-          <w:rFonts w:asciiTheme="minorHAnsi" w:hAnsiTheme="minorHAnsi"/>
           <w:noProof/>
-          <w:color w:val="auto"/>
-          <w:kern w:val="2"/>
-          <w:sz w:val="24"/>
-          <w:szCs w:val="24"/>
-          <w14:ligatures w14:val="standardContextual"/>
         </w:rPr>
       </w:pPr>
-      <w:hyperlink w:anchor="_Toc237100949" w:history="1">
+      <w:hyperlink w:anchor="_Toc237115585" w:history="1">
         <w:r>
           <w:rPr>
             <w:rStyle w:val="Hyperlink"/>
             <w:noProof/>
           </w:rPr>
-          <w:t>TC-10 Install the FMX design package</w:t>
+          <w:t>TC-10 Install or repair the FMX components</w:t>
         </w:r>
         <w:r>
           <w:rPr>
@@ -2073,7 +1917,7 @@
             <w:noProof/>
             <w:webHidden/>
           </w:rPr>
-          <w:instrText xml:space="preserve"> PAGEREF _Toc237100949 \h </w:instrText>
+          <w:instrText xml:space="preserve"> PAGEREF _Toc237115585 \h </w:instrText>
         </w:r>
         <w:r>
           <w:rPr>
@@ -2111,16 +1955,10 @@
           <w:tab w:val="right" w:leader="dot" w:pos="9350"/>
         </w:tabs>
         <w:rPr>
-          <w:rFonts w:asciiTheme="minorHAnsi" w:hAnsiTheme="minorHAnsi"/>
           <w:noProof/>
-          <w:color w:val="auto"/>
-          <w:kern w:val="2"/>
-          <w:sz w:val="24"/>
-          <w:szCs w:val="24"/>
-          <w14:ligatures w14:val="standardContextual"/>
         </w:rPr>
       </w:pPr>
-      <w:hyperlink w:anchor="_Toc237100950" w:history="1">
+      <w:hyperlink w:anchor="_Toc237115586" w:history="1">
         <w:r>
           <w:rPr>
             <w:rStyle w:val="Hyperlink"/>
@@ -2147,7 +1985,7 @@
             <w:noProof/>
             <w:webHidden/>
           </w:rPr>
-          <w:instrText xml:space="preserve"> PAGEREF _Toc237100950 \h </w:instrText>
+          <w:instrText xml:space="preserve"> PAGEREF _Toc237115586 \h </w:instrText>
         </w:r>
         <w:r>
           <w:rPr>
@@ -2185,16 +2023,10 @@
           <w:tab w:val="right" w:leader="dot" w:pos="9350"/>
         </w:tabs>
         <w:rPr>
-          <w:rFonts w:asciiTheme="minorHAnsi" w:hAnsiTheme="minorHAnsi"/>
           <w:noProof/>
-          <w:color w:val="auto"/>
-          <w:kern w:val="2"/>
-          <w:sz w:val="24"/>
-          <w:szCs w:val="24"/>
-          <w14:ligatures w14:val="standardContextual"/>
         </w:rPr>
       </w:pPr>
-      <w:hyperlink w:anchor="_Toc237100951" w:history="1">
+      <w:hyperlink w:anchor="_Toc237115587" w:history="1">
         <w:r>
           <w:rPr>
             <w:rStyle w:val="Hyperlink"/>
@@ -2221,7 +2053,7 @@
             <w:noProof/>
             <w:webHidden/>
           </w:rPr>
-          <w:instrText xml:space="preserve"> PAGEREF _Toc237100951 \h </w:instrText>
+          <w:instrText xml:space="preserve"> PAGEREF _Toc237115587 \h </w:instrText>
         </w:r>
         <w:r>
           <w:rPr>
@@ -2259,16 +2091,10 @@
           <w:tab w:val="right" w:leader="dot" w:pos="9350"/>
         </w:tabs>
         <w:rPr>
-          <w:rFonts w:asciiTheme="minorHAnsi" w:hAnsiTheme="minorHAnsi"/>
           <w:noProof/>
-          <w:color w:val="auto"/>
-          <w:kern w:val="2"/>
-          <w:sz w:val="24"/>
-          <w:szCs w:val="24"/>
-          <w14:ligatures w14:val="standardContextual"/>
         </w:rPr>
       </w:pPr>
-      <w:hyperlink w:anchor="_Toc237100952" w:history="1">
+      <w:hyperlink w:anchor="_Toc237115588" w:history="1">
         <w:r>
           <w:rPr>
             <w:rStyle w:val="Hyperlink"/>
@@ -2295,7 +2121,7 @@
             <w:noProof/>
             <w:webHidden/>
           </w:rPr>
-          <w:instrText xml:space="preserve"> PAGEREF _Toc237100952 \h </w:instrText>
+          <w:instrText xml:space="preserve"> PAGEREF _Toc237115588 \h </w:instrText>
         </w:r>
         <w:r>
           <w:rPr>
@@ -2315,7 +2141,7 @@
             <w:noProof/>
             <w:webHidden/>
           </w:rPr>
-          <w:t>15</w:t>
+          <w:t>16</w:t>
         </w:r>
         <w:r>
           <w:rPr>
@@ -2333,16 +2159,10 @@
           <w:tab w:val="right" w:leader="dot" w:pos="9350"/>
         </w:tabs>
         <w:rPr>
-          <w:rFonts w:asciiTheme="minorHAnsi" w:hAnsiTheme="minorHAnsi"/>
           <w:noProof/>
-          <w:color w:val="auto"/>
-          <w:kern w:val="2"/>
-          <w:sz w:val="24"/>
-          <w:szCs w:val="24"/>
-          <w14:ligatures w14:val="standardContextual"/>
         </w:rPr>
       </w:pPr>
-      <w:hyperlink w:anchor="_Toc237100953" w:history="1">
+      <w:hyperlink w:anchor="_Toc237115589" w:history="1">
         <w:r>
           <w:rPr>
             <w:rStyle w:val="Hyperlink"/>
@@ -2369,7 +2189,7 @@
             <w:noProof/>
             <w:webHidden/>
           </w:rPr>
-          <w:instrText xml:space="preserve"> PAGEREF _Toc237100953 \h </w:instrText>
+          <w:instrText xml:space="preserve"> PAGEREF _Toc237115589 \h </w:instrText>
         </w:r>
         <w:r>
           <w:rPr>
@@ -2407,16 +2227,10 @@
           <w:tab w:val="right" w:leader="dot" w:pos="9350"/>
         </w:tabs>
         <w:rPr>
-          <w:rFonts w:asciiTheme="minorHAnsi" w:hAnsiTheme="minorHAnsi"/>
           <w:noProof/>
-          <w:color w:val="auto"/>
-          <w:kern w:val="2"/>
-          <w:sz w:val="24"/>
-          <w:szCs w:val="24"/>
-          <w14:ligatures w14:val="standardContextual"/>
         </w:rPr>
       </w:pPr>
-      <w:hyperlink w:anchor="_Toc237100954" w:history="1">
+      <w:hyperlink w:anchor="_Toc237115590" w:history="1">
         <w:r>
           <w:rPr>
             <w:rStyle w:val="Hyperlink"/>
@@ -2443,7 +2257,7 @@
             <w:noProof/>
             <w:webHidden/>
           </w:rPr>
-          <w:instrText xml:space="preserve"> PAGEREF _Toc237100954 \h </w:instrText>
+          <w:instrText xml:space="preserve"> PAGEREF _Toc237115590 \h </w:instrText>
         </w:r>
         <w:r>
           <w:rPr>
@@ -2481,16 +2295,10 @@
           <w:tab w:val="right" w:leader="dot" w:pos="9350"/>
         </w:tabs>
         <w:rPr>
-          <w:rFonts w:asciiTheme="minorHAnsi" w:hAnsiTheme="minorHAnsi"/>
           <w:noProof/>
-          <w:color w:val="auto"/>
-          <w:kern w:val="2"/>
-          <w:sz w:val="24"/>
-          <w:szCs w:val="24"/>
-          <w14:ligatures w14:val="standardContextual"/>
         </w:rPr>
       </w:pPr>
-      <w:hyperlink w:anchor="_Toc237100955" w:history="1">
+      <w:hyperlink w:anchor="_Toc237115591" w:history="1">
         <w:r>
           <w:rPr>
             <w:rStyle w:val="Hyperlink"/>
@@ -2517,7 +2325,7 @@
             <w:noProof/>
             <w:webHidden/>
           </w:rPr>
-          <w:instrText xml:space="preserve"> PAGEREF _Toc237100955 \h </w:instrText>
+          <w:instrText xml:space="preserve"> PAGEREF _Toc237115591 \h </w:instrText>
         </w:r>
         <w:r>
           <w:rPr>
@@ -2555,16 +2363,10 @@
           <w:tab w:val="right" w:leader="dot" w:pos="9350"/>
         </w:tabs>
         <w:rPr>
-          <w:rFonts w:asciiTheme="minorHAnsi" w:hAnsiTheme="minorHAnsi"/>
           <w:noProof/>
-          <w:color w:val="auto"/>
-          <w:kern w:val="2"/>
-          <w:sz w:val="24"/>
-          <w:szCs w:val="24"/>
-          <w14:ligatures w14:val="standardContextual"/>
         </w:rPr>
       </w:pPr>
-      <w:hyperlink w:anchor="_Toc237100956" w:history="1">
+      <w:hyperlink w:anchor="_Toc237115592" w:history="1">
         <w:r>
           <w:rPr>
             <w:rStyle w:val="Hyperlink"/>
@@ -2591,7 +2393,7 @@
             <w:noProof/>
             <w:webHidden/>
           </w:rPr>
-          <w:instrText xml:space="preserve"> PAGEREF _Toc237100956 \h </w:instrText>
+          <w:instrText xml:space="preserve"> PAGEREF _Toc237115592 \h </w:instrText>
         </w:r>
         <w:r>
           <w:rPr>
@@ -2629,16 +2431,10 @@
           <w:tab w:val="right" w:leader="dot" w:pos="9350"/>
         </w:tabs>
         <w:rPr>
-          <w:rFonts w:asciiTheme="minorHAnsi" w:hAnsiTheme="minorHAnsi"/>
           <w:noProof/>
-          <w:color w:val="auto"/>
-          <w:kern w:val="2"/>
-          <w:sz w:val="24"/>
-          <w:szCs w:val="24"/>
-          <w14:ligatures w14:val="standardContextual"/>
         </w:rPr>
       </w:pPr>
-      <w:hyperlink w:anchor="_Toc237100957" w:history="1">
+      <w:hyperlink w:anchor="_Toc237115593" w:history="1">
         <w:r>
           <w:rPr>
             <w:rStyle w:val="Hyperlink"/>
@@ -2665,7 +2461,7 @@
             <w:noProof/>
             <w:webHidden/>
           </w:rPr>
-          <w:instrText xml:space="preserve"> PAGEREF _Toc237100957 \h </w:instrText>
+          <w:instrText xml:space="preserve"> PAGEREF _Toc237115593 \h </w:instrText>
         </w:r>
         <w:r>
           <w:rPr>
@@ -2703,16 +2499,10 @@
           <w:tab w:val="right" w:leader="dot" w:pos="9350"/>
         </w:tabs>
         <w:rPr>
-          <w:rFonts w:asciiTheme="minorHAnsi" w:hAnsiTheme="minorHAnsi"/>
           <w:noProof/>
-          <w:color w:val="auto"/>
-          <w:kern w:val="2"/>
-          <w:sz w:val="24"/>
-          <w:szCs w:val="24"/>
-          <w14:ligatures w14:val="standardContextual"/>
         </w:rPr>
       </w:pPr>
-      <w:hyperlink w:anchor="_Toc237100958" w:history="1">
+      <w:hyperlink w:anchor="_Toc237115594" w:history="1">
         <w:r>
           <w:rPr>
             <w:rStyle w:val="Hyperlink"/>
@@ -2739,7 +2529,7 @@
             <w:noProof/>
             <w:webHidden/>
           </w:rPr>
-          <w:instrText xml:space="preserve"> PAGEREF _Toc237100958 \h </w:instrText>
+          <w:instrText xml:space="preserve"> PAGEREF _Toc237115594 \h </w:instrText>
         </w:r>
         <w:r>
           <w:rPr>
@@ -2777,16 +2567,10 @@
           <w:tab w:val="right" w:leader="dot" w:pos="9350"/>
         </w:tabs>
         <w:rPr>
-          <w:rFonts w:asciiTheme="minorHAnsi" w:hAnsiTheme="minorHAnsi"/>
           <w:noProof/>
-          <w:color w:val="auto"/>
-          <w:kern w:val="2"/>
-          <w:sz w:val="24"/>
-          <w:szCs w:val="24"/>
-          <w14:ligatures w14:val="standardContextual"/>
         </w:rPr>
       </w:pPr>
-      <w:hyperlink w:anchor="_Toc237100959" w:history="1">
+      <w:hyperlink w:anchor="_Toc237115595" w:history="1">
         <w:r>
           <w:rPr>
             <w:rStyle w:val="Hyperlink"/>
@@ -2813,7 +2597,7 @@
             <w:noProof/>
             <w:webHidden/>
           </w:rPr>
-          <w:instrText xml:space="preserve"> PAGEREF _Toc237100959 \h </w:instrText>
+          <w:instrText xml:space="preserve"> PAGEREF _Toc237115595 \h </w:instrText>
         </w:r>
         <w:r>
           <w:rPr>
@@ -2851,16 +2635,10 @@
           <w:tab w:val="right" w:leader="dot" w:pos="9350"/>
         </w:tabs>
         <w:rPr>
-          <w:rFonts w:asciiTheme="minorHAnsi" w:hAnsiTheme="minorHAnsi"/>
           <w:noProof/>
-          <w:color w:val="auto"/>
-          <w:kern w:val="2"/>
-          <w:sz w:val="24"/>
-          <w:szCs w:val="24"/>
-          <w14:ligatures w14:val="standardContextual"/>
         </w:rPr>
       </w:pPr>
-      <w:hyperlink w:anchor="_Toc237100960" w:history="1">
+      <w:hyperlink w:anchor="_Toc237115596" w:history="1">
         <w:r>
           <w:rPr>
             <w:rStyle w:val="Hyperlink"/>
@@ -2887,7 +2665,7 @@
             <w:noProof/>
             <w:webHidden/>
           </w:rPr>
-          <w:instrText xml:space="preserve"> PAGEREF _Toc237100960 \h </w:instrText>
+          <w:instrText xml:space="preserve"> PAGEREF _Toc237115596 \h </w:instrText>
         </w:r>
         <w:r>
           <w:rPr>
@@ -2925,16 +2703,10 @@
           <w:tab w:val="right" w:leader="dot" w:pos="9350"/>
         </w:tabs>
         <w:rPr>
-          <w:rFonts w:asciiTheme="minorHAnsi" w:hAnsiTheme="minorHAnsi"/>
           <w:noProof/>
-          <w:color w:val="auto"/>
-          <w:kern w:val="2"/>
-          <w:sz w:val="24"/>
-          <w:szCs w:val="24"/>
-          <w14:ligatures w14:val="standardContextual"/>
         </w:rPr>
       </w:pPr>
-      <w:hyperlink w:anchor="_Toc237100961" w:history="1">
+      <w:hyperlink w:anchor="_Toc237115597" w:history="1">
         <w:r>
           <w:rPr>
             <w:rStyle w:val="Hyperlink"/>
@@ -2961,7 +2733,7 @@
             <w:noProof/>
             <w:webHidden/>
           </w:rPr>
-          <w:instrText xml:space="preserve"> PAGEREF _Toc237100961 \h </w:instrText>
+          <w:instrText xml:space="preserve"> PAGEREF _Toc237115597 \h </w:instrText>
         </w:r>
         <w:r>
           <w:rPr>
@@ -2999,16 +2771,10 @@
           <w:tab w:val="right" w:leader="dot" w:pos="9350"/>
         </w:tabs>
         <w:rPr>
-          <w:rFonts w:asciiTheme="minorHAnsi" w:hAnsiTheme="minorHAnsi"/>
           <w:noProof/>
-          <w:color w:val="auto"/>
-          <w:kern w:val="2"/>
-          <w:sz w:val="24"/>
-          <w:szCs w:val="24"/>
-          <w14:ligatures w14:val="standardContextual"/>
         </w:rPr>
       </w:pPr>
-      <w:hyperlink w:anchor="_Toc237100962" w:history="1">
+      <w:hyperlink w:anchor="_Toc237115598" w:history="1">
         <w:r>
           <w:rPr>
             <w:rStyle w:val="Hyperlink"/>
@@ -3035,7 +2801,7 @@
             <w:noProof/>
             <w:webHidden/>
           </w:rPr>
-          <w:instrText xml:space="preserve"> PAGEREF _Toc237100962 \h </w:instrText>
+          <w:instrText xml:space="preserve"> PAGEREF _Toc237115598 \h </w:instrText>
         </w:r>
         <w:r>
           <w:rPr>
@@ -3073,16 +2839,10 @@
           <w:tab w:val="right" w:leader="dot" w:pos="9350"/>
         </w:tabs>
         <w:rPr>
-          <w:rFonts w:asciiTheme="minorHAnsi" w:hAnsiTheme="minorHAnsi"/>
           <w:noProof/>
-          <w:color w:val="auto"/>
-          <w:kern w:val="2"/>
-          <w:sz w:val="24"/>
-          <w:szCs w:val="24"/>
-          <w14:ligatures w14:val="standardContextual"/>
         </w:rPr>
       </w:pPr>
-      <w:hyperlink w:anchor="_Toc237100963" w:history="1">
+      <w:hyperlink w:anchor="_Toc237115599" w:history="1">
         <w:r>
           <w:rPr>
             <w:rStyle w:val="Hyperlink"/>
@@ -3109,7 +2869,7 @@
             <w:noProof/>
             <w:webHidden/>
           </w:rPr>
-          <w:instrText xml:space="preserve"> PAGEREF _Toc237100963 \h </w:instrText>
+          <w:instrText xml:space="preserve"> PAGEREF _Toc237115599 \h </w:instrText>
         </w:r>
         <w:r>
           <w:rPr>
@@ -3147,16 +2907,10 @@
           <w:tab w:val="right" w:leader="dot" w:pos="9350"/>
         </w:tabs>
         <w:rPr>
-          <w:rFonts w:asciiTheme="minorHAnsi" w:hAnsiTheme="minorHAnsi"/>
           <w:noProof/>
-          <w:color w:val="auto"/>
-          <w:kern w:val="2"/>
-          <w:sz w:val="24"/>
-          <w:szCs w:val="24"/>
-          <w14:ligatures w14:val="standardContextual"/>
         </w:rPr>
       </w:pPr>
-      <w:hyperlink w:anchor="_Toc237100964" w:history="1">
+      <w:hyperlink w:anchor="_Toc237115600" w:history="1">
         <w:r>
           <w:rPr>
             <w:rStyle w:val="Hyperlink"/>
@@ -3183,7 +2937,7 @@
             <w:noProof/>
             <w:webHidden/>
           </w:rPr>
-          <w:instrText xml:space="preserve"> PAGEREF _Toc237100964 \h </w:instrText>
+          <w:instrText xml:space="preserve"> PAGEREF _Toc237115600 \h </w:instrText>
         </w:r>
         <w:r>
           <w:rPr>
@@ -3221,16 +2975,10 @@
           <w:tab w:val="right" w:leader="dot" w:pos="9350"/>
         </w:tabs>
         <w:rPr>
-          <w:rFonts w:asciiTheme="minorHAnsi" w:hAnsiTheme="minorHAnsi"/>
           <w:noProof/>
-          <w:color w:val="auto"/>
-          <w:kern w:val="2"/>
-          <w:sz w:val="24"/>
-          <w:szCs w:val="24"/>
-          <w14:ligatures w14:val="standardContextual"/>
         </w:rPr>
       </w:pPr>
-      <w:hyperlink w:anchor="_Toc237100965" w:history="1">
+      <w:hyperlink w:anchor="_Toc237115601" w:history="1">
         <w:r>
           <w:rPr>
             <w:rStyle w:val="Hyperlink"/>
@@ -3257,7 +3005,7 @@
             <w:noProof/>
             <w:webHidden/>
           </w:rPr>
-          <w:instrText xml:space="preserve"> PAGEREF _Toc237100965 \h </w:instrText>
+          <w:instrText xml:space="preserve"> PAGEREF _Toc237115601 \h </w:instrText>
         </w:r>
         <w:r>
           <w:rPr>
@@ -3295,16 +3043,10 @@
           <w:tab w:val="right" w:leader="dot" w:pos="9350"/>
         </w:tabs>
         <w:rPr>
-          <w:rFonts w:asciiTheme="minorHAnsi" w:hAnsiTheme="minorHAnsi"/>
           <w:noProof/>
-          <w:color w:val="auto"/>
-          <w:kern w:val="2"/>
-          <w:sz w:val="24"/>
-          <w:szCs w:val="24"/>
-          <w14:ligatures w14:val="standardContextual"/>
         </w:rPr>
       </w:pPr>
-      <w:hyperlink w:anchor="_Toc237100966" w:history="1">
+      <w:hyperlink w:anchor="_Toc237115602" w:history="1">
         <w:r>
           <w:rPr>
             <w:rStyle w:val="Hyperlink"/>
@@ -3331,7 +3073,7 @@
             <w:noProof/>
             <w:webHidden/>
           </w:rPr>
-          <w:instrText xml:space="preserve"> PAGEREF _Toc237100966 \h </w:instrText>
+          <w:instrText xml:space="preserve"> PAGEREF _Toc237115602 \h </w:instrText>
         </w:r>
         <w:r>
           <w:rPr>
@@ -3369,16 +3111,10 @@
           <w:tab w:val="right" w:leader="dot" w:pos="9350"/>
         </w:tabs>
         <w:rPr>
-          <w:rFonts w:asciiTheme="minorHAnsi" w:hAnsiTheme="minorHAnsi"/>
           <w:noProof/>
-          <w:color w:val="auto"/>
-          <w:kern w:val="2"/>
-          <w:sz w:val="24"/>
-          <w:szCs w:val="24"/>
-          <w14:ligatures w14:val="standardContextual"/>
         </w:rPr>
       </w:pPr>
-      <w:hyperlink w:anchor="_Toc237100967" w:history="1">
+      <w:hyperlink w:anchor="_Toc237115603" w:history="1">
         <w:r>
           <w:rPr>
             <w:rStyle w:val="Hyperlink"/>
@@ -3405,7 +3141,7 @@
             <w:noProof/>
             <w:webHidden/>
           </w:rPr>
-          <w:instrText xml:space="preserve"> PAGEREF _Toc237100967 \h </w:instrText>
+          <w:instrText xml:space="preserve"> PAGEREF _Toc237115603 \h </w:instrText>
         </w:r>
         <w:r>
           <w:rPr>
@@ -3443,16 +3179,10 @@
           <w:tab w:val="right" w:leader="dot" w:pos="9350"/>
         </w:tabs>
         <w:rPr>
-          <w:rFonts w:asciiTheme="minorHAnsi" w:hAnsiTheme="minorHAnsi"/>
           <w:noProof/>
-          <w:color w:val="auto"/>
-          <w:kern w:val="2"/>
-          <w:sz w:val="24"/>
-          <w:szCs w:val="24"/>
-          <w14:ligatures w14:val="standardContextual"/>
         </w:rPr>
       </w:pPr>
-      <w:hyperlink w:anchor="_Toc237100968" w:history="1">
+      <w:hyperlink w:anchor="_Toc237115604" w:history="1">
         <w:r>
           <w:rPr>
             <w:rStyle w:val="Hyperlink"/>
@@ -3479,7 +3209,7 @@
             <w:noProof/>
             <w:webHidden/>
           </w:rPr>
-          <w:instrText xml:space="preserve"> PAGEREF _Toc237100968 \h </w:instrText>
+          <w:instrText xml:space="preserve"> PAGEREF _Toc237115604 \h </w:instrText>
         </w:r>
         <w:r>
           <w:rPr>
@@ -3517,16 +3247,10 @@
           <w:tab w:val="right" w:leader="dot" w:pos="9350"/>
         </w:tabs>
         <w:rPr>
-          <w:rFonts w:asciiTheme="minorHAnsi" w:hAnsiTheme="minorHAnsi"/>
           <w:noProof/>
-          <w:color w:val="auto"/>
-          <w:kern w:val="2"/>
-          <w:sz w:val="24"/>
-          <w:szCs w:val="24"/>
-          <w14:ligatures w14:val="standardContextual"/>
         </w:rPr>
       </w:pPr>
-      <w:hyperlink w:anchor="_Toc237100969" w:history="1">
+      <w:hyperlink w:anchor="_Toc237115605" w:history="1">
         <w:r>
           <w:rPr>
             <w:rStyle w:val="Hyperlink"/>
@@ -3553,7 +3277,7 @@
             <w:noProof/>
             <w:webHidden/>
           </w:rPr>
-          <w:instrText xml:space="preserve"> PAGEREF _Toc237100969 \h </w:instrText>
+          <w:instrText xml:space="preserve"> PAGEREF _Toc237115605 \h </w:instrText>
         </w:r>
         <w:r>
           <w:rPr>
@@ -3591,16 +3315,10 @@
           <w:tab w:val="right" w:leader="dot" w:pos="9350"/>
         </w:tabs>
         <w:rPr>
-          <w:rFonts w:asciiTheme="minorHAnsi" w:hAnsiTheme="minorHAnsi"/>
           <w:noProof/>
-          <w:color w:val="auto"/>
-          <w:kern w:val="2"/>
-          <w:sz w:val="24"/>
-          <w:szCs w:val="24"/>
-          <w14:ligatures w14:val="standardContextual"/>
         </w:rPr>
       </w:pPr>
-      <w:hyperlink w:anchor="_Toc237100970" w:history="1">
+      <w:hyperlink w:anchor="_Toc237115606" w:history="1">
         <w:r>
           <w:rPr>
             <w:rStyle w:val="Hyperlink"/>
@@ -3627,7 +3345,7 @@
             <w:noProof/>
             <w:webHidden/>
           </w:rPr>
-          <w:instrText xml:space="preserve"> PAGEREF _Toc237100970 \h </w:instrText>
+          <w:instrText xml:space="preserve"> PAGEREF _Toc237115606 \h </w:instrText>
         </w:r>
         <w:r>
           <w:rPr>
@@ -3665,16 +3383,10 @@
           <w:tab w:val="right" w:leader="dot" w:pos="9350"/>
         </w:tabs>
         <w:rPr>
-          <w:rFonts w:asciiTheme="minorHAnsi" w:hAnsiTheme="minorHAnsi"/>
           <w:noProof/>
-          <w:color w:val="auto"/>
-          <w:kern w:val="2"/>
-          <w:sz w:val="24"/>
-          <w:szCs w:val="24"/>
-          <w14:ligatures w14:val="standardContextual"/>
         </w:rPr>
       </w:pPr>
-      <w:hyperlink w:anchor="_Toc237100971" w:history="1">
+      <w:hyperlink w:anchor="_Toc237115607" w:history="1">
         <w:r>
           <w:rPr>
             <w:rStyle w:val="Hyperlink"/>
@@ -3701,7 +3413,7 @@
             <w:noProof/>
             <w:webHidden/>
           </w:rPr>
-          <w:instrText xml:space="preserve"> PAGEREF _Toc237100971 \h </w:instrText>
+          <w:instrText xml:space="preserve"> PAGEREF _Toc237115607 \h </w:instrText>
         </w:r>
         <w:r>
           <w:rPr>
@@ -3739,16 +3451,10 @@
           <w:tab w:val="right" w:leader="dot" w:pos="9350"/>
         </w:tabs>
         <w:rPr>
-          <w:rFonts w:asciiTheme="minorHAnsi" w:hAnsiTheme="minorHAnsi"/>
           <w:noProof/>
-          <w:color w:val="auto"/>
-          <w:kern w:val="2"/>
-          <w:sz w:val="24"/>
-          <w:szCs w:val="24"/>
-          <w14:ligatures w14:val="standardContextual"/>
         </w:rPr>
       </w:pPr>
-      <w:hyperlink w:anchor="_Toc237100972" w:history="1">
+      <w:hyperlink w:anchor="_Toc237115608" w:history="1">
         <w:r>
           <w:rPr>
             <w:rStyle w:val="Hyperlink"/>
@@ -3775,7 +3481,7 @@
             <w:noProof/>
             <w:webHidden/>
           </w:rPr>
-          <w:instrText xml:space="preserve"> PAGEREF _Toc237100972 \h </w:instrText>
+          <w:instrText xml:space="preserve"> PAGEREF _Toc237115608 \h </w:instrText>
         </w:r>
         <w:r>
           <w:rPr>
@@ -3828,7 +3534,7 @@
       <w:pPr>
         <w:pStyle w:val="Heading1"/>
       </w:pPr>
-      <w:bookmarkStart w:id="0" w:name="_Toc237100924"/>
+      <w:bookmarkStart w:id="0" w:name="_Toc237115560"/>
       <w:r>
         <w:lastRenderedPageBreak/>
         <w:t>1. Purpose and Test Philosophy</w:t>
@@ -3879,9 +3585,6 @@
           <w:p>
             <w:pPr>
               <w:pStyle w:val="Callout"/>
-              <w:rPr>
-                <w:rFonts w:hint="eastAsia"/>
-              </w:rPr>
             </w:pPr>
             <w:r>
               <w:rPr>
@@ -3901,7 +3604,7 @@
       <w:pPr>
         <w:pStyle w:val="Heading2"/>
       </w:pPr>
-      <w:bookmarkStart w:id="1" w:name="_Toc237100925"/>
+      <w:bookmarkStart w:id="1" w:name="_Toc237115561"/>
       <w:r>
         <w:t>1.1 Scope</w:t>
       </w:r>
@@ -3959,7 +3662,7 @@
       <w:pPr>
         <w:pStyle w:val="Heading2"/>
       </w:pPr>
-      <w:bookmarkStart w:id="2" w:name="_Toc237100926"/>
+      <w:bookmarkStart w:id="2" w:name="_Toc237115562"/>
       <w:r>
         <w:t>1.2 Stop conditions</w:t>
       </w:r>
@@ -4018,7 +3721,7 @@
       <w:pPr>
         <w:pStyle w:val="Heading1"/>
       </w:pPr>
-      <w:bookmarkStart w:id="3" w:name="_Toc237100927"/>
+      <w:bookmarkStart w:id="3" w:name="_Toc237115563"/>
       <w:r>
         <w:t>2. Exact Folders and Files</w:t>
       </w:r>
@@ -4781,7 +4484,7 @@
       <w:pPr>
         <w:pStyle w:val="Heading2"/>
       </w:pPr>
-      <w:bookmarkStart w:id="4" w:name="_Toc237100928"/>
+      <w:bookmarkStart w:id="4" w:name="_Toc237115564"/>
       <w:r>
         <w:t>2.1 Studio executable matrix</w:t>
       </w:r>
@@ -5049,9 +4752,6 @@
           <w:p>
             <w:pPr>
               <w:pStyle w:val="Callout"/>
-              <w:rPr>
-                <w:rFonts w:hint="eastAsia"/>
-              </w:rPr>
             </w:pPr>
             <w:r>
               <w:rPr>
@@ -5071,7 +4771,7 @@
       <w:pPr>
         <w:pStyle w:val="Heading2"/>
       </w:pPr>
-      <w:bookmarkStart w:id="5" w:name="_Toc237100929"/>
+      <w:bookmarkStart w:id="5" w:name="_Toc237115565"/>
       <w:r>
         <w:t>2.2 Package source and build outputs</w:t>
       </w:r>
@@ -5463,14 +5163,14 @@
     <w:p/>
     <w:p>
       <w:r>
-        <w:t>Runtime packages build for Win32 and Win64. The Delphi IDE loads the Win32 design package. The release gate builds packages but does not install them into the IDE. Installation is an explicit test/developer action.</w:t>
+        <w:t>Runtime packages build for Win32 and Win64. The Delphi IDE loads the self-contained Win32 design package. Installation remains an explicit developer action, but the supported installer automates build, verification, copying, and per-user registration.</w:t>
       </w:r>
     </w:p>
     <w:p>
       <w:pPr>
         <w:pStyle w:val="Heading1"/>
       </w:pPr>
-      <w:bookmarkStart w:id="6" w:name="_Toc237100930"/>
+      <w:bookmarkStart w:id="6" w:name="_Toc237115566"/>
       <w:r>
         <w:t>3. Prerequisites and Test Data</w:t>
       </w:r>
@@ -5562,9 +5262,6 @@
           <w:p>
             <w:pPr>
               <w:pStyle w:val="Callout"/>
-              <w:rPr>
-                <w:rFonts w:hint="eastAsia"/>
-              </w:rPr>
             </w:pPr>
             <w:r>
               <w:rPr>
@@ -5584,7 +5281,7 @@
       <w:pPr>
         <w:pStyle w:val="Heading2"/>
       </w:pPr>
-      <w:bookmarkStart w:id="7" w:name="_Toc237100931"/>
+      <w:bookmarkStart w:id="7" w:name="_Toc237115567"/>
       <w:r>
         <w:t>3.1 Create the disposable GA4 test copy</w:t>
       </w:r>
@@ -5679,9 +5376,6 @@
           <w:p>
             <w:pPr>
               <w:pStyle w:val="Callout"/>
-              <w:rPr>
-                <w:rFonts w:hint="eastAsia"/>
-              </w:rPr>
             </w:pPr>
             <w:r>
               <w:rPr>
@@ -5701,7 +5395,7 @@
       <w:pPr>
         <w:pStyle w:val="Heading1"/>
       </w:pPr>
-      <w:bookmarkStart w:id="8" w:name="_Toc237100932"/>
+      <w:bookmarkStart w:id="8" w:name="_Toc237115568"/>
       <w:r>
         <w:t>4. Build the Studio Manually</w:t>
       </w:r>
@@ -5716,7 +5410,7 @@
       <w:pPr>
         <w:pStyle w:val="Heading2"/>
       </w:pPr>
-      <w:bookmarkStart w:id="9" w:name="_Toc237100933"/>
+      <w:bookmarkStart w:id="9" w:name="_Toc237115569"/>
       <w:r>
         <w:t>4.1 RAD Studio method</w:t>
       </w:r>
@@ -5786,7 +5480,7 @@
       <w:pPr>
         <w:pStyle w:val="Heading2"/>
       </w:pPr>
-      <w:bookmarkStart w:id="10" w:name="_Toc237100934"/>
+      <w:bookmarkStart w:id="10" w:name="_Toc237115570"/>
       <w:r>
         <w:t>4.2 Command-line method</w:t>
       </w:r>
@@ -5795,9 +5489,6 @@
     <w:p>
       <w:pPr>
         <w:pStyle w:val="CodeBlock"/>
-        <w:rPr>
-          <w:rFonts w:hint="eastAsia"/>
-        </w:rPr>
       </w:pPr>
       <w:r>
         <w:t>cd "C:\New Delphi Projects\Delphi App Translation"</w:t>
@@ -5806,9 +5497,6 @@
     <w:p>
       <w:pPr>
         <w:pStyle w:val="CodeBlock"/>
-        <w:rPr>
-          <w:rFonts w:hint="eastAsia"/>
-        </w:rPr>
       </w:pPr>
       <w:r>
         <w:t>cmd /d /c "call ""C:\Program Files (x86)\Embarcadero\Studio\37.0\bin\rsvars.bat"" &amp;&amp; msbuild DelphiAppTranslationStudio.dproj /t:Build /p:Config=Debug /p:Platform=Win32 /v:minimal"</w:t>
@@ -5817,9 +5505,6 @@
     <w:p>
       <w:pPr>
         <w:pStyle w:val="CodeBlock"/>
-        <w:rPr>
-          <w:rFonts w:hint="eastAsia"/>
-        </w:rPr>
       </w:pPr>
       <w:r>
         <w:lastRenderedPageBreak/>
@@ -5829,9 +5514,6 @@
     <w:p>
       <w:pPr>
         <w:pStyle w:val="CodeBlock"/>
-        <w:rPr>
-          <w:rFonts w:hint="eastAsia"/>
-        </w:rPr>
       </w:pPr>
       <w:r>
         <w:t>cmd /d /c "call ""C:\Program Files (x86)\Embarcadero\Studio\37.0\bin\rsvars.bat"" &amp;&amp; msbuild DelphiAppTranslationStudio.dproj /t:Build /p:Config=Release /p:Platform=Win32 /v:minimal"</w:t>
@@ -5840,9 +5522,6 @@
     <w:p>
       <w:pPr>
         <w:pStyle w:val="CodeBlock"/>
-        <w:rPr>
-          <w:rFonts w:hint="eastAsia"/>
-        </w:rPr>
       </w:pPr>
       <w:r>
         <w:t>cmd /d /c "call ""C:\Program Files (x86)\Embarcadero\Studio\37.0\bin\rsvars.bat"" &amp;&amp; msbuild DelphiAppTranslationStudio.dproj /t:Build /p:Config=Release /p:Platform=Win64 /v:minimal"</w:t>
@@ -5852,7 +5531,7 @@
       <w:pPr>
         <w:pStyle w:val="Heading1"/>
       </w:pPr>
-      <w:bookmarkStart w:id="11" w:name="_Toc237100935"/>
+      <w:bookmarkStart w:id="11" w:name="_Toc237115571"/>
       <w:r>
         <w:t>5. Automated Release Gate</w:t>
       </w:r>
@@ -5866,9 +5545,6 @@
     <w:p>
       <w:pPr>
         <w:pStyle w:val="CodeBlock"/>
-        <w:rPr>
-          <w:rFonts w:hint="eastAsia"/>
-        </w:rPr>
       </w:pPr>
       <w:r>
         <w:t>cd "C:\New Delphi Projects\Delphi App Translation"</w:t>
@@ -5877,9 +5553,6 @@
     <w:p>
       <w:pPr>
         <w:pStyle w:val="CodeBlock"/>
-        <w:rPr>
-          <w:rFonts w:hint="eastAsia"/>
-        </w:rPr>
       </w:pPr>
       <w:r>
         <w:t>powershell.exe -ExecutionPolicy Bypass -File .\tools\tests\RunPhase10ReleaseValidation.ps1</w:t>
@@ -5921,7 +5594,7 @@
       <w:pPr>
         <w:pStyle w:val="Heading2"/>
       </w:pPr>
-      <w:bookmarkStart w:id="12" w:name="_Toc237100936"/>
+      <w:bookmarkStart w:id="12" w:name="_Toc237115572"/>
       <w:r>
         <w:t>5.1 What the gate proves</w:t>
       </w:r>
@@ -6254,7 +5927,7 @@
       <w:pPr>
         <w:pStyle w:val="Heading1"/>
       </w:pPr>
-      <w:bookmarkStart w:id="13" w:name="_Toc237100937"/>
+      <w:bookmarkStart w:id="13" w:name="_Toc237115573"/>
       <w:r>
         <w:lastRenderedPageBreak/>
         <w:t>6. Manual Studio Acceptance</w:t>
@@ -6265,7 +5938,7 @@
       <w:pPr>
         <w:pStyle w:val="Heading2"/>
       </w:pPr>
-      <w:bookmarkStart w:id="14" w:name="_Toc237100938"/>
+      <w:bookmarkStart w:id="14" w:name="_Toc237115574"/>
       <w:r>
         <w:t>TC-01 Launch and navigation</w:t>
       </w:r>
@@ -6300,9 +5973,6 @@
           <w:p>
             <w:pPr>
               <w:pStyle w:val="Callout"/>
-              <w:rPr>
-                <w:rFonts w:hint="eastAsia"/>
-              </w:rPr>
             </w:pPr>
             <w:r>
               <w:rPr>
@@ -6371,6 +6041,18 @@
         </w:numPr>
       </w:pPr>
       <w:r>
+        <w:t>Read the bottom status card after every selection.</w:t>
+      </w:r>
+    </w:p>
+    <w:p>
+      <w:pPr>
+        <w:pStyle w:val="ListNumber"/>
+        <w:numPr>
+          <w:ilvl w:val="0"/>
+          <w:numId w:val="12"/>
+        </w:numPr>
+      </w:pPr>
+      <w:r>
         <w:t>Resize the maximized window and inspect the top, bottom, left, and right edges of each page.</w:t>
       </w:r>
     </w:p>
@@ -6396,6 +6078,14 @@
       </w:pPr>
       <w:r>
         <w:t>The blue workflow selection follows the active page.</w:t>
+      </w:r>
+    </w:p>
+    <w:p>
+      <w:pPr>
+        <w:pStyle w:val="ListBullet"/>
+      </w:pPr>
+      <w:r>
+        <w:t>The bottom status card changes to page-specific guidance and never retains a message from the previous page.</w:t>
       </w:r>
     </w:p>
     <w:p>
@@ -6554,7 +6244,7 @@
       <w:pPr>
         <w:pStyle w:val="Heading2"/>
       </w:pPr>
-      <w:bookmarkStart w:id="15" w:name="_Toc237100939"/>
+      <w:bookmarkStart w:id="15" w:name="_Toc237115575"/>
       <w:r>
         <w:t>TC-02 Open the disposable GA4 project</w:t>
       </w:r>
@@ -6589,9 +6279,6 @@
           <w:p>
             <w:pPr>
               <w:pStyle w:val="Callout"/>
-              <w:rPr>
-                <w:rFonts w:hint="eastAsia"/>
-              </w:rPr>
             </w:pPr>
             <w:r>
               <w:rPr>
@@ -6660,6 +6347,7 @@
         </w:numPr>
       </w:pPr>
       <w:r>
+        <w:lastRenderedPageBreak/>
         <w:t>In a separate console, run git -C "C:\New Delphi Projects\Echurchsite Analytical - Component Test" status --short.</w:t>
       </w:r>
     </w:p>
@@ -6668,7 +6356,6 @@
         <w:pStyle w:val="Heading3"/>
       </w:pPr>
       <w:r>
-        <w:lastRenderedPageBreak/>
         <w:t>Expected result</w:t>
       </w:r>
     </w:p>
@@ -6844,7 +6531,7 @@
       <w:pPr>
         <w:pStyle w:val="Heading2"/>
       </w:pPr>
-      <w:bookmarkStart w:id="16" w:name="_Toc237100940"/>
+      <w:bookmarkStart w:id="16" w:name="_Toc237115576"/>
       <w:r>
         <w:t>TC-03 Scan the project</w:t>
       </w:r>
@@ -6879,9 +6566,6 @@
           <w:p>
             <w:pPr>
               <w:pStyle w:val="Callout"/>
-              <w:rPr>
-                <w:rFonts w:hint="eastAsia"/>
-              </w:rPr>
             </w:pPr>
             <w:r>
               <w:rPr>
@@ -6962,6 +6646,18 @@
         </w:numPr>
       </w:pPr>
       <w:r>
+        <w:t>Scroll rapidly from the top to the bottom and back through the scan-result list.</w:t>
+      </w:r>
+    </w:p>
+    <w:p>
+      <w:pPr>
+        <w:pStyle w:val="ListNumber"/>
+        <w:numPr>
+          <w:ilvl w:val="0"/>
+          <w:numId w:val="14"/>
+        </w:numPr>
+      </w:pPr>
+      <w:r>
         <w:t>Run git -C "C:\New Delphi Projects\Echurchsite Analytical - Component Test" status --short again.</w:t>
       </w:r>
     </w:p>
@@ -6987,6 +6683,14 @@
       </w:pPr>
       <w:r>
         <w:t>The result list contains stable form/component/property keys and readable source text.</w:t>
+      </w:r>
+    </w:p>
+    <w:p>
+      <w:pPr>
+        <w:pStyle w:val="ListBullet"/>
+      </w:pPr>
+      <w:r>
+        <w:t>Rows remain separated while scrolling; text never paints over adjacent rows.</w:t>
       </w:r>
     </w:p>
     <w:p>
@@ -7049,6 +6753,7 @@
                 <w:color w:val="234C80"/>
                 <w:sz w:val="17"/>
               </w:rPr>
+              <w:lastRenderedPageBreak/>
               <w:t>Result</w:t>
             </w:r>
           </w:p>
@@ -7145,9 +6850,8 @@
       <w:pPr>
         <w:pStyle w:val="Heading2"/>
       </w:pPr>
-      <w:bookmarkStart w:id="17" w:name="_Toc237100941"/>
-      <w:r>
-        <w:lastRenderedPageBreak/>
+      <w:bookmarkStart w:id="17" w:name="_Toc237115577"/>
+      <w:r>
         <w:t>TC-04 Configure and test a provider</w:t>
       </w:r>
       <w:bookmarkEnd w:id="17"/>
@@ -7181,9 +6885,6 @@
           <w:p>
             <w:pPr>
               <w:pStyle w:val="Callout"/>
-              <w:rPr>
-                <w:rFonts w:hint="eastAsia"/>
-              </w:rPr>
             </w:pPr>
             <w:r>
               <w:rPr>
@@ -7463,7 +7164,7 @@
       <w:pPr>
         <w:pStyle w:val="Heading2"/>
       </w:pPr>
-      <w:bookmarkStart w:id="18" w:name="_Toc237100942"/>
+      <w:bookmarkStart w:id="18" w:name="_Toc237115578"/>
       <w:r>
         <w:t>TC-05 Create the development catalog</w:t>
       </w:r>
@@ -7498,9 +7199,6 @@
           <w:p>
             <w:pPr>
               <w:pStyle w:val="Callout"/>
-              <w:rPr>
-                <w:rFonts w:hint="eastAsia"/>
-              </w:rPr>
             </w:pPr>
             <w:r>
               <w:rPr>
@@ -7545,6 +7243,7 @@
         </w:numPr>
       </w:pPr>
       <w:r>
+        <w:lastRenderedPageBreak/>
         <w:t>Confirm source language English (United States) [en-US].</w:t>
       </w:r>
     </w:p>
@@ -7593,7 +7292,7 @@
         </w:numPr>
       </w:pPr>
       <w:r>
-        <w:t>Open the displayed catalog path in a text editor and confirm it is JSON, not CSV.</w:t>
+        <w:t>Click the blue displayed catalog path. Confirm File Explorer opens with the JSON catalog selected, then open it in a text editor and confirm it is JSON, not CSV.</w:t>
       </w:r>
     </w:p>
     <w:p>
@@ -7601,7 +7300,6 @@
         <w:pStyle w:val="Heading3"/>
       </w:pPr>
       <w:r>
-        <w:lastRenderedPageBreak/>
         <w:t>Expected result</w:t>
       </w:r>
     </w:p>
@@ -7761,7 +7459,7 @@
       <w:pPr>
         <w:pStyle w:val="Heading2"/>
       </w:pPr>
-      <w:bookmarkStart w:id="19" w:name="_Toc237100943"/>
+      <w:bookmarkStart w:id="19" w:name="_Toc237115579"/>
       <w:r>
         <w:t>TC-06 Translate automatically</w:t>
       </w:r>
@@ -7796,9 +7494,6 @@
           <w:p>
             <w:pPr>
               <w:pStyle w:val="Callout"/>
-              <w:rPr>
-                <w:rFonts w:hint="eastAsia"/>
-              </w:rPr>
             </w:pPr>
             <w:r>
               <w:rPr>
@@ -7911,6 +7606,7 @@
         <w:pStyle w:val="ListBullet"/>
       </w:pPr>
       <w:r>
+        <w:lastRenderedPageBreak/>
         <w:t>Reviewed, Approved, Excluded, and Obsolete entries are not overwritten.</w:t>
       </w:r>
     </w:p>
@@ -8062,9 +7758,8 @@
       <w:pPr>
         <w:pStyle w:val="Heading2"/>
       </w:pPr>
-      <w:bookmarkStart w:id="20" w:name="_Toc237100944"/>
-      <w:r>
-        <w:lastRenderedPageBreak/>
+      <w:bookmarkStart w:id="20" w:name="_Toc237115580"/>
+      <w:r>
         <w:t>TC-07 Focused linguistic and structural review</w:t>
       </w:r>
       <w:bookmarkEnd w:id="20"/>
@@ -8098,9 +7793,6 @@
           <w:p>
             <w:pPr>
               <w:pStyle w:val="Callout"/>
-              <w:rPr>
-                <w:rFonts w:hint="eastAsia"/>
-              </w:rPr>
             </w:pPr>
             <w:r>
               <w:rPr>
@@ -8169,6 +7861,18 @@
         </w:numPr>
       </w:pPr>
       <w:r>
+        <w:t>For the remaining translated drafts, choose Review All, verify the count in the confirmation, and accept. Then choose Approve All, verify its Reviewed count, and accept.</w:t>
+      </w:r>
+    </w:p>
+    <w:p>
+      <w:pPr>
+        <w:pStyle w:val="ListNumber"/>
+        <w:numPr>
+          <w:ilvl w:val="0"/>
+          <w:numId w:val="18"/>
+        </w:numPr>
+      </w:pPr>
+      <w:r>
         <w:t>If the catalog has a Pascal resourcestring, confirm its runtime classification and leave Manual TranslateText wiring confirmed clear unless the target code has actually been wired.</w:t>
       </w:r>
     </w:p>
@@ -8194,6 +7898,14 @@
       </w:pPr>
       <w:r>
         <w:t>Reviewed and Approved are separate deliberate steps.</w:t>
+      </w:r>
+    </w:p>
+    <w:p>
+      <w:pPr>
+        <w:pStyle w:val="ListBullet"/>
+      </w:pPr>
+      <w:r>
+        <w:t>Each bulk action operates on its stated eligible set, saves once, and leaves Excluded, Obsolete, and already Approved entries unchanged.</w:t>
       </w:r>
     </w:p>
     <w:p>
@@ -8344,8 +8056,9 @@
       <w:pPr>
         <w:pStyle w:val="Heading2"/>
       </w:pPr>
-      <w:bookmarkStart w:id="21" w:name="_Toc237100945"/>
-      <w:r>
+      <w:bookmarkStart w:id="21" w:name="_Toc237115581"/>
+      <w:r>
+        <w:lastRenderedPageBreak/>
         <w:t>TC-08 Validate and export runtime JSON</w:t>
       </w:r>
       <w:bookmarkEnd w:id="21"/>
@@ -8379,9 +8092,6 @@
           <w:p>
             <w:pPr>
               <w:pStyle w:val="Callout"/>
-              <w:rPr>
-                <w:rFonts w:hint="eastAsia"/>
-              </w:rPr>
             </w:pPr>
             <w:r>
               <w:rPr>
@@ -8426,7 +8136,7 @@
         </w:numPr>
       </w:pPr>
       <w:r>
-        <w:t>Resolve all errors involving missing text, duplicate keys, changed source, placeholders, sequential/indexed Format arguments, or accelerator keys.</w:t>
+        <w:t>Read the plain-language summary. Double-click an entry-specific warning and confirm Translate opens with that entry selected.</w:t>
       </w:r>
     </w:p>
     <w:p>
@@ -8438,7 +8148,7 @@
         </w:numPr>
       </w:pPr>
       <w:r>
-        <w:t>Treat manual resourcestring wiring as a separate readiness warning and resolve it before claiming complete runtime coverage.</w:t>
+        <w:t>Resolve all errors involving missing text, duplicate keys, changed source, placeholders, sequential/indexed Format arguments, or accelerator keys. Review warnings; informational runtime placeholders require no action.</w:t>
       </w:r>
     </w:p>
     <w:p>
@@ -8450,7 +8160,7 @@
         </w:numPr>
       </w:pPr>
       <w:r>
-        <w:t>Select Export and choose Export Runtime Pack.</w:t>
+        <w:t>Treat manual resourcestring wiring as a separate readiness warning and resolve it before claiming complete runtime coverage.</w:t>
       </w:r>
     </w:p>
     <w:p>
@@ -8462,6 +8172,18 @@
         </w:numPr>
       </w:pPr>
       <w:r>
+        <w:t>Select Export and choose Export Runtime Pack.</w:t>
+      </w:r>
+    </w:p>
+    <w:p>
+      <w:pPr>
+        <w:pStyle w:val="ListNumber"/>
+        <w:numPr>
+          <w:ilvl w:val="0"/>
+          <w:numId w:val="19"/>
+        </w:numPr>
+      </w:pPr>
+      <w:r>
         <w:t>Open the displayed output file and confirm it is JSON.</w:t>
       </w:r>
     </w:p>
@@ -8470,7 +8192,6 @@
         <w:pStyle w:val="Heading3"/>
       </w:pPr>
       <w:r>
-        <w:lastRenderedPageBreak/>
         <w:t>Expected result</w:t>
       </w:r>
     </w:p>
@@ -8643,7 +8364,7 @@
       <w:pPr>
         <w:pStyle w:val="Heading1"/>
       </w:pPr>
-      <w:bookmarkStart w:id="22" w:name="_Toc237100946"/>
+      <w:bookmarkStart w:id="22" w:name="_Toc237115582"/>
       <w:r>
         <w:lastRenderedPageBreak/>
         <w:t>7. Component Integration Acceptance</w:t>
@@ -8654,7 +8375,7 @@
       <w:pPr>
         <w:pStyle w:val="Heading2"/>
       </w:pPr>
-      <w:bookmarkStart w:id="23" w:name="_Toc237100947"/>
+      <w:bookmarkStart w:id="23" w:name="_Toc237115583"/>
       <w:r>
         <w:t>TC-09 Generate the non-mutating component kit</w:t>
       </w:r>
@@ -8689,9 +8410,6 @@
           <w:p>
             <w:pPr>
               <w:pStyle w:val="Callout"/>
-              <w:rPr>
-                <w:rFonts w:hint="eastAsia"/>
-              </w:rPr>
             </w:pPr>
             <w:r>
               <w:rPr>
@@ -8808,7 +8526,7 @@
         <w:pStyle w:val="ListBullet"/>
       </w:pPr>
       <w:r>
-        <w:t>The kit contains README.txt, component-integration.json, Deploy-LanguagePacks.ps1, ComponentSource, and Localization\Languages.</w:t>
+        <w:t>The kit contains README.txt, component-integration.json, Install-Components.cmd, Install-Components.ps1, DelphiPackages, Deploy-LanguagePacks.ps1, ComponentSource, and Localization\Languages.</w:t>
       </w:r>
     </w:p>
     <w:p>
@@ -8967,7 +8685,7 @@
       <w:pPr>
         <w:pStyle w:val="Heading2"/>
       </w:pPr>
-      <w:bookmarkStart w:id="24" w:name="_Toc237100948"/>
+      <w:bookmarkStart w:id="24" w:name="_Toc237115584"/>
       <w:r>
         <w:t>7.1 Expected component-kit contents</w:t>
       </w:r>
@@ -9094,7 +8812,7 @@
                 <w:color w:val="163A63"/>
                 <w:sz w:val="17"/>
               </w:rPr>
-              <w:t>component-integration.json</w:t>
+              <w:t>Install-Components.ps1</w:t>
             </w:r>
           </w:p>
         </w:tc>
@@ -9113,7 +8831,7 @@
                 <w:color w:val="163A63"/>
                 <w:sz w:val="17"/>
               </w:rPr>
-              <w:t>Application identity, FMX framework, manager/selector classes, language metadata, and scanner form roots.</w:t>
+              <w:t>One-step build/copy/register installer; auto-detects the framework bundled in the kit.</w:t>
             </w:r>
           </w:p>
         </w:tc>
@@ -9137,7 +8855,7 @@
                 <w:color w:val="163A63"/>
                 <w:sz w:val="17"/>
               </w:rPr>
-              <w:t>Deploy-LanguagePacks.ps1</w:t>
+              <w:t>Install-Components.cmd</w:t>
             </w:r>
           </w:p>
         </w:tc>
@@ -9155,7 +8873,7 @@
                 <w:color w:val="163A63"/>
                 <w:sz w:val="17"/>
               </w:rPr>
-              <w:t>Copies only JSON packs to a selected executable directory.</w:t>
+              <w:t>Double-click launcher that invokes the installer with ExecutionPolicy Bypass and keeps the result visible.</w:t>
             </w:r>
           </w:p>
         </w:tc>
@@ -9180,7 +8898,7 @@
                 <w:color w:val="163A63"/>
                 <w:sz w:val="17"/>
               </w:rPr>
-              <w:t>Localization\Languages\en-US.json</w:t>
+              <w:t>DelphiPackages\*.bpl</w:t>
             </w:r>
           </w:p>
         </w:tc>
@@ -9199,7 +8917,7 @@
                 <w:color w:val="163A63"/>
                 <w:sz w:val="17"/>
               </w:rPr>
-              <w:t>Generated source-language pack for deterministic return to English.</w:t>
+              <w:t>Verified Win32 core, framework runtime, and self-contained design packages.</w:t>
             </w:r>
           </w:p>
         </w:tc>
@@ -9223,7 +8941,7 @@
                 <w:color w:val="163A63"/>
                 <w:sz w:val="17"/>
               </w:rPr>
-              <w:t>Localization\Languages\&lt;locale&gt;.json</w:t>
+              <w:t>component-integration.json</w:t>
             </w:r>
           </w:p>
         </w:tc>
@@ -9241,7 +8959,7 @@
                 <w:color w:val="163A63"/>
                 <w:sz w:val="17"/>
               </w:rPr>
-              <w:t>Validated translated runtime pack.</w:t>
+              <w:t>Application identity, FMX framework, manager/selector classes, language metadata, and scanner form roots.</w:t>
             </w:r>
           </w:p>
         </w:tc>
@@ -9266,7 +8984,7 @@
                 <w:color w:val="163A63"/>
                 <w:sz w:val="17"/>
               </w:rPr>
-              <w:t>ComponentSource\DAT.Components.Core.pas</w:t>
+              <w:t>Deploy-LanguagePacks.ps1</w:t>
             </w:r>
           </w:p>
         </w:tc>
@@ -9285,7 +9003,7 @@
                 <w:color w:val="163A63"/>
                 <w:sz w:val="17"/>
               </w:rPr>
-              <w:t>Framework-neutral manager core.</w:t>
+              <w:t>Copies only JSON packs to a selected executable directory.</w:t>
             </w:r>
           </w:p>
         </w:tc>
@@ -9309,7 +9027,7 @@
                 <w:color w:val="163A63"/>
                 <w:sz w:val="17"/>
               </w:rPr>
-              <w:t>ComponentSource\DAT.Components.FMX.pas</w:t>
+              <w:t>Localization\Languages\en-US.json</w:t>
             </w:r>
           </w:p>
         </w:tc>
@@ -9327,7 +9045,7 @@
                 <w:color w:val="163A63"/>
                 <w:sz w:val="17"/>
               </w:rPr>
-              <w:t>FMX lifecycle adapter and manager.</w:t>
+              <w:t>Generated source-language pack for deterministic return to English.</w:t>
             </w:r>
           </w:p>
         </w:tc>
@@ -9352,7 +9070,7 @@
                 <w:color w:val="163A63"/>
                 <w:sz w:val="17"/>
               </w:rPr>
-              <w:t>ComponentSource\DAT.Components.FMX.LanguageSelector.pas</w:t>
+              <w:t>Localization\Languages\&lt;locale&gt;.json</w:t>
             </w:r>
           </w:p>
         </w:tc>
@@ -9371,7 +9089,7 @@
                 <w:color w:val="163A63"/>
                 <w:sz w:val="17"/>
               </w:rPr>
-              <w:t>Optional typed FMX language combo box.</w:t>
+              <w:t>Validated translated runtime pack.</w:t>
             </w:r>
           </w:p>
         </w:tc>
@@ -9395,6 +9113,135 @@
                 <w:color w:val="163A63"/>
                 <w:sz w:val="17"/>
               </w:rPr>
+              <w:t>ComponentSource\DAT.Components.Core.pas</w:t>
+            </w:r>
+          </w:p>
+        </w:tc>
+        <w:tc>
+          <w:tcPr>
+            <w:tcW w:w="5260" w:type="dxa"/>
+            <w:vAlign w:val="center"/>
+          </w:tcPr>
+          <w:p>
+            <w:pPr>
+              <w:spacing w:after="40" w:line="252" w:lineRule="auto"/>
+            </w:pPr>
+            <w:r>
+              <w:rPr>
+                <w:color w:val="163A63"/>
+                <w:sz w:val="17"/>
+              </w:rPr>
+              <w:t>Framework-neutral manager core.</w:t>
+            </w:r>
+          </w:p>
+        </w:tc>
+      </w:tr>
+      <w:tr>
+        <w:trPr>
+          <w:cantSplit/>
+          <w:jc w:val="center"/>
+        </w:trPr>
+        <w:tc>
+          <w:tcPr>
+            <w:tcW w:w="4100" w:type="dxa"/>
+            <w:shd w:val="clear" w:color="auto" w:fill="F6F9FC"/>
+            <w:vAlign w:val="center"/>
+          </w:tcPr>
+          <w:p>
+            <w:pPr>
+              <w:spacing w:after="40" w:line="252" w:lineRule="auto"/>
+            </w:pPr>
+            <w:r>
+              <w:rPr>
+                <w:color w:val="163A63"/>
+                <w:sz w:val="17"/>
+              </w:rPr>
+              <w:t>ComponentSource\DAT.Components.FMX.pas</w:t>
+            </w:r>
+          </w:p>
+        </w:tc>
+        <w:tc>
+          <w:tcPr>
+            <w:tcW w:w="5260" w:type="dxa"/>
+            <w:shd w:val="clear" w:color="auto" w:fill="F6F9FC"/>
+            <w:vAlign w:val="center"/>
+          </w:tcPr>
+          <w:p>
+            <w:pPr>
+              <w:spacing w:after="40" w:line="252" w:lineRule="auto"/>
+            </w:pPr>
+            <w:r>
+              <w:rPr>
+                <w:color w:val="163A63"/>
+                <w:sz w:val="17"/>
+              </w:rPr>
+              <w:t>FMX lifecycle adapter and manager.</w:t>
+            </w:r>
+          </w:p>
+        </w:tc>
+      </w:tr>
+      <w:tr>
+        <w:trPr>
+          <w:cantSplit/>
+          <w:jc w:val="center"/>
+        </w:trPr>
+        <w:tc>
+          <w:tcPr>
+            <w:tcW w:w="4100" w:type="dxa"/>
+            <w:vAlign w:val="center"/>
+          </w:tcPr>
+          <w:p>
+            <w:pPr>
+              <w:spacing w:after="40" w:line="252" w:lineRule="auto"/>
+            </w:pPr>
+            <w:r>
+              <w:rPr>
+                <w:color w:val="163A63"/>
+                <w:sz w:val="17"/>
+              </w:rPr>
+              <w:t>ComponentSource\DAT.Components.FMX.LanguageSelector.pas</w:t>
+            </w:r>
+          </w:p>
+        </w:tc>
+        <w:tc>
+          <w:tcPr>
+            <w:tcW w:w="5260" w:type="dxa"/>
+            <w:vAlign w:val="center"/>
+          </w:tcPr>
+          <w:p>
+            <w:pPr>
+              <w:spacing w:after="40" w:line="252" w:lineRule="auto"/>
+            </w:pPr>
+            <w:r>
+              <w:rPr>
+                <w:color w:val="163A63"/>
+                <w:sz w:val="17"/>
+              </w:rPr>
+              <w:t>Optional typed FMX language combo box.</w:t>
+            </w:r>
+          </w:p>
+        </w:tc>
+      </w:tr>
+      <w:tr>
+        <w:trPr>
+          <w:cantSplit/>
+          <w:jc w:val="center"/>
+        </w:trPr>
+        <w:tc>
+          <w:tcPr>
+            <w:tcW w:w="4100" w:type="dxa"/>
+            <w:shd w:val="clear" w:color="auto" w:fill="F6F9FC"/>
+            <w:vAlign w:val="center"/>
+          </w:tcPr>
+          <w:p>
+            <w:pPr>
+              <w:spacing w:after="40" w:line="252" w:lineRule="auto"/>
+            </w:pPr>
+            <w:r>
+              <w:rPr>
+                <w:color w:val="163A63"/>
+                <w:sz w:val="17"/>
+              </w:rPr>
               <w:t>ComponentSource\DAT.Runtime.*.pas</w:t>
             </w:r>
           </w:p>
@@ -9402,6 +9249,7 @@
         <w:tc>
           <w:tcPr>
             <w:tcW w:w="5260" w:type="dxa"/>
+            <w:shd w:val="clear" w:color="auto" w:fill="F6F9FC"/>
             <w:vAlign w:val="center"/>
           </w:tcPr>
           <w:p>
@@ -9424,9 +9272,9 @@
       <w:pPr>
         <w:pStyle w:val="Heading2"/>
       </w:pPr>
-      <w:bookmarkStart w:id="25" w:name="_Toc237100949"/>
-      <w:r>
-        <w:t>TC-10 Install the FMX design package</w:t>
+      <w:bookmarkStart w:id="25" w:name="_Toc237115585"/>
+      <w:r>
+        <w:t>TC-10 Install or repair the FMX components</w:t>
       </w:r>
       <w:bookmarkEnd w:id="25"/>
     </w:p>
@@ -9459,9 +9307,6 @@
           <w:p>
             <w:pPr>
               <w:pStyle w:val="Callout"/>
-              <w:rPr>
-                <w:rFonts w:hint="eastAsia"/>
-              </w:rPr>
             </w:pPr>
             <w:r>
               <w:rPr>
@@ -9471,7 +9316,7 @@
               <w:t xml:space="preserve">Objective. </w:t>
             </w:r>
             <w:r>
-              <w:t>Make the manager and selector available on the DAT Localization Tool Palette page without silently changing the target.</w:t>
+              <w:t>Use the supported one-step setup to make the manager and selector available on DAT Localization without changing the target.</w:t>
             </w:r>
           </w:p>
         </w:tc>
@@ -9494,7 +9339,7 @@
         </w:numPr>
       </w:pPr>
       <w:r>
-        <w:t>Close any running Studio or package-test executable.</w:t>
+        <w:t>Close every RAD Studio window. Leave Delphi App Translation Studio open.</w:t>
       </w:r>
     </w:p>
     <w:p>
@@ -9506,7 +9351,7 @@
         </w:numPr>
       </w:pPr>
       <w:r>
-        <w:t>Confirm the release-gate output exists at C:\New Delphi Projects\Delphi App Translation\bin\packages\Win32\Release.</w:t>
+        <w:t>On Integration, choose Install / Repair Components and approve the Windows prompt. The equivalent direct command is powershell.exe -ExecutionPolicy Bypass -File .\tools\Install-DATLanguageManagerComponents.ps1 -Framework FMX -Configuration Release -Action Repair.</w:t>
       </w:r>
     </w:p>
     <w:p>
@@ -9518,7 +9363,7 @@
         </w:numPr>
       </w:pPr>
       <w:r>
-        <w:t>In RAD Studio choose Component &gt; Install Packages &gt; Add.</w:t>
+        <w:t>Wait for the build, verification, copy, and registration success messages. Restart RAD Studio and open an FMX form.</w:t>
       </w:r>
     </w:p>
     <w:p>
@@ -9530,7 +9375,7 @@
         </w:numPr>
       </w:pPr>
       <w:r>
-        <w:t>Select C:\New Delphi Projects\Delphi App Translation\bin\packages\Win32\Release\DATLanguageManagerFMXDesign.bpl.</w:t>
+        <w:t>Confirm DAT Localization appears in the Tool Palette.</w:t>
       </w:r>
     </w:p>
     <w:p>
@@ -9542,7 +9387,8 @@
         </w:numPr>
       </w:pPr>
       <w:r>
-        <w:t>Confirm the package loads and DAT Localization appears in the Tool Palette for an FMX form.</w:t>
+        <w:lastRenderedPageBreak/>
+        <w:t>For the documented manual fallback only, use Component &gt; Install Packages &gt; Add and select the compiled DATLanguageManagerFMXDesign.bpl. Never use Component &gt; Install Component and never select DATLanguageManagerFMXDesign.dpk.</w:t>
       </w:r>
     </w:p>
     <w:p>
@@ -9566,7 +9412,15 @@
         <w:pStyle w:val="ListBullet"/>
       </w:pPr>
       <w:r>
-        <w:t>The matching core and FMX runtime BPL dependencies resolve from the same output folder.</w:t>
+        <w:t>The three FMX-related BPL files are present under C:\Users\Public\Documents\Embarcadero\Studio\37.0\Bpl.</w:t>
+      </w:r>
+    </w:p>
+    <w:p>
+      <w:pPr>
+        <w:pStyle w:val="ListBullet"/>
+      </w:pPr>
+      <w:r>
+        <w:t>The design BPL has no custom DAT runtime-BPL import, so it loads without a missing-module error.</w:t>
       </w:r>
     </w:p>
     <w:p>
@@ -9670,7 +9524,6 @@
                 <w:color w:val="234C80"/>
                 <w:sz w:val="17"/>
               </w:rPr>
-              <w:lastRenderedPageBreak/>
               <w:t>Date</w:t>
             </w:r>
           </w:p>
@@ -9710,7 +9563,7 @@
       <w:pPr>
         <w:pStyle w:val="Heading2"/>
       </w:pPr>
-      <w:bookmarkStart w:id="26" w:name="_Toc237100950"/>
+      <w:bookmarkStart w:id="26" w:name="_Toc237115586"/>
       <w:r>
         <w:t>TC-11 Perform the visible Delphi integration</w:t>
       </w:r>
@@ -9745,9 +9598,6 @@
           <w:p>
             <w:pPr>
               <w:pStyle w:val="Callout"/>
-              <w:rPr>
-                <w:rFonts w:hint="eastAsia"/>
-              </w:rPr>
             </w:pPr>
             <w:r>
               <w:rPr>
@@ -9884,6 +9734,7 @@
         <w:pStyle w:val="Heading3"/>
       </w:pPr>
       <w:r>
+        <w:lastRenderedPageBreak/>
         <w:t>Expected result</w:t>
       </w:r>
     </w:p>
@@ -10076,16 +9927,12 @@
           <w:p>
             <w:pPr>
               <w:pStyle w:val="Callout"/>
-              <w:rPr>
-                <w:rFonts w:hint="eastAsia"/>
-              </w:rPr>
             </w:pPr>
             <w:r>
               <w:rPr>
                 <w:b/>
                 <w:color w:val="234C80"/>
               </w:rPr>
-              <w:lastRenderedPageBreak/>
               <w:t xml:space="preserve">Ninety-form projects. </w:t>
             </w:r>
             <w:r>
@@ -10099,7 +9946,7 @@
       <w:pPr>
         <w:pStyle w:val="Heading2"/>
       </w:pPr>
-      <w:bookmarkStart w:id="27" w:name="_Toc237100951"/>
+      <w:bookmarkStart w:id="27" w:name="_Toc237115587"/>
       <w:r>
         <w:t>TC-12 Build GA4 Win32 and Win64</w:t>
       </w:r>
@@ -10134,9 +9981,6 @@
           <w:p>
             <w:pPr>
               <w:pStyle w:val="Callout"/>
-              <w:rPr>
-                <w:rFonts w:hint="eastAsia"/>
-              </w:rPr>
             </w:pPr>
             <w:r>
               <w:rPr>
@@ -10288,6 +10132,7 @@
                 <w:color w:val="234C80"/>
                 <w:sz w:val="17"/>
               </w:rPr>
+              <w:lastRenderedPageBreak/>
               <w:t>Result</w:t>
             </w:r>
           </w:p>
@@ -10384,7 +10229,7 @@
       <w:pPr>
         <w:pStyle w:val="Heading2"/>
       </w:pPr>
-      <w:bookmarkStart w:id="28" w:name="_Toc237100952"/>
+      <w:bookmarkStart w:id="28" w:name="_Toc237115588"/>
       <w:r>
         <w:t>TC-13 Deploy language packs</w:t>
       </w:r>
@@ -10419,9 +10264,6 @@
           <w:p>
             <w:pPr>
               <w:pStyle w:val="Callout"/>
-              <w:rPr>
-                <w:rFonts w:hint="eastAsia"/>
-              </w:rPr>
             </w:pPr>
             <w:r>
               <w:rPr>
@@ -10466,7 +10308,6 @@
         </w:numPr>
       </w:pPr>
       <w:r>
-        <w:lastRenderedPageBreak/>
         <w:t>Run the kit deployment script for C:\New Delphi Projects\Echurchsite Analytical - Component Test\bin\Win32\Debug.</w:t>
       </w:r>
     </w:p>
@@ -10665,9 +10506,6 @@
     <w:p>
       <w:pPr>
         <w:pStyle w:val="CodeBlock"/>
-        <w:rPr>
-          <w:rFonts w:hint="eastAsia"/>
-        </w:rPr>
       </w:pPr>
       <w:r>
         <w:t>&amp; "C:\New Delphi Projects\Delphi App Translation\export\component-integration\WebsiteAnalytics\Deploy-LanguagePacks.ps1" -ApplicationDirectory "C:\New Delphi Projects\Echurchsite Analytical - Component Test\bin\Win32\Debug"</w:t>
@@ -10676,9 +10514,6 @@
     <w:p>
       <w:pPr>
         <w:pStyle w:val="CodeBlock"/>
-        <w:rPr>
-          <w:rFonts w:hint="eastAsia"/>
-        </w:rPr>
       </w:pPr>
       <w:r>
         <w:t>&amp; "C:\New Delphi Projects\Delphi App Translation\export\component-integration\WebsiteAnalytics\Deploy-LanguagePacks.ps1" -ApplicationDirectory "C:\New Delphi Projects\Echurchsite Analytical - Component Test\bin\Win64\Debug"</w:t>
@@ -10693,7 +10528,7 @@
       <w:pPr>
         <w:pStyle w:val="Heading1"/>
       </w:pPr>
-      <w:bookmarkStart w:id="29" w:name="_Toc237100953"/>
+      <w:bookmarkStart w:id="29" w:name="_Toc237115589"/>
       <w:r>
         <w:lastRenderedPageBreak/>
         <w:t>8. Runtime Acceptance</w:t>
@@ -10704,7 +10539,7 @@
       <w:pPr>
         <w:pStyle w:val="Heading2"/>
       </w:pPr>
-      <w:bookmarkStart w:id="30" w:name="_Toc237100954"/>
+      <w:bookmarkStart w:id="30" w:name="_Toc237115590"/>
       <w:r>
         <w:t>TC-14 First launch and source language</w:t>
       </w:r>
@@ -10739,9 +10574,6 @@
           <w:p>
             <w:pPr>
               <w:pStyle w:val="Callout"/>
-              <w:rPr>
-                <w:rFonts w:hint="eastAsia"/>
-              </w:rPr>
             </w:pPr>
             <w:r>
               <w:rPr>
@@ -10985,7 +10817,7 @@
       <w:pPr>
         <w:pStyle w:val="Heading2"/>
       </w:pPr>
-      <w:bookmarkStart w:id="31" w:name="_Toc237100955"/>
+      <w:bookmarkStart w:id="31" w:name="_Toc237115591"/>
       <w:r>
         <w:t>TC-15 Immediate language switching</w:t>
       </w:r>
@@ -11020,9 +10852,6 @@
           <w:p>
             <w:pPr>
               <w:pStyle w:val="Callout"/>
-              <w:rPr>
-                <w:rFonts w:hint="eastAsia"/>
-              </w:rPr>
             </w:pPr>
             <w:r>
               <w:rPr>
@@ -11279,7 +11108,7 @@
       <w:pPr>
         <w:pStyle w:val="Heading2"/>
       </w:pPr>
-      <w:bookmarkStart w:id="32" w:name="_Toc237100956"/>
+      <w:bookmarkStart w:id="32" w:name="_Toc237115592"/>
       <w:r>
         <w:t>TC-16 Preserve control state and date range</w:t>
       </w:r>
@@ -11314,9 +11143,6 @@
           <w:p>
             <w:pPr>
               <w:pStyle w:val="Callout"/>
-              <w:rPr>
-                <w:rFonts w:hint="eastAsia"/>
-              </w:rPr>
             </w:pPr>
             <w:r>
               <w:rPr>
@@ -11560,7 +11386,7 @@
       <w:pPr>
         <w:pStyle w:val="Heading2"/>
       </w:pPr>
-      <w:bookmarkStart w:id="33" w:name="_Toc237100957"/>
+      <w:bookmarkStart w:id="33" w:name="_Toc237115593"/>
       <w:r>
         <w:t>TC-17 Preference persistence and restart</w:t>
       </w:r>
@@ -11595,9 +11421,6 @@
           <w:p>
             <w:pPr>
               <w:pStyle w:val="Callout"/>
-              <w:rPr>
-                <w:rFonts w:hint="eastAsia"/>
-              </w:rPr>
             </w:pPr>
             <w:r>
               <w:rPr>
@@ -11842,7 +11665,7 @@
       <w:pPr>
         <w:pStyle w:val="Heading2"/>
       </w:pPr>
-      <w:bookmarkStart w:id="34" w:name="_Toc237100958"/>
+      <w:bookmarkStart w:id="34" w:name="_Toc237115594"/>
       <w:r>
         <w:t>TC-18 Offline runtime</w:t>
       </w:r>
@@ -11877,9 +11700,6 @@
           <w:p>
             <w:pPr>
               <w:pStyle w:val="Callout"/>
-              <w:rPr>
-                <w:rFonts w:hint="eastAsia"/>
-              </w:rPr>
             </w:pPr>
             <w:r>
               <w:rPr>
@@ -12116,7 +11936,7 @@
       <w:pPr>
         <w:pStyle w:val="Heading2"/>
       </w:pPr>
-      <w:bookmarkStart w:id="35" w:name="_Toc237100959"/>
+      <w:bookmarkStart w:id="35" w:name="_Toc237115595"/>
       <w:r>
         <w:t>TC-19 Missing and malformed pack behavior</w:t>
       </w:r>
@@ -12151,9 +11971,6 @@
           <w:p>
             <w:pPr>
               <w:pStyle w:val="Callout"/>
-              <w:rPr>
-                <w:rFonts w:hint="eastAsia"/>
-              </w:rPr>
             </w:pPr>
             <w:r>
               <w:rPr>
@@ -12409,7 +12226,7 @@
       <w:pPr>
         <w:pStyle w:val="Heading2"/>
       </w:pPr>
-      <w:bookmarkStart w:id="36" w:name="_Toc237100960"/>
+      <w:bookmarkStart w:id="36" w:name="_Toc237115596"/>
       <w:r>
         <w:t>8.1 Repeat the runtime matrix</w:t>
       </w:r>
@@ -12743,7 +12560,7 @@
       <w:pPr>
         <w:pStyle w:val="Heading1"/>
       </w:pPr>
-      <w:bookmarkStart w:id="37" w:name="_Toc237100961"/>
+      <w:bookmarkStart w:id="37" w:name="_Toc237115597"/>
       <w:r>
         <w:t>9. VCL Acceptance Delta</w:t>
       </w:r>
@@ -12990,7 +12807,7 @@
       <w:pPr>
         <w:pStyle w:val="Heading1"/>
       </w:pPr>
-      <w:bookmarkStart w:id="38" w:name="_Toc237100962"/>
+      <w:bookmarkStart w:id="38" w:name="_Toc237115598"/>
       <w:r>
         <w:t>10. Studio Self-Translation</w:t>
       </w:r>
@@ -13004,9 +12821,6 @@
     <w:p>
       <w:pPr>
         <w:pStyle w:val="CodeBlock"/>
-        <w:rPr>
-          <w:rFonts w:hint="eastAsia"/>
-        </w:rPr>
       </w:pPr>
       <w:r>
         <w:t>cd "C:\New Delphi Projects\Delphi App Translation"</w:t>
@@ -13015,9 +12829,6 @@
     <w:p>
       <w:pPr>
         <w:pStyle w:val="CodeBlock"/>
-        <w:rPr>
-          <w:rFonts w:hint="eastAsia"/>
-        </w:rPr>
       </w:pPr>
       <w:r>
         <w:t>powershell.exe -ExecutionPolicy Bypass -File .\tools\tests\RunStudioSelfLocalizationSmokeTest.ps1</w:t>
@@ -13059,7 +12870,7 @@
       <w:pPr>
         <w:pStyle w:val="Heading1"/>
       </w:pPr>
-      <w:bookmarkStart w:id="39" w:name="_Toc237100963"/>
+      <w:bookmarkStart w:id="39" w:name="_Toc237115599"/>
       <w:r>
         <w:lastRenderedPageBreak/>
         <w:t>11. Starting Over, Restore, and Reset</w:t>
@@ -13070,7 +12881,7 @@
       <w:pPr>
         <w:pStyle w:val="Heading2"/>
       </w:pPr>
-      <w:bookmarkStart w:id="40" w:name="_Toc237100964"/>
+      <w:bookmarkStart w:id="40" w:name="_Toc237115600"/>
       <w:r>
         <w:t>11.1 Recommended component path</w:t>
       </w:r>
@@ -13115,9 +12926,6 @@
           <w:p>
             <w:pPr>
               <w:pStyle w:val="Callout"/>
-              <w:rPr>
-                <w:rFonts w:hint="eastAsia"/>
-              </w:rPr>
             </w:pPr>
             <w:r>
               <w:rPr>
@@ -13137,7 +12945,7 @@
       <w:pPr>
         <w:pStyle w:val="Heading2"/>
       </w:pPr>
-      <w:bookmarkStart w:id="41" w:name="_Toc237100965"/>
+      <w:bookmarkStart w:id="41" w:name="_Toc237115601"/>
       <w:r>
         <w:t>11.2 Advanced automatic-source reset test</w:t>
       </w:r>
@@ -13263,7 +13071,7 @@
       <w:pPr>
         <w:pStyle w:val="Heading1"/>
       </w:pPr>
-      <w:bookmarkStart w:id="42" w:name="_Toc237100966"/>
+      <w:bookmarkStart w:id="42" w:name="_Toc237115602"/>
       <w:r>
         <w:lastRenderedPageBreak/>
         <w:t>12. Negative and Recovery Tests</w:t>
@@ -13844,7 +13652,7 @@
       <w:pPr>
         <w:pStyle w:val="Heading1"/>
       </w:pPr>
-      <w:bookmarkStart w:id="43" w:name="_Toc237100967"/>
+      <w:bookmarkStart w:id="43" w:name="_Toc237115603"/>
       <w:r>
         <w:t>13. Performance and Large-Project Checks</w:t>
       </w:r>
@@ -14402,7 +14210,7 @@
       <w:pPr>
         <w:pStyle w:val="Heading1"/>
       </w:pPr>
-      <w:bookmarkStart w:id="44" w:name="_Toc237100968"/>
+      <w:bookmarkStart w:id="44" w:name="_Toc237115604"/>
       <w:r>
         <w:t>14. Defect Recording</w:t>
       </w:r>
@@ -14888,7 +14696,7 @@
       <w:pPr>
         <w:pStyle w:val="Heading1"/>
       </w:pPr>
-      <w:bookmarkStart w:id="45" w:name="_Toc237100969"/>
+      <w:bookmarkStart w:id="45" w:name="_Toc237115605"/>
       <w:r>
         <w:t>15. Final Acceptance Checklist</w:t>
       </w:r>
@@ -16354,7 +16162,7 @@
       <w:pPr>
         <w:pStyle w:val="Heading1"/>
       </w:pPr>
-      <w:bookmarkStart w:id="46" w:name="_Toc237100970"/>
+      <w:bookmarkStart w:id="46" w:name="_Toc237115606"/>
       <w:r>
         <w:lastRenderedPageBreak/>
         <w:t>16. Appendix A - Exact Test Scripts</w:t>
@@ -16769,7 +16577,7 @@
       <w:pPr>
         <w:pStyle w:val="Heading1"/>
       </w:pPr>
-      <w:bookmarkStart w:id="47" w:name="_Toc237100971"/>
+      <w:bookmarkStart w:id="47" w:name="_Toc237115607"/>
       <w:r>
         <w:t>17. Appendix B - What Each JSON File Is</w:t>
       </w:r>
@@ -17128,9 +16936,6 @@
           <w:p>
             <w:pPr>
               <w:pStyle w:val="Callout"/>
-              <w:rPr>
-                <w:rFonts w:hint="eastAsia"/>
-              </w:rPr>
             </w:pPr>
             <w:r>
               <w:rPr>
@@ -17150,7 +16955,7 @@
       <w:pPr>
         <w:pStyle w:val="Heading1"/>
       </w:pPr>
-      <w:bookmarkStart w:id="48" w:name="_Toc237100972"/>
+      <w:bookmarkStart w:id="48" w:name="_Toc237115608"/>
       <w:r>
         <w:lastRenderedPageBreak/>
         <w:t>18. Appendix C - Current Verified Baseline</w:t>
@@ -17584,160 +17389,160 @@
       </w:rPr>
     </w:lvl>
   </w:abstractNum>
-  <w:num w:numId="1" w16cid:durableId="1704861050">
+  <w:num w:numId="1" w16cid:durableId="1856536297">
     <w:abstractNumId w:val="8"/>
   </w:num>
-  <w:num w:numId="2" w16cid:durableId="1997562242">
+  <w:num w:numId="2" w16cid:durableId="476654121">
     <w:abstractNumId w:val="6"/>
   </w:num>
-  <w:num w:numId="3" w16cid:durableId="1037655051">
+  <w:num w:numId="3" w16cid:durableId="1077895826">
     <w:abstractNumId w:val="5"/>
   </w:num>
-  <w:num w:numId="4" w16cid:durableId="1687518603">
+  <w:num w:numId="4" w16cid:durableId="592398878">
     <w:abstractNumId w:val="4"/>
   </w:num>
-  <w:num w:numId="5" w16cid:durableId="352801428">
+  <w:num w:numId="5" w16cid:durableId="330180175">
     <w:abstractNumId w:val="7"/>
   </w:num>
-  <w:num w:numId="6" w16cid:durableId="1168907354">
+  <w:num w:numId="6" w16cid:durableId="1598253388">
     <w:abstractNumId w:val="3"/>
   </w:num>
-  <w:num w:numId="7" w16cid:durableId="1889609434">
+  <w:num w:numId="7" w16cid:durableId="220555008">
     <w:abstractNumId w:val="2"/>
   </w:num>
-  <w:num w:numId="8" w16cid:durableId="988168686">
+  <w:num w:numId="8" w16cid:durableId="1331639282">
     <w:abstractNumId w:val="1"/>
   </w:num>
-  <w:num w:numId="9" w16cid:durableId="511650997">
+  <w:num w:numId="9" w16cid:durableId="200557752">
     <w:abstractNumId w:val="0"/>
   </w:num>
-  <w:num w:numId="10" w16cid:durableId="1035690276">
+  <w:num w:numId="10" w16cid:durableId="1877160079">
     <w:abstractNumId w:val="7"/>
     <w:lvlOverride w:ilvl="0">
       <w:startOverride w:val="1"/>
     </w:lvlOverride>
   </w:num>
-  <w:num w:numId="11" w16cid:durableId="921986292">
+  <w:num w:numId="11" w16cid:durableId="1881355320">
     <w:abstractNumId w:val="7"/>
     <w:lvlOverride w:ilvl="0">
       <w:startOverride w:val="1"/>
     </w:lvlOverride>
   </w:num>
-  <w:num w:numId="12" w16cid:durableId="800078294">
+  <w:num w:numId="12" w16cid:durableId="2023699235">
     <w:abstractNumId w:val="7"/>
     <w:lvlOverride w:ilvl="0">
       <w:startOverride w:val="1"/>
     </w:lvlOverride>
   </w:num>
-  <w:num w:numId="13" w16cid:durableId="919288784">
+  <w:num w:numId="13" w16cid:durableId="824974289">
     <w:abstractNumId w:val="7"/>
     <w:lvlOverride w:ilvl="0">
       <w:startOverride w:val="1"/>
     </w:lvlOverride>
   </w:num>
-  <w:num w:numId="14" w16cid:durableId="2081780779">
+  <w:num w:numId="14" w16cid:durableId="1440757544">
     <w:abstractNumId w:val="7"/>
     <w:lvlOverride w:ilvl="0">
       <w:startOverride w:val="1"/>
     </w:lvlOverride>
   </w:num>
-  <w:num w:numId="15" w16cid:durableId="1176458274">
+  <w:num w:numId="15" w16cid:durableId="29569894">
     <w:abstractNumId w:val="7"/>
     <w:lvlOverride w:ilvl="0">
       <w:startOverride w:val="1"/>
     </w:lvlOverride>
   </w:num>
-  <w:num w:numId="16" w16cid:durableId="2081176495">
+  <w:num w:numId="16" w16cid:durableId="1535848629">
     <w:abstractNumId w:val="7"/>
     <w:lvlOverride w:ilvl="0">
       <w:startOverride w:val="1"/>
     </w:lvlOverride>
   </w:num>
-  <w:num w:numId="17" w16cid:durableId="1077282446">
+  <w:num w:numId="17" w16cid:durableId="578371211">
     <w:abstractNumId w:val="7"/>
     <w:lvlOverride w:ilvl="0">
       <w:startOverride w:val="1"/>
     </w:lvlOverride>
   </w:num>
-  <w:num w:numId="18" w16cid:durableId="1512137931">
+  <w:num w:numId="18" w16cid:durableId="1459109729">
     <w:abstractNumId w:val="7"/>
     <w:lvlOverride w:ilvl="0">
       <w:startOverride w:val="1"/>
     </w:lvlOverride>
   </w:num>
-  <w:num w:numId="19" w16cid:durableId="305404323">
+  <w:num w:numId="19" w16cid:durableId="788671028">
     <w:abstractNumId w:val="7"/>
     <w:lvlOverride w:ilvl="0">
       <w:startOverride w:val="1"/>
     </w:lvlOverride>
   </w:num>
-  <w:num w:numId="20" w16cid:durableId="420761107">
+  <w:num w:numId="20" w16cid:durableId="1870603983">
     <w:abstractNumId w:val="7"/>
     <w:lvlOverride w:ilvl="0">
       <w:startOverride w:val="1"/>
     </w:lvlOverride>
   </w:num>
-  <w:num w:numId="21" w16cid:durableId="2014645837">
+  <w:num w:numId="21" w16cid:durableId="1911309971">
     <w:abstractNumId w:val="7"/>
     <w:lvlOverride w:ilvl="0">
       <w:startOverride w:val="1"/>
     </w:lvlOverride>
   </w:num>
-  <w:num w:numId="22" w16cid:durableId="1113212940">
+  <w:num w:numId="22" w16cid:durableId="1492403704">
     <w:abstractNumId w:val="7"/>
     <w:lvlOverride w:ilvl="0">
       <w:startOverride w:val="1"/>
     </w:lvlOverride>
   </w:num>
-  <w:num w:numId="23" w16cid:durableId="1020661910">
+  <w:num w:numId="23" w16cid:durableId="431241740">
     <w:abstractNumId w:val="7"/>
     <w:lvlOverride w:ilvl="0">
       <w:startOverride w:val="1"/>
     </w:lvlOverride>
   </w:num>
-  <w:num w:numId="24" w16cid:durableId="258954610">
+  <w:num w:numId="24" w16cid:durableId="2127239272">
     <w:abstractNumId w:val="7"/>
     <w:lvlOverride w:ilvl="0">
       <w:startOverride w:val="1"/>
     </w:lvlOverride>
   </w:num>
-  <w:num w:numId="25" w16cid:durableId="71972801">
+  <w:num w:numId="25" w16cid:durableId="762725753">
     <w:abstractNumId w:val="7"/>
     <w:lvlOverride w:ilvl="0">
       <w:startOverride w:val="1"/>
     </w:lvlOverride>
   </w:num>
-  <w:num w:numId="26" w16cid:durableId="819274013">
+  <w:num w:numId="26" w16cid:durableId="2055233622">
     <w:abstractNumId w:val="7"/>
     <w:lvlOverride w:ilvl="0">
       <w:startOverride w:val="1"/>
     </w:lvlOverride>
   </w:num>
-  <w:num w:numId="27" w16cid:durableId="216236023">
+  <w:num w:numId="27" w16cid:durableId="1359508285">
     <w:abstractNumId w:val="7"/>
     <w:lvlOverride w:ilvl="0">
       <w:startOverride w:val="1"/>
     </w:lvlOverride>
   </w:num>
-  <w:num w:numId="28" w16cid:durableId="148834966">
+  <w:num w:numId="28" w16cid:durableId="34352605">
     <w:abstractNumId w:val="7"/>
     <w:lvlOverride w:ilvl="0">
       <w:startOverride w:val="1"/>
     </w:lvlOverride>
   </w:num>
-  <w:num w:numId="29" w16cid:durableId="1653636339">
+  <w:num w:numId="29" w16cid:durableId="2094625810">
     <w:abstractNumId w:val="7"/>
     <w:lvlOverride w:ilvl="0">
       <w:startOverride w:val="1"/>
     </w:lvlOverride>
   </w:num>
-  <w:num w:numId="30" w16cid:durableId="29040459">
+  <w:num w:numId="30" w16cid:durableId="240334907">
     <w:abstractNumId w:val="7"/>
     <w:lvlOverride w:ilvl="0">
       <w:startOverride w:val="1"/>
     </w:lvlOverride>
   </w:num>
-  <w:num w:numId="31" w16cid:durableId="1625576768">
+  <w:num w:numId="31" w16cid:durableId="1622760335">
     <w:abstractNumId w:val="7"/>
     <w:lvlOverride w:ilvl="0">
       <w:startOverride w:val="1"/>
@@ -29167,7 +28972,7 @@
     <w:autoRedefine/>
     <w:uiPriority w:val="39"/>
     <w:unhideWhenUsed/>
-    <w:rsid w:val="0084529C"/>
+    <w:rsid w:val="00E83985"/>
     <w:pPr>
       <w:spacing w:after="100"/>
     </w:pPr>
@@ -29179,7 +28984,7 @@
     <w:autoRedefine/>
     <w:uiPriority w:val="39"/>
     <w:unhideWhenUsed/>
-    <w:rsid w:val="0084529C"/>
+    <w:rsid w:val="00E83985"/>
     <w:pPr>
       <w:spacing w:after="100"/>
       <w:ind w:left="220"/>
@@ -29190,7 +28995,7 @@
     <w:basedOn w:val="DefaultParagraphFont"/>
     <w:uiPriority w:val="99"/>
     <w:unhideWhenUsed/>
-    <w:rsid w:val="0084529C"/>
+    <w:rsid w:val="00E83985"/>
     <w:rPr>
       <w:color w:val="0000FF" w:themeColor="hyperlink"/>
       <w:u w:val="single"/>

</xml_diff>

<commit_message>
fix: preserve Delphi package registry during install
</commit_message>
<xml_diff>
--- a/docs/guides/Delphi App Translation Studio Complete Test Guide.docx
+++ b/docs/guides/Delphi App Translation Studio Complete Test Guide.docx
@@ -13,7 +13,7 @@
           <w:noProof/>
         </w:rPr>
         <w:drawing>
-          <wp:inline distT="0" distB="0" distL="0" distR="0" wp14:anchorId="22309C9D" wp14:editId="3DF4E7EF">
+          <wp:inline distT="0" distB="0" distL="0" distR="0" wp14:anchorId="41E5AD72" wp14:editId="233BBDFD">
             <wp:extent cx="1325880" cy="1325880"/>
             <wp:effectExtent l="0" t="0" r="0" b="0"/>
             <wp:docPr id="1" name="Picture 1"/>
@@ -190,7 +190,7 @@
       <w:r>
         <w:fldChar w:fldCharType="separate"/>
       </w:r>
-      <w:hyperlink w:anchor="_Toc237115560" w:history="1">
+      <w:hyperlink w:anchor="_Toc237117191" w:history="1">
         <w:r>
           <w:rPr>
             <w:rStyle w:val="Hyperlink"/>
@@ -217,7 +217,7 @@
             <w:noProof/>
             <w:webHidden/>
           </w:rPr>
-          <w:instrText xml:space="preserve"> PAGEREF _Toc237115560 \h </w:instrText>
+          <w:instrText xml:space="preserve"> PAGEREF _Toc237117191 \h </w:instrText>
         </w:r>
         <w:r>
           <w:rPr>
@@ -258,7 +258,7 @@
           <w:noProof/>
         </w:rPr>
       </w:pPr>
-      <w:hyperlink w:anchor="_Toc237115561" w:history="1">
+      <w:hyperlink w:anchor="_Toc237117192" w:history="1">
         <w:r>
           <w:rPr>
             <w:rStyle w:val="Hyperlink"/>
@@ -285,7 +285,7 @@
             <w:noProof/>
             <w:webHidden/>
           </w:rPr>
-          <w:instrText xml:space="preserve"> PAGEREF _Toc237115561 \h </w:instrText>
+          <w:instrText xml:space="preserve"> PAGEREF _Toc237117192 \h </w:instrText>
         </w:r>
         <w:r>
           <w:rPr>
@@ -326,7 +326,7 @@
           <w:noProof/>
         </w:rPr>
       </w:pPr>
-      <w:hyperlink w:anchor="_Toc237115562" w:history="1">
+      <w:hyperlink w:anchor="_Toc237117193" w:history="1">
         <w:r>
           <w:rPr>
             <w:rStyle w:val="Hyperlink"/>
@@ -353,7 +353,7 @@
             <w:noProof/>
             <w:webHidden/>
           </w:rPr>
-          <w:instrText xml:space="preserve"> PAGEREF _Toc237115562 \h </w:instrText>
+          <w:instrText xml:space="preserve"> PAGEREF _Toc237117193 \h </w:instrText>
         </w:r>
         <w:r>
           <w:rPr>
@@ -394,7 +394,7 @@
           <w:noProof/>
         </w:rPr>
       </w:pPr>
-      <w:hyperlink w:anchor="_Toc237115563" w:history="1">
+      <w:hyperlink w:anchor="_Toc237117194" w:history="1">
         <w:r>
           <w:rPr>
             <w:rStyle w:val="Hyperlink"/>
@@ -421,7 +421,7 @@
             <w:noProof/>
             <w:webHidden/>
           </w:rPr>
-          <w:instrText xml:space="preserve"> PAGEREF _Toc237115563 \h </w:instrText>
+          <w:instrText xml:space="preserve"> PAGEREF _Toc237117194 \h </w:instrText>
         </w:r>
         <w:r>
           <w:rPr>
@@ -462,7 +462,7 @@
           <w:noProof/>
         </w:rPr>
       </w:pPr>
-      <w:hyperlink w:anchor="_Toc237115564" w:history="1">
+      <w:hyperlink w:anchor="_Toc237117195" w:history="1">
         <w:r>
           <w:rPr>
             <w:rStyle w:val="Hyperlink"/>
@@ -489,7 +489,7 @@
             <w:noProof/>
             <w:webHidden/>
           </w:rPr>
-          <w:instrText xml:space="preserve"> PAGEREF _Toc237115564 \h </w:instrText>
+          <w:instrText xml:space="preserve"> PAGEREF _Toc237117195 \h </w:instrText>
         </w:r>
         <w:r>
           <w:rPr>
@@ -530,7 +530,7 @@
           <w:noProof/>
         </w:rPr>
       </w:pPr>
-      <w:hyperlink w:anchor="_Toc237115565" w:history="1">
+      <w:hyperlink w:anchor="_Toc237117196" w:history="1">
         <w:r>
           <w:rPr>
             <w:rStyle w:val="Hyperlink"/>
@@ -557,7 +557,7 @@
             <w:noProof/>
             <w:webHidden/>
           </w:rPr>
-          <w:instrText xml:space="preserve"> PAGEREF _Toc237115565 \h </w:instrText>
+          <w:instrText xml:space="preserve"> PAGEREF _Toc237117196 \h </w:instrText>
         </w:r>
         <w:r>
           <w:rPr>
@@ -598,7 +598,7 @@
           <w:noProof/>
         </w:rPr>
       </w:pPr>
-      <w:hyperlink w:anchor="_Toc237115566" w:history="1">
+      <w:hyperlink w:anchor="_Toc237117197" w:history="1">
         <w:r>
           <w:rPr>
             <w:rStyle w:val="Hyperlink"/>
@@ -625,7 +625,7 @@
             <w:noProof/>
             <w:webHidden/>
           </w:rPr>
-          <w:instrText xml:space="preserve"> PAGEREF _Toc237115566 \h </w:instrText>
+          <w:instrText xml:space="preserve"> PAGEREF _Toc237117197 \h </w:instrText>
         </w:r>
         <w:r>
           <w:rPr>
@@ -666,7 +666,7 @@
           <w:noProof/>
         </w:rPr>
       </w:pPr>
-      <w:hyperlink w:anchor="_Toc237115567" w:history="1">
+      <w:hyperlink w:anchor="_Toc237117198" w:history="1">
         <w:r>
           <w:rPr>
             <w:rStyle w:val="Hyperlink"/>
@@ -693,7 +693,7 @@
             <w:noProof/>
             <w:webHidden/>
           </w:rPr>
-          <w:instrText xml:space="preserve"> PAGEREF _Toc237115567 \h </w:instrText>
+          <w:instrText xml:space="preserve"> PAGEREF _Toc237117198 \h </w:instrText>
         </w:r>
         <w:r>
           <w:rPr>
@@ -734,7 +734,7 @@
           <w:noProof/>
         </w:rPr>
       </w:pPr>
-      <w:hyperlink w:anchor="_Toc237115568" w:history="1">
+      <w:hyperlink w:anchor="_Toc237117199" w:history="1">
         <w:r>
           <w:rPr>
             <w:rStyle w:val="Hyperlink"/>
@@ -761,7 +761,7 @@
             <w:noProof/>
             <w:webHidden/>
           </w:rPr>
-          <w:instrText xml:space="preserve"> PAGEREF _Toc237115568 \h </w:instrText>
+          <w:instrText xml:space="preserve"> PAGEREF _Toc237117199 \h </w:instrText>
         </w:r>
         <w:r>
           <w:rPr>
@@ -802,7 +802,7 @@
           <w:noProof/>
         </w:rPr>
       </w:pPr>
-      <w:hyperlink w:anchor="_Toc237115569" w:history="1">
+      <w:hyperlink w:anchor="_Toc237117200" w:history="1">
         <w:r>
           <w:rPr>
             <w:rStyle w:val="Hyperlink"/>
@@ -829,7 +829,7 @@
             <w:noProof/>
             <w:webHidden/>
           </w:rPr>
-          <w:instrText xml:space="preserve"> PAGEREF _Toc237115569 \h </w:instrText>
+          <w:instrText xml:space="preserve"> PAGEREF _Toc237117200 \h </w:instrText>
         </w:r>
         <w:r>
           <w:rPr>
@@ -870,7 +870,7 @@
           <w:noProof/>
         </w:rPr>
       </w:pPr>
-      <w:hyperlink w:anchor="_Toc237115570" w:history="1">
+      <w:hyperlink w:anchor="_Toc237117201" w:history="1">
         <w:r>
           <w:rPr>
             <w:rStyle w:val="Hyperlink"/>
@@ -897,7 +897,7 @@
             <w:noProof/>
             <w:webHidden/>
           </w:rPr>
-          <w:instrText xml:space="preserve"> PAGEREF _Toc237115570 \h </w:instrText>
+          <w:instrText xml:space="preserve"> PAGEREF _Toc237117201 \h </w:instrText>
         </w:r>
         <w:r>
           <w:rPr>
@@ -938,7 +938,7 @@
           <w:noProof/>
         </w:rPr>
       </w:pPr>
-      <w:hyperlink w:anchor="_Toc237115571" w:history="1">
+      <w:hyperlink w:anchor="_Toc237117202" w:history="1">
         <w:r>
           <w:rPr>
             <w:rStyle w:val="Hyperlink"/>
@@ -965,7 +965,7 @@
             <w:noProof/>
             <w:webHidden/>
           </w:rPr>
-          <w:instrText xml:space="preserve"> PAGEREF _Toc237115571 \h </w:instrText>
+          <w:instrText xml:space="preserve"> PAGEREF _Toc237117202 \h </w:instrText>
         </w:r>
         <w:r>
           <w:rPr>
@@ -1006,7 +1006,7 @@
           <w:noProof/>
         </w:rPr>
       </w:pPr>
-      <w:hyperlink w:anchor="_Toc237115572" w:history="1">
+      <w:hyperlink w:anchor="_Toc237117203" w:history="1">
         <w:r>
           <w:rPr>
             <w:rStyle w:val="Hyperlink"/>
@@ -1033,7 +1033,7 @@
             <w:noProof/>
             <w:webHidden/>
           </w:rPr>
-          <w:instrText xml:space="preserve"> PAGEREF _Toc237115572 \h </w:instrText>
+          <w:instrText xml:space="preserve"> PAGEREF _Toc237117203 \h </w:instrText>
         </w:r>
         <w:r>
           <w:rPr>
@@ -1074,7 +1074,7 @@
           <w:noProof/>
         </w:rPr>
       </w:pPr>
-      <w:hyperlink w:anchor="_Toc237115573" w:history="1">
+      <w:hyperlink w:anchor="_Toc237117204" w:history="1">
         <w:r>
           <w:rPr>
             <w:rStyle w:val="Hyperlink"/>
@@ -1101,7 +1101,7 @@
             <w:noProof/>
             <w:webHidden/>
           </w:rPr>
-          <w:instrText xml:space="preserve"> PAGEREF _Toc237115573 \h </w:instrText>
+          <w:instrText xml:space="preserve"> PAGEREF _Toc237117204 \h </w:instrText>
         </w:r>
         <w:r>
           <w:rPr>
@@ -1142,7 +1142,7 @@
           <w:noProof/>
         </w:rPr>
       </w:pPr>
-      <w:hyperlink w:anchor="_Toc237115574" w:history="1">
+      <w:hyperlink w:anchor="_Toc237117205" w:history="1">
         <w:r>
           <w:rPr>
             <w:rStyle w:val="Hyperlink"/>
@@ -1169,7 +1169,7 @@
             <w:noProof/>
             <w:webHidden/>
           </w:rPr>
-          <w:instrText xml:space="preserve"> PAGEREF _Toc237115574 \h </w:instrText>
+          <w:instrText xml:space="preserve"> PAGEREF _Toc237117205 \h </w:instrText>
         </w:r>
         <w:r>
           <w:rPr>
@@ -1210,7 +1210,7 @@
           <w:noProof/>
         </w:rPr>
       </w:pPr>
-      <w:hyperlink w:anchor="_Toc237115575" w:history="1">
+      <w:hyperlink w:anchor="_Toc237117206" w:history="1">
         <w:r>
           <w:rPr>
             <w:rStyle w:val="Hyperlink"/>
@@ -1237,7 +1237,7 @@
             <w:noProof/>
             <w:webHidden/>
           </w:rPr>
-          <w:instrText xml:space="preserve"> PAGEREF _Toc237115575 \h </w:instrText>
+          <w:instrText xml:space="preserve"> PAGEREF _Toc237117206 \h </w:instrText>
         </w:r>
         <w:r>
           <w:rPr>
@@ -1278,7 +1278,7 @@
           <w:noProof/>
         </w:rPr>
       </w:pPr>
-      <w:hyperlink w:anchor="_Toc237115576" w:history="1">
+      <w:hyperlink w:anchor="_Toc237117207" w:history="1">
         <w:r>
           <w:rPr>
             <w:rStyle w:val="Hyperlink"/>
@@ -1305,7 +1305,7 @@
             <w:noProof/>
             <w:webHidden/>
           </w:rPr>
-          <w:instrText xml:space="preserve"> PAGEREF _Toc237115576 \h </w:instrText>
+          <w:instrText xml:space="preserve"> PAGEREF _Toc237117207 \h </w:instrText>
         </w:r>
         <w:r>
           <w:rPr>
@@ -1346,7 +1346,7 @@
           <w:noProof/>
         </w:rPr>
       </w:pPr>
-      <w:hyperlink w:anchor="_Toc237115577" w:history="1">
+      <w:hyperlink w:anchor="_Toc237117208" w:history="1">
         <w:r>
           <w:rPr>
             <w:rStyle w:val="Hyperlink"/>
@@ -1373,7 +1373,7 @@
             <w:noProof/>
             <w:webHidden/>
           </w:rPr>
-          <w:instrText xml:space="preserve"> PAGEREF _Toc237115577 \h </w:instrText>
+          <w:instrText xml:space="preserve"> PAGEREF _Toc237117208 \h </w:instrText>
         </w:r>
         <w:r>
           <w:rPr>
@@ -1414,7 +1414,7 @@
           <w:noProof/>
         </w:rPr>
       </w:pPr>
-      <w:hyperlink w:anchor="_Toc237115578" w:history="1">
+      <w:hyperlink w:anchor="_Toc237117209" w:history="1">
         <w:r>
           <w:rPr>
             <w:rStyle w:val="Hyperlink"/>
@@ -1441,7 +1441,7 @@
             <w:noProof/>
             <w:webHidden/>
           </w:rPr>
-          <w:instrText xml:space="preserve"> PAGEREF _Toc237115578 \h </w:instrText>
+          <w:instrText xml:space="preserve"> PAGEREF _Toc237117209 \h </w:instrText>
         </w:r>
         <w:r>
           <w:rPr>
@@ -1482,7 +1482,7 @@
           <w:noProof/>
         </w:rPr>
       </w:pPr>
-      <w:hyperlink w:anchor="_Toc237115579" w:history="1">
+      <w:hyperlink w:anchor="_Toc237117210" w:history="1">
         <w:r>
           <w:rPr>
             <w:rStyle w:val="Hyperlink"/>
@@ -1509,7 +1509,7 @@
             <w:noProof/>
             <w:webHidden/>
           </w:rPr>
-          <w:instrText xml:space="preserve"> PAGEREF _Toc237115579 \h </w:instrText>
+          <w:instrText xml:space="preserve"> PAGEREF _Toc237117210 \h </w:instrText>
         </w:r>
         <w:r>
           <w:rPr>
@@ -1550,7 +1550,7 @@
           <w:noProof/>
         </w:rPr>
       </w:pPr>
-      <w:hyperlink w:anchor="_Toc237115580" w:history="1">
+      <w:hyperlink w:anchor="_Toc237117211" w:history="1">
         <w:r>
           <w:rPr>
             <w:rStyle w:val="Hyperlink"/>
@@ -1577,7 +1577,7 @@
             <w:noProof/>
             <w:webHidden/>
           </w:rPr>
-          <w:instrText xml:space="preserve"> PAGEREF _Toc237115580 \h </w:instrText>
+          <w:instrText xml:space="preserve"> PAGEREF _Toc237117211 \h </w:instrText>
         </w:r>
         <w:r>
           <w:rPr>
@@ -1618,7 +1618,7 @@
           <w:noProof/>
         </w:rPr>
       </w:pPr>
-      <w:hyperlink w:anchor="_Toc237115581" w:history="1">
+      <w:hyperlink w:anchor="_Toc237117212" w:history="1">
         <w:r>
           <w:rPr>
             <w:rStyle w:val="Hyperlink"/>
@@ -1645,7 +1645,7 @@
             <w:noProof/>
             <w:webHidden/>
           </w:rPr>
-          <w:instrText xml:space="preserve"> PAGEREF _Toc237115581 \h </w:instrText>
+          <w:instrText xml:space="preserve"> PAGEREF _Toc237117212 \h </w:instrText>
         </w:r>
         <w:r>
           <w:rPr>
@@ -1686,7 +1686,7 @@
           <w:noProof/>
         </w:rPr>
       </w:pPr>
-      <w:hyperlink w:anchor="_Toc237115582" w:history="1">
+      <w:hyperlink w:anchor="_Toc237117213" w:history="1">
         <w:r>
           <w:rPr>
             <w:rStyle w:val="Hyperlink"/>
@@ -1713,7 +1713,7 @@
             <w:noProof/>
             <w:webHidden/>
           </w:rPr>
-          <w:instrText xml:space="preserve"> PAGEREF _Toc237115582 \h </w:instrText>
+          <w:instrText xml:space="preserve"> PAGEREF _Toc237117213 \h </w:instrText>
         </w:r>
         <w:r>
           <w:rPr>
@@ -1754,7 +1754,7 @@
           <w:noProof/>
         </w:rPr>
       </w:pPr>
-      <w:hyperlink w:anchor="_Toc237115583" w:history="1">
+      <w:hyperlink w:anchor="_Toc237117214" w:history="1">
         <w:r>
           <w:rPr>
             <w:rStyle w:val="Hyperlink"/>
@@ -1781,7 +1781,7 @@
             <w:noProof/>
             <w:webHidden/>
           </w:rPr>
-          <w:instrText xml:space="preserve"> PAGEREF _Toc237115583 \h </w:instrText>
+          <w:instrText xml:space="preserve"> PAGEREF _Toc237117214 \h </w:instrText>
         </w:r>
         <w:r>
           <w:rPr>
@@ -1822,7 +1822,7 @@
           <w:noProof/>
         </w:rPr>
       </w:pPr>
-      <w:hyperlink w:anchor="_Toc237115584" w:history="1">
+      <w:hyperlink w:anchor="_Toc237117215" w:history="1">
         <w:r>
           <w:rPr>
             <w:rStyle w:val="Hyperlink"/>
@@ -1849,7 +1849,7 @@
             <w:noProof/>
             <w:webHidden/>
           </w:rPr>
-          <w:instrText xml:space="preserve"> PAGEREF _Toc237115584 \h </w:instrText>
+          <w:instrText xml:space="preserve"> PAGEREF _Toc237117215 \h </w:instrText>
         </w:r>
         <w:r>
           <w:rPr>
@@ -1890,7 +1890,7 @@
           <w:noProof/>
         </w:rPr>
       </w:pPr>
-      <w:hyperlink w:anchor="_Toc237115585" w:history="1">
+      <w:hyperlink w:anchor="_Toc237117216" w:history="1">
         <w:r>
           <w:rPr>
             <w:rStyle w:val="Hyperlink"/>
@@ -1917,7 +1917,7 @@
             <w:noProof/>
             <w:webHidden/>
           </w:rPr>
-          <w:instrText xml:space="preserve"> PAGEREF _Toc237115585 \h </w:instrText>
+          <w:instrText xml:space="preserve"> PAGEREF _Toc237117216 \h </w:instrText>
         </w:r>
         <w:r>
           <w:rPr>
@@ -1958,7 +1958,7 @@
           <w:noProof/>
         </w:rPr>
       </w:pPr>
-      <w:hyperlink w:anchor="_Toc237115586" w:history="1">
+      <w:hyperlink w:anchor="_Toc237117217" w:history="1">
         <w:r>
           <w:rPr>
             <w:rStyle w:val="Hyperlink"/>
@@ -1985,7 +1985,7 @@
             <w:noProof/>
             <w:webHidden/>
           </w:rPr>
-          <w:instrText xml:space="preserve"> PAGEREF _Toc237115586 \h </w:instrText>
+          <w:instrText xml:space="preserve"> PAGEREF _Toc237117217 \h </w:instrText>
         </w:r>
         <w:r>
           <w:rPr>
@@ -2026,7 +2026,7 @@
           <w:noProof/>
         </w:rPr>
       </w:pPr>
-      <w:hyperlink w:anchor="_Toc237115587" w:history="1">
+      <w:hyperlink w:anchor="_Toc237117218" w:history="1">
         <w:r>
           <w:rPr>
             <w:rStyle w:val="Hyperlink"/>
@@ -2053,7 +2053,7 @@
             <w:noProof/>
             <w:webHidden/>
           </w:rPr>
-          <w:instrText xml:space="preserve"> PAGEREF _Toc237115587 \h </w:instrText>
+          <w:instrText xml:space="preserve"> PAGEREF _Toc237117218 \h </w:instrText>
         </w:r>
         <w:r>
           <w:rPr>
@@ -2094,7 +2094,7 @@
           <w:noProof/>
         </w:rPr>
       </w:pPr>
-      <w:hyperlink w:anchor="_Toc237115588" w:history="1">
+      <w:hyperlink w:anchor="_Toc237117219" w:history="1">
         <w:r>
           <w:rPr>
             <w:rStyle w:val="Hyperlink"/>
@@ -2121,7 +2121,7 @@
             <w:noProof/>
             <w:webHidden/>
           </w:rPr>
-          <w:instrText xml:space="preserve"> PAGEREF _Toc237115588 \h </w:instrText>
+          <w:instrText xml:space="preserve"> PAGEREF _Toc237117219 \h </w:instrText>
         </w:r>
         <w:r>
           <w:rPr>
@@ -2162,7 +2162,7 @@
           <w:noProof/>
         </w:rPr>
       </w:pPr>
-      <w:hyperlink w:anchor="_Toc237115589" w:history="1">
+      <w:hyperlink w:anchor="_Toc237117220" w:history="1">
         <w:r>
           <w:rPr>
             <w:rStyle w:val="Hyperlink"/>
@@ -2189,7 +2189,7 @@
             <w:noProof/>
             <w:webHidden/>
           </w:rPr>
-          <w:instrText xml:space="preserve"> PAGEREF _Toc237115589 \h </w:instrText>
+          <w:instrText xml:space="preserve"> PAGEREF _Toc237117220 \h </w:instrText>
         </w:r>
         <w:r>
           <w:rPr>
@@ -2230,7 +2230,7 @@
           <w:noProof/>
         </w:rPr>
       </w:pPr>
-      <w:hyperlink w:anchor="_Toc237115590" w:history="1">
+      <w:hyperlink w:anchor="_Toc237117221" w:history="1">
         <w:r>
           <w:rPr>
             <w:rStyle w:val="Hyperlink"/>
@@ -2257,7 +2257,7 @@
             <w:noProof/>
             <w:webHidden/>
           </w:rPr>
-          <w:instrText xml:space="preserve"> PAGEREF _Toc237115590 \h </w:instrText>
+          <w:instrText xml:space="preserve"> PAGEREF _Toc237117221 \h </w:instrText>
         </w:r>
         <w:r>
           <w:rPr>
@@ -2298,7 +2298,7 @@
           <w:noProof/>
         </w:rPr>
       </w:pPr>
-      <w:hyperlink w:anchor="_Toc237115591" w:history="1">
+      <w:hyperlink w:anchor="_Toc237117222" w:history="1">
         <w:r>
           <w:rPr>
             <w:rStyle w:val="Hyperlink"/>
@@ -2325,7 +2325,7 @@
             <w:noProof/>
             <w:webHidden/>
           </w:rPr>
-          <w:instrText xml:space="preserve"> PAGEREF _Toc237115591 \h </w:instrText>
+          <w:instrText xml:space="preserve"> PAGEREF _Toc237117222 \h </w:instrText>
         </w:r>
         <w:r>
           <w:rPr>
@@ -2366,7 +2366,7 @@
           <w:noProof/>
         </w:rPr>
       </w:pPr>
-      <w:hyperlink w:anchor="_Toc237115592" w:history="1">
+      <w:hyperlink w:anchor="_Toc237117223" w:history="1">
         <w:r>
           <w:rPr>
             <w:rStyle w:val="Hyperlink"/>
@@ -2393,7 +2393,7 @@
             <w:noProof/>
             <w:webHidden/>
           </w:rPr>
-          <w:instrText xml:space="preserve"> PAGEREF _Toc237115592 \h </w:instrText>
+          <w:instrText xml:space="preserve"> PAGEREF _Toc237117223 \h </w:instrText>
         </w:r>
         <w:r>
           <w:rPr>
@@ -2434,7 +2434,7 @@
           <w:noProof/>
         </w:rPr>
       </w:pPr>
-      <w:hyperlink w:anchor="_Toc237115593" w:history="1">
+      <w:hyperlink w:anchor="_Toc237117224" w:history="1">
         <w:r>
           <w:rPr>
             <w:rStyle w:val="Hyperlink"/>
@@ -2461,7 +2461,7 @@
             <w:noProof/>
             <w:webHidden/>
           </w:rPr>
-          <w:instrText xml:space="preserve"> PAGEREF _Toc237115593 \h </w:instrText>
+          <w:instrText xml:space="preserve"> PAGEREF _Toc237117224 \h </w:instrText>
         </w:r>
         <w:r>
           <w:rPr>
@@ -2502,7 +2502,7 @@
           <w:noProof/>
         </w:rPr>
       </w:pPr>
-      <w:hyperlink w:anchor="_Toc237115594" w:history="1">
+      <w:hyperlink w:anchor="_Toc237117225" w:history="1">
         <w:r>
           <w:rPr>
             <w:rStyle w:val="Hyperlink"/>
@@ -2529,7 +2529,7 @@
             <w:noProof/>
             <w:webHidden/>
           </w:rPr>
-          <w:instrText xml:space="preserve"> PAGEREF _Toc237115594 \h </w:instrText>
+          <w:instrText xml:space="preserve"> PAGEREF _Toc237117225 \h </w:instrText>
         </w:r>
         <w:r>
           <w:rPr>
@@ -2570,7 +2570,7 @@
           <w:noProof/>
         </w:rPr>
       </w:pPr>
-      <w:hyperlink w:anchor="_Toc237115595" w:history="1">
+      <w:hyperlink w:anchor="_Toc237117226" w:history="1">
         <w:r>
           <w:rPr>
             <w:rStyle w:val="Hyperlink"/>
@@ -2597,7 +2597,7 @@
             <w:noProof/>
             <w:webHidden/>
           </w:rPr>
-          <w:instrText xml:space="preserve"> PAGEREF _Toc237115595 \h </w:instrText>
+          <w:instrText xml:space="preserve"> PAGEREF _Toc237117226 \h </w:instrText>
         </w:r>
         <w:r>
           <w:rPr>
@@ -2638,7 +2638,7 @@
           <w:noProof/>
         </w:rPr>
       </w:pPr>
-      <w:hyperlink w:anchor="_Toc237115596" w:history="1">
+      <w:hyperlink w:anchor="_Toc237117227" w:history="1">
         <w:r>
           <w:rPr>
             <w:rStyle w:val="Hyperlink"/>
@@ -2665,7 +2665,7 @@
             <w:noProof/>
             <w:webHidden/>
           </w:rPr>
-          <w:instrText xml:space="preserve"> PAGEREF _Toc237115596 \h </w:instrText>
+          <w:instrText xml:space="preserve"> PAGEREF _Toc237117227 \h </w:instrText>
         </w:r>
         <w:r>
           <w:rPr>
@@ -2706,7 +2706,7 @@
           <w:noProof/>
         </w:rPr>
       </w:pPr>
-      <w:hyperlink w:anchor="_Toc237115597" w:history="1">
+      <w:hyperlink w:anchor="_Toc237117228" w:history="1">
         <w:r>
           <w:rPr>
             <w:rStyle w:val="Hyperlink"/>
@@ -2733,7 +2733,7 @@
             <w:noProof/>
             <w:webHidden/>
           </w:rPr>
-          <w:instrText xml:space="preserve"> PAGEREF _Toc237115597 \h </w:instrText>
+          <w:instrText xml:space="preserve"> PAGEREF _Toc237117228 \h </w:instrText>
         </w:r>
         <w:r>
           <w:rPr>
@@ -2774,7 +2774,7 @@
           <w:noProof/>
         </w:rPr>
       </w:pPr>
-      <w:hyperlink w:anchor="_Toc237115598" w:history="1">
+      <w:hyperlink w:anchor="_Toc237117229" w:history="1">
         <w:r>
           <w:rPr>
             <w:rStyle w:val="Hyperlink"/>
@@ -2801,7 +2801,7 @@
             <w:noProof/>
             <w:webHidden/>
           </w:rPr>
-          <w:instrText xml:space="preserve"> PAGEREF _Toc237115598 \h </w:instrText>
+          <w:instrText xml:space="preserve"> PAGEREF _Toc237117229 \h </w:instrText>
         </w:r>
         <w:r>
           <w:rPr>
@@ -2842,7 +2842,7 @@
           <w:noProof/>
         </w:rPr>
       </w:pPr>
-      <w:hyperlink w:anchor="_Toc237115599" w:history="1">
+      <w:hyperlink w:anchor="_Toc237117230" w:history="1">
         <w:r>
           <w:rPr>
             <w:rStyle w:val="Hyperlink"/>
@@ -2869,7 +2869,7 @@
             <w:noProof/>
             <w:webHidden/>
           </w:rPr>
-          <w:instrText xml:space="preserve"> PAGEREF _Toc237115599 \h </w:instrText>
+          <w:instrText xml:space="preserve"> PAGEREF _Toc237117230 \h </w:instrText>
         </w:r>
         <w:r>
           <w:rPr>
@@ -2910,7 +2910,7 @@
           <w:noProof/>
         </w:rPr>
       </w:pPr>
-      <w:hyperlink w:anchor="_Toc237115600" w:history="1">
+      <w:hyperlink w:anchor="_Toc237117231" w:history="1">
         <w:r>
           <w:rPr>
             <w:rStyle w:val="Hyperlink"/>
@@ -2937,7 +2937,7 @@
             <w:noProof/>
             <w:webHidden/>
           </w:rPr>
-          <w:instrText xml:space="preserve"> PAGEREF _Toc237115600 \h </w:instrText>
+          <w:instrText xml:space="preserve"> PAGEREF _Toc237117231 \h </w:instrText>
         </w:r>
         <w:r>
           <w:rPr>
@@ -2978,7 +2978,7 @@
           <w:noProof/>
         </w:rPr>
       </w:pPr>
-      <w:hyperlink w:anchor="_Toc237115601" w:history="1">
+      <w:hyperlink w:anchor="_Toc237117232" w:history="1">
         <w:r>
           <w:rPr>
             <w:rStyle w:val="Hyperlink"/>
@@ -3005,7 +3005,7 @@
             <w:noProof/>
             <w:webHidden/>
           </w:rPr>
-          <w:instrText xml:space="preserve"> PAGEREF _Toc237115601 \h </w:instrText>
+          <w:instrText xml:space="preserve"> PAGEREF _Toc237117232 \h </w:instrText>
         </w:r>
         <w:r>
           <w:rPr>
@@ -3046,7 +3046,7 @@
           <w:noProof/>
         </w:rPr>
       </w:pPr>
-      <w:hyperlink w:anchor="_Toc237115602" w:history="1">
+      <w:hyperlink w:anchor="_Toc237117233" w:history="1">
         <w:r>
           <w:rPr>
             <w:rStyle w:val="Hyperlink"/>
@@ -3073,7 +3073,7 @@
             <w:noProof/>
             <w:webHidden/>
           </w:rPr>
-          <w:instrText xml:space="preserve"> PAGEREF _Toc237115602 \h </w:instrText>
+          <w:instrText xml:space="preserve"> PAGEREF _Toc237117233 \h </w:instrText>
         </w:r>
         <w:r>
           <w:rPr>
@@ -3114,7 +3114,7 @@
           <w:noProof/>
         </w:rPr>
       </w:pPr>
-      <w:hyperlink w:anchor="_Toc237115603" w:history="1">
+      <w:hyperlink w:anchor="_Toc237117234" w:history="1">
         <w:r>
           <w:rPr>
             <w:rStyle w:val="Hyperlink"/>
@@ -3141,7 +3141,7 @@
             <w:noProof/>
             <w:webHidden/>
           </w:rPr>
-          <w:instrText xml:space="preserve"> PAGEREF _Toc237115603 \h </w:instrText>
+          <w:instrText xml:space="preserve"> PAGEREF _Toc237117234 \h </w:instrText>
         </w:r>
         <w:r>
           <w:rPr>
@@ -3182,7 +3182,7 @@
           <w:noProof/>
         </w:rPr>
       </w:pPr>
-      <w:hyperlink w:anchor="_Toc237115604" w:history="1">
+      <w:hyperlink w:anchor="_Toc237117235" w:history="1">
         <w:r>
           <w:rPr>
             <w:rStyle w:val="Hyperlink"/>
@@ -3209,7 +3209,7 @@
             <w:noProof/>
             <w:webHidden/>
           </w:rPr>
-          <w:instrText xml:space="preserve"> PAGEREF _Toc237115604 \h </w:instrText>
+          <w:instrText xml:space="preserve"> PAGEREF _Toc237117235 \h </w:instrText>
         </w:r>
         <w:r>
           <w:rPr>
@@ -3250,7 +3250,7 @@
           <w:noProof/>
         </w:rPr>
       </w:pPr>
-      <w:hyperlink w:anchor="_Toc237115605" w:history="1">
+      <w:hyperlink w:anchor="_Toc237117236" w:history="1">
         <w:r>
           <w:rPr>
             <w:rStyle w:val="Hyperlink"/>
@@ -3277,7 +3277,7 @@
             <w:noProof/>
             <w:webHidden/>
           </w:rPr>
-          <w:instrText xml:space="preserve"> PAGEREF _Toc237115605 \h </w:instrText>
+          <w:instrText xml:space="preserve"> PAGEREF _Toc237117236 \h </w:instrText>
         </w:r>
         <w:r>
           <w:rPr>
@@ -3318,7 +3318,7 @@
           <w:noProof/>
         </w:rPr>
       </w:pPr>
-      <w:hyperlink w:anchor="_Toc237115606" w:history="1">
+      <w:hyperlink w:anchor="_Toc237117237" w:history="1">
         <w:r>
           <w:rPr>
             <w:rStyle w:val="Hyperlink"/>
@@ -3345,7 +3345,7 @@
             <w:noProof/>
             <w:webHidden/>
           </w:rPr>
-          <w:instrText xml:space="preserve"> PAGEREF _Toc237115606 \h </w:instrText>
+          <w:instrText xml:space="preserve"> PAGEREF _Toc237117237 \h </w:instrText>
         </w:r>
         <w:r>
           <w:rPr>
@@ -3386,7 +3386,7 @@
           <w:noProof/>
         </w:rPr>
       </w:pPr>
-      <w:hyperlink w:anchor="_Toc237115607" w:history="1">
+      <w:hyperlink w:anchor="_Toc237117238" w:history="1">
         <w:r>
           <w:rPr>
             <w:rStyle w:val="Hyperlink"/>
@@ -3413,7 +3413,7 @@
             <w:noProof/>
             <w:webHidden/>
           </w:rPr>
-          <w:instrText xml:space="preserve"> PAGEREF _Toc237115607 \h </w:instrText>
+          <w:instrText xml:space="preserve"> PAGEREF _Toc237117238 \h </w:instrText>
         </w:r>
         <w:r>
           <w:rPr>
@@ -3454,7 +3454,7 @@
           <w:noProof/>
         </w:rPr>
       </w:pPr>
-      <w:hyperlink w:anchor="_Toc237115608" w:history="1">
+      <w:hyperlink w:anchor="_Toc237117239" w:history="1">
         <w:r>
           <w:rPr>
             <w:rStyle w:val="Hyperlink"/>
@@ -3481,7 +3481,7 @@
             <w:noProof/>
             <w:webHidden/>
           </w:rPr>
-          <w:instrText xml:space="preserve"> PAGEREF _Toc237115608 \h </w:instrText>
+          <w:instrText xml:space="preserve"> PAGEREF _Toc237117239 \h </w:instrText>
         </w:r>
         <w:r>
           <w:rPr>
@@ -3534,7 +3534,7 @@
       <w:pPr>
         <w:pStyle w:val="Heading1"/>
       </w:pPr>
-      <w:bookmarkStart w:id="0" w:name="_Toc237115560"/>
+      <w:bookmarkStart w:id="0" w:name="_Toc237117191"/>
       <w:r>
         <w:lastRenderedPageBreak/>
         <w:t>1. Purpose and Test Philosophy</w:t>
@@ -3585,6 +3585,9 @@
           <w:p>
             <w:pPr>
               <w:pStyle w:val="Callout"/>
+              <w:rPr>
+                <w:rFonts w:hint="eastAsia"/>
+              </w:rPr>
             </w:pPr>
             <w:r>
               <w:rPr>
@@ -3604,7 +3607,7 @@
       <w:pPr>
         <w:pStyle w:val="Heading2"/>
       </w:pPr>
-      <w:bookmarkStart w:id="1" w:name="_Toc237115561"/>
+      <w:bookmarkStart w:id="1" w:name="_Toc237117192"/>
       <w:r>
         <w:t>1.1 Scope</w:t>
       </w:r>
@@ -3662,7 +3665,7 @@
       <w:pPr>
         <w:pStyle w:val="Heading2"/>
       </w:pPr>
-      <w:bookmarkStart w:id="2" w:name="_Toc237115562"/>
+      <w:bookmarkStart w:id="2" w:name="_Toc237117193"/>
       <w:r>
         <w:t>1.2 Stop conditions</w:t>
       </w:r>
@@ -3721,7 +3724,7 @@
       <w:pPr>
         <w:pStyle w:val="Heading1"/>
       </w:pPr>
-      <w:bookmarkStart w:id="3" w:name="_Toc237115563"/>
+      <w:bookmarkStart w:id="3" w:name="_Toc237117194"/>
       <w:r>
         <w:t>2. Exact Folders and Files</w:t>
       </w:r>
@@ -4484,7 +4487,7 @@
       <w:pPr>
         <w:pStyle w:val="Heading2"/>
       </w:pPr>
-      <w:bookmarkStart w:id="4" w:name="_Toc237115564"/>
+      <w:bookmarkStart w:id="4" w:name="_Toc237117195"/>
       <w:r>
         <w:t>2.1 Studio executable matrix</w:t>
       </w:r>
@@ -4752,6 +4755,9 @@
           <w:p>
             <w:pPr>
               <w:pStyle w:val="Callout"/>
+              <w:rPr>
+                <w:rFonts w:hint="eastAsia"/>
+              </w:rPr>
             </w:pPr>
             <w:r>
               <w:rPr>
@@ -4771,7 +4777,7 @@
       <w:pPr>
         <w:pStyle w:val="Heading2"/>
       </w:pPr>
-      <w:bookmarkStart w:id="5" w:name="_Toc237115565"/>
+      <w:bookmarkStart w:id="5" w:name="_Toc237117196"/>
       <w:r>
         <w:t>2.2 Package source and build outputs</w:t>
       </w:r>
@@ -5170,7 +5176,7 @@
       <w:pPr>
         <w:pStyle w:val="Heading1"/>
       </w:pPr>
-      <w:bookmarkStart w:id="6" w:name="_Toc237115566"/>
+      <w:bookmarkStart w:id="6" w:name="_Toc237117197"/>
       <w:r>
         <w:t>3. Prerequisites and Test Data</w:t>
       </w:r>
@@ -5262,6 +5268,9 @@
           <w:p>
             <w:pPr>
               <w:pStyle w:val="Callout"/>
+              <w:rPr>
+                <w:rFonts w:hint="eastAsia"/>
+              </w:rPr>
             </w:pPr>
             <w:r>
               <w:rPr>
@@ -5281,7 +5290,7 @@
       <w:pPr>
         <w:pStyle w:val="Heading2"/>
       </w:pPr>
-      <w:bookmarkStart w:id="7" w:name="_Toc237115567"/>
+      <w:bookmarkStart w:id="7" w:name="_Toc237117198"/>
       <w:r>
         <w:t>3.1 Create the disposable GA4 test copy</w:t>
       </w:r>
@@ -5376,6 +5385,9 @@
           <w:p>
             <w:pPr>
               <w:pStyle w:val="Callout"/>
+              <w:rPr>
+                <w:rFonts w:hint="eastAsia"/>
+              </w:rPr>
             </w:pPr>
             <w:r>
               <w:rPr>
@@ -5395,7 +5407,7 @@
       <w:pPr>
         <w:pStyle w:val="Heading1"/>
       </w:pPr>
-      <w:bookmarkStart w:id="8" w:name="_Toc237115568"/>
+      <w:bookmarkStart w:id="8" w:name="_Toc237117199"/>
       <w:r>
         <w:t>4. Build the Studio Manually</w:t>
       </w:r>
@@ -5410,7 +5422,7 @@
       <w:pPr>
         <w:pStyle w:val="Heading2"/>
       </w:pPr>
-      <w:bookmarkStart w:id="9" w:name="_Toc237115569"/>
+      <w:bookmarkStart w:id="9" w:name="_Toc237117200"/>
       <w:r>
         <w:t>4.1 RAD Studio method</w:t>
       </w:r>
@@ -5480,7 +5492,7 @@
       <w:pPr>
         <w:pStyle w:val="Heading2"/>
       </w:pPr>
-      <w:bookmarkStart w:id="10" w:name="_Toc237115570"/>
+      <w:bookmarkStart w:id="10" w:name="_Toc237117201"/>
       <w:r>
         <w:t>4.2 Command-line method</w:t>
       </w:r>
@@ -5489,6 +5501,9 @@
     <w:p>
       <w:pPr>
         <w:pStyle w:val="CodeBlock"/>
+        <w:rPr>
+          <w:rFonts w:hint="eastAsia"/>
+        </w:rPr>
       </w:pPr>
       <w:r>
         <w:t>cd "C:\New Delphi Projects\Delphi App Translation"</w:t>
@@ -5497,6 +5512,9 @@
     <w:p>
       <w:pPr>
         <w:pStyle w:val="CodeBlock"/>
+        <w:rPr>
+          <w:rFonts w:hint="eastAsia"/>
+        </w:rPr>
       </w:pPr>
       <w:r>
         <w:t>cmd /d /c "call ""C:\Program Files (x86)\Embarcadero\Studio\37.0\bin\rsvars.bat"" &amp;&amp; msbuild DelphiAppTranslationStudio.dproj /t:Build /p:Config=Debug /p:Platform=Win32 /v:minimal"</w:t>
@@ -5505,6 +5523,9 @@
     <w:p>
       <w:pPr>
         <w:pStyle w:val="CodeBlock"/>
+        <w:rPr>
+          <w:rFonts w:hint="eastAsia"/>
+        </w:rPr>
       </w:pPr>
       <w:r>
         <w:lastRenderedPageBreak/>
@@ -5514,6 +5535,9 @@
     <w:p>
       <w:pPr>
         <w:pStyle w:val="CodeBlock"/>
+        <w:rPr>
+          <w:rFonts w:hint="eastAsia"/>
+        </w:rPr>
       </w:pPr>
       <w:r>
         <w:t>cmd /d /c "call ""C:\Program Files (x86)\Embarcadero\Studio\37.0\bin\rsvars.bat"" &amp;&amp; msbuild DelphiAppTranslationStudio.dproj /t:Build /p:Config=Release /p:Platform=Win32 /v:minimal"</w:t>
@@ -5522,6 +5546,9 @@
     <w:p>
       <w:pPr>
         <w:pStyle w:val="CodeBlock"/>
+        <w:rPr>
+          <w:rFonts w:hint="eastAsia"/>
+        </w:rPr>
       </w:pPr>
       <w:r>
         <w:t>cmd /d /c "call ""C:\Program Files (x86)\Embarcadero\Studio\37.0\bin\rsvars.bat"" &amp;&amp; msbuild DelphiAppTranslationStudio.dproj /t:Build /p:Config=Release /p:Platform=Win64 /v:minimal"</w:t>
@@ -5531,7 +5558,7 @@
       <w:pPr>
         <w:pStyle w:val="Heading1"/>
       </w:pPr>
-      <w:bookmarkStart w:id="11" w:name="_Toc237115571"/>
+      <w:bookmarkStart w:id="11" w:name="_Toc237117202"/>
       <w:r>
         <w:t>5. Automated Release Gate</w:t>
       </w:r>
@@ -5545,6 +5572,9 @@
     <w:p>
       <w:pPr>
         <w:pStyle w:val="CodeBlock"/>
+        <w:rPr>
+          <w:rFonts w:hint="eastAsia"/>
+        </w:rPr>
       </w:pPr>
       <w:r>
         <w:t>cd "C:\New Delphi Projects\Delphi App Translation"</w:t>
@@ -5553,6 +5583,9 @@
     <w:p>
       <w:pPr>
         <w:pStyle w:val="CodeBlock"/>
+        <w:rPr>
+          <w:rFonts w:hint="eastAsia"/>
+        </w:rPr>
       </w:pPr>
       <w:r>
         <w:t>powershell.exe -ExecutionPolicy Bypass -File .\tools\tests\RunPhase10ReleaseValidation.ps1</w:t>
@@ -5594,7 +5627,7 @@
       <w:pPr>
         <w:pStyle w:val="Heading2"/>
       </w:pPr>
-      <w:bookmarkStart w:id="12" w:name="_Toc237115572"/>
+      <w:bookmarkStart w:id="12" w:name="_Toc237117203"/>
       <w:r>
         <w:t>5.1 What the gate proves</w:t>
       </w:r>
@@ -5927,7 +5960,7 @@
       <w:pPr>
         <w:pStyle w:val="Heading1"/>
       </w:pPr>
-      <w:bookmarkStart w:id="13" w:name="_Toc237115573"/>
+      <w:bookmarkStart w:id="13" w:name="_Toc237117204"/>
       <w:r>
         <w:lastRenderedPageBreak/>
         <w:t>6. Manual Studio Acceptance</w:t>
@@ -5938,7 +5971,7 @@
       <w:pPr>
         <w:pStyle w:val="Heading2"/>
       </w:pPr>
-      <w:bookmarkStart w:id="14" w:name="_Toc237115574"/>
+      <w:bookmarkStart w:id="14" w:name="_Toc237117205"/>
       <w:r>
         <w:t>TC-01 Launch and navigation</w:t>
       </w:r>
@@ -5973,6 +6006,9 @@
           <w:p>
             <w:pPr>
               <w:pStyle w:val="Callout"/>
+              <w:rPr>
+                <w:rFonts w:hint="eastAsia"/>
+              </w:rPr>
             </w:pPr>
             <w:r>
               <w:rPr>
@@ -6244,7 +6280,7 @@
       <w:pPr>
         <w:pStyle w:val="Heading2"/>
       </w:pPr>
-      <w:bookmarkStart w:id="15" w:name="_Toc237115575"/>
+      <w:bookmarkStart w:id="15" w:name="_Toc237117206"/>
       <w:r>
         <w:t>TC-02 Open the disposable GA4 project</w:t>
       </w:r>
@@ -6279,6 +6315,9 @@
           <w:p>
             <w:pPr>
               <w:pStyle w:val="Callout"/>
+              <w:rPr>
+                <w:rFonts w:hint="eastAsia"/>
+              </w:rPr>
             </w:pPr>
             <w:r>
               <w:rPr>
@@ -6531,7 +6570,7 @@
       <w:pPr>
         <w:pStyle w:val="Heading2"/>
       </w:pPr>
-      <w:bookmarkStart w:id="16" w:name="_Toc237115576"/>
+      <w:bookmarkStart w:id="16" w:name="_Toc237117207"/>
       <w:r>
         <w:t>TC-03 Scan the project</w:t>
       </w:r>
@@ -6566,6 +6605,9 @@
           <w:p>
             <w:pPr>
               <w:pStyle w:val="Callout"/>
+              <w:rPr>
+                <w:rFonts w:hint="eastAsia"/>
+              </w:rPr>
             </w:pPr>
             <w:r>
               <w:rPr>
@@ -6850,7 +6892,7 @@
       <w:pPr>
         <w:pStyle w:val="Heading2"/>
       </w:pPr>
-      <w:bookmarkStart w:id="17" w:name="_Toc237115577"/>
+      <w:bookmarkStart w:id="17" w:name="_Toc237117208"/>
       <w:r>
         <w:t>TC-04 Configure and test a provider</w:t>
       </w:r>
@@ -6885,6 +6927,9 @@
           <w:p>
             <w:pPr>
               <w:pStyle w:val="Callout"/>
+              <w:rPr>
+                <w:rFonts w:hint="eastAsia"/>
+              </w:rPr>
             </w:pPr>
             <w:r>
               <w:rPr>
@@ -7164,7 +7209,7 @@
       <w:pPr>
         <w:pStyle w:val="Heading2"/>
       </w:pPr>
-      <w:bookmarkStart w:id="18" w:name="_Toc237115578"/>
+      <w:bookmarkStart w:id="18" w:name="_Toc237117209"/>
       <w:r>
         <w:t>TC-05 Create the development catalog</w:t>
       </w:r>
@@ -7199,6 +7244,9 @@
           <w:p>
             <w:pPr>
               <w:pStyle w:val="Callout"/>
+              <w:rPr>
+                <w:rFonts w:hint="eastAsia"/>
+              </w:rPr>
             </w:pPr>
             <w:r>
               <w:rPr>
@@ -7459,7 +7507,7 @@
       <w:pPr>
         <w:pStyle w:val="Heading2"/>
       </w:pPr>
-      <w:bookmarkStart w:id="19" w:name="_Toc237115579"/>
+      <w:bookmarkStart w:id="19" w:name="_Toc237117210"/>
       <w:r>
         <w:t>TC-06 Translate automatically</w:t>
       </w:r>
@@ -7494,6 +7542,9 @@
           <w:p>
             <w:pPr>
               <w:pStyle w:val="Callout"/>
+              <w:rPr>
+                <w:rFonts w:hint="eastAsia"/>
+              </w:rPr>
             </w:pPr>
             <w:r>
               <w:rPr>
@@ -7758,7 +7809,7 @@
       <w:pPr>
         <w:pStyle w:val="Heading2"/>
       </w:pPr>
-      <w:bookmarkStart w:id="20" w:name="_Toc237115580"/>
+      <w:bookmarkStart w:id="20" w:name="_Toc237117211"/>
       <w:r>
         <w:t>TC-07 Focused linguistic and structural review</w:t>
       </w:r>
@@ -7793,6 +7844,9 @@
           <w:p>
             <w:pPr>
               <w:pStyle w:val="Callout"/>
+              <w:rPr>
+                <w:rFonts w:hint="eastAsia"/>
+              </w:rPr>
             </w:pPr>
             <w:r>
               <w:rPr>
@@ -8056,7 +8110,7 @@
       <w:pPr>
         <w:pStyle w:val="Heading2"/>
       </w:pPr>
-      <w:bookmarkStart w:id="21" w:name="_Toc237115581"/>
+      <w:bookmarkStart w:id="21" w:name="_Toc237117212"/>
       <w:r>
         <w:lastRenderedPageBreak/>
         <w:t>TC-08 Validate and export runtime JSON</w:t>
@@ -8092,6 +8146,9 @@
           <w:p>
             <w:pPr>
               <w:pStyle w:val="Callout"/>
+              <w:rPr>
+                <w:rFonts w:hint="eastAsia"/>
+              </w:rPr>
             </w:pPr>
             <w:r>
               <w:rPr>
@@ -8364,7 +8421,7 @@
       <w:pPr>
         <w:pStyle w:val="Heading1"/>
       </w:pPr>
-      <w:bookmarkStart w:id="22" w:name="_Toc237115582"/>
+      <w:bookmarkStart w:id="22" w:name="_Toc237117213"/>
       <w:r>
         <w:lastRenderedPageBreak/>
         <w:t>7. Component Integration Acceptance</w:t>
@@ -8375,7 +8432,7 @@
       <w:pPr>
         <w:pStyle w:val="Heading2"/>
       </w:pPr>
-      <w:bookmarkStart w:id="23" w:name="_Toc237115583"/>
+      <w:bookmarkStart w:id="23" w:name="_Toc237117214"/>
       <w:r>
         <w:t>TC-09 Generate the non-mutating component kit</w:t>
       </w:r>
@@ -8410,6 +8467,9 @@
           <w:p>
             <w:pPr>
               <w:pStyle w:val="Callout"/>
+              <w:rPr>
+                <w:rFonts w:hint="eastAsia"/>
+              </w:rPr>
             </w:pPr>
             <w:r>
               <w:rPr>
@@ -8685,7 +8745,7 @@
       <w:pPr>
         <w:pStyle w:val="Heading2"/>
       </w:pPr>
-      <w:bookmarkStart w:id="24" w:name="_Toc237115584"/>
+      <w:bookmarkStart w:id="24" w:name="_Toc237117215"/>
       <w:r>
         <w:t>7.1 Expected component-kit contents</w:t>
       </w:r>
@@ -9272,7 +9332,7 @@
       <w:pPr>
         <w:pStyle w:val="Heading2"/>
       </w:pPr>
-      <w:bookmarkStart w:id="25" w:name="_Toc237115585"/>
+      <w:bookmarkStart w:id="25" w:name="_Toc237117216"/>
       <w:r>
         <w:t>TC-10 Install or repair the FMX components</w:t>
       </w:r>
@@ -9307,6 +9367,9 @@
           <w:p>
             <w:pPr>
               <w:pStyle w:val="Callout"/>
+              <w:rPr>
+                <w:rFonts w:hint="eastAsia"/>
+              </w:rPr>
             </w:pPr>
             <w:r>
               <w:rPr>
@@ -9363,7 +9426,7 @@
         </w:numPr>
       </w:pPr>
       <w:r>
-        <w:t>Wait for the build, verification, copy, and registration success messages. Restart RAD Studio and open an FMX form.</w:t>
+        <w:t>Wait for the build, verification, copy, and registration success messages. Restart RAD Studio.</w:t>
       </w:r>
     </w:p>
     <w:p>
@@ -9375,7 +9438,7 @@
         </w:numPr>
       </w:pPr>
       <w:r>
-        <w:t>Confirm DAT Localization appears in the Tool Palette.</w:t>
+        <w:t>Before opening a project form, choose Component &gt; Install Packages. Confirm the normal Embarcadero package list remains present, Embarcadero FMX Components is listed and checked, and the DAT Language Manager FireMonkey design-time package is listed and checked.</w:t>
       </w:r>
     </w:p>
     <w:p>
@@ -9387,6 +9450,18 @@
         </w:numPr>
       </w:pPr>
       <w:r>
+        <w:t>Open an FMX form and confirm DAT Localization appears in the Tool Palette.</w:t>
+      </w:r>
+    </w:p>
+    <w:p>
+      <w:pPr>
+        <w:pStyle w:val="ListNumber"/>
+        <w:numPr>
+          <w:ilvl w:val="0"/>
+          <w:numId w:val="21"/>
+        </w:numPr>
+      </w:pPr>
+      <w:r>
         <w:lastRenderedPageBreak/>
         <w:t>For the documented manual fallback only, use Component &gt; Install Packages &gt; Add and select the compiled DATLanguageManagerFMXDesign.bpl. Never use Component &gt; Install Component and never select DATLanguageManagerFMXDesign.dpk.</w:t>
       </w:r>
@@ -9421,6 +9496,14 @@
       </w:pPr>
       <w:r>
         <w:t>The design BPL has no custom DAT runtime-BPL import, so it loads without a missing-module error.</w:t>
+      </w:r>
+    </w:p>
+    <w:p>
+      <w:pPr>
+        <w:pStyle w:val="ListBullet"/>
+      </w:pPr>
+      <w:r>
+        <w:t>The complete standard package list remains available; standard controls such as TTabControl stream normally.</w:t>
       </w:r>
     </w:p>
     <w:p>
@@ -9563,7 +9646,7 @@
       <w:pPr>
         <w:pStyle w:val="Heading2"/>
       </w:pPr>
-      <w:bookmarkStart w:id="26" w:name="_Toc237115586"/>
+      <w:bookmarkStart w:id="26" w:name="_Toc237117217"/>
       <w:r>
         <w:t>TC-11 Perform the visible Delphi integration</w:t>
       </w:r>
@@ -9598,6 +9681,9 @@
           <w:p>
             <w:pPr>
               <w:pStyle w:val="Callout"/>
+              <w:rPr>
+                <w:rFonts w:hint="eastAsia"/>
+              </w:rPr>
             </w:pPr>
             <w:r>
               <w:rPr>
@@ -9714,6 +9800,7 @@
         </w:numPr>
       </w:pPr>
       <w:r>
+        <w:lastRenderedPageBreak/>
         <w:t>Set its LanguageManager property to the manager. Leave AutoPopulate and ShowLanguageCode True.</w:t>
       </w:r>
     </w:p>
@@ -9734,7 +9821,6 @@
         <w:pStyle w:val="Heading3"/>
       </w:pPr>
       <w:r>
-        <w:lastRenderedPageBreak/>
         <w:t>Expected result</w:t>
       </w:r>
     </w:p>
@@ -9927,6 +10013,9 @@
           <w:p>
             <w:pPr>
               <w:pStyle w:val="Callout"/>
+              <w:rPr>
+                <w:rFonts w:hint="eastAsia"/>
+              </w:rPr>
             </w:pPr>
             <w:r>
               <w:rPr>
@@ -9946,7 +10035,7 @@
       <w:pPr>
         <w:pStyle w:val="Heading2"/>
       </w:pPr>
-      <w:bookmarkStart w:id="27" w:name="_Toc237115587"/>
+      <w:bookmarkStart w:id="27" w:name="_Toc237117218"/>
       <w:r>
         <w:t>TC-12 Build GA4 Win32 and Win64</w:t>
       </w:r>
@@ -9981,6 +10070,9 @@
           <w:p>
             <w:pPr>
               <w:pStyle w:val="Callout"/>
+              <w:rPr>
+                <w:rFonts w:hint="eastAsia"/>
+              </w:rPr>
             </w:pPr>
             <w:r>
               <w:rPr>
@@ -10085,6 +10177,7 @@
         <w:pStyle w:val="ListBullet"/>
       </w:pPr>
       <w:r>
+        <w:lastRenderedPageBreak/>
         <w:t>The target contains the manager and selector through normal compiled source/designer resources.</w:t>
       </w:r>
     </w:p>
@@ -10132,7 +10225,6 @@
                 <w:color w:val="234C80"/>
                 <w:sz w:val="17"/>
               </w:rPr>
-              <w:lastRenderedPageBreak/>
               <w:t>Result</w:t>
             </w:r>
           </w:p>
@@ -10229,7 +10321,7 @@
       <w:pPr>
         <w:pStyle w:val="Heading2"/>
       </w:pPr>
-      <w:bookmarkStart w:id="28" w:name="_Toc237115588"/>
+      <w:bookmarkStart w:id="28" w:name="_Toc237117219"/>
       <w:r>
         <w:t>TC-13 Deploy language packs</w:t>
       </w:r>
@@ -10264,6 +10356,9 @@
           <w:p>
             <w:pPr>
               <w:pStyle w:val="Callout"/>
+              <w:rPr>
+                <w:rFonts w:hint="eastAsia"/>
+              </w:rPr>
             </w:pPr>
             <w:r>
               <w:rPr>
@@ -10506,6 +10601,9 @@
     <w:p>
       <w:pPr>
         <w:pStyle w:val="CodeBlock"/>
+        <w:rPr>
+          <w:rFonts w:hint="eastAsia"/>
+        </w:rPr>
       </w:pPr>
       <w:r>
         <w:t>&amp; "C:\New Delphi Projects\Delphi App Translation\export\component-integration\WebsiteAnalytics\Deploy-LanguagePacks.ps1" -ApplicationDirectory "C:\New Delphi Projects\Echurchsite Analytical - Component Test\bin\Win32\Debug"</w:t>
@@ -10514,21 +10612,19 @@
     <w:p>
       <w:pPr>
         <w:pStyle w:val="CodeBlock"/>
+        <w:rPr>
+          <w:rFonts w:hint="eastAsia"/>
+        </w:rPr>
       </w:pPr>
       <w:r>
         <w:t>&amp; "C:\New Delphi Projects\Delphi App Translation\export\component-integration\WebsiteAnalytics\Deploy-LanguagePacks.ps1" -ApplicationDirectory "C:\New Delphi Projects\Echurchsite Analytical - Component Test\bin\Win64\Debug"</w:t>
       </w:r>
     </w:p>
     <w:p>
-      <w:r>
-        <w:br w:type="page"/>
-      </w:r>
-    </w:p>
-    <w:p>
       <w:pPr>
         <w:pStyle w:val="Heading1"/>
       </w:pPr>
-      <w:bookmarkStart w:id="29" w:name="_Toc237115589"/>
+      <w:bookmarkStart w:id="29" w:name="_Toc237117220"/>
       <w:r>
         <w:lastRenderedPageBreak/>
         <w:t>8. Runtime Acceptance</w:t>
@@ -10539,7 +10635,7 @@
       <w:pPr>
         <w:pStyle w:val="Heading2"/>
       </w:pPr>
-      <w:bookmarkStart w:id="30" w:name="_Toc237115590"/>
+      <w:bookmarkStart w:id="30" w:name="_Toc237117221"/>
       <w:r>
         <w:t>TC-14 First launch and source language</w:t>
       </w:r>
@@ -10574,6 +10670,9 @@
           <w:p>
             <w:pPr>
               <w:pStyle w:val="Callout"/>
+              <w:rPr>
+                <w:rFonts w:hint="eastAsia"/>
+              </w:rPr>
             </w:pPr>
             <w:r>
               <w:rPr>
@@ -10817,7 +10916,7 @@
       <w:pPr>
         <w:pStyle w:val="Heading2"/>
       </w:pPr>
-      <w:bookmarkStart w:id="31" w:name="_Toc237115591"/>
+      <w:bookmarkStart w:id="31" w:name="_Toc237117222"/>
       <w:r>
         <w:t>TC-15 Immediate language switching</w:t>
       </w:r>
@@ -10852,6 +10951,9 @@
           <w:p>
             <w:pPr>
               <w:pStyle w:val="Callout"/>
+              <w:rPr>
+                <w:rFonts w:hint="eastAsia"/>
+              </w:rPr>
             </w:pPr>
             <w:r>
               <w:rPr>
@@ -11108,7 +11210,7 @@
       <w:pPr>
         <w:pStyle w:val="Heading2"/>
       </w:pPr>
-      <w:bookmarkStart w:id="32" w:name="_Toc237115592"/>
+      <w:bookmarkStart w:id="32" w:name="_Toc237117223"/>
       <w:r>
         <w:t>TC-16 Preserve control state and date range</w:t>
       </w:r>
@@ -11143,6 +11245,9 @@
           <w:p>
             <w:pPr>
               <w:pStyle w:val="Callout"/>
+              <w:rPr>
+                <w:rFonts w:hint="eastAsia"/>
+              </w:rPr>
             </w:pPr>
             <w:r>
               <w:rPr>
@@ -11386,7 +11491,7 @@
       <w:pPr>
         <w:pStyle w:val="Heading2"/>
       </w:pPr>
-      <w:bookmarkStart w:id="33" w:name="_Toc237115593"/>
+      <w:bookmarkStart w:id="33" w:name="_Toc237117224"/>
       <w:r>
         <w:t>TC-17 Preference persistence and restart</w:t>
       </w:r>
@@ -11421,6 +11526,9 @@
           <w:p>
             <w:pPr>
               <w:pStyle w:val="Callout"/>
+              <w:rPr>
+                <w:rFonts w:hint="eastAsia"/>
+              </w:rPr>
             </w:pPr>
             <w:r>
               <w:rPr>
@@ -11665,7 +11773,7 @@
       <w:pPr>
         <w:pStyle w:val="Heading2"/>
       </w:pPr>
-      <w:bookmarkStart w:id="34" w:name="_Toc237115594"/>
+      <w:bookmarkStart w:id="34" w:name="_Toc237117225"/>
       <w:r>
         <w:t>TC-18 Offline runtime</w:t>
       </w:r>
@@ -11700,6 +11808,9 @@
           <w:p>
             <w:pPr>
               <w:pStyle w:val="Callout"/>
+              <w:rPr>
+                <w:rFonts w:hint="eastAsia"/>
+              </w:rPr>
             </w:pPr>
             <w:r>
               <w:rPr>
@@ -11936,7 +12047,7 @@
       <w:pPr>
         <w:pStyle w:val="Heading2"/>
       </w:pPr>
-      <w:bookmarkStart w:id="35" w:name="_Toc237115595"/>
+      <w:bookmarkStart w:id="35" w:name="_Toc237117226"/>
       <w:r>
         <w:t>TC-19 Missing and malformed pack behavior</w:t>
       </w:r>
@@ -11971,6 +12082,9 @@
           <w:p>
             <w:pPr>
               <w:pStyle w:val="Callout"/>
+              <w:rPr>
+                <w:rFonts w:hint="eastAsia"/>
+              </w:rPr>
             </w:pPr>
             <w:r>
               <w:rPr>
@@ -12226,7 +12340,7 @@
       <w:pPr>
         <w:pStyle w:val="Heading2"/>
       </w:pPr>
-      <w:bookmarkStart w:id="36" w:name="_Toc237115596"/>
+      <w:bookmarkStart w:id="36" w:name="_Toc237117227"/>
       <w:r>
         <w:t>8.1 Repeat the runtime matrix</w:t>
       </w:r>
@@ -12560,7 +12674,7 @@
       <w:pPr>
         <w:pStyle w:val="Heading1"/>
       </w:pPr>
-      <w:bookmarkStart w:id="37" w:name="_Toc237115597"/>
+      <w:bookmarkStart w:id="37" w:name="_Toc237117228"/>
       <w:r>
         <w:t>9. VCL Acceptance Delta</w:t>
       </w:r>
@@ -12807,7 +12921,7 @@
       <w:pPr>
         <w:pStyle w:val="Heading1"/>
       </w:pPr>
-      <w:bookmarkStart w:id="38" w:name="_Toc237115598"/>
+      <w:bookmarkStart w:id="38" w:name="_Toc237117229"/>
       <w:r>
         <w:t>10. Studio Self-Translation</w:t>
       </w:r>
@@ -12821,6 +12935,9 @@
     <w:p>
       <w:pPr>
         <w:pStyle w:val="CodeBlock"/>
+        <w:rPr>
+          <w:rFonts w:hint="eastAsia"/>
+        </w:rPr>
       </w:pPr>
       <w:r>
         <w:t>cd "C:\New Delphi Projects\Delphi App Translation"</w:t>
@@ -12829,6 +12946,9 @@
     <w:p>
       <w:pPr>
         <w:pStyle w:val="CodeBlock"/>
+        <w:rPr>
+          <w:rFonts w:hint="eastAsia"/>
+        </w:rPr>
       </w:pPr>
       <w:r>
         <w:t>powershell.exe -ExecutionPolicy Bypass -File .\tools\tests\RunStudioSelfLocalizationSmokeTest.ps1</w:t>
@@ -12870,7 +12990,7 @@
       <w:pPr>
         <w:pStyle w:val="Heading1"/>
       </w:pPr>
-      <w:bookmarkStart w:id="39" w:name="_Toc237115599"/>
+      <w:bookmarkStart w:id="39" w:name="_Toc237117230"/>
       <w:r>
         <w:lastRenderedPageBreak/>
         <w:t>11. Starting Over, Restore, and Reset</w:t>
@@ -12881,7 +13001,7 @@
       <w:pPr>
         <w:pStyle w:val="Heading2"/>
       </w:pPr>
-      <w:bookmarkStart w:id="40" w:name="_Toc237115600"/>
+      <w:bookmarkStart w:id="40" w:name="_Toc237117231"/>
       <w:r>
         <w:t>11.1 Recommended component path</w:t>
       </w:r>
@@ -12926,6 +13046,9 @@
           <w:p>
             <w:pPr>
               <w:pStyle w:val="Callout"/>
+              <w:rPr>
+                <w:rFonts w:hint="eastAsia"/>
+              </w:rPr>
             </w:pPr>
             <w:r>
               <w:rPr>
@@ -12945,7 +13068,7 @@
       <w:pPr>
         <w:pStyle w:val="Heading2"/>
       </w:pPr>
-      <w:bookmarkStart w:id="41" w:name="_Toc237115601"/>
+      <w:bookmarkStart w:id="41" w:name="_Toc237117232"/>
       <w:r>
         <w:t>11.2 Advanced automatic-source reset test</w:t>
       </w:r>
@@ -13071,7 +13194,7 @@
       <w:pPr>
         <w:pStyle w:val="Heading1"/>
       </w:pPr>
-      <w:bookmarkStart w:id="42" w:name="_Toc237115602"/>
+      <w:bookmarkStart w:id="42" w:name="_Toc237117233"/>
       <w:r>
         <w:lastRenderedPageBreak/>
         <w:t>12. Negative and Recovery Tests</w:t>
@@ -13652,7 +13775,7 @@
       <w:pPr>
         <w:pStyle w:val="Heading1"/>
       </w:pPr>
-      <w:bookmarkStart w:id="43" w:name="_Toc237115603"/>
+      <w:bookmarkStart w:id="43" w:name="_Toc237117234"/>
       <w:r>
         <w:t>13. Performance and Large-Project Checks</w:t>
       </w:r>
@@ -14210,7 +14333,7 @@
       <w:pPr>
         <w:pStyle w:val="Heading1"/>
       </w:pPr>
-      <w:bookmarkStart w:id="44" w:name="_Toc237115604"/>
+      <w:bookmarkStart w:id="44" w:name="_Toc237117235"/>
       <w:r>
         <w:t>14. Defect Recording</w:t>
       </w:r>
@@ -14696,7 +14819,7 @@
       <w:pPr>
         <w:pStyle w:val="Heading1"/>
       </w:pPr>
-      <w:bookmarkStart w:id="45" w:name="_Toc237115605"/>
+      <w:bookmarkStart w:id="45" w:name="_Toc237117236"/>
       <w:r>
         <w:t>15. Final Acceptance Checklist</w:t>
       </w:r>
@@ -16162,7 +16285,7 @@
       <w:pPr>
         <w:pStyle w:val="Heading1"/>
       </w:pPr>
-      <w:bookmarkStart w:id="46" w:name="_Toc237115606"/>
+      <w:bookmarkStart w:id="46" w:name="_Toc237117237"/>
       <w:r>
         <w:lastRenderedPageBreak/>
         <w:t>16. Appendix A - Exact Test Scripts</w:t>
@@ -16577,7 +16700,7 @@
       <w:pPr>
         <w:pStyle w:val="Heading1"/>
       </w:pPr>
-      <w:bookmarkStart w:id="47" w:name="_Toc237115607"/>
+      <w:bookmarkStart w:id="47" w:name="_Toc237117238"/>
       <w:r>
         <w:t>17. Appendix B - What Each JSON File Is</w:t>
       </w:r>
@@ -16936,6 +17059,9 @@
           <w:p>
             <w:pPr>
               <w:pStyle w:val="Callout"/>
+              <w:rPr>
+                <w:rFonts w:hint="eastAsia"/>
+              </w:rPr>
             </w:pPr>
             <w:r>
               <w:rPr>
@@ -16955,7 +17081,7 @@
       <w:pPr>
         <w:pStyle w:val="Heading1"/>
       </w:pPr>
-      <w:bookmarkStart w:id="48" w:name="_Toc237115608"/>
+      <w:bookmarkStart w:id="48" w:name="_Toc237117239"/>
       <w:r>
         <w:lastRenderedPageBreak/>
         <w:t>18. Appendix C - Current Verified Baseline</w:t>
@@ -17389,160 +17515,160 @@
       </w:rPr>
     </w:lvl>
   </w:abstractNum>
-  <w:num w:numId="1" w16cid:durableId="1856536297">
+  <w:num w:numId="1" w16cid:durableId="998266771">
     <w:abstractNumId w:val="8"/>
   </w:num>
-  <w:num w:numId="2" w16cid:durableId="476654121">
+  <w:num w:numId="2" w16cid:durableId="1847013240">
     <w:abstractNumId w:val="6"/>
   </w:num>
-  <w:num w:numId="3" w16cid:durableId="1077895826">
+  <w:num w:numId="3" w16cid:durableId="1348216647">
     <w:abstractNumId w:val="5"/>
   </w:num>
-  <w:num w:numId="4" w16cid:durableId="592398878">
+  <w:num w:numId="4" w16cid:durableId="272251309">
     <w:abstractNumId w:val="4"/>
   </w:num>
-  <w:num w:numId="5" w16cid:durableId="330180175">
+  <w:num w:numId="5" w16cid:durableId="539438576">
     <w:abstractNumId w:val="7"/>
   </w:num>
-  <w:num w:numId="6" w16cid:durableId="1598253388">
+  <w:num w:numId="6" w16cid:durableId="1240793195">
     <w:abstractNumId w:val="3"/>
   </w:num>
-  <w:num w:numId="7" w16cid:durableId="220555008">
+  <w:num w:numId="7" w16cid:durableId="1143886878">
     <w:abstractNumId w:val="2"/>
   </w:num>
-  <w:num w:numId="8" w16cid:durableId="1331639282">
+  <w:num w:numId="8" w16cid:durableId="1783645415">
     <w:abstractNumId w:val="1"/>
   </w:num>
-  <w:num w:numId="9" w16cid:durableId="200557752">
+  <w:num w:numId="9" w16cid:durableId="832919060">
     <w:abstractNumId w:val="0"/>
   </w:num>
-  <w:num w:numId="10" w16cid:durableId="1877160079">
+  <w:num w:numId="10" w16cid:durableId="1731075323">
     <w:abstractNumId w:val="7"/>
     <w:lvlOverride w:ilvl="0">
       <w:startOverride w:val="1"/>
     </w:lvlOverride>
   </w:num>
-  <w:num w:numId="11" w16cid:durableId="1881355320">
+  <w:num w:numId="11" w16cid:durableId="264189555">
     <w:abstractNumId w:val="7"/>
     <w:lvlOverride w:ilvl="0">
       <w:startOverride w:val="1"/>
     </w:lvlOverride>
   </w:num>
-  <w:num w:numId="12" w16cid:durableId="2023699235">
+  <w:num w:numId="12" w16cid:durableId="1906068947">
     <w:abstractNumId w:val="7"/>
     <w:lvlOverride w:ilvl="0">
       <w:startOverride w:val="1"/>
     </w:lvlOverride>
   </w:num>
-  <w:num w:numId="13" w16cid:durableId="824974289">
+  <w:num w:numId="13" w16cid:durableId="1890724006">
     <w:abstractNumId w:val="7"/>
     <w:lvlOverride w:ilvl="0">
       <w:startOverride w:val="1"/>
     </w:lvlOverride>
   </w:num>
-  <w:num w:numId="14" w16cid:durableId="1440757544">
+  <w:num w:numId="14" w16cid:durableId="815033516">
     <w:abstractNumId w:val="7"/>
     <w:lvlOverride w:ilvl="0">
       <w:startOverride w:val="1"/>
     </w:lvlOverride>
   </w:num>
-  <w:num w:numId="15" w16cid:durableId="29569894">
+  <w:num w:numId="15" w16cid:durableId="1745251157">
     <w:abstractNumId w:val="7"/>
     <w:lvlOverride w:ilvl="0">
       <w:startOverride w:val="1"/>
     </w:lvlOverride>
   </w:num>
-  <w:num w:numId="16" w16cid:durableId="1535848629">
+  <w:num w:numId="16" w16cid:durableId="574240367">
     <w:abstractNumId w:val="7"/>
     <w:lvlOverride w:ilvl="0">
       <w:startOverride w:val="1"/>
     </w:lvlOverride>
   </w:num>
-  <w:num w:numId="17" w16cid:durableId="578371211">
+  <w:num w:numId="17" w16cid:durableId="811024144">
     <w:abstractNumId w:val="7"/>
     <w:lvlOverride w:ilvl="0">
       <w:startOverride w:val="1"/>
     </w:lvlOverride>
   </w:num>
-  <w:num w:numId="18" w16cid:durableId="1459109729">
+  <w:num w:numId="18" w16cid:durableId="883522962">
     <w:abstractNumId w:val="7"/>
     <w:lvlOverride w:ilvl="0">
       <w:startOverride w:val="1"/>
     </w:lvlOverride>
   </w:num>
-  <w:num w:numId="19" w16cid:durableId="788671028">
+  <w:num w:numId="19" w16cid:durableId="822938272">
     <w:abstractNumId w:val="7"/>
     <w:lvlOverride w:ilvl="0">
       <w:startOverride w:val="1"/>
     </w:lvlOverride>
   </w:num>
-  <w:num w:numId="20" w16cid:durableId="1870603983">
+  <w:num w:numId="20" w16cid:durableId="228805690">
     <w:abstractNumId w:val="7"/>
     <w:lvlOverride w:ilvl="0">
       <w:startOverride w:val="1"/>
     </w:lvlOverride>
   </w:num>
-  <w:num w:numId="21" w16cid:durableId="1911309971">
+  <w:num w:numId="21" w16cid:durableId="1491167697">
     <w:abstractNumId w:val="7"/>
     <w:lvlOverride w:ilvl="0">
       <w:startOverride w:val="1"/>
     </w:lvlOverride>
   </w:num>
-  <w:num w:numId="22" w16cid:durableId="1492403704">
+  <w:num w:numId="22" w16cid:durableId="1374578115">
     <w:abstractNumId w:val="7"/>
     <w:lvlOverride w:ilvl="0">
       <w:startOverride w:val="1"/>
     </w:lvlOverride>
   </w:num>
-  <w:num w:numId="23" w16cid:durableId="431241740">
+  <w:num w:numId="23" w16cid:durableId="1713967594">
     <w:abstractNumId w:val="7"/>
     <w:lvlOverride w:ilvl="0">
       <w:startOverride w:val="1"/>
     </w:lvlOverride>
   </w:num>
-  <w:num w:numId="24" w16cid:durableId="2127239272">
+  <w:num w:numId="24" w16cid:durableId="2054772843">
     <w:abstractNumId w:val="7"/>
     <w:lvlOverride w:ilvl="0">
       <w:startOverride w:val="1"/>
     </w:lvlOverride>
   </w:num>
-  <w:num w:numId="25" w16cid:durableId="762725753">
+  <w:num w:numId="25" w16cid:durableId="150609970">
     <w:abstractNumId w:val="7"/>
     <w:lvlOverride w:ilvl="0">
       <w:startOverride w:val="1"/>
     </w:lvlOverride>
   </w:num>
-  <w:num w:numId="26" w16cid:durableId="2055233622">
+  <w:num w:numId="26" w16cid:durableId="502743100">
     <w:abstractNumId w:val="7"/>
     <w:lvlOverride w:ilvl="0">
       <w:startOverride w:val="1"/>
     </w:lvlOverride>
   </w:num>
-  <w:num w:numId="27" w16cid:durableId="1359508285">
+  <w:num w:numId="27" w16cid:durableId="1642807214">
     <w:abstractNumId w:val="7"/>
     <w:lvlOverride w:ilvl="0">
       <w:startOverride w:val="1"/>
     </w:lvlOverride>
   </w:num>
-  <w:num w:numId="28" w16cid:durableId="34352605">
+  <w:num w:numId="28" w16cid:durableId="1168443577">
     <w:abstractNumId w:val="7"/>
     <w:lvlOverride w:ilvl="0">
       <w:startOverride w:val="1"/>
     </w:lvlOverride>
   </w:num>
-  <w:num w:numId="29" w16cid:durableId="2094625810">
+  <w:num w:numId="29" w16cid:durableId="1931233836">
     <w:abstractNumId w:val="7"/>
     <w:lvlOverride w:ilvl="0">
       <w:startOverride w:val="1"/>
     </w:lvlOverride>
   </w:num>
-  <w:num w:numId="30" w16cid:durableId="240334907">
+  <w:num w:numId="30" w16cid:durableId="1650355963">
     <w:abstractNumId w:val="7"/>
     <w:lvlOverride w:ilvl="0">
       <w:startOverride w:val="1"/>
     </w:lvlOverride>
   </w:num>
-  <w:num w:numId="31" w16cid:durableId="1622760335">
+  <w:num w:numId="31" w16cid:durableId="2103794308">
     <w:abstractNumId w:val="7"/>
     <w:lvlOverride w:ilvl="0">
       <w:startOverride w:val="1"/>
@@ -28972,7 +29098,7 @@
     <w:autoRedefine/>
     <w:uiPriority w:val="39"/>
     <w:unhideWhenUsed/>
-    <w:rsid w:val="00E83985"/>
+    <w:rsid w:val="001D3533"/>
     <w:pPr>
       <w:spacing w:after="100"/>
     </w:pPr>
@@ -28984,7 +29110,7 @@
     <w:autoRedefine/>
     <w:uiPriority w:val="39"/>
     <w:unhideWhenUsed/>
-    <w:rsid w:val="00E83985"/>
+    <w:rsid w:val="001D3533"/>
     <w:pPr>
       <w:spacing w:after="100"/>
       <w:ind w:left="220"/>
@@ -28995,7 +29121,7 @@
     <w:basedOn w:val="DefaultParagraphFont"/>
     <w:uiPriority w:val="99"/>
     <w:unhideWhenUsed/>
-    <w:rsid w:val="00E83985"/>
+    <w:rsid w:val="001D3533"/>
     <w:rPr>
       <w:color w:val="0000FF" w:themeColor="hyperlink"/>
       <w:u w:val="single"/>

</xml_diff>

<commit_message>
fix: ignore missing optional Delphi packages
</commit_message>
<xml_diff>
--- a/docs/guides/Delphi App Translation Studio Complete Test Guide.docx
+++ b/docs/guides/Delphi App Translation Studio Complete Test Guide.docx
@@ -13,7 +13,7 @@
           <w:noProof/>
         </w:rPr>
         <w:drawing>
-          <wp:inline distT="0" distB="0" distL="0" distR="0" wp14:anchorId="41E5AD72" wp14:editId="233BBDFD">
+          <wp:inline distT="0" distB="0" distL="0" distR="0" wp14:anchorId="2D377EFA" wp14:editId="450F0C2B">
             <wp:extent cx="1325880" cy="1325880"/>
             <wp:effectExtent l="0" t="0" r="0" b="0"/>
             <wp:docPr id="1" name="Picture 1"/>
@@ -190,7 +190,7 @@
       <w:r>
         <w:fldChar w:fldCharType="separate"/>
       </w:r>
-      <w:hyperlink w:anchor="_Toc237117191" w:history="1">
+      <w:hyperlink w:anchor="_Toc237165434" w:history="1">
         <w:r>
           <w:rPr>
             <w:rStyle w:val="Hyperlink"/>
@@ -217,7 +217,7 @@
             <w:noProof/>
             <w:webHidden/>
           </w:rPr>
-          <w:instrText xml:space="preserve"> PAGEREF _Toc237117191 \h </w:instrText>
+          <w:instrText xml:space="preserve"> PAGEREF _Toc237165434 \h </w:instrText>
         </w:r>
         <w:r>
           <w:rPr>
@@ -258,7 +258,7 @@
           <w:noProof/>
         </w:rPr>
       </w:pPr>
-      <w:hyperlink w:anchor="_Toc237117192" w:history="1">
+      <w:hyperlink w:anchor="_Toc237165435" w:history="1">
         <w:r>
           <w:rPr>
             <w:rStyle w:val="Hyperlink"/>
@@ -285,7 +285,7 @@
             <w:noProof/>
             <w:webHidden/>
           </w:rPr>
-          <w:instrText xml:space="preserve"> PAGEREF _Toc237117192 \h </w:instrText>
+          <w:instrText xml:space="preserve"> PAGEREF _Toc237165435 \h </w:instrText>
         </w:r>
         <w:r>
           <w:rPr>
@@ -326,7 +326,7 @@
           <w:noProof/>
         </w:rPr>
       </w:pPr>
-      <w:hyperlink w:anchor="_Toc237117193" w:history="1">
+      <w:hyperlink w:anchor="_Toc237165436" w:history="1">
         <w:r>
           <w:rPr>
             <w:rStyle w:val="Hyperlink"/>
@@ -353,7 +353,7 @@
             <w:noProof/>
             <w:webHidden/>
           </w:rPr>
-          <w:instrText xml:space="preserve"> PAGEREF _Toc237117193 \h </w:instrText>
+          <w:instrText xml:space="preserve"> PAGEREF _Toc237165436 \h </w:instrText>
         </w:r>
         <w:r>
           <w:rPr>
@@ -394,7 +394,7 @@
           <w:noProof/>
         </w:rPr>
       </w:pPr>
-      <w:hyperlink w:anchor="_Toc237117194" w:history="1">
+      <w:hyperlink w:anchor="_Toc237165437" w:history="1">
         <w:r>
           <w:rPr>
             <w:rStyle w:val="Hyperlink"/>
@@ -421,7 +421,7 @@
             <w:noProof/>
             <w:webHidden/>
           </w:rPr>
-          <w:instrText xml:space="preserve"> PAGEREF _Toc237117194 \h </w:instrText>
+          <w:instrText xml:space="preserve"> PAGEREF _Toc237165437 \h </w:instrText>
         </w:r>
         <w:r>
           <w:rPr>
@@ -462,7 +462,7 @@
           <w:noProof/>
         </w:rPr>
       </w:pPr>
-      <w:hyperlink w:anchor="_Toc237117195" w:history="1">
+      <w:hyperlink w:anchor="_Toc237165438" w:history="1">
         <w:r>
           <w:rPr>
             <w:rStyle w:val="Hyperlink"/>
@@ -489,7 +489,7 @@
             <w:noProof/>
             <w:webHidden/>
           </w:rPr>
-          <w:instrText xml:space="preserve"> PAGEREF _Toc237117195 \h </w:instrText>
+          <w:instrText xml:space="preserve"> PAGEREF _Toc237165438 \h </w:instrText>
         </w:r>
         <w:r>
           <w:rPr>
@@ -530,7 +530,7 @@
           <w:noProof/>
         </w:rPr>
       </w:pPr>
-      <w:hyperlink w:anchor="_Toc237117196" w:history="1">
+      <w:hyperlink w:anchor="_Toc237165439" w:history="1">
         <w:r>
           <w:rPr>
             <w:rStyle w:val="Hyperlink"/>
@@ -557,7 +557,7 @@
             <w:noProof/>
             <w:webHidden/>
           </w:rPr>
-          <w:instrText xml:space="preserve"> PAGEREF _Toc237117196 \h </w:instrText>
+          <w:instrText xml:space="preserve"> PAGEREF _Toc237165439 \h </w:instrText>
         </w:r>
         <w:r>
           <w:rPr>
@@ -598,7 +598,7 @@
           <w:noProof/>
         </w:rPr>
       </w:pPr>
-      <w:hyperlink w:anchor="_Toc237117197" w:history="1">
+      <w:hyperlink w:anchor="_Toc237165440" w:history="1">
         <w:r>
           <w:rPr>
             <w:rStyle w:val="Hyperlink"/>
@@ -625,7 +625,7 @@
             <w:noProof/>
             <w:webHidden/>
           </w:rPr>
-          <w:instrText xml:space="preserve"> PAGEREF _Toc237117197 \h </w:instrText>
+          <w:instrText xml:space="preserve"> PAGEREF _Toc237165440 \h </w:instrText>
         </w:r>
         <w:r>
           <w:rPr>
@@ -666,7 +666,7 @@
           <w:noProof/>
         </w:rPr>
       </w:pPr>
-      <w:hyperlink w:anchor="_Toc237117198" w:history="1">
+      <w:hyperlink w:anchor="_Toc237165441" w:history="1">
         <w:r>
           <w:rPr>
             <w:rStyle w:val="Hyperlink"/>
@@ -693,7 +693,7 @@
             <w:noProof/>
             <w:webHidden/>
           </w:rPr>
-          <w:instrText xml:space="preserve"> PAGEREF _Toc237117198 \h </w:instrText>
+          <w:instrText xml:space="preserve"> PAGEREF _Toc237165441 \h </w:instrText>
         </w:r>
         <w:r>
           <w:rPr>
@@ -734,7 +734,7 @@
           <w:noProof/>
         </w:rPr>
       </w:pPr>
-      <w:hyperlink w:anchor="_Toc237117199" w:history="1">
+      <w:hyperlink w:anchor="_Toc237165442" w:history="1">
         <w:r>
           <w:rPr>
             <w:rStyle w:val="Hyperlink"/>
@@ -761,7 +761,7 @@
             <w:noProof/>
             <w:webHidden/>
           </w:rPr>
-          <w:instrText xml:space="preserve"> PAGEREF _Toc237117199 \h </w:instrText>
+          <w:instrText xml:space="preserve"> PAGEREF _Toc237165442 \h </w:instrText>
         </w:r>
         <w:r>
           <w:rPr>
@@ -802,7 +802,7 @@
           <w:noProof/>
         </w:rPr>
       </w:pPr>
-      <w:hyperlink w:anchor="_Toc237117200" w:history="1">
+      <w:hyperlink w:anchor="_Toc237165443" w:history="1">
         <w:r>
           <w:rPr>
             <w:rStyle w:val="Hyperlink"/>
@@ -829,7 +829,7 @@
             <w:noProof/>
             <w:webHidden/>
           </w:rPr>
-          <w:instrText xml:space="preserve"> PAGEREF _Toc237117200 \h </w:instrText>
+          <w:instrText xml:space="preserve"> PAGEREF _Toc237165443 \h </w:instrText>
         </w:r>
         <w:r>
           <w:rPr>
@@ -870,7 +870,7 @@
           <w:noProof/>
         </w:rPr>
       </w:pPr>
-      <w:hyperlink w:anchor="_Toc237117201" w:history="1">
+      <w:hyperlink w:anchor="_Toc237165444" w:history="1">
         <w:r>
           <w:rPr>
             <w:rStyle w:val="Hyperlink"/>
@@ -897,7 +897,7 @@
             <w:noProof/>
             <w:webHidden/>
           </w:rPr>
-          <w:instrText xml:space="preserve"> PAGEREF _Toc237117201 \h </w:instrText>
+          <w:instrText xml:space="preserve"> PAGEREF _Toc237165444 \h </w:instrText>
         </w:r>
         <w:r>
           <w:rPr>
@@ -938,7 +938,7 @@
           <w:noProof/>
         </w:rPr>
       </w:pPr>
-      <w:hyperlink w:anchor="_Toc237117202" w:history="1">
+      <w:hyperlink w:anchor="_Toc237165445" w:history="1">
         <w:r>
           <w:rPr>
             <w:rStyle w:val="Hyperlink"/>
@@ -965,7 +965,7 @@
             <w:noProof/>
             <w:webHidden/>
           </w:rPr>
-          <w:instrText xml:space="preserve"> PAGEREF _Toc237117202 \h </w:instrText>
+          <w:instrText xml:space="preserve"> PAGEREF _Toc237165445 \h </w:instrText>
         </w:r>
         <w:r>
           <w:rPr>
@@ -1006,7 +1006,7 @@
           <w:noProof/>
         </w:rPr>
       </w:pPr>
-      <w:hyperlink w:anchor="_Toc237117203" w:history="1">
+      <w:hyperlink w:anchor="_Toc237165446" w:history="1">
         <w:r>
           <w:rPr>
             <w:rStyle w:val="Hyperlink"/>
@@ -1033,7 +1033,7 @@
             <w:noProof/>
             <w:webHidden/>
           </w:rPr>
-          <w:instrText xml:space="preserve"> PAGEREF _Toc237117203 \h </w:instrText>
+          <w:instrText xml:space="preserve"> PAGEREF _Toc237165446 \h </w:instrText>
         </w:r>
         <w:r>
           <w:rPr>
@@ -1074,7 +1074,7 @@
           <w:noProof/>
         </w:rPr>
       </w:pPr>
-      <w:hyperlink w:anchor="_Toc237117204" w:history="1">
+      <w:hyperlink w:anchor="_Toc237165447" w:history="1">
         <w:r>
           <w:rPr>
             <w:rStyle w:val="Hyperlink"/>
@@ -1101,7 +1101,7 @@
             <w:noProof/>
             <w:webHidden/>
           </w:rPr>
-          <w:instrText xml:space="preserve"> PAGEREF _Toc237117204 \h </w:instrText>
+          <w:instrText xml:space="preserve"> PAGEREF _Toc237165447 \h </w:instrText>
         </w:r>
         <w:r>
           <w:rPr>
@@ -1142,7 +1142,7 @@
           <w:noProof/>
         </w:rPr>
       </w:pPr>
-      <w:hyperlink w:anchor="_Toc237117205" w:history="1">
+      <w:hyperlink w:anchor="_Toc237165448" w:history="1">
         <w:r>
           <w:rPr>
             <w:rStyle w:val="Hyperlink"/>
@@ -1169,7 +1169,7 @@
             <w:noProof/>
             <w:webHidden/>
           </w:rPr>
-          <w:instrText xml:space="preserve"> PAGEREF _Toc237117205 \h </w:instrText>
+          <w:instrText xml:space="preserve"> PAGEREF _Toc237165448 \h </w:instrText>
         </w:r>
         <w:r>
           <w:rPr>
@@ -1210,7 +1210,7 @@
           <w:noProof/>
         </w:rPr>
       </w:pPr>
-      <w:hyperlink w:anchor="_Toc237117206" w:history="1">
+      <w:hyperlink w:anchor="_Toc237165449" w:history="1">
         <w:r>
           <w:rPr>
             <w:rStyle w:val="Hyperlink"/>
@@ -1237,7 +1237,7 @@
             <w:noProof/>
             <w:webHidden/>
           </w:rPr>
-          <w:instrText xml:space="preserve"> PAGEREF _Toc237117206 \h </w:instrText>
+          <w:instrText xml:space="preserve"> PAGEREF _Toc237165449 \h </w:instrText>
         </w:r>
         <w:r>
           <w:rPr>
@@ -1278,7 +1278,7 @@
           <w:noProof/>
         </w:rPr>
       </w:pPr>
-      <w:hyperlink w:anchor="_Toc237117207" w:history="1">
+      <w:hyperlink w:anchor="_Toc237165450" w:history="1">
         <w:r>
           <w:rPr>
             <w:rStyle w:val="Hyperlink"/>
@@ -1305,7 +1305,7 @@
             <w:noProof/>
             <w:webHidden/>
           </w:rPr>
-          <w:instrText xml:space="preserve"> PAGEREF _Toc237117207 \h </w:instrText>
+          <w:instrText xml:space="preserve"> PAGEREF _Toc237165450 \h </w:instrText>
         </w:r>
         <w:r>
           <w:rPr>
@@ -1346,7 +1346,7 @@
           <w:noProof/>
         </w:rPr>
       </w:pPr>
-      <w:hyperlink w:anchor="_Toc237117208" w:history="1">
+      <w:hyperlink w:anchor="_Toc237165451" w:history="1">
         <w:r>
           <w:rPr>
             <w:rStyle w:val="Hyperlink"/>
@@ -1373,7 +1373,7 @@
             <w:noProof/>
             <w:webHidden/>
           </w:rPr>
-          <w:instrText xml:space="preserve"> PAGEREF _Toc237117208 \h </w:instrText>
+          <w:instrText xml:space="preserve"> PAGEREF _Toc237165451 \h </w:instrText>
         </w:r>
         <w:r>
           <w:rPr>
@@ -1414,7 +1414,7 @@
           <w:noProof/>
         </w:rPr>
       </w:pPr>
-      <w:hyperlink w:anchor="_Toc237117209" w:history="1">
+      <w:hyperlink w:anchor="_Toc237165452" w:history="1">
         <w:r>
           <w:rPr>
             <w:rStyle w:val="Hyperlink"/>
@@ -1441,7 +1441,7 @@
             <w:noProof/>
             <w:webHidden/>
           </w:rPr>
-          <w:instrText xml:space="preserve"> PAGEREF _Toc237117209 \h </w:instrText>
+          <w:instrText xml:space="preserve"> PAGEREF _Toc237165452 \h </w:instrText>
         </w:r>
         <w:r>
           <w:rPr>
@@ -1482,7 +1482,7 @@
           <w:noProof/>
         </w:rPr>
       </w:pPr>
-      <w:hyperlink w:anchor="_Toc237117210" w:history="1">
+      <w:hyperlink w:anchor="_Toc237165453" w:history="1">
         <w:r>
           <w:rPr>
             <w:rStyle w:val="Hyperlink"/>
@@ -1509,7 +1509,7 @@
             <w:noProof/>
             <w:webHidden/>
           </w:rPr>
-          <w:instrText xml:space="preserve"> PAGEREF _Toc237117210 \h </w:instrText>
+          <w:instrText xml:space="preserve"> PAGEREF _Toc237165453 \h </w:instrText>
         </w:r>
         <w:r>
           <w:rPr>
@@ -1550,7 +1550,7 @@
           <w:noProof/>
         </w:rPr>
       </w:pPr>
-      <w:hyperlink w:anchor="_Toc237117211" w:history="1">
+      <w:hyperlink w:anchor="_Toc237165454" w:history="1">
         <w:r>
           <w:rPr>
             <w:rStyle w:val="Hyperlink"/>
@@ -1577,7 +1577,7 @@
             <w:noProof/>
             <w:webHidden/>
           </w:rPr>
-          <w:instrText xml:space="preserve"> PAGEREF _Toc237117211 \h </w:instrText>
+          <w:instrText xml:space="preserve"> PAGEREF _Toc237165454 \h </w:instrText>
         </w:r>
         <w:r>
           <w:rPr>
@@ -1618,7 +1618,7 @@
           <w:noProof/>
         </w:rPr>
       </w:pPr>
-      <w:hyperlink w:anchor="_Toc237117212" w:history="1">
+      <w:hyperlink w:anchor="_Toc237165455" w:history="1">
         <w:r>
           <w:rPr>
             <w:rStyle w:val="Hyperlink"/>
@@ -1645,7 +1645,7 @@
             <w:noProof/>
             <w:webHidden/>
           </w:rPr>
-          <w:instrText xml:space="preserve"> PAGEREF _Toc237117212 \h </w:instrText>
+          <w:instrText xml:space="preserve"> PAGEREF _Toc237165455 \h </w:instrText>
         </w:r>
         <w:r>
           <w:rPr>
@@ -1686,7 +1686,7 @@
           <w:noProof/>
         </w:rPr>
       </w:pPr>
-      <w:hyperlink w:anchor="_Toc237117213" w:history="1">
+      <w:hyperlink w:anchor="_Toc237165456" w:history="1">
         <w:r>
           <w:rPr>
             <w:rStyle w:val="Hyperlink"/>
@@ -1713,7 +1713,7 @@
             <w:noProof/>
             <w:webHidden/>
           </w:rPr>
-          <w:instrText xml:space="preserve"> PAGEREF _Toc237117213 \h </w:instrText>
+          <w:instrText xml:space="preserve"> PAGEREF _Toc237165456 \h </w:instrText>
         </w:r>
         <w:r>
           <w:rPr>
@@ -1754,7 +1754,7 @@
           <w:noProof/>
         </w:rPr>
       </w:pPr>
-      <w:hyperlink w:anchor="_Toc237117214" w:history="1">
+      <w:hyperlink w:anchor="_Toc237165457" w:history="1">
         <w:r>
           <w:rPr>
             <w:rStyle w:val="Hyperlink"/>
@@ -1781,7 +1781,7 @@
             <w:noProof/>
             <w:webHidden/>
           </w:rPr>
-          <w:instrText xml:space="preserve"> PAGEREF _Toc237117214 \h </w:instrText>
+          <w:instrText xml:space="preserve"> PAGEREF _Toc237165457 \h </w:instrText>
         </w:r>
         <w:r>
           <w:rPr>
@@ -1822,7 +1822,7 @@
           <w:noProof/>
         </w:rPr>
       </w:pPr>
-      <w:hyperlink w:anchor="_Toc237117215" w:history="1">
+      <w:hyperlink w:anchor="_Toc237165458" w:history="1">
         <w:r>
           <w:rPr>
             <w:rStyle w:val="Hyperlink"/>
@@ -1849,7 +1849,7 @@
             <w:noProof/>
             <w:webHidden/>
           </w:rPr>
-          <w:instrText xml:space="preserve"> PAGEREF _Toc237117215 \h </w:instrText>
+          <w:instrText xml:space="preserve"> PAGEREF _Toc237165458 \h </w:instrText>
         </w:r>
         <w:r>
           <w:rPr>
@@ -1890,7 +1890,7 @@
           <w:noProof/>
         </w:rPr>
       </w:pPr>
-      <w:hyperlink w:anchor="_Toc237117216" w:history="1">
+      <w:hyperlink w:anchor="_Toc237165459" w:history="1">
         <w:r>
           <w:rPr>
             <w:rStyle w:val="Hyperlink"/>
@@ -1917,7 +1917,7 @@
             <w:noProof/>
             <w:webHidden/>
           </w:rPr>
-          <w:instrText xml:space="preserve"> PAGEREF _Toc237117216 \h </w:instrText>
+          <w:instrText xml:space="preserve"> PAGEREF _Toc237165459 \h </w:instrText>
         </w:r>
         <w:r>
           <w:rPr>
@@ -1958,7 +1958,7 @@
           <w:noProof/>
         </w:rPr>
       </w:pPr>
-      <w:hyperlink w:anchor="_Toc237117217" w:history="1">
+      <w:hyperlink w:anchor="_Toc237165460" w:history="1">
         <w:r>
           <w:rPr>
             <w:rStyle w:val="Hyperlink"/>
@@ -1985,7 +1985,7 @@
             <w:noProof/>
             <w:webHidden/>
           </w:rPr>
-          <w:instrText xml:space="preserve"> PAGEREF _Toc237117217 \h </w:instrText>
+          <w:instrText xml:space="preserve"> PAGEREF _Toc237165460 \h </w:instrText>
         </w:r>
         <w:r>
           <w:rPr>
@@ -2026,7 +2026,7 @@
           <w:noProof/>
         </w:rPr>
       </w:pPr>
-      <w:hyperlink w:anchor="_Toc237117218" w:history="1">
+      <w:hyperlink w:anchor="_Toc237165461" w:history="1">
         <w:r>
           <w:rPr>
             <w:rStyle w:val="Hyperlink"/>
@@ -2053,7 +2053,7 @@
             <w:noProof/>
             <w:webHidden/>
           </w:rPr>
-          <w:instrText xml:space="preserve"> PAGEREF _Toc237117218 \h </w:instrText>
+          <w:instrText xml:space="preserve"> PAGEREF _Toc237165461 \h </w:instrText>
         </w:r>
         <w:r>
           <w:rPr>
@@ -2094,7 +2094,7 @@
           <w:noProof/>
         </w:rPr>
       </w:pPr>
-      <w:hyperlink w:anchor="_Toc237117219" w:history="1">
+      <w:hyperlink w:anchor="_Toc237165462" w:history="1">
         <w:r>
           <w:rPr>
             <w:rStyle w:val="Hyperlink"/>
@@ -2121,7 +2121,7 @@
             <w:noProof/>
             <w:webHidden/>
           </w:rPr>
-          <w:instrText xml:space="preserve"> PAGEREF _Toc237117219 \h </w:instrText>
+          <w:instrText xml:space="preserve"> PAGEREF _Toc237165462 \h </w:instrText>
         </w:r>
         <w:r>
           <w:rPr>
@@ -2162,7 +2162,7 @@
           <w:noProof/>
         </w:rPr>
       </w:pPr>
-      <w:hyperlink w:anchor="_Toc237117220" w:history="1">
+      <w:hyperlink w:anchor="_Toc237165463" w:history="1">
         <w:r>
           <w:rPr>
             <w:rStyle w:val="Hyperlink"/>
@@ -2189,7 +2189,7 @@
             <w:noProof/>
             <w:webHidden/>
           </w:rPr>
-          <w:instrText xml:space="preserve"> PAGEREF _Toc237117220 \h </w:instrText>
+          <w:instrText xml:space="preserve"> PAGEREF _Toc237165463 \h </w:instrText>
         </w:r>
         <w:r>
           <w:rPr>
@@ -2230,7 +2230,7 @@
           <w:noProof/>
         </w:rPr>
       </w:pPr>
-      <w:hyperlink w:anchor="_Toc237117221" w:history="1">
+      <w:hyperlink w:anchor="_Toc237165464" w:history="1">
         <w:r>
           <w:rPr>
             <w:rStyle w:val="Hyperlink"/>
@@ -2257,7 +2257,7 @@
             <w:noProof/>
             <w:webHidden/>
           </w:rPr>
-          <w:instrText xml:space="preserve"> PAGEREF _Toc237117221 \h </w:instrText>
+          <w:instrText xml:space="preserve"> PAGEREF _Toc237165464 \h </w:instrText>
         </w:r>
         <w:r>
           <w:rPr>
@@ -2298,7 +2298,7 @@
           <w:noProof/>
         </w:rPr>
       </w:pPr>
-      <w:hyperlink w:anchor="_Toc237117222" w:history="1">
+      <w:hyperlink w:anchor="_Toc237165465" w:history="1">
         <w:r>
           <w:rPr>
             <w:rStyle w:val="Hyperlink"/>
@@ -2325,7 +2325,7 @@
             <w:noProof/>
             <w:webHidden/>
           </w:rPr>
-          <w:instrText xml:space="preserve"> PAGEREF _Toc237117222 \h </w:instrText>
+          <w:instrText xml:space="preserve"> PAGEREF _Toc237165465 \h </w:instrText>
         </w:r>
         <w:r>
           <w:rPr>
@@ -2366,7 +2366,7 @@
           <w:noProof/>
         </w:rPr>
       </w:pPr>
-      <w:hyperlink w:anchor="_Toc237117223" w:history="1">
+      <w:hyperlink w:anchor="_Toc237165466" w:history="1">
         <w:r>
           <w:rPr>
             <w:rStyle w:val="Hyperlink"/>
@@ -2393,7 +2393,7 @@
             <w:noProof/>
             <w:webHidden/>
           </w:rPr>
-          <w:instrText xml:space="preserve"> PAGEREF _Toc237117223 \h </w:instrText>
+          <w:instrText xml:space="preserve"> PAGEREF _Toc237165466 \h </w:instrText>
         </w:r>
         <w:r>
           <w:rPr>
@@ -2434,7 +2434,7 @@
           <w:noProof/>
         </w:rPr>
       </w:pPr>
-      <w:hyperlink w:anchor="_Toc237117224" w:history="1">
+      <w:hyperlink w:anchor="_Toc237165467" w:history="1">
         <w:r>
           <w:rPr>
             <w:rStyle w:val="Hyperlink"/>
@@ -2461,7 +2461,7 @@
             <w:noProof/>
             <w:webHidden/>
           </w:rPr>
-          <w:instrText xml:space="preserve"> PAGEREF _Toc237117224 \h </w:instrText>
+          <w:instrText xml:space="preserve"> PAGEREF _Toc237165467 \h </w:instrText>
         </w:r>
         <w:r>
           <w:rPr>
@@ -2481,7 +2481,7 @@
             <w:noProof/>
             <w:webHidden/>
           </w:rPr>
-          <w:t>18</w:t>
+          <w:t>19</w:t>
         </w:r>
         <w:r>
           <w:rPr>
@@ -2502,7 +2502,7 @@
           <w:noProof/>
         </w:rPr>
       </w:pPr>
-      <w:hyperlink w:anchor="_Toc237117225" w:history="1">
+      <w:hyperlink w:anchor="_Toc237165468" w:history="1">
         <w:r>
           <w:rPr>
             <w:rStyle w:val="Hyperlink"/>
@@ -2529,7 +2529,7 @@
             <w:noProof/>
             <w:webHidden/>
           </w:rPr>
-          <w:instrText xml:space="preserve"> PAGEREF _Toc237117225 \h </w:instrText>
+          <w:instrText xml:space="preserve"> PAGEREF _Toc237165468 \h </w:instrText>
         </w:r>
         <w:r>
           <w:rPr>
@@ -2570,7 +2570,7 @@
           <w:noProof/>
         </w:rPr>
       </w:pPr>
-      <w:hyperlink w:anchor="_Toc237117226" w:history="1">
+      <w:hyperlink w:anchor="_Toc237165469" w:history="1">
         <w:r>
           <w:rPr>
             <w:rStyle w:val="Hyperlink"/>
@@ -2597,7 +2597,7 @@
             <w:noProof/>
             <w:webHidden/>
           </w:rPr>
-          <w:instrText xml:space="preserve"> PAGEREF _Toc237117226 \h </w:instrText>
+          <w:instrText xml:space="preserve"> PAGEREF _Toc237165469 \h </w:instrText>
         </w:r>
         <w:r>
           <w:rPr>
@@ -2638,7 +2638,7 @@
           <w:noProof/>
         </w:rPr>
       </w:pPr>
-      <w:hyperlink w:anchor="_Toc237117227" w:history="1">
+      <w:hyperlink w:anchor="_Toc237165470" w:history="1">
         <w:r>
           <w:rPr>
             <w:rStyle w:val="Hyperlink"/>
@@ -2665,7 +2665,7 @@
             <w:noProof/>
             <w:webHidden/>
           </w:rPr>
-          <w:instrText xml:space="preserve"> PAGEREF _Toc237117227 \h </w:instrText>
+          <w:instrText xml:space="preserve"> PAGEREF _Toc237165470 \h </w:instrText>
         </w:r>
         <w:r>
           <w:rPr>
@@ -2706,7 +2706,7 @@
           <w:noProof/>
         </w:rPr>
       </w:pPr>
-      <w:hyperlink w:anchor="_Toc237117228" w:history="1">
+      <w:hyperlink w:anchor="_Toc237165471" w:history="1">
         <w:r>
           <w:rPr>
             <w:rStyle w:val="Hyperlink"/>
@@ -2733,7 +2733,7 @@
             <w:noProof/>
             <w:webHidden/>
           </w:rPr>
-          <w:instrText xml:space="preserve"> PAGEREF _Toc237117228 \h </w:instrText>
+          <w:instrText xml:space="preserve"> PAGEREF _Toc237165471 \h </w:instrText>
         </w:r>
         <w:r>
           <w:rPr>
@@ -2774,7 +2774,7 @@
           <w:noProof/>
         </w:rPr>
       </w:pPr>
-      <w:hyperlink w:anchor="_Toc237117229" w:history="1">
+      <w:hyperlink w:anchor="_Toc237165472" w:history="1">
         <w:r>
           <w:rPr>
             <w:rStyle w:val="Hyperlink"/>
@@ -2801,7 +2801,7 @@
             <w:noProof/>
             <w:webHidden/>
           </w:rPr>
-          <w:instrText xml:space="preserve"> PAGEREF _Toc237117229 \h </w:instrText>
+          <w:instrText xml:space="preserve"> PAGEREF _Toc237165472 \h </w:instrText>
         </w:r>
         <w:r>
           <w:rPr>
@@ -2842,7 +2842,7 @@
           <w:noProof/>
         </w:rPr>
       </w:pPr>
-      <w:hyperlink w:anchor="_Toc237117230" w:history="1">
+      <w:hyperlink w:anchor="_Toc237165473" w:history="1">
         <w:r>
           <w:rPr>
             <w:rStyle w:val="Hyperlink"/>
@@ -2869,7 +2869,7 @@
             <w:noProof/>
             <w:webHidden/>
           </w:rPr>
-          <w:instrText xml:space="preserve"> PAGEREF _Toc237117230 \h </w:instrText>
+          <w:instrText xml:space="preserve"> PAGEREF _Toc237165473 \h </w:instrText>
         </w:r>
         <w:r>
           <w:rPr>
@@ -2910,7 +2910,7 @@
           <w:noProof/>
         </w:rPr>
       </w:pPr>
-      <w:hyperlink w:anchor="_Toc237117231" w:history="1">
+      <w:hyperlink w:anchor="_Toc237165474" w:history="1">
         <w:r>
           <w:rPr>
             <w:rStyle w:val="Hyperlink"/>
@@ -2937,7 +2937,7 @@
             <w:noProof/>
             <w:webHidden/>
           </w:rPr>
-          <w:instrText xml:space="preserve"> PAGEREF _Toc237117231 \h </w:instrText>
+          <w:instrText xml:space="preserve"> PAGEREF _Toc237165474 \h </w:instrText>
         </w:r>
         <w:r>
           <w:rPr>
@@ -2978,7 +2978,7 @@
           <w:noProof/>
         </w:rPr>
       </w:pPr>
-      <w:hyperlink w:anchor="_Toc237117232" w:history="1">
+      <w:hyperlink w:anchor="_Toc237165475" w:history="1">
         <w:r>
           <w:rPr>
             <w:rStyle w:val="Hyperlink"/>
@@ -3005,7 +3005,7 @@
             <w:noProof/>
             <w:webHidden/>
           </w:rPr>
-          <w:instrText xml:space="preserve"> PAGEREF _Toc237117232 \h </w:instrText>
+          <w:instrText xml:space="preserve"> PAGEREF _Toc237165475 \h </w:instrText>
         </w:r>
         <w:r>
           <w:rPr>
@@ -3046,7 +3046,7 @@
           <w:noProof/>
         </w:rPr>
       </w:pPr>
-      <w:hyperlink w:anchor="_Toc237117233" w:history="1">
+      <w:hyperlink w:anchor="_Toc237165476" w:history="1">
         <w:r>
           <w:rPr>
             <w:rStyle w:val="Hyperlink"/>
@@ -3073,7 +3073,7 @@
             <w:noProof/>
             <w:webHidden/>
           </w:rPr>
-          <w:instrText xml:space="preserve"> PAGEREF _Toc237117233 \h </w:instrText>
+          <w:instrText xml:space="preserve"> PAGEREF _Toc237165476 \h </w:instrText>
         </w:r>
         <w:r>
           <w:rPr>
@@ -3114,7 +3114,7 @@
           <w:noProof/>
         </w:rPr>
       </w:pPr>
-      <w:hyperlink w:anchor="_Toc237117234" w:history="1">
+      <w:hyperlink w:anchor="_Toc237165477" w:history="1">
         <w:r>
           <w:rPr>
             <w:rStyle w:val="Hyperlink"/>
@@ -3141,7 +3141,7 @@
             <w:noProof/>
             <w:webHidden/>
           </w:rPr>
-          <w:instrText xml:space="preserve"> PAGEREF _Toc237117234 \h </w:instrText>
+          <w:instrText xml:space="preserve"> PAGEREF _Toc237165477 \h </w:instrText>
         </w:r>
         <w:r>
           <w:rPr>
@@ -3182,7 +3182,7 @@
           <w:noProof/>
         </w:rPr>
       </w:pPr>
-      <w:hyperlink w:anchor="_Toc237117235" w:history="1">
+      <w:hyperlink w:anchor="_Toc237165478" w:history="1">
         <w:r>
           <w:rPr>
             <w:rStyle w:val="Hyperlink"/>
@@ -3209,7 +3209,7 @@
             <w:noProof/>
             <w:webHidden/>
           </w:rPr>
-          <w:instrText xml:space="preserve"> PAGEREF _Toc237117235 \h </w:instrText>
+          <w:instrText xml:space="preserve"> PAGEREF _Toc237165478 \h </w:instrText>
         </w:r>
         <w:r>
           <w:rPr>
@@ -3250,7 +3250,7 @@
           <w:noProof/>
         </w:rPr>
       </w:pPr>
-      <w:hyperlink w:anchor="_Toc237117236" w:history="1">
+      <w:hyperlink w:anchor="_Toc237165479" w:history="1">
         <w:r>
           <w:rPr>
             <w:rStyle w:val="Hyperlink"/>
@@ -3277,7 +3277,7 @@
             <w:noProof/>
             <w:webHidden/>
           </w:rPr>
-          <w:instrText xml:space="preserve"> PAGEREF _Toc237117236 \h </w:instrText>
+          <w:instrText xml:space="preserve"> PAGEREF _Toc237165479 \h </w:instrText>
         </w:r>
         <w:r>
           <w:rPr>
@@ -3318,7 +3318,7 @@
           <w:noProof/>
         </w:rPr>
       </w:pPr>
-      <w:hyperlink w:anchor="_Toc237117237" w:history="1">
+      <w:hyperlink w:anchor="_Toc237165480" w:history="1">
         <w:r>
           <w:rPr>
             <w:rStyle w:val="Hyperlink"/>
@@ -3345,7 +3345,7 @@
             <w:noProof/>
             <w:webHidden/>
           </w:rPr>
-          <w:instrText xml:space="preserve"> PAGEREF _Toc237117237 \h </w:instrText>
+          <w:instrText xml:space="preserve"> PAGEREF _Toc237165480 \h </w:instrText>
         </w:r>
         <w:r>
           <w:rPr>
@@ -3386,7 +3386,7 @@
           <w:noProof/>
         </w:rPr>
       </w:pPr>
-      <w:hyperlink w:anchor="_Toc237117238" w:history="1">
+      <w:hyperlink w:anchor="_Toc237165481" w:history="1">
         <w:r>
           <w:rPr>
             <w:rStyle w:val="Hyperlink"/>
@@ -3413,7 +3413,7 @@
             <w:noProof/>
             <w:webHidden/>
           </w:rPr>
-          <w:instrText xml:space="preserve"> PAGEREF _Toc237117238 \h </w:instrText>
+          <w:instrText xml:space="preserve"> PAGEREF _Toc237165481 \h </w:instrText>
         </w:r>
         <w:r>
           <w:rPr>
@@ -3454,7 +3454,7 @@
           <w:noProof/>
         </w:rPr>
       </w:pPr>
-      <w:hyperlink w:anchor="_Toc237117239" w:history="1">
+      <w:hyperlink w:anchor="_Toc237165482" w:history="1">
         <w:r>
           <w:rPr>
             <w:rStyle w:val="Hyperlink"/>
@@ -3481,7 +3481,7 @@
             <w:noProof/>
             <w:webHidden/>
           </w:rPr>
-          <w:instrText xml:space="preserve"> PAGEREF _Toc237117239 \h </w:instrText>
+          <w:instrText xml:space="preserve"> PAGEREF _Toc237165482 \h </w:instrText>
         </w:r>
         <w:r>
           <w:rPr>
@@ -3534,7 +3534,7 @@
       <w:pPr>
         <w:pStyle w:val="Heading1"/>
       </w:pPr>
-      <w:bookmarkStart w:id="0" w:name="_Toc237117191"/>
+      <w:bookmarkStart w:id="0" w:name="_Toc237165434"/>
       <w:r>
         <w:lastRenderedPageBreak/>
         <w:t>1. Purpose and Test Philosophy</w:t>
@@ -3585,9 +3585,6 @@
           <w:p>
             <w:pPr>
               <w:pStyle w:val="Callout"/>
-              <w:rPr>
-                <w:rFonts w:hint="eastAsia"/>
-              </w:rPr>
             </w:pPr>
             <w:r>
               <w:rPr>
@@ -3607,7 +3604,7 @@
       <w:pPr>
         <w:pStyle w:val="Heading2"/>
       </w:pPr>
-      <w:bookmarkStart w:id="1" w:name="_Toc237117192"/>
+      <w:bookmarkStart w:id="1" w:name="_Toc237165435"/>
       <w:r>
         <w:t>1.1 Scope</w:t>
       </w:r>
@@ -3665,7 +3662,7 @@
       <w:pPr>
         <w:pStyle w:val="Heading2"/>
       </w:pPr>
-      <w:bookmarkStart w:id="2" w:name="_Toc237117193"/>
+      <w:bookmarkStart w:id="2" w:name="_Toc237165436"/>
       <w:r>
         <w:t>1.2 Stop conditions</w:t>
       </w:r>
@@ -3724,7 +3721,7 @@
       <w:pPr>
         <w:pStyle w:val="Heading1"/>
       </w:pPr>
-      <w:bookmarkStart w:id="3" w:name="_Toc237117194"/>
+      <w:bookmarkStart w:id="3" w:name="_Toc237165437"/>
       <w:r>
         <w:t>2. Exact Folders and Files</w:t>
       </w:r>
@@ -4487,7 +4484,7 @@
       <w:pPr>
         <w:pStyle w:val="Heading2"/>
       </w:pPr>
-      <w:bookmarkStart w:id="4" w:name="_Toc237117195"/>
+      <w:bookmarkStart w:id="4" w:name="_Toc237165438"/>
       <w:r>
         <w:t>2.1 Studio executable matrix</w:t>
       </w:r>
@@ -4755,9 +4752,6 @@
           <w:p>
             <w:pPr>
               <w:pStyle w:val="Callout"/>
-              <w:rPr>
-                <w:rFonts w:hint="eastAsia"/>
-              </w:rPr>
             </w:pPr>
             <w:r>
               <w:rPr>
@@ -4777,7 +4771,7 @@
       <w:pPr>
         <w:pStyle w:val="Heading2"/>
       </w:pPr>
-      <w:bookmarkStart w:id="5" w:name="_Toc237117196"/>
+      <w:bookmarkStart w:id="5" w:name="_Toc237165439"/>
       <w:r>
         <w:t>2.2 Package source and build outputs</w:t>
       </w:r>
@@ -5176,7 +5170,7 @@
       <w:pPr>
         <w:pStyle w:val="Heading1"/>
       </w:pPr>
-      <w:bookmarkStart w:id="6" w:name="_Toc237117197"/>
+      <w:bookmarkStart w:id="6" w:name="_Toc237165440"/>
       <w:r>
         <w:t>3. Prerequisites and Test Data</w:t>
       </w:r>
@@ -5268,9 +5262,6 @@
           <w:p>
             <w:pPr>
               <w:pStyle w:val="Callout"/>
-              <w:rPr>
-                <w:rFonts w:hint="eastAsia"/>
-              </w:rPr>
             </w:pPr>
             <w:r>
               <w:rPr>
@@ -5290,7 +5281,7 @@
       <w:pPr>
         <w:pStyle w:val="Heading2"/>
       </w:pPr>
-      <w:bookmarkStart w:id="7" w:name="_Toc237117198"/>
+      <w:bookmarkStart w:id="7" w:name="_Toc237165441"/>
       <w:r>
         <w:t>3.1 Create the disposable GA4 test copy</w:t>
       </w:r>
@@ -5385,9 +5376,6 @@
           <w:p>
             <w:pPr>
               <w:pStyle w:val="Callout"/>
-              <w:rPr>
-                <w:rFonts w:hint="eastAsia"/>
-              </w:rPr>
             </w:pPr>
             <w:r>
               <w:rPr>
@@ -5407,7 +5395,7 @@
       <w:pPr>
         <w:pStyle w:val="Heading1"/>
       </w:pPr>
-      <w:bookmarkStart w:id="8" w:name="_Toc237117199"/>
+      <w:bookmarkStart w:id="8" w:name="_Toc237165442"/>
       <w:r>
         <w:t>4. Build the Studio Manually</w:t>
       </w:r>
@@ -5422,7 +5410,7 @@
       <w:pPr>
         <w:pStyle w:val="Heading2"/>
       </w:pPr>
-      <w:bookmarkStart w:id="9" w:name="_Toc237117200"/>
+      <w:bookmarkStart w:id="9" w:name="_Toc237165443"/>
       <w:r>
         <w:t>4.1 RAD Studio method</w:t>
       </w:r>
@@ -5492,7 +5480,7 @@
       <w:pPr>
         <w:pStyle w:val="Heading2"/>
       </w:pPr>
-      <w:bookmarkStart w:id="10" w:name="_Toc237117201"/>
+      <w:bookmarkStart w:id="10" w:name="_Toc237165444"/>
       <w:r>
         <w:t>4.2 Command-line method</w:t>
       </w:r>
@@ -5501,9 +5489,6 @@
     <w:p>
       <w:pPr>
         <w:pStyle w:val="CodeBlock"/>
-        <w:rPr>
-          <w:rFonts w:hint="eastAsia"/>
-        </w:rPr>
       </w:pPr>
       <w:r>
         <w:t>cd "C:\New Delphi Projects\Delphi App Translation"</w:t>
@@ -5512,9 +5497,6 @@
     <w:p>
       <w:pPr>
         <w:pStyle w:val="CodeBlock"/>
-        <w:rPr>
-          <w:rFonts w:hint="eastAsia"/>
-        </w:rPr>
       </w:pPr>
       <w:r>
         <w:t>cmd /d /c "call ""C:\Program Files (x86)\Embarcadero\Studio\37.0\bin\rsvars.bat"" &amp;&amp; msbuild DelphiAppTranslationStudio.dproj /t:Build /p:Config=Debug /p:Platform=Win32 /v:minimal"</w:t>
@@ -5523,9 +5505,6 @@
     <w:p>
       <w:pPr>
         <w:pStyle w:val="CodeBlock"/>
-        <w:rPr>
-          <w:rFonts w:hint="eastAsia"/>
-        </w:rPr>
       </w:pPr>
       <w:r>
         <w:lastRenderedPageBreak/>
@@ -5535,9 +5514,6 @@
     <w:p>
       <w:pPr>
         <w:pStyle w:val="CodeBlock"/>
-        <w:rPr>
-          <w:rFonts w:hint="eastAsia"/>
-        </w:rPr>
       </w:pPr>
       <w:r>
         <w:t>cmd /d /c "call ""C:\Program Files (x86)\Embarcadero\Studio\37.0\bin\rsvars.bat"" &amp;&amp; msbuild DelphiAppTranslationStudio.dproj /t:Build /p:Config=Release /p:Platform=Win32 /v:minimal"</w:t>
@@ -5546,9 +5522,6 @@
     <w:p>
       <w:pPr>
         <w:pStyle w:val="CodeBlock"/>
-        <w:rPr>
-          <w:rFonts w:hint="eastAsia"/>
-        </w:rPr>
       </w:pPr>
       <w:r>
         <w:t>cmd /d /c "call ""C:\Program Files (x86)\Embarcadero\Studio\37.0\bin\rsvars.bat"" &amp;&amp; msbuild DelphiAppTranslationStudio.dproj /t:Build /p:Config=Release /p:Platform=Win64 /v:minimal"</w:t>
@@ -5558,7 +5531,7 @@
       <w:pPr>
         <w:pStyle w:val="Heading1"/>
       </w:pPr>
-      <w:bookmarkStart w:id="11" w:name="_Toc237117202"/>
+      <w:bookmarkStart w:id="11" w:name="_Toc237165445"/>
       <w:r>
         <w:t>5. Automated Release Gate</w:t>
       </w:r>
@@ -5572,9 +5545,6 @@
     <w:p>
       <w:pPr>
         <w:pStyle w:val="CodeBlock"/>
-        <w:rPr>
-          <w:rFonts w:hint="eastAsia"/>
-        </w:rPr>
       </w:pPr>
       <w:r>
         <w:t>cd "C:\New Delphi Projects\Delphi App Translation"</w:t>
@@ -5583,9 +5553,6 @@
     <w:p>
       <w:pPr>
         <w:pStyle w:val="CodeBlock"/>
-        <w:rPr>
-          <w:rFonts w:hint="eastAsia"/>
-        </w:rPr>
       </w:pPr>
       <w:r>
         <w:t>powershell.exe -ExecutionPolicy Bypass -File .\tools\tests\RunPhase10ReleaseValidation.ps1</w:t>
@@ -5627,7 +5594,7 @@
       <w:pPr>
         <w:pStyle w:val="Heading2"/>
       </w:pPr>
-      <w:bookmarkStart w:id="12" w:name="_Toc237117203"/>
+      <w:bookmarkStart w:id="12" w:name="_Toc237165446"/>
       <w:r>
         <w:t>5.1 What the gate proves</w:t>
       </w:r>
@@ -5960,7 +5927,7 @@
       <w:pPr>
         <w:pStyle w:val="Heading1"/>
       </w:pPr>
-      <w:bookmarkStart w:id="13" w:name="_Toc237117204"/>
+      <w:bookmarkStart w:id="13" w:name="_Toc237165447"/>
       <w:r>
         <w:lastRenderedPageBreak/>
         <w:t>6. Manual Studio Acceptance</w:t>
@@ -5971,7 +5938,7 @@
       <w:pPr>
         <w:pStyle w:val="Heading2"/>
       </w:pPr>
-      <w:bookmarkStart w:id="14" w:name="_Toc237117205"/>
+      <w:bookmarkStart w:id="14" w:name="_Toc237165448"/>
       <w:r>
         <w:t>TC-01 Launch and navigation</w:t>
       </w:r>
@@ -6006,9 +5973,6 @@
           <w:p>
             <w:pPr>
               <w:pStyle w:val="Callout"/>
-              <w:rPr>
-                <w:rFonts w:hint="eastAsia"/>
-              </w:rPr>
             </w:pPr>
             <w:r>
               <w:rPr>
@@ -6280,7 +6244,7 @@
       <w:pPr>
         <w:pStyle w:val="Heading2"/>
       </w:pPr>
-      <w:bookmarkStart w:id="15" w:name="_Toc237117206"/>
+      <w:bookmarkStart w:id="15" w:name="_Toc237165449"/>
       <w:r>
         <w:t>TC-02 Open the disposable GA4 project</w:t>
       </w:r>
@@ -6315,9 +6279,6 @@
           <w:p>
             <w:pPr>
               <w:pStyle w:val="Callout"/>
-              <w:rPr>
-                <w:rFonts w:hint="eastAsia"/>
-              </w:rPr>
             </w:pPr>
             <w:r>
               <w:rPr>
@@ -6570,7 +6531,7 @@
       <w:pPr>
         <w:pStyle w:val="Heading2"/>
       </w:pPr>
-      <w:bookmarkStart w:id="16" w:name="_Toc237117207"/>
+      <w:bookmarkStart w:id="16" w:name="_Toc237165450"/>
       <w:r>
         <w:t>TC-03 Scan the project</w:t>
       </w:r>
@@ -6605,9 +6566,6 @@
           <w:p>
             <w:pPr>
               <w:pStyle w:val="Callout"/>
-              <w:rPr>
-                <w:rFonts w:hint="eastAsia"/>
-              </w:rPr>
             </w:pPr>
             <w:r>
               <w:rPr>
@@ -6892,7 +6850,7 @@
       <w:pPr>
         <w:pStyle w:val="Heading2"/>
       </w:pPr>
-      <w:bookmarkStart w:id="17" w:name="_Toc237117208"/>
+      <w:bookmarkStart w:id="17" w:name="_Toc237165451"/>
       <w:r>
         <w:t>TC-04 Configure and test a provider</w:t>
       </w:r>
@@ -6927,9 +6885,6 @@
           <w:p>
             <w:pPr>
               <w:pStyle w:val="Callout"/>
-              <w:rPr>
-                <w:rFonts w:hint="eastAsia"/>
-              </w:rPr>
             </w:pPr>
             <w:r>
               <w:rPr>
@@ -7209,7 +7164,7 @@
       <w:pPr>
         <w:pStyle w:val="Heading2"/>
       </w:pPr>
-      <w:bookmarkStart w:id="18" w:name="_Toc237117209"/>
+      <w:bookmarkStart w:id="18" w:name="_Toc237165452"/>
       <w:r>
         <w:t>TC-05 Create the development catalog</w:t>
       </w:r>
@@ -7244,9 +7199,6 @@
           <w:p>
             <w:pPr>
               <w:pStyle w:val="Callout"/>
-              <w:rPr>
-                <w:rFonts w:hint="eastAsia"/>
-              </w:rPr>
             </w:pPr>
             <w:r>
               <w:rPr>
@@ -7507,7 +7459,7 @@
       <w:pPr>
         <w:pStyle w:val="Heading2"/>
       </w:pPr>
-      <w:bookmarkStart w:id="19" w:name="_Toc237117210"/>
+      <w:bookmarkStart w:id="19" w:name="_Toc237165453"/>
       <w:r>
         <w:t>TC-06 Translate automatically</w:t>
       </w:r>
@@ -7542,9 +7494,6 @@
           <w:p>
             <w:pPr>
               <w:pStyle w:val="Callout"/>
-              <w:rPr>
-                <w:rFonts w:hint="eastAsia"/>
-              </w:rPr>
             </w:pPr>
             <w:r>
               <w:rPr>
@@ -7809,7 +7758,7 @@
       <w:pPr>
         <w:pStyle w:val="Heading2"/>
       </w:pPr>
-      <w:bookmarkStart w:id="20" w:name="_Toc237117211"/>
+      <w:bookmarkStart w:id="20" w:name="_Toc237165454"/>
       <w:r>
         <w:t>TC-07 Focused linguistic and structural review</w:t>
       </w:r>
@@ -7844,9 +7793,6 @@
           <w:p>
             <w:pPr>
               <w:pStyle w:val="Callout"/>
-              <w:rPr>
-                <w:rFonts w:hint="eastAsia"/>
-              </w:rPr>
             </w:pPr>
             <w:r>
               <w:rPr>
@@ -8110,7 +8056,7 @@
       <w:pPr>
         <w:pStyle w:val="Heading2"/>
       </w:pPr>
-      <w:bookmarkStart w:id="21" w:name="_Toc237117212"/>
+      <w:bookmarkStart w:id="21" w:name="_Toc237165455"/>
       <w:r>
         <w:lastRenderedPageBreak/>
         <w:t>TC-08 Validate and export runtime JSON</w:t>
@@ -8146,9 +8092,6 @@
           <w:p>
             <w:pPr>
               <w:pStyle w:val="Callout"/>
-              <w:rPr>
-                <w:rFonts w:hint="eastAsia"/>
-              </w:rPr>
             </w:pPr>
             <w:r>
               <w:rPr>
@@ -8421,7 +8364,7 @@
       <w:pPr>
         <w:pStyle w:val="Heading1"/>
       </w:pPr>
-      <w:bookmarkStart w:id="22" w:name="_Toc237117213"/>
+      <w:bookmarkStart w:id="22" w:name="_Toc237165456"/>
       <w:r>
         <w:lastRenderedPageBreak/>
         <w:t>7. Component Integration Acceptance</w:t>
@@ -8432,7 +8375,7 @@
       <w:pPr>
         <w:pStyle w:val="Heading2"/>
       </w:pPr>
-      <w:bookmarkStart w:id="23" w:name="_Toc237117214"/>
+      <w:bookmarkStart w:id="23" w:name="_Toc237165457"/>
       <w:r>
         <w:t>TC-09 Generate the non-mutating component kit</w:t>
       </w:r>
@@ -8467,9 +8410,6 @@
           <w:p>
             <w:pPr>
               <w:pStyle w:val="Callout"/>
-              <w:rPr>
-                <w:rFonts w:hint="eastAsia"/>
-              </w:rPr>
             </w:pPr>
             <w:r>
               <w:rPr>
@@ -8745,7 +8685,7 @@
       <w:pPr>
         <w:pStyle w:val="Heading2"/>
       </w:pPr>
-      <w:bookmarkStart w:id="24" w:name="_Toc237117215"/>
+      <w:bookmarkStart w:id="24" w:name="_Toc237165458"/>
       <w:r>
         <w:t>7.1 Expected component-kit contents</w:t>
       </w:r>
@@ -9332,7 +9272,7 @@
       <w:pPr>
         <w:pStyle w:val="Heading2"/>
       </w:pPr>
-      <w:bookmarkStart w:id="25" w:name="_Toc237117216"/>
+      <w:bookmarkStart w:id="25" w:name="_Toc237165459"/>
       <w:r>
         <w:t>TC-10 Install or repair the FMX components</w:t>
       </w:r>
@@ -9367,9 +9307,6 @@
           <w:p>
             <w:pPr>
               <w:pStyle w:val="Callout"/>
-              <w:rPr>
-                <w:rFonts w:hint="eastAsia"/>
-              </w:rPr>
             </w:pPr>
             <w:r>
               <w:rPr>
@@ -9504,6 +9441,14 @@
       </w:pPr>
       <w:r>
         <w:t>The complete standard package list remains available; standard controls such as TTabControl stream normally.</w:t>
+      </w:r>
+    </w:p>
+    <w:p>
+      <w:pPr>
+        <w:pStyle w:val="ListBullet"/>
+      </w:pPr>
+      <w:r>
+        <w:t>Every package left in the effective per-user list has an installed BPL; stale optional registrations do not produce an IDE-startup error.</w:t>
       </w:r>
     </w:p>
     <w:p>
@@ -9646,7 +9591,7 @@
       <w:pPr>
         <w:pStyle w:val="Heading2"/>
       </w:pPr>
-      <w:bookmarkStart w:id="26" w:name="_Toc237117217"/>
+      <w:bookmarkStart w:id="26" w:name="_Toc237165460"/>
       <w:r>
         <w:t>TC-11 Perform the visible Delphi integration</w:t>
       </w:r>
@@ -9681,9 +9626,6 @@
           <w:p>
             <w:pPr>
               <w:pStyle w:val="Callout"/>
-              <w:rPr>
-                <w:rFonts w:hint="eastAsia"/>
-              </w:rPr>
             </w:pPr>
             <w:r>
               <w:rPr>
@@ -9788,6 +9730,7 @@
         </w:numPr>
       </w:pPr>
       <w:r>
+        <w:lastRenderedPageBreak/>
         <w:t>Place one TDATFMXLanguageComboBox in an appropriate visible header/menu area.</w:t>
       </w:r>
     </w:p>
@@ -9800,7 +9743,6 @@
         </w:numPr>
       </w:pPr>
       <w:r>
-        <w:lastRenderedPageBreak/>
         <w:t>Set its LanguageManager property to the manager. Leave AutoPopulate and ShowLanguageCode True.</w:t>
       </w:r>
     </w:p>
@@ -10013,9 +9955,6 @@
           <w:p>
             <w:pPr>
               <w:pStyle w:val="Callout"/>
-              <w:rPr>
-                <w:rFonts w:hint="eastAsia"/>
-              </w:rPr>
             </w:pPr>
             <w:r>
               <w:rPr>
@@ -10035,7 +9974,7 @@
       <w:pPr>
         <w:pStyle w:val="Heading2"/>
       </w:pPr>
-      <w:bookmarkStart w:id="27" w:name="_Toc237117218"/>
+      <w:bookmarkStart w:id="27" w:name="_Toc237165461"/>
       <w:r>
         <w:t>TC-12 Build GA4 Win32 and Win64</w:t>
       </w:r>
@@ -10070,9 +10009,6 @@
           <w:p>
             <w:pPr>
               <w:pStyle w:val="Callout"/>
-              <w:rPr>
-                <w:rFonts w:hint="eastAsia"/>
-              </w:rPr>
             </w:pPr>
             <w:r>
               <w:rPr>
@@ -10161,6 +10097,7 @@
         <w:pStyle w:val="Heading3"/>
       </w:pPr>
       <w:r>
+        <w:lastRenderedPageBreak/>
         <w:t>Expected result</w:t>
       </w:r>
     </w:p>
@@ -10177,7 +10114,6 @@
         <w:pStyle w:val="ListBullet"/>
       </w:pPr>
       <w:r>
-        <w:lastRenderedPageBreak/>
         <w:t>The target contains the manager and selector through normal compiled source/designer resources.</w:t>
       </w:r>
     </w:p>
@@ -10321,7 +10257,7 @@
       <w:pPr>
         <w:pStyle w:val="Heading2"/>
       </w:pPr>
-      <w:bookmarkStart w:id="28" w:name="_Toc237117219"/>
+      <w:bookmarkStart w:id="28" w:name="_Toc237165462"/>
       <w:r>
         <w:t>TC-13 Deploy language packs</w:t>
       </w:r>
@@ -10356,9 +10292,6 @@
           <w:p>
             <w:pPr>
               <w:pStyle w:val="Callout"/>
-              <w:rPr>
-                <w:rFonts w:hint="eastAsia"/>
-              </w:rPr>
             </w:pPr>
             <w:r>
               <w:rPr>
@@ -10601,9 +10534,6 @@
     <w:p>
       <w:pPr>
         <w:pStyle w:val="CodeBlock"/>
-        <w:rPr>
-          <w:rFonts w:hint="eastAsia"/>
-        </w:rPr>
       </w:pPr>
       <w:r>
         <w:t>&amp; "C:\New Delphi Projects\Delphi App Translation\export\component-integration\WebsiteAnalytics\Deploy-LanguagePacks.ps1" -ApplicationDirectory "C:\New Delphi Projects\Echurchsite Analytical - Component Test\bin\Win32\Debug"</w:t>
@@ -10612,11 +10542,9 @@
     <w:p>
       <w:pPr>
         <w:pStyle w:val="CodeBlock"/>
-        <w:rPr>
-          <w:rFonts w:hint="eastAsia"/>
-        </w:rPr>
-      </w:pPr>
-      <w:r>
+      </w:pPr>
+      <w:r>
+        <w:lastRenderedPageBreak/>
         <w:t>&amp; "C:\New Delphi Projects\Delphi App Translation\export\component-integration\WebsiteAnalytics\Deploy-LanguagePacks.ps1" -ApplicationDirectory "C:\New Delphi Projects\Echurchsite Analytical - Component Test\bin\Win64\Debug"</w:t>
       </w:r>
     </w:p>
@@ -10624,9 +10552,8 @@
       <w:pPr>
         <w:pStyle w:val="Heading1"/>
       </w:pPr>
-      <w:bookmarkStart w:id="29" w:name="_Toc237117220"/>
-      <w:r>
-        <w:lastRenderedPageBreak/>
+      <w:bookmarkStart w:id="29" w:name="_Toc237165463"/>
+      <w:r>
         <w:t>8. Runtime Acceptance</w:t>
       </w:r>
       <w:bookmarkEnd w:id="29"/>
@@ -10635,7 +10562,7 @@
       <w:pPr>
         <w:pStyle w:val="Heading2"/>
       </w:pPr>
-      <w:bookmarkStart w:id="30" w:name="_Toc237117221"/>
+      <w:bookmarkStart w:id="30" w:name="_Toc237165464"/>
       <w:r>
         <w:t>TC-14 First launch and source language</w:t>
       </w:r>
@@ -10670,9 +10597,6 @@
           <w:p>
             <w:pPr>
               <w:pStyle w:val="Callout"/>
-              <w:rPr>
-                <w:rFonts w:hint="eastAsia"/>
-              </w:rPr>
             </w:pPr>
             <w:r>
               <w:rPr>
@@ -10916,7 +10840,7 @@
       <w:pPr>
         <w:pStyle w:val="Heading2"/>
       </w:pPr>
-      <w:bookmarkStart w:id="31" w:name="_Toc237117222"/>
+      <w:bookmarkStart w:id="31" w:name="_Toc237165465"/>
       <w:r>
         <w:t>TC-15 Immediate language switching</w:t>
       </w:r>
@@ -10951,9 +10875,6 @@
           <w:p>
             <w:pPr>
               <w:pStyle w:val="Callout"/>
-              <w:rPr>
-                <w:rFonts w:hint="eastAsia"/>
-              </w:rPr>
             </w:pPr>
             <w:r>
               <w:rPr>
@@ -11010,6 +10931,7 @@
         </w:numPr>
       </w:pPr>
       <w:r>
+        <w:lastRenderedPageBreak/>
         <w:t>Observe the application title, headings, labels, buttons, menu/list text, hints where practical, and the already-open secondary form.</w:t>
       </w:r>
     </w:p>
@@ -11042,7 +10964,6 @@
         <w:pStyle w:val="Heading3"/>
       </w:pPr>
       <w:r>
-        <w:lastRenderedPageBreak/>
         <w:t>Expected result</w:t>
       </w:r>
     </w:p>
@@ -11210,7 +11131,7 @@
       <w:pPr>
         <w:pStyle w:val="Heading2"/>
       </w:pPr>
-      <w:bookmarkStart w:id="32" w:name="_Toc237117223"/>
+      <w:bookmarkStart w:id="32" w:name="_Toc237165466"/>
       <w:r>
         <w:t>TC-16 Preserve control state and date range</w:t>
       </w:r>
@@ -11245,9 +11166,6 @@
           <w:p>
             <w:pPr>
               <w:pStyle w:val="Callout"/>
-              <w:rPr>
-                <w:rFonts w:hint="eastAsia"/>
-              </w:rPr>
             </w:pPr>
             <w:r>
               <w:rPr>
@@ -11491,8 +11409,9 @@
       <w:pPr>
         <w:pStyle w:val="Heading2"/>
       </w:pPr>
-      <w:bookmarkStart w:id="33" w:name="_Toc237117224"/>
-      <w:r>
+      <w:bookmarkStart w:id="33" w:name="_Toc237165467"/>
+      <w:r>
+        <w:lastRenderedPageBreak/>
         <w:t>TC-17 Preference persistence and restart</w:t>
       </w:r>
       <w:bookmarkEnd w:id="33"/>
@@ -11526,9 +11445,6 @@
           <w:p>
             <w:pPr>
               <w:pStyle w:val="Callout"/>
-              <w:rPr>
-                <w:rFonts w:hint="eastAsia"/>
-              </w:rPr>
             </w:pPr>
             <w:r>
               <w:rPr>
@@ -11549,7 +11465,6 @@
         <w:pStyle w:val="Heading3"/>
       </w:pPr>
       <w:r>
-        <w:lastRenderedPageBreak/>
         <w:t>Procedure</w:t>
       </w:r>
     </w:p>
@@ -11773,7 +11688,7 @@
       <w:pPr>
         <w:pStyle w:val="Heading2"/>
       </w:pPr>
-      <w:bookmarkStart w:id="34" w:name="_Toc237117225"/>
+      <w:bookmarkStart w:id="34" w:name="_Toc237165468"/>
       <w:r>
         <w:t>TC-18 Offline runtime</w:t>
       </w:r>
@@ -11808,9 +11723,6 @@
           <w:p>
             <w:pPr>
               <w:pStyle w:val="Callout"/>
-              <w:rPr>
-                <w:rFonts w:hint="eastAsia"/>
-              </w:rPr>
             </w:pPr>
             <w:r>
               <w:rPr>
@@ -11911,6 +11823,7 @@
         <w:pStyle w:val="ListBullet"/>
       </w:pPr>
       <w:r>
+        <w:lastRenderedPageBreak/>
         <w:t>No provider dialog, API-key prompt, network delay, or cloud dependency appears in the target.</w:t>
       </w:r>
     </w:p>
@@ -12007,7 +11920,6 @@
                 <w:color w:val="234C80"/>
                 <w:sz w:val="17"/>
               </w:rPr>
-              <w:lastRenderedPageBreak/>
               <w:t>Date</w:t>
             </w:r>
           </w:p>
@@ -12047,7 +11959,7 @@
       <w:pPr>
         <w:pStyle w:val="Heading2"/>
       </w:pPr>
-      <w:bookmarkStart w:id="35" w:name="_Toc237117226"/>
+      <w:bookmarkStart w:id="35" w:name="_Toc237165469"/>
       <w:r>
         <w:t>TC-19 Missing and malformed pack behavior</w:t>
       </w:r>
@@ -12082,9 +11994,6 @@
           <w:p>
             <w:pPr>
               <w:pStyle w:val="Callout"/>
-              <w:rPr>
-                <w:rFonts w:hint="eastAsia"/>
-              </w:rPr>
             </w:pPr>
             <w:r>
               <w:rPr>
@@ -12340,7 +12249,7 @@
       <w:pPr>
         <w:pStyle w:val="Heading2"/>
       </w:pPr>
-      <w:bookmarkStart w:id="36" w:name="_Toc237117227"/>
+      <w:bookmarkStart w:id="36" w:name="_Toc237165470"/>
       <w:r>
         <w:t>8.1 Repeat the runtime matrix</w:t>
       </w:r>
@@ -12564,6 +12473,7 @@
                 <w:color w:val="163A63"/>
                 <w:sz w:val="17"/>
               </w:rPr>
+              <w:lastRenderedPageBreak/>
               <w:t>bin\Win32\Release\WebsiteAnalytics.exe</w:t>
             </w:r>
           </w:p>
@@ -12674,7 +12584,7 @@
       <w:pPr>
         <w:pStyle w:val="Heading1"/>
       </w:pPr>
-      <w:bookmarkStart w:id="37" w:name="_Toc237117228"/>
+      <w:bookmarkStart w:id="37" w:name="_Toc237165471"/>
       <w:r>
         <w:t>9. VCL Acceptance Delta</w:t>
       </w:r>
@@ -12921,7 +12831,7 @@
       <w:pPr>
         <w:pStyle w:val="Heading1"/>
       </w:pPr>
-      <w:bookmarkStart w:id="38" w:name="_Toc237117229"/>
+      <w:bookmarkStart w:id="38" w:name="_Toc237165472"/>
       <w:r>
         <w:t>10. Studio Self-Translation</w:t>
       </w:r>
@@ -12935,9 +12845,6 @@
     <w:p>
       <w:pPr>
         <w:pStyle w:val="CodeBlock"/>
-        <w:rPr>
-          <w:rFonts w:hint="eastAsia"/>
-        </w:rPr>
       </w:pPr>
       <w:r>
         <w:t>cd "C:\New Delphi Projects\Delphi App Translation"</w:t>
@@ -12946,9 +12853,6 @@
     <w:p>
       <w:pPr>
         <w:pStyle w:val="CodeBlock"/>
-        <w:rPr>
-          <w:rFonts w:hint="eastAsia"/>
-        </w:rPr>
       </w:pPr>
       <w:r>
         <w:t>powershell.exe -ExecutionPolicy Bypass -File .\tools\tests\RunStudioSelfLocalizationSmokeTest.ps1</w:t>
@@ -12975,6 +12879,7 @@
         <w:pStyle w:val="ListBullet"/>
       </w:pPr>
       <w:r>
+        <w:lastRenderedPageBreak/>
         <w:t>Expected final line: Studio self-localization smoke tests passed.</w:t>
       </w:r>
     </w:p>
@@ -12990,9 +12895,8 @@
       <w:pPr>
         <w:pStyle w:val="Heading1"/>
       </w:pPr>
-      <w:bookmarkStart w:id="39" w:name="_Toc237117230"/>
-      <w:r>
-        <w:lastRenderedPageBreak/>
+      <w:bookmarkStart w:id="39" w:name="_Toc237165473"/>
+      <w:r>
         <w:t>11. Starting Over, Restore, and Reset</w:t>
       </w:r>
       <w:bookmarkEnd w:id="39"/>
@@ -13001,7 +12905,7 @@
       <w:pPr>
         <w:pStyle w:val="Heading2"/>
       </w:pPr>
-      <w:bookmarkStart w:id="40" w:name="_Toc237117231"/>
+      <w:bookmarkStart w:id="40" w:name="_Toc237165474"/>
       <w:r>
         <w:t>11.1 Recommended component path</w:t>
       </w:r>
@@ -13046,9 +12950,6 @@
           <w:p>
             <w:pPr>
               <w:pStyle w:val="Callout"/>
-              <w:rPr>
-                <w:rFonts w:hint="eastAsia"/>
-              </w:rPr>
             </w:pPr>
             <w:r>
               <w:rPr>
@@ -13068,7 +12969,7 @@
       <w:pPr>
         <w:pStyle w:val="Heading2"/>
       </w:pPr>
-      <w:bookmarkStart w:id="41" w:name="_Toc237117232"/>
+      <w:bookmarkStart w:id="41" w:name="_Toc237165475"/>
       <w:r>
         <w:t>11.2 Advanced automatic-source reset test</w:t>
       </w:r>
@@ -13194,7 +13095,7 @@
       <w:pPr>
         <w:pStyle w:val="Heading1"/>
       </w:pPr>
-      <w:bookmarkStart w:id="42" w:name="_Toc237117233"/>
+      <w:bookmarkStart w:id="42" w:name="_Toc237165476"/>
       <w:r>
         <w:lastRenderedPageBreak/>
         <w:t>12. Negative and Recovery Tests</w:t>
@@ -13775,7 +13676,7 @@
       <w:pPr>
         <w:pStyle w:val="Heading1"/>
       </w:pPr>
-      <w:bookmarkStart w:id="43" w:name="_Toc237117234"/>
+      <w:bookmarkStart w:id="43" w:name="_Toc237165477"/>
       <w:r>
         <w:t>13. Performance and Large-Project Checks</w:t>
       </w:r>
@@ -14333,7 +14234,7 @@
       <w:pPr>
         <w:pStyle w:val="Heading1"/>
       </w:pPr>
-      <w:bookmarkStart w:id="44" w:name="_Toc237117235"/>
+      <w:bookmarkStart w:id="44" w:name="_Toc237165478"/>
       <w:r>
         <w:t>14. Defect Recording</w:t>
       </w:r>
@@ -14819,7 +14720,7 @@
       <w:pPr>
         <w:pStyle w:val="Heading1"/>
       </w:pPr>
-      <w:bookmarkStart w:id="45" w:name="_Toc237117236"/>
+      <w:bookmarkStart w:id="45" w:name="_Toc237165479"/>
       <w:r>
         <w:t>15. Final Acceptance Checklist</w:t>
       </w:r>
@@ -16285,7 +16186,7 @@
       <w:pPr>
         <w:pStyle w:val="Heading1"/>
       </w:pPr>
-      <w:bookmarkStart w:id="46" w:name="_Toc237117237"/>
+      <w:bookmarkStart w:id="46" w:name="_Toc237165480"/>
       <w:r>
         <w:lastRenderedPageBreak/>
         <w:t>16. Appendix A - Exact Test Scripts</w:t>
@@ -16700,7 +16601,7 @@
       <w:pPr>
         <w:pStyle w:val="Heading1"/>
       </w:pPr>
-      <w:bookmarkStart w:id="47" w:name="_Toc237117238"/>
+      <w:bookmarkStart w:id="47" w:name="_Toc237165481"/>
       <w:r>
         <w:t>17. Appendix B - What Each JSON File Is</w:t>
       </w:r>
@@ -17059,9 +16960,6 @@
           <w:p>
             <w:pPr>
               <w:pStyle w:val="Callout"/>
-              <w:rPr>
-                <w:rFonts w:hint="eastAsia"/>
-              </w:rPr>
             </w:pPr>
             <w:r>
               <w:rPr>
@@ -17081,7 +16979,7 @@
       <w:pPr>
         <w:pStyle w:val="Heading1"/>
       </w:pPr>
-      <w:bookmarkStart w:id="48" w:name="_Toc237117239"/>
+      <w:bookmarkStart w:id="48" w:name="_Toc237165482"/>
       <w:r>
         <w:lastRenderedPageBreak/>
         <w:t>18. Appendix C - Current Verified Baseline</w:t>
@@ -17515,160 +17413,160 @@
       </w:rPr>
     </w:lvl>
   </w:abstractNum>
-  <w:num w:numId="1" w16cid:durableId="998266771">
+  <w:num w:numId="1" w16cid:durableId="1560238857">
     <w:abstractNumId w:val="8"/>
   </w:num>
-  <w:num w:numId="2" w16cid:durableId="1847013240">
+  <w:num w:numId="2" w16cid:durableId="593320240">
     <w:abstractNumId w:val="6"/>
   </w:num>
-  <w:num w:numId="3" w16cid:durableId="1348216647">
+  <w:num w:numId="3" w16cid:durableId="528955836">
     <w:abstractNumId w:val="5"/>
   </w:num>
-  <w:num w:numId="4" w16cid:durableId="272251309">
+  <w:num w:numId="4" w16cid:durableId="2006668464">
     <w:abstractNumId w:val="4"/>
   </w:num>
-  <w:num w:numId="5" w16cid:durableId="539438576">
+  <w:num w:numId="5" w16cid:durableId="2008438236">
     <w:abstractNumId w:val="7"/>
   </w:num>
-  <w:num w:numId="6" w16cid:durableId="1240793195">
+  <w:num w:numId="6" w16cid:durableId="824250089">
     <w:abstractNumId w:val="3"/>
   </w:num>
-  <w:num w:numId="7" w16cid:durableId="1143886878">
+  <w:num w:numId="7" w16cid:durableId="60561352">
     <w:abstractNumId w:val="2"/>
   </w:num>
-  <w:num w:numId="8" w16cid:durableId="1783645415">
+  <w:num w:numId="8" w16cid:durableId="165707589">
     <w:abstractNumId w:val="1"/>
   </w:num>
-  <w:num w:numId="9" w16cid:durableId="832919060">
+  <w:num w:numId="9" w16cid:durableId="2049791579">
     <w:abstractNumId w:val="0"/>
   </w:num>
-  <w:num w:numId="10" w16cid:durableId="1731075323">
+  <w:num w:numId="10" w16cid:durableId="144708636">
     <w:abstractNumId w:val="7"/>
     <w:lvlOverride w:ilvl="0">
       <w:startOverride w:val="1"/>
     </w:lvlOverride>
   </w:num>
-  <w:num w:numId="11" w16cid:durableId="264189555">
+  <w:num w:numId="11" w16cid:durableId="1155073669">
     <w:abstractNumId w:val="7"/>
     <w:lvlOverride w:ilvl="0">
       <w:startOverride w:val="1"/>
     </w:lvlOverride>
   </w:num>
-  <w:num w:numId="12" w16cid:durableId="1906068947">
+  <w:num w:numId="12" w16cid:durableId="1743018501">
     <w:abstractNumId w:val="7"/>
     <w:lvlOverride w:ilvl="0">
       <w:startOverride w:val="1"/>
     </w:lvlOverride>
   </w:num>
-  <w:num w:numId="13" w16cid:durableId="1890724006">
+  <w:num w:numId="13" w16cid:durableId="152575879">
     <w:abstractNumId w:val="7"/>
     <w:lvlOverride w:ilvl="0">
       <w:startOverride w:val="1"/>
     </w:lvlOverride>
   </w:num>
-  <w:num w:numId="14" w16cid:durableId="815033516">
+  <w:num w:numId="14" w16cid:durableId="658312102">
     <w:abstractNumId w:val="7"/>
     <w:lvlOverride w:ilvl="0">
       <w:startOverride w:val="1"/>
     </w:lvlOverride>
   </w:num>
-  <w:num w:numId="15" w16cid:durableId="1745251157">
+  <w:num w:numId="15" w16cid:durableId="278028978">
     <w:abstractNumId w:val="7"/>
     <w:lvlOverride w:ilvl="0">
       <w:startOverride w:val="1"/>
     </w:lvlOverride>
   </w:num>
-  <w:num w:numId="16" w16cid:durableId="574240367">
+  <w:num w:numId="16" w16cid:durableId="1976830971">
     <w:abstractNumId w:val="7"/>
     <w:lvlOverride w:ilvl="0">
       <w:startOverride w:val="1"/>
     </w:lvlOverride>
   </w:num>
-  <w:num w:numId="17" w16cid:durableId="811024144">
+  <w:num w:numId="17" w16cid:durableId="2130664594">
     <w:abstractNumId w:val="7"/>
     <w:lvlOverride w:ilvl="0">
       <w:startOverride w:val="1"/>
     </w:lvlOverride>
   </w:num>
-  <w:num w:numId="18" w16cid:durableId="883522962">
+  <w:num w:numId="18" w16cid:durableId="1708721984">
     <w:abstractNumId w:val="7"/>
     <w:lvlOverride w:ilvl="0">
       <w:startOverride w:val="1"/>
     </w:lvlOverride>
   </w:num>
-  <w:num w:numId="19" w16cid:durableId="822938272">
+  <w:num w:numId="19" w16cid:durableId="919602446">
     <w:abstractNumId w:val="7"/>
     <w:lvlOverride w:ilvl="0">
       <w:startOverride w:val="1"/>
     </w:lvlOverride>
   </w:num>
-  <w:num w:numId="20" w16cid:durableId="228805690">
+  <w:num w:numId="20" w16cid:durableId="326983595">
     <w:abstractNumId w:val="7"/>
     <w:lvlOverride w:ilvl="0">
       <w:startOverride w:val="1"/>
     </w:lvlOverride>
   </w:num>
-  <w:num w:numId="21" w16cid:durableId="1491167697">
+  <w:num w:numId="21" w16cid:durableId="180554383">
     <w:abstractNumId w:val="7"/>
     <w:lvlOverride w:ilvl="0">
       <w:startOverride w:val="1"/>
     </w:lvlOverride>
   </w:num>
-  <w:num w:numId="22" w16cid:durableId="1374578115">
+  <w:num w:numId="22" w16cid:durableId="725496881">
     <w:abstractNumId w:val="7"/>
     <w:lvlOverride w:ilvl="0">
       <w:startOverride w:val="1"/>
     </w:lvlOverride>
   </w:num>
-  <w:num w:numId="23" w16cid:durableId="1713967594">
+  <w:num w:numId="23" w16cid:durableId="511261470">
     <w:abstractNumId w:val="7"/>
     <w:lvlOverride w:ilvl="0">
       <w:startOverride w:val="1"/>
     </w:lvlOverride>
   </w:num>
-  <w:num w:numId="24" w16cid:durableId="2054772843">
+  <w:num w:numId="24" w16cid:durableId="1860512110">
     <w:abstractNumId w:val="7"/>
     <w:lvlOverride w:ilvl="0">
       <w:startOverride w:val="1"/>
     </w:lvlOverride>
   </w:num>
-  <w:num w:numId="25" w16cid:durableId="150609970">
+  <w:num w:numId="25" w16cid:durableId="637104033">
     <w:abstractNumId w:val="7"/>
     <w:lvlOverride w:ilvl="0">
       <w:startOverride w:val="1"/>
     </w:lvlOverride>
   </w:num>
-  <w:num w:numId="26" w16cid:durableId="502743100">
+  <w:num w:numId="26" w16cid:durableId="289558818">
     <w:abstractNumId w:val="7"/>
     <w:lvlOverride w:ilvl="0">
       <w:startOverride w:val="1"/>
     </w:lvlOverride>
   </w:num>
-  <w:num w:numId="27" w16cid:durableId="1642807214">
+  <w:num w:numId="27" w16cid:durableId="951474447">
     <w:abstractNumId w:val="7"/>
     <w:lvlOverride w:ilvl="0">
       <w:startOverride w:val="1"/>
     </w:lvlOverride>
   </w:num>
-  <w:num w:numId="28" w16cid:durableId="1168443577">
+  <w:num w:numId="28" w16cid:durableId="1953629224">
     <w:abstractNumId w:val="7"/>
     <w:lvlOverride w:ilvl="0">
       <w:startOverride w:val="1"/>
     </w:lvlOverride>
   </w:num>
-  <w:num w:numId="29" w16cid:durableId="1931233836">
+  <w:num w:numId="29" w16cid:durableId="2032030075">
     <w:abstractNumId w:val="7"/>
     <w:lvlOverride w:ilvl="0">
       <w:startOverride w:val="1"/>
     </w:lvlOverride>
   </w:num>
-  <w:num w:numId="30" w16cid:durableId="1650355963">
+  <w:num w:numId="30" w16cid:durableId="246232135">
     <w:abstractNumId w:val="7"/>
     <w:lvlOverride w:ilvl="0">
       <w:startOverride w:val="1"/>
     </w:lvlOverride>
   </w:num>
-  <w:num w:numId="31" w16cid:durableId="2103794308">
+  <w:num w:numId="31" w16cid:durableId="2010402076">
     <w:abstractNumId w:val="7"/>
     <w:lvlOverride w:ilvl="0">
       <w:startOverride w:val="1"/>
@@ -29098,7 +28996,7 @@
     <w:autoRedefine/>
     <w:uiPriority w:val="39"/>
     <w:unhideWhenUsed/>
-    <w:rsid w:val="001D3533"/>
+    <w:rsid w:val="00DE55FA"/>
     <w:pPr>
       <w:spacing w:after="100"/>
     </w:pPr>
@@ -29110,7 +29008,7 @@
     <w:autoRedefine/>
     <w:uiPriority w:val="39"/>
     <w:unhideWhenUsed/>
-    <w:rsid w:val="001D3533"/>
+    <w:rsid w:val="00DE55FA"/>
     <w:pPr>
       <w:spacing w:after="100"/>
       <w:ind w:left="220"/>
@@ -29121,7 +29019,7 @@
     <w:basedOn w:val="DefaultParagraphFont"/>
     <w:uiPriority w:val="99"/>
     <w:unhideWhenUsed/>
-    <w:rsid w:val="001D3533"/>
+    <w:rsid w:val="00DE55FA"/>
     <w:rPr>
       <w:color w:val="0000FF" w:themeColor="hyperlink"/>
       <w:u w:val="single"/>

</xml_diff>

<commit_message>
Replace automatic package install with Delphi-managed workflow
</commit_message>
<xml_diff>
--- a/docs/guides/Delphi App Translation Studio Complete Test Guide.docx
+++ b/docs/guides/Delphi App Translation Studio Complete Test Guide.docx
@@ -13,7 +13,7 @@
           <w:noProof/>
         </w:rPr>
         <w:drawing>
-          <wp:inline distT="0" distB="0" distL="0" distR="0" wp14:anchorId="2D377EFA" wp14:editId="450F0C2B">
+          <wp:inline distT="0" distB="0" distL="0" distR="0" wp14:anchorId="36584C51" wp14:editId="74748914">
             <wp:extent cx="1325880" cy="1325880"/>
             <wp:effectExtent l="0" t="0" r="0" b="0"/>
             <wp:docPr id="1" name="Picture 1"/>
@@ -120,7 +120,7 @@
           <w:color w:val="5D7693"/>
         </w:rPr>
         <w:br/>
-        <w:t>Last changed: August 8, 2026</w:t>
+        <w:t>Last changed: August 9, 2026</w:t>
       </w:r>
       <w:r>
         <w:rPr>
@@ -190,7 +190,7 @@
       <w:r>
         <w:fldChar w:fldCharType="separate"/>
       </w:r>
-      <w:hyperlink w:anchor="_Toc237165434" w:history="1">
+      <w:hyperlink w:anchor="_Toc237169181" w:history="1">
         <w:r>
           <w:rPr>
             <w:rStyle w:val="Hyperlink"/>
@@ -217,7 +217,7 @@
             <w:noProof/>
             <w:webHidden/>
           </w:rPr>
-          <w:instrText xml:space="preserve"> PAGEREF _Toc237165434 \h </w:instrText>
+          <w:instrText xml:space="preserve"> PAGEREF _Toc237169181 \h </w:instrText>
         </w:r>
         <w:r>
           <w:rPr>
@@ -258,7 +258,7 @@
           <w:noProof/>
         </w:rPr>
       </w:pPr>
-      <w:hyperlink w:anchor="_Toc237165435" w:history="1">
+      <w:hyperlink w:anchor="_Toc237169182" w:history="1">
         <w:r>
           <w:rPr>
             <w:rStyle w:val="Hyperlink"/>
@@ -285,7 +285,7 @@
             <w:noProof/>
             <w:webHidden/>
           </w:rPr>
-          <w:instrText xml:space="preserve"> PAGEREF _Toc237165435 \h </w:instrText>
+          <w:instrText xml:space="preserve"> PAGEREF _Toc237169182 \h </w:instrText>
         </w:r>
         <w:r>
           <w:rPr>
@@ -326,7 +326,7 @@
           <w:noProof/>
         </w:rPr>
       </w:pPr>
-      <w:hyperlink w:anchor="_Toc237165436" w:history="1">
+      <w:hyperlink w:anchor="_Toc237169183" w:history="1">
         <w:r>
           <w:rPr>
             <w:rStyle w:val="Hyperlink"/>
@@ -353,7 +353,7 @@
             <w:noProof/>
             <w:webHidden/>
           </w:rPr>
-          <w:instrText xml:space="preserve"> PAGEREF _Toc237165436 \h </w:instrText>
+          <w:instrText xml:space="preserve"> PAGEREF _Toc237169183 \h </w:instrText>
         </w:r>
         <w:r>
           <w:rPr>
@@ -394,7 +394,7 @@
           <w:noProof/>
         </w:rPr>
       </w:pPr>
-      <w:hyperlink w:anchor="_Toc237165437" w:history="1">
+      <w:hyperlink w:anchor="_Toc237169184" w:history="1">
         <w:r>
           <w:rPr>
             <w:rStyle w:val="Hyperlink"/>
@@ -421,7 +421,7 @@
             <w:noProof/>
             <w:webHidden/>
           </w:rPr>
-          <w:instrText xml:space="preserve"> PAGEREF _Toc237165437 \h </w:instrText>
+          <w:instrText xml:space="preserve"> PAGEREF _Toc237169184 \h </w:instrText>
         </w:r>
         <w:r>
           <w:rPr>
@@ -462,7 +462,7 @@
           <w:noProof/>
         </w:rPr>
       </w:pPr>
-      <w:hyperlink w:anchor="_Toc237165438" w:history="1">
+      <w:hyperlink w:anchor="_Toc237169185" w:history="1">
         <w:r>
           <w:rPr>
             <w:rStyle w:val="Hyperlink"/>
@@ -489,7 +489,7 @@
             <w:noProof/>
             <w:webHidden/>
           </w:rPr>
-          <w:instrText xml:space="preserve"> PAGEREF _Toc237165438 \h </w:instrText>
+          <w:instrText xml:space="preserve"> PAGEREF _Toc237169185 \h </w:instrText>
         </w:r>
         <w:r>
           <w:rPr>
@@ -530,7 +530,7 @@
           <w:noProof/>
         </w:rPr>
       </w:pPr>
-      <w:hyperlink w:anchor="_Toc237165439" w:history="1">
+      <w:hyperlink w:anchor="_Toc237169186" w:history="1">
         <w:r>
           <w:rPr>
             <w:rStyle w:val="Hyperlink"/>
@@ -557,7 +557,7 @@
             <w:noProof/>
             <w:webHidden/>
           </w:rPr>
-          <w:instrText xml:space="preserve"> PAGEREF _Toc237165439 \h </w:instrText>
+          <w:instrText xml:space="preserve"> PAGEREF _Toc237169186 \h </w:instrText>
         </w:r>
         <w:r>
           <w:rPr>
@@ -598,7 +598,7 @@
           <w:noProof/>
         </w:rPr>
       </w:pPr>
-      <w:hyperlink w:anchor="_Toc237165440" w:history="1">
+      <w:hyperlink w:anchor="_Toc237169187" w:history="1">
         <w:r>
           <w:rPr>
             <w:rStyle w:val="Hyperlink"/>
@@ -625,7 +625,7 @@
             <w:noProof/>
             <w:webHidden/>
           </w:rPr>
-          <w:instrText xml:space="preserve"> PAGEREF _Toc237165440 \h </w:instrText>
+          <w:instrText xml:space="preserve"> PAGEREF _Toc237169187 \h </w:instrText>
         </w:r>
         <w:r>
           <w:rPr>
@@ -666,7 +666,7 @@
           <w:noProof/>
         </w:rPr>
       </w:pPr>
-      <w:hyperlink w:anchor="_Toc237165441" w:history="1">
+      <w:hyperlink w:anchor="_Toc237169188" w:history="1">
         <w:r>
           <w:rPr>
             <w:rStyle w:val="Hyperlink"/>
@@ -693,7 +693,75 @@
             <w:noProof/>
             <w:webHidden/>
           </w:rPr>
-          <w:instrText xml:space="preserve"> PAGEREF _Toc237165441 \h </w:instrText>
+          <w:instrText xml:space="preserve"> PAGEREF _Toc237169188 \h </w:instrText>
+        </w:r>
+        <w:r>
+          <w:rPr>
+            <w:noProof/>
+            <w:webHidden/>
+          </w:rPr>
+        </w:r>
+        <w:r>
+          <w:rPr>
+            <w:noProof/>
+            <w:webHidden/>
+          </w:rPr>
+          <w:fldChar w:fldCharType="separate"/>
+        </w:r>
+        <w:r>
+          <w:rPr>
+            <w:noProof/>
+            <w:webHidden/>
+          </w:rPr>
+          <w:t>4</w:t>
+        </w:r>
+        <w:r>
+          <w:rPr>
+            <w:noProof/>
+            <w:webHidden/>
+          </w:rPr>
+          <w:fldChar w:fldCharType="end"/>
+        </w:r>
+      </w:hyperlink>
+    </w:p>
+    <w:p>
+      <w:pPr>
+        <w:pStyle w:val="TOC2"/>
+        <w:tabs>
+          <w:tab w:val="right" w:leader="dot" w:pos="9350"/>
+        </w:tabs>
+        <w:rPr>
+          <w:noProof/>
+        </w:rPr>
+      </w:pPr>
+      <w:hyperlink w:anchor="_Toc237169189" w:history="1">
+        <w:r>
+          <w:rPr>
+            <w:rStyle w:val="Hyperlink"/>
+            <w:noProof/>
+          </w:rPr>
+          <w:t>3.2 Establish a clean Delphi package baseline</w:t>
+        </w:r>
+        <w:r>
+          <w:rPr>
+            <w:noProof/>
+            <w:webHidden/>
+          </w:rPr>
+          <w:tab/>
+        </w:r>
+        <w:r>
+          <w:rPr>
+            <w:noProof/>
+            <w:webHidden/>
+          </w:rPr>
+          <w:fldChar w:fldCharType="begin"/>
+        </w:r>
+        <w:r>
+          <w:rPr>
+            <w:noProof/>
+            <w:webHidden/>
+          </w:rPr>
+          <w:instrText xml:space="preserve"> PAGEREF _Toc237169189 \h </w:instrText>
         </w:r>
         <w:r>
           <w:rPr>
@@ -734,7 +802,7 @@
           <w:noProof/>
         </w:rPr>
       </w:pPr>
-      <w:hyperlink w:anchor="_Toc237165442" w:history="1">
+      <w:hyperlink w:anchor="_Toc237169190" w:history="1">
         <w:r>
           <w:rPr>
             <w:rStyle w:val="Hyperlink"/>
@@ -761,7 +829,7 @@
             <w:noProof/>
             <w:webHidden/>
           </w:rPr>
-          <w:instrText xml:space="preserve"> PAGEREF _Toc237165442 \h </w:instrText>
+          <w:instrText xml:space="preserve"> PAGEREF _Toc237169190 \h </w:instrText>
         </w:r>
         <w:r>
           <w:rPr>
@@ -802,7 +870,7 @@
           <w:noProof/>
         </w:rPr>
       </w:pPr>
-      <w:hyperlink w:anchor="_Toc237165443" w:history="1">
+      <w:hyperlink w:anchor="_Toc237169191" w:history="1">
         <w:r>
           <w:rPr>
             <w:rStyle w:val="Hyperlink"/>
@@ -829,7 +897,7 @@
             <w:noProof/>
             <w:webHidden/>
           </w:rPr>
-          <w:instrText xml:space="preserve"> PAGEREF _Toc237165443 \h </w:instrText>
+          <w:instrText xml:space="preserve"> PAGEREF _Toc237169191 \h </w:instrText>
         </w:r>
         <w:r>
           <w:rPr>
@@ -849,7 +917,7 @@
             <w:noProof/>
             <w:webHidden/>
           </w:rPr>
-          <w:t>4</w:t>
+          <w:t>5</w:t>
         </w:r>
         <w:r>
           <w:rPr>
@@ -870,7 +938,7 @@
           <w:noProof/>
         </w:rPr>
       </w:pPr>
-      <w:hyperlink w:anchor="_Toc237165444" w:history="1">
+      <w:hyperlink w:anchor="_Toc237169192" w:history="1">
         <w:r>
           <w:rPr>
             <w:rStyle w:val="Hyperlink"/>
@@ -897,7 +965,7 @@
             <w:noProof/>
             <w:webHidden/>
           </w:rPr>
-          <w:instrText xml:space="preserve"> PAGEREF _Toc237165444 \h </w:instrText>
+          <w:instrText xml:space="preserve"> PAGEREF _Toc237169192 \h </w:instrText>
         </w:r>
         <w:r>
           <w:rPr>
@@ -917,7 +985,7 @@
             <w:noProof/>
             <w:webHidden/>
           </w:rPr>
-          <w:t>4</w:t>
+          <w:t>5</w:t>
         </w:r>
         <w:r>
           <w:rPr>
@@ -938,7 +1006,7 @@
           <w:noProof/>
         </w:rPr>
       </w:pPr>
-      <w:hyperlink w:anchor="_Toc237165445" w:history="1">
+      <w:hyperlink w:anchor="_Toc237169193" w:history="1">
         <w:r>
           <w:rPr>
             <w:rStyle w:val="Hyperlink"/>
@@ -965,7 +1033,7 @@
             <w:noProof/>
             <w:webHidden/>
           </w:rPr>
-          <w:instrText xml:space="preserve"> PAGEREF _Toc237165445 \h </w:instrText>
+          <w:instrText xml:space="preserve"> PAGEREF _Toc237169193 \h </w:instrText>
         </w:r>
         <w:r>
           <w:rPr>
@@ -1006,7 +1074,7 @@
           <w:noProof/>
         </w:rPr>
       </w:pPr>
-      <w:hyperlink w:anchor="_Toc237165446" w:history="1">
+      <w:hyperlink w:anchor="_Toc237169194" w:history="1">
         <w:r>
           <w:rPr>
             <w:rStyle w:val="Hyperlink"/>
@@ -1033,7 +1101,7 @@
             <w:noProof/>
             <w:webHidden/>
           </w:rPr>
-          <w:instrText xml:space="preserve"> PAGEREF _Toc237165446 \h </w:instrText>
+          <w:instrText xml:space="preserve"> PAGEREF _Toc237169194 \h </w:instrText>
         </w:r>
         <w:r>
           <w:rPr>
@@ -1074,7 +1142,7 @@
           <w:noProof/>
         </w:rPr>
       </w:pPr>
-      <w:hyperlink w:anchor="_Toc237165447" w:history="1">
+      <w:hyperlink w:anchor="_Toc237169195" w:history="1">
         <w:r>
           <w:rPr>
             <w:rStyle w:val="Hyperlink"/>
@@ -1101,7 +1169,7 @@
             <w:noProof/>
             <w:webHidden/>
           </w:rPr>
-          <w:instrText xml:space="preserve"> PAGEREF _Toc237165447 \h </w:instrText>
+          <w:instrText xml:space="preserve"> PAGEREF _Toc237169195 \h </w:instrText>
         </w:r>
         <w:r>
           <w:rPr>
@@ -1121,7 +1189,7 @@
             <w:noProof/>
             <w:webHidden/>
           </w:rPr>
-          <w:t>6</w:t>
+          <w:t>7</w:t>
         </w:r>
         <w:r>
           <w:rPr>
@@ -1142,7 +1210,7 @@
           <w:noProof/>
         </w:rPr>
       </w:pPr>
-      <w:hyperlink w:anchor="_Toc237165448" w:history="1">
+      <w:hyperlink w:anchor="_Toc237169196" w:history="1">
         <w:r>
           <w:rPr>
             <w:rStyle w:val="Hyperlink"/>
@@ -1169,7 +1237,7 @@
             <w:noProof/>
             <w:webHidden/>
           </w:rPr>
-          <w:instrText xml:space="preserve"> PAGEREF _Toc237165448 \h </w:instrText>
+          <w:instrText xml:space="preserve"> PAGEREF _Toc237169196 \h </w:instrText>
         </w:r>
         <w:r>
           <w:rPr>
@@ -1189,7 +1257,7 @@
             <w:noProof/>
             <w:webHidden/>
           </w:rPr>
-          <w:t>6</w:t>
+          <w:t>7</w:t>
         </w:r>
         <w:r>
           <w:rPr>
@@ -1210,7 +1278,7 @@
           <w:noProof/>
         </w:rPr>
       </w:pPr>
-      <w:hyperlink w:anchor="_Toc237165449" w:history="1">
+      <w:hyperlink w:anchor="_Toc237169197" w:history="1">
         <w:r>
           <w:rPr>
             <w:rStyle w:val="Hyperlink"/>
@@ -1237,7 +1305,7 @@
             <w:noProof/>
             <w:webHidden/>
           </w:rPr>
-          <w:instrText xml:space="preserve"> PAGEREF _Toc237165449 \h </w:instrText>
+          <w:instrText xml:space="preserve"> PAGEREF _Toc237169197 \h </w:instrText>
         </w:r>
         <w:r>
           <w:rPr>
@@ -1257,7 +1325,7 @@
             <w:noProof/>
             <w:webHidden/>
           </w:rPr>
-          <w:t>6</w:t>
+          <w:t>7</w:t>
         </w:r>
         <w:r>
           <w:rPr>
@@ -1278,7 +1346,7 @@
           <w:noProof/>
         </w:rPr>
       </w:pPr>
-      <w:hyperlink w:anchor="_Toc237165450" w:history="1">
+      <w:hyperlink w:anchor="_Toc237169198" w:history="1">
         <w:r>
           <w:rPr>
             <w:rStyle w:val="Hyperlink"/>
@@ -1305,7 +1373,7 @@
             <w:noProof/>
             <w:webHidden/>
           </w:rPr>
-          <w:instrText xml:space="preserve"> PAGEREF _Toc237165450 \h </w:instrText>
+          <w:instrText xml:space="preserve"> PAGEREF _Toc237169198 \h </w:instrText>
         </w:r>
         <w:r>
           <w:rPr>
@@ -1325,7 +1393,7 @@
             <w:noProof/>
             <w:webHidden/>
           </w:rPr>
-          <w:t>7</w:t>
+          <w:t>8</w:t>
         </w:r>
         <w:r>
           <w:rPr>
@@ -1346,7 +1414,7 @@
           <w:noProof/>
         </w:rPr>
       </w:pPr>
-      <w:hyperlink w:anchor="_Toc237165451" w:history="1">
+      <w:hyperlink w:anchor="_Toc237169199" w:history="1">
         <w:r>
           <w:rPr>
             <w:rStyle w:val="Hyperlink"/>
@@ -1373,7 +1441,7 @@
             <w:noProof/>
             <w:webHidden/>
           </w:rPr>
-          <w:instrText xml:space="preserve"> PAGEREF _Toc237165451 \h </w:instrText>
+          <w:instrText xml:space="preserve"> PAGEREF _Toc237169199 \h </w:instrText>
         </w:r>
         <w:r>
           <w:rPr>
@@ -1393,7 +1461,7 @@
             <w:noProof/>
             <w:webHidden/>
           </w:rPr>
-          <w:t>8</w:t>
+          <w:t>9</w:t>
         </w:r>
         <w:r>
           <w:rPr>
@@ -1414,7 +1482,7 @@
           <w:noProof/>
         </w:rPr>
       </w:pPr>
-      <w:hyperlink w:anchor="_Toc237165452" w:history="1">
+      <w:hyperlink w:anchor="_Toc237169200" w:history="1">
         <w:r>
           <w:rPr>
             <w:rStyle w:val="Hyperlink"/>
@@ -1441,7 +1509,7 @@
             <w:noProof/>
             <w:webHidden/>
           </w:rPr>
-          <w:instrText xml:space="preserve"> PAGEREF _Toc237165452 \h </w:instrText>
+          <w:instrText xml:space="preserve"> PAGEREF _Toc237169200 \h </w:instrText>
         </w:r>
         <w:r>
           <w:rPr>
@@ -1461,7 +1529,7 @@
             <w:noProof/>
             <w:webHidden/>
           </w:rPr>
-          <w:t>8</w:t>
+          <w:t>9</w:t>
         </w:r>
         <w:r>
           <w:rPr>
@@ -1482,7 +1550,7 @@
           <w:noProof/>
         </w:rPr>
       </w:pPr>
-      <w:hyperlink w:anchor="_Toc237165453" w:history="1">
+      <w:hyperlink w:anchor="_Toc237169201" w:history="1">
         <w:r>
           <w:rPr>
             <w:rStyle w:val="Hyperlink"/>
@@ -1509,7 +1577,7 @@
             <w:noProof/>
             <w:webHidden/>
           </w:rPr>
-          <w:instrText xml:space="preserve"> PAGEREF _Toc237165453 \h </w:instrText>
+          <w:instrText xml:space="preserve"> PAGEREF _Toc237169201 \h </w:instrText>
         </w:r>
         <w:r>
           <w:rPr>
@@ -1529,7 +1597,7 @@
             <w:noProof/>
             <w:webHidden/>
           </w:rPr>
-          <w:t>9</w:t>
+          <w:t>10</w:t>
         </w:r>
         <w:r>
           <w:rPr>
@@ -1550,7 +1618,7 @@
           <w:noProof/>
         </w:rPr>
       </w:pPr>
-      <w:hyperlink w:anchor="_Toc237165454" w:history="1">
+      <w:hyperlink w:anchor="_Toc237169202" w:history="1">
         <w:r>
           <w:rPr>
             <w:rStyle w:val="Hyperlink"/>
@@ -1577,7 +1645,7 @@
             <w:noProof/>
             <w:webHidden/>
           </w:rPr>
-          <w:instrText xml:space="preserve"> PAGEREF _Toc237165454 \h </w:instrText>
+          <w:instrText xml:space="preserve"> PAGEREF _Toc237169202 \h </w:instrText>
         </w:r>
         <w:r>
           <w:rPr>
@@ -1597,7 +1665,7 @@
             <w:noProof/>
             <w:webHidden/>
           </w:rPr>
-          <w:t>10</w:t>
+          <w:t>11</w:t>
         </w:r>
         <w:r>
           <w:rPr>
@@ -1618,7 +1686,7 @@
           <w:noProof/>
         </w:rPr>
       </w:pPr>
-      <w:hyperlink w:anchor="_Toc237165455" w:history="1">
+      <w:hyperlink w:anchor="_Toc237169203" w:history="1">
         <w:r>
           <w:rPr>
             <w:rStyle w:val="Hyperlink"/>
@@ -1645,7 +1713,7 @@
             <w:noProof/>
             <w:webHidden/>
           </w:rPr>
-          <w:instrText xml:space="preserve"> PAGEREF _Toc237165455 \h </w:instrText>
+          <w:instrText xml:space="preserve"> PAGEREF _Toc237169203 \h </w:instrText>
         </w:r>
         <w:r>
           <w:rPr>
@@ -1665,7 +1733,7 @@
             <w:noProof/>
             <w:webHidden/>
           </w:rPr>
-          <w:t>11</w:t>
+          <w:t>12</w:t>
         </w:r>
         <w:r>
           <w:rPr>
@@ -1686,7 +1754,7 @@
           <w:noProof/>
         </w:rPr>
       </w:pPr>
-      <w:hyperlink w:anchor="_Toc237165456" w:history="1">
+      <w:hyperlink w:anchor="_Toc237169204" w:history="1">
         <w:r>
           <w:rPr>
             <w:rStyle w:val="Hyperlink"/>
@@ -1713,7 +1781,7 @@
             <w:noProof/>
             <w:webHidden/>
           </w:rPr>
-          <w:instrText xml:space="preserve"> PAGEREF _Toc237165456 \h </w:instrText>
+          <w:instrText xml:space="preserve"> PAGEREF _Toc237169204 \h </w:instrText>
         </w:r>
         <w:r>
           <w:rPr>
@@ -1733,7 +1801,7 @@
             <w:noProof/>
             <w:webHidden/>
           </w:rPr>
-          <w:t>12</w:t>
+          <w:t>13</w:t>
         </w:r>
         <w:r>
           <w:rPr>
@@ -1754,7 +1822,7 @@
           <w:noProof/>
         </w:rPr>
       </w:pPr>
-      <w:hyperlink w:anchor="_Toc237165457" w:history="1">
+      <w:hyperlink w:anchor="_Toc237169205" w:history="1">
         <w:r>
           <w:rPr>
             <w:rStyle w:val="Hyperlink"/>
@@ -1781,7 +1849,7 @@
             <w:noProof/>
             <w:webHidden/>
           </w:rPr>
-          <w:instrText xml:space="preserve"> PAGEREF _Toc237165457 \h </w:instrText>
+          <w:instrText xml:space="preserve"> PAGEREF _Toc237169205 \h </w:instrText>
         </w:r>
         <w:r>
           <w:rPr>
@@ -1801,7 +1869,7 @@
             <w:noProof/>
             <w:webHidden/>
           </w:rPr>
-          <w:t>12</w:t>
+          <w:t>13</w:t>
         </w:r>
         <w:r>
           <w:rPr>
@@ -1822,7 +1890,7 @@
           <w:noProof/>
         </w:rPr>
       </w:pPr>
-      <w:hyperlink w:anchor="_Toc237165458" w:history="1">
+      <w:hyperlink w:anchor="_Toc237169206" w:history="1">
         <w:r>
           <w:rPr>
             <w:rStyle w:val="Hyperlink"/>
@@ -1849,7 +1917,7 @@
             <w:noProof/>
             <w:webHidden/>
           </w:rPr>
-          <w:instrText xml:space="preserve"> PAGEREF _Toc237165458 \h </w:instrText>
+          <w:instrText xml:space="preserve"> PAGEREF _Toc237169206 \h </w:instrText>
         </w:r>
         <w:r>
           <w:rPr>
@@ -1869,7 +1937,7 @@
             <w:noProof/>
             <w:webHidden/>
           </w:rPr>
-          <w:t>12</w:t>
+          <w:t>14</w:t>
         </w:r>
         <w:r>
           <w:rPr>
@@ -1890,13 +1958,13 @@
           <w:noProof/>
         </w:rPr>
       </w:pPr>
-      <w:hyperlink w:anchor="_Toc237165459" w:history="1">
+      <w:hyperlink w:anchor="_Toc237169207" w:history="1">
         <w:r>
           <w:rPr>
             <w:rStyle w:val="Hyperlink"/>
             <w:noProof/>
           </w:rPr>
-          <w:t>TC-10 Install or repair the FMX components</w:t>
+          <w:t>TC-10 Install the FMX design package through Delphi</w:t>
         </w:r>
         <w:r>
           <w:rPr>
@@ -1917,7 +1985,7 @@
             <w:noProof/>
             <w:webHidden/>
           </w:rPr>
-          <w:instrText xml:space="preserve"> PAGEREF _Toc237165459 \h </w:instrText>
+          <w:instrText xml:space="preserve"> PAGEREF _Toc237169207 \h </w:instrText>
         </w:r>
         <w:r>
           <w:rPr>
@@ -1937,7 +2005,7 @@
             <w:noProof/>
             <w:webHidden/>
           </w:rPr>
-          <w:t>13</w:t>
+          <w:t>14</w:t>
         </w:r>
         <w:r>
           <w:rPr>
@@ -1958,7 +2026,7 @@
           <w:noProof/>
         </w:rPr>
       </w:pPr>
-      <w:hyperlink w:anchor="_Toc237165460" w:history="1">
+      <w:hyperlink w:anchor="_Toc237169208" w:history="1">
         <w:r>
           <w:rPr>
             <w:rStyle w:val="Hyperlink"/>
@@ -1985,7 +2053,7 @@
             <w:noProof/>
             <w:webHidden/>
           </w:rPr>
-          <w:instrText xml:space="preserve"> PAGEREF _Toc237165460 \h </w:instrText>
+          <w:instrText xml:space="preserve"> PAGEREF _Toc237169208 \h </w:instrText>
         </w:r>
         <w:r>
           <w:rPr>
@@ -2005,7 +2073,7 @@
             <w:noProof/>
             <w:webHidden/>
           </w:rPr>
-          <w:t>14</w:t>
+          <w:t>15</w:t>
         </w:r>
         <w:r>
           <w:rPr>
@@ -2026,7 +2094,7 @@
           <w:noProof/>
         </w:rPr>
       </w:pPr>
-      <w:hyperlink w:anchor="_Toc237165461" w:history="1">
+      <w:hyperlink w:anchor="_Toc237169209" w:history="1">
         <w:r>
           <w:rPr>
             <w:rStyle w:val="Hyperlink"/>
@@ -2053,7 +2121,7 @@
             <w:noProof/>
             <w:webHidden/>
           </w:rPr>
-          <w:instrText xml:space="preserve"> PAGEREF _Toc237165461 \h </w:instrText>
+          <w:instrText xml:space="preserve"> PAGEREF _Toc237169209 \h </w:instrText>
         </w:r>
         <w:r>
           <w:rPr>
@@ -2073,7 +2141,7 @@
             <w:noProof/>
             <w:webHidden/>
           </w:rPr>
-          <w:t>15</w:t>
+          <w:t>16</w:t>
         </w:r>
         <w:r>
           <w:rPr>
@@ -2094,7 +2162,7 @@
           <w:noProof/>
         </w:rPr>
       </w:pPr>
-      <w:hyperlink w:anchor="_Toc237165462" w:history="1">
+      <w:hyperlink w:anchor="_Toc237169210" w:history="1">
         <w:r>
           <w:rPr>
             <w:rStyle w:val="Hyperlink"/>
@@ -2121,7 +2189,7 @@
             <w:noProof/>
             <w:webHidden/>
           </w:rPr>
-          <w:instrText xml:space="preserve"> PAGEREF _Toc237165462 \h </w:instrText>
+          <w:instrText xml:space="preserve"> PAGEREF _Toc237169210 \h </w:instrText>
         </w:r>
         <w:r>
           <w:rPr>
@@ -2141,7 +2209,7 @@
             <w:noProof/>
             <w:webHidden/>
           </w:rPr>
-          <w:t>16</w:t>
+          <w:t>17</w:t>
         </w:r>
         <w:r>
           <w:rPr>
@@ -2162,7 +2230,7 @@
           <w:noProof/>
         </w:rPr>
       </w:pPr>
-      <w:hyperlink w:anchor="_Toc237165463" w:history="1">
+      <w:hyperlink w:anchor="_Toc237169211" w:history="1">
         <w:r>
           <w:rPr>
             <w:rStyle w:val="Hyperlink"/>
@@ -2189,7 +2257,7 @@
             <w:noProof/>
             <w:webHidden/>
           </w:rPr>
-          <w:instrText xml:space="preserve"> PAGEREF _Toc237165463 \h </w:instrText>
+          <w:instrText xml:space="preserve"> PAGEREF _Toc237169211 \h </w:instrText>
         </w:r>
         <w:r>
           <w:rPr>
@@ -2209,7 +2277,7 @@
             <w:noProof/>
             <w:webHidden/>
           </w:rPr>
-          <w:t>17</w:t>
+          <w:t>18</w:t>
         </w:r>
         <w:r>
           <w:rPr>
@@ -2230,7 +2298,7 @@
           <w:noProof/>
         </w:rPr>
       </w:pPr>
-      <w:hyperlink w:anchor="_Toc237165464" w:history="1">
+      <w:hyperlink w:anchor="_Toc237169212" w:history="1">
         <w:r>
           <w:rPr>
             <w:rStyle w:val="Hyperlink"/>
@@ -2257,7 +2325,7 @@
             <w:noProof/>
             <w:webHidden/>
           </w:rPr>
-          <w:instrText xml:space="preserve"> PAGEREF _Toc237165464 \h </w:instrText>
+          <w:instrText xml:space="preserve"> PAGEREF _Toc237169212 \h </w:instrText>
         </w:r>
         <w:r>
           <w:rPr>
@@ -2277,7 +2345,7 @@
             <w:noProof/>
             <w:webHidden/>
           </w:rPr>
-          <w:t>17</w:t>
+          <w:t>18</w:t>
         </w:r>
         <w:r>
           <w:rPr>
@@ -2298,7 +2366,7 @@
           <w:noProof/>
         </w:rPr>
       </w:pPr>
-      <w:hyperlink w:anchor="_Toc237165465" w:history="1">
+      <w:hyperlink w:anchor="_Toc237169213" w:history="1">
         <w:r>
           <w:rPr>
             <w:rStyle w:val="Hyperlink"/>
@@ -2325,7 +2393,7 @@
             <w:noProof/>
             <w:webHidden/>
           </w:rPr>
-          <w:instrText xml:space="preserve"> PAGEREF _Toc237165465 \h </w:instrText>
+          <w:instrText xml:space="preserve"> PAGEREF _Toc237169213 \h </w:instrText>
         </w:r>
         <w:r>
           <w:rPr>
@@ -2345,7 +2413,7 @@
             <w:noProof/>
             <w:webHidden/>
           </w:rPr>
-          <w:t>17</w:t>
+          <w:t>18</w:t>
         </w:r>
         <w:r>
           <w:rPr>
@@ -2366,7 +2434,7 @@
           <w:noProof/>
         </w:rPr>
       </w:pPr>
-      <w:hyperlink w:anchor="_Toc237165466" w:history="1">
+      <w:hyperlink w:anchor="_Toc237169214" w:history="1">
         <w:r>
           <w:rPr>
             <w:rStyle w:val="Hyperlink"/>
@@ -2393,7 +2461,7 @@
             <w:noProof/>
             <w:webHidden/>
           </w:rPr>
-          <w:instrText xml:space="preserve"> PAGEREF _Toc237165466 \h </w:instrText>
+          <w:instrText xml:space="preserve"> PAGEREF _Toc237169214 \h </w:instrText>
         </w:r>
         <w:r>
           <w:rPr>
@@ -2413,7 +2481,7 @@
             <w:noProof/>
             <w:webHidden/>
           </w:rPr>
-          <w:t>18</w:t>
+          <w:t>19</w:t>
         </w:r>
         <w:r>
           <w:rPr>
@@ -2434,7 +2502,7 @@
           <w:noProof/>
         </w:rPr>
       </w:pPr>
-      <w:hyperlink w:anchor="_Toc237165467" w:history="1">
+      <w:hyperlink w:anchor="_Toc237169215" w:history="1">
         <w:r>
           <w:rPr>
             <w:rStyle w:val="Hyperlink"/>
@@ -2461,7 +2529,7 @@
             <w:noProof/>
             <w:webHidden/>
           </w:rPr>
-          <w:instrText xml:space="preserve"> PAGEREF _Toc237165467 \h </w:instrText>
+          <w:instrText xml:space="preserve"> PAGEREF _Toc237169215 \h </w:instrText>
         </w:r>
         <w:r>
           <w:rPr>
@@ -2502,7 +2570,7 @@
           <w:noProof/>
         </w:rPr>
       </w:pPr>
-      <w:hyperlink w:anchor="_Toc237165468" w:history="1">
+      <w:hyperlink w:anchor="_Toc237169216" w:history="1">
         <w:r>
           <w:rPr>
             <w:rStyle w:val="Hyperlink"/>
@@ -2529,7 +2597,7 @@
             <w:noProof/>
             <w:webHidden/>
           </w:rPr>
-          <w:instrText xml:space="preserve"> PAGEREF _Toc237165468 \h </w:instrText>
+          <w:instrText xml:space="preserve"> PAGEREF _Toc237169216 \h </w:instrText>
         </w:r>
         <w:r>
           <w:rPr>
@@ -2549,7 +2617,7 @@
             <w:noProof/>
             <w:webHidden/>
           </w:rPr>
-          <w:t>19</w:t>
+          <w:t>20</w:t>
         </w:r>
         <w:r>
           <w:rPr>
@@ -2570,7 +2638,7 @@
           <w:noProof/>
         </w:rPr>
       </w:pPr>
-      <w:hyperlink w:anchor="_Toc237165469" w:history="1">
+      <w:hyperlink w:anchor="_Toc237169217" w:history="1">
         <w:r>
           <w:rPr>
             <w:rStyle w:val="Hyperlink"/>
@@ -2597,7 +2665,7 @@
             <w:noProof/>
             <w:webHidden/>
           </w:rPr>
-          <w:instrText xml:space="preserve"> PAGEREF _Toc237165469 \h </w:instrText>
+          <w:instrText xml:space="preserve"> PAGEREF _Toc237169217 \h </w:instrText>
         </w:r>
         <w:r>
           <w:rPr>
@@ -2617,7 +2685,7 @@
             <w:noProof/>
             <w:webHidden/>
           </w:rPr>
-          <w:t>20</w:t>
+          <w:t>21</w:t>
         </w:r>
         <w:r>
           <w:rPr>
@@ -2638,7 +2706,7 @@
           <w:noProof/>
         </w:rPr>
       </w:pPr>
-      <w:hyperlink w:anchor="_Toc237165470" w:history="1">
+      <w:hyperlink w:anchor="_Toc237169218" w:history="1">
         <w:r>
           <w:rPr>
             <w:rStyle w:val="Hyperlink"/>
@@ -2665,7 +2733,7 @@
             <w:noProof/>
             <w:webHidden/>
           </w:rPr>
-          <w:instrText xml:space="preserve"> PAGEREF _Toc237165470 \h </w:instrText>
+          <w:instrText xml:space="preserve"> PAGEREF _Toc237169218 \h </w:instrText>
         </w:r>
         <w:r>
           <w:rPr>
@@ -2685,7 +2753,7 @@
             <w:noProof/>
             <w:webHidden/>
           </w:rPr>
-          <w:t>20</w:t>
+          <w:t>21</w:t>
         </w:r>
         <w:r>
           <w:rPr>
@@ -2706,7 +2774,7 @@
           <w:noProof/>
         </w:rPr>
       </w:pPr>
-      <w:hyperlink w:anchor="_Toc237165471" w:history="1">
+      <w:hyperlink w:anchor="_Toc237169219" w:history="1">
         <w:r>
           <w:rPr>
             <w:rStyle w:val="Hyperlink"/>
@@ -2733,7 +2801,7 @@
             <w:noProof/>
             <w:webHidden/>
           </w:rPr>
-          <w:instrText xml:space="preserve"> PAGEREF _Toc237165471 \h </w:instrText>
+          <w:instrText xml:space="preserve"> PAGEREF _Toc237169219 \h </w:instrText>
         </w:r>
         <w:r>
           <w:rPr>
@@ -2753,7 +2821,7 @@
             <w:noProof/>
             <w:webHidden/>
           </w:rPr>
-          <w:t>21</w:t>
+          <w:t>22</w:t>
         </w:r>
         <w:r>
           <w:rPr>
@@ -2774,7 +2842,7 @@
           <w:noProof/>
         </w:rPr>
       </w:pPr>
-      <w:hyperlink w:anchor="_Toc237165472" w:history="1">
+      <w:hyperlink w:anchor="_Toc237169220" w:history="1">
         <w:r>
           <w:rPr>
             <w:rStyle w:val="Hyperlink"/>
@@ -2801,7 +2869,7 @@
             <w:noProof/>
             <w:webHidden/>
           </w:rPr>
-          <w:instrText xml:space="preserve"> PAGEREF _Toc237165472 \h </w:instrText>
+          <w:instrText xml:space="preserve"> PAGEREF _Toc237169220 \h </w:instrText>
         </w:r>
         <w:r>
           <w:rPr>
@@ -2821,7 +2889,7 @@
             <w:noProof/>
             <w:webHidden/>
           </w:rPr>
-          <w:t>21</w:t>
+          <w:t>22</w:t>
         </w:r>
         <w:r>
           <w:rPr>
@@ -2842,7 +2910,7 @@
           <w:noProof/>
         </w:rPr>
       </w:pPr>
-      <w:hyperlink w:anchor="_Toc237165473" w:history="1">
+      <w:hyperlink w:anchor="_Toc237169221" w:history="1">
         <w:r>
           <w:rPr>
             <w:rStyle w:val="Hyperlink"/>
@@ -2869,7 +2937,7 @@
             <w:noProof/>
             <w:webHidden/>
           </w:rPr>
-          <w:instrText xml:space="preserve"> PAGEREF _Toc237165473 \h </w:instrText>
+          <w:instrText xml:space="preserve"> PAGEREF _Toc237169221 \h </w:instrText>
         </w:r>
         <w:r>
           <w:rPr>
@@ -2889,7 +2957,7 @@
             <w:noProof/>
             <w:webHidden/>
           </w:rPr>
-          <w:t>22</w:t>
+          <w:t>23</w:t>
         </w:r>
         <w:r>
           <w:rPr>
@@ -2910,7 +2978,7 @@
           <w:noProof/>
         </w:rPr>
       </w:pPr>
-      <w:hyperlink w:anchor="_Toc237165474" w:history="1">
+      <w:hyperlink w:anchor="_Toc237169222" w:history="1">
         <w:r>
           <w:rPr>
             <w:rStyle w:val="Hyperlink"/>
@@ -2937,7 +3005,7 @@
             <w:noProof/>
             <w:webHidden/>
           </w:rPr>
-          <w:instrText xml:space="preserve"> PAGEREF _Toc237165474 \h </w:instrText>
+          <w:instrText xml:space="preserve"> PAGEREF _Toc237169222 \h </w:instrText>
         </w:r>
         <w:r>
           <w:rPr>
@@ -2957,7 +3025,7 @@
             <w:noProof/>
             <w:webHidden/>
           </w:rPr>
-          <w:t>22</w:t>
+          <w:t>23</w:t>
         </w:r>
         <w:r>
           <w:rPr>
@@ -2978,7 +3046,7 @@
           <w:noProof/>
         </w:rPr>
       </w:pPr>
-      <w:hyperlink w:anchor="_Toc237165475" w:history="1">
+      <w:hyperlink w:anchor="_Toc237169223" w:history="1">
         <w:r>
           <w:rPr>
             <w:rStyle w:val="Hyperlink"/>
@@ -3005,7 +3073,7 @@
             <w:noProof/>
             <w:webHidden/>
           </w:rPr>
-          <w:instrText xml:space="preserve"> PAGEREF _Toc237165475 \h </w:instrText>
+          <w:instrText xml:space="preserve"> PAGEREF _Toc237169223 \h </w:instrText>
         </w:r>
         <w:r>
           <w:rPr>
@@ -3025,7 +3093,7 @@
             <w:noProof/>
             <w:webHidden/>
           </w:rPr>
-          <w:t>22</w:t>
+          <w:t>23</w:t>
         </w:r>
         <w:r>
           <w:rPr>
@@ -3046,7 +3114,7 @@
           <w:noProof/>
         </w:rPr>
       </w:pPr>
-      <w:hyperlink w:anchor="_Toc237165476" w:history="1">
+      <w:hyperlink w:anchor="_Toc237169224" w:history="1">
         <w:r>
           <w:rPr>
             <w:rStyle w:val="Hyperlink"/>
@@ -3073,7 +3141,7 @@
             <w:noProof/>
             <w:webHidden/>
           </w:rPr>
-          <w:instrText xml:space="preserve"> PAGEREF _Toc237165476 \h </w:instrText>
+          <w:instrText xml:space="preserve"> PAGEREF _Toc237169224 \h </w:instrText>
         </w:r>
         <w:r>
           <w:rPr>
@@ -3093,7 +3161,7 @@
             <w:noProof/>
             <w:webHidden/>
           </w:rPr>
-          <w:t>23</w:t>
+          <w:t>24</w:t>
         </w:r>
         <w:r>
           <w:rPr>
@@ -3114,7 +3182,7 @@
           <w:noProof/>
         </w:rPr>
       </w:pPr>
-      <w:hyperlink w:anchor="_Toc237165477" w:history="1">
+      <w:hyperlink w:anchor="_Toc237169225" w:history="1">
         <w:r>
           <w:rPr>
             <w:rStyle w:val="Hyperlink"/>
@@ -3141,7 +3209,7 @@
             <w:noProof/>
             <w:webHidden/>
           </w:rPr>
-          <w:instrText xml:space="preserve"> PAGEREF _Toc237165477 \h </w:instrText>
+          <w:instrText xml:space="preserve"> PAGEREF _Toc237169225 \h </w:instrText>
         </w:r>
         <w:r>
           <w:rPr>
@@ -3161,7 +3229,7 @@
             <w:noProof/>
             <w:webHidden/>
           </w:rPr>
-          <w:t>23</w:t>
+          <w:t>24</w:t>
         </w:r>
         <w:r>
           <w:rPr>
@@ -3182,7 +3250,7 @@
           <w:noProof/>
         </w:rPr>
       </w:pPr>
-      <w:hyperlink w:anchor="_Toc237165478" w:history="1">
+      <w:hyperlink w:anchor="_Toc237169226" w:history="1">
         <w:r>
           <w:rPr>
             <w:rStyle w:val="Hyperlink"/>
@@ -3209,7 +3277,7 @@
             <w:noProof/>
             <w:webHidden/>
           </w:rPr>
-          <w:instrText xml:space="preserve"> PAGEREF _Toc237165478 \h </w:instrText>
+          <w:instrText xml:space="preserve"> PAGEREF _Toc237169226 \h </w:instrText>
         </w:r>
         <w:r>
           <w:rPr>
@@ -3229,7 +3297,7 @@
             <w:noProof/>
             <w:webHidden/>
           </w:rPr>
-          <w:t>24</w:t>
+          <w:t>25</w:t>
         </w:r>
         <w:r>
           <w:rPr>
@@ -3250,7 +3318,7 @@
           <w:noProof/>
         </w:rPr>
       </w:pPr>
-      <w:hyperlink w:anchor="_Toc237165479" w:history="1">
+      <w:hyperlink w:anchor="_Toc237169227" w:history="1">
         <w:r>
           <w:rPr>
             <w:rStyle w:val="Hyperlink"/>
@@ -3277,7 +3345,7 @@
             <w:noProof/>
             <w:webHidden/>
           </w:rPr>
-          <w:instrText xml:space="preserve"> PAGEREF _Toc237165479 \h </w:instrText>
+          <w:instrText xml:space="preserve"> PAGEREF _Toc237169227 \h </w:instrText>
         </w:r>
         <w:r>
           <w:rPr>
@@ -3297,7 +3365,7 @@
             <w:noProof/>
             <w:webHidden/>
           </w:rPr>
-          <w:t>25</w:t>
+          <w:t>26</w:t>
         </w:r>
         <w:r>
           <w:rPr>
@@ -3318,7 +3386,7 @@
           <w:noProof/>
         </w:rPr>
       </w:pPr>
-      <w:hyperlink w:anchor="_Toc237165480" w:history="1">
+      <w:hyperlink w:anchor="_Toc237169228" w:history="1">
         <w:r>
           <w:rPr>
             <w:rStyle w:val="Hyperlink"/>
@@ -3345,7 +3413,7 @@
             <w:noProof/>
             <w:webHidden/>
           </w:rPr>
-          <w:instrText xml:space="preserve"> PAGEREF _Toc237165480 \h </w:instrText>
+          <w:instrText xml:space="preserve"> PAGEREF _Toc237169228 \h </w:instrText>
         </w:r>
         <w:r>
           <w:rPr>
@@ -3365,7 +3433,7 @@
             <w:noProof/>
             <w:webHidden/>
           </w:rPr>
-          <w:t>26</w:t>
+          <w:t>27</w:t>
         </w:r>
         <w:r>
           <w:rPr>
@@ -3386,7 +3454,7 @@
           <w:noProof/>
         </w:rPr>
       </w:pPr>
-      <w:hyperlink w:anchor="_Toc237165481" w:history="1">
+      <w:hyperlink w:anchor="_Toc237169229" w:history="1">
         <w:r>
           <w:rPr>
             <w:rStyle w:val="Hyperlink"/>
@@ -3413,7 +3481,7 @@
             <w:noProof/>
             <w:webHidden/>
           </w:rPr>
-          <w:instrText xml:space="preserve"> PAGEREF _Toc237165481 \h </w:instrText>
+          <w:instrText xml:space="preserve"> PAGEREF _Toc237169229 \h </w:instrText>
         </w:r>
         <w:r>
           <w:rPr>
@@ -3433,7 +3501,7 @@
             <w:noProof/>
             <w:webHidden/>
           </w:rPr>
-          <w:t>26</w:t>
+          <w:t>27</w:t>
         </w:r>
         <w:r>
           <w:rPr>
@@ -3454,7 +3522,7 @@
           <w:noProof/>
         </w:rPr>
       </w:pPr>
-      <w:hyperlink w:anchor="_Toc237165482" w:history="1">
+      <w:hyperlink w:anchor="_Toc237169230" w:history="1">
         <w:r>
           <w:rPr>
             <w:rStyle w:val="Hyperlink"/>
@@ -3481,7 +3549,7 @@
             <w:noProof/>
             <w:webHidden/>
           </w:rPr>
-          <w:instrText xml:space="preserve"> PAGEREF _Toc237165482 \h </w:instrText>
+          <w:instrText xml:space="preserve"> PAGEREF _Toc237169230 \h </w:instrText>
         </w:r>
         <w:r>
           <w:rPr>
@@ -3501,7 +3569,7 @@
             <w:noProof/>
             <w:webHidden/>
           </w:rPr>
-          <w:t>27</w:t>
+          <w:t>28</w:t>
         </w:r>
         <w:r>
           <w:rPr>
@@ -3534,7 +3602,7 @@
       <w:pPr>
         <w:pStyle w:val="Heading1"/>
       </w:pPr>
-      <w:bookmarkStart w:id="0" w:name="_Toc237165434"/>
+      <w:bookmarkStart w:id="0" w:name="_Toc237169181"/>
       <w:r>
         <w:lastRenderedPageBreak/>
         <w:t>1. Purpose and Test Philosophy</w:t>
@@ -3585,6 +3653,9 @@
           <w:p>
             <w:pPr>
               <w:pStyle w:val="Callout"/>
+              <w:rPr>
+                <w:rFonts w:hint="eastAsia"/>
+              </w:rPr>
             </w:pPr>
             <w:r>
               <w:rPr>
@@ -3604,7 +3675,7 @@
       <w:pPr>
         <w:pStyle w:val="Heading2"/>
       </w:pPr>
-      <w:bookmarkStart w:id="1" w:name="_Toc237165435"/>
+      <w:bookmarkStart w:id="1" w:name="_Toc237169182"/>
       <w:r>
         <w:t>1.1 Scope</w:t>
       </w:r>
@@ -3662,7 +3733,7 @@
       <w:pPr>
         <w:pStyle w:val="Heading2"/>
       </w:pPr>
-      <w:bookmarkStart w:id="2" w:name="_Toc237165436"/>
+      <w:bookmarkStart w:id="2" w:name="_Toc237169183"/>
       <w:r>
         <w:t>1.2 Stop conditions</w:t>
       </w:r>
@@ -3721,7 +3792,7 @@
       <w:pPr>
         <w:pStyle w:val="Heading1"/>
       </w:pPr>
-      <w:bookmarkStart w:id="3" w:name="_Toc237165437"/>
+      <w:bookmarkStart w:id="3" w:name="_Toc237169184"/>
       <w:r>
         <w:t>2. Exact Folders and Files</w:t>
       </w:r>
@@ -4484,7 +4555,7 @@
       <w:pPr>
         <w:pStyle w:val="Heading2"/>
       </w:pPr>
-      <w:bookmarkStart w:id="4" w:name="_Toc237165438"/>
+      <w:bookmarkStart w:id="4" w:name="_Toc237169185"/>
       <w:r>
         <w:t>2.1 Studio executable matrix</w:t>
       </w:r>
@@ -4752,6 +4823,9 @@
           <w:p>
             <w:pPr>
               <w:pStyle w:val="Callout"/>
+              <w:rPr>
+                <w:rFonts w:hint="eastAsia"/>
+              </w:rPr>
             </w:pPr>
             <w:r>
               <w:rPr>
@@ -4771,7 +4845,7 @@
       <w:pPr>
         <w:pStyle w:val="Heading2"/>
       </w:pPr>
-      <w:bookmarkStart w:id="5" w:name="_Toc237165439"/>
+      <w:bookmarkStart w:id="5" w:name="_Toc237169186"/>
       <w:r>
         <w:t>2.2 Package source and build outputs</w:t>
       </w:r>
@@ -5163,14 +5237,14 @@
     <w:p/>
     <w:p>
       <w:r>
-        <w:t>Runtime packages build for Win32 and Win64. The Delphi IDE loads the self-contained Win32 design package. Installation remains an explicit developer action, but the supported installer automates build, verification, copying, and per-user registration.</w:t>
+        <w:t>Runtime packages build for Win32 and Win64. The Delphi IDE loads the self-contained Win32 design package. Installation is an explicit developer action performed only through RAD Studio's Component &gt; Install Packages &gt; Add command. The Studio does not copy, register, or automatically install BPLs.</w:t>
       </w:r>
     </w:p>
     <w:p>
       <w:pPr>
         <w:pStyle w:val="Heading1"/>
       </w:pPr>
-      <w:bookmarkStart w:id="6" w:name="_Toc237165440"/>
+      <w:bookmarkStart w:id="6" w:name="_Toc237169187"/>
       <w:r>
         <w:t>3. Prerequisites and Test Data</w:t>
       </w:r>
@@ -5181,7 +5255,7 @@
         <w:pStyle w:val="ListBullet"/>
       </w:pPr>
       <w:r>
-        <w:t>Windows account able to run RAD Studio and an elevated PowerShell window.</w:t>
+        <w:t>Windows account able to run RAD Studio and an elevated PowerShell window for builds.</w:t>
       </w:r>
     </w:p>
     <w:p>
@@ -5262,6 +5336,9 @@
           <w:p>
             <w:pPr>
               <w:pStyle w:val="Callout"/>
+              <w:rPr>
+                <w:rFonts w:hint="eastAsia"/>
+              </w:rPr>
             </w:pPr>
             <w:r>
               <w:rPr>
@@ -5281,7 +5358,7 @@
       <w:pPr>
         <w:pStyle w:val="Heading2"/>
       </w:pPr>
-      <w:bookmarkStart w:id="7" w:name="_Toc237165441"/>
+      <w:bookmarkStart w:id="7" w:name="_Toc237169188"/>
       <w:r>
         <w:t>3.1 Create the disposable GA4 test copy</w:t>
       </w:r>
@@ -5376,6 +5453,9 @@
           <w:p>
             <w:pPr>
               <w:pStyle w:val="Callout"/>
+              <w:rPr>
+                <w:rFonts w:hint="eastAsia"/>
+              </w:rPr>
             </w:pPr>
             <w:r>
               <w:rPr>
@@ -5393,28 +5473,13 @@
     </w:tbl>
     <w:p>
       <w:pPr>
-        <w:pStyle w:val="Heading1"/>
-      </w:pPr>
-      <w:bookmarkStart w:id="8" w:name="_Toc237165442"/>
-      <w:r>
-        <w:t>4. Build the Studio Manually</w:t>
+        <w:pStyle w:val="Heading2"/>
+      </w:pPr>
+      <w:bookmarkStart w:id="8" w:name="_Toc237169189"/>
+      <w:r>
+        <w:t>3.2 Establish a clean Delphi package baseline</w:t>
       </w:r>
       <w:bookmarkEnd w:id="8"/>
-    </w:p>
-    <w:p>
-      <w:r>
-        <w:t>Run builds from an elevated PowerShell or Developer Command Prompt. The project file sends executables to bin\&lt;Platform&gt;\&lt;Configuration&gt; and DCUs to dcu\&lt;Platform&gt;\&lt;Configuration&gt;.</w:t>
-      </w:r>
-    </w:p>
-    <w:p>
-      <w:pPr>
-        <w:pStyle w:val="Heading2"/>
-      </w:pPr>
-      <w:bookmarkStart w:id="9" w:name="_Toc237165443"/>
-      <w:r>
-        <w:t>4.1 RAD Studio method</w:t>
-      </w:r>
-      <w:bookmarkEnd w:id="9"/>
     </w:p>
     <w:p>
       <w:pPr>
@@ -5425,7 +5490,7 @@
         </w:numPr>
       </w:pPr>
       <w:r>
-        <w:t>Open C:\New Delphi Projects\Delphi App Translation\DelphiAppTranslationStudio.dproj.</w:t>
+        <w:t>Start RAD Studio without opening the disposable target project or any target form.</w:t>
       </w:r>
     </w:p>
     <w:p>
@@ -5437,7 +5502,7 @@
         </w:numPr>
       </w:pPr>
       <w:r>
-        <w:t>Select Win32 / Debug and choose Project &gt; Build DelphiAppTranslationStudio.</w:t>
+        <w:t>Choose Component &gt; Install Packages.</w:t>
       </w:r>
     </w:p>
     <w:p>
@@ -5449,7 +5514,7 @@
         </w:numPr>
       </w:pPr>
       <w:r>
-        <w:t>Repeat for Win64 / Debug, Win32 / Release, and Win64 / Release.</w:t>
+        <w:t>If DAT Language Manager FireMonkey design-time package is listed, select it, choose Remove, confirm the removal, and choose OK. If it is not listed, choose Cancel and continue.</w:t>
       </w:r>
     </w:p>
     <w:p>
@@ -5461,7 +5526,7 @@
         </w:numPr>
       </w:pPr>
       <w:r>
-        <w:t>Confirm the four exact executables listed in Section 2.1 have current timestamps and nonzero sizes.</w:t>
+        <w:t>Close and restart RAD Studio. Confirm that no package-load error appears. Do not manually delete BPLs and do not edit the BDS registry.</w:t>
       </w:r>
     </w:p>
     <w:p>
@@ -5473,6 +5538,139 @@
         </w:numPr>
       </w:pPr>
       <w:r>
+        <w:t>Leave the target project closed until TC-10 installs the freshly generated design package.</w:t>
+      </w:r>
+    </w:p>
+    <w:tbl>
+      <w:tblPr>
+        <w:tblW w:w="9360" w:type="dxa"/>
+        <w:jc w:val="center"/>
+        <w:tblLayout w:type="fixed"/>
+        <w:tblCellMar>
+          <w:top w:w="80" w:type="dxa"/>
+          <w:left w:w="120" w:type="dxa"/>
+          <w:bottom w:w="80" w:type="dxa"/>
+          <w:right w:w="120" w:type="dxa"/>
+        </w:tblCellMar>
+        <w:tblLook w:val="04A0" w:firstRow="1" w:lastRow="0" w:firstColumn="1" w:lastColumn="0" w:noHBand="0" w:noVBand="1"/>
+      </w:tblPr>
+      <w:tblGrid>
+        <w:gridCol w:w="9360"/>
+      </w:tblGrid>
+      <w:tr>
+        <w:trPr>
+          <w:jc w:val="center"/>
+        </w:trPr>
+        <w:tc>
+          <w:tcPr>
+            <w:tcW w:w="9360" w:type="dxa"/>
+            <w:shd w:val="clear" w:color="auto" w:fill="EAF3FF"/>
+            <w:vAlign w:val="center"/>
+          </w:tcPr>
+          <w:p>
+            <w:pPr>
+              <w:pStyle w:val="Callout"/>
+              <w:rPr>
+                <w:rFonts w:hint="eastAsia"/>
+              </w:rPr>
+            </w:pPr>
+            <w:r>
+              <w:rPr>
+                <w:b/>
+                <w:color w:val="234C80"/>
+              </w:rPr>
+              <w:t xml:space="preserve">Use Delphi's package manager only. </w:t>
+            </w:r>
+            <w:r>
+              <w:t>Never use Component &gt; Install Component for this product, never select a .dpk, and never copy package files into Delphi system folders. The accepted workflow uses the compiled Win32 design .bpl through Component &gt; Install Packages &gt; Add.</w:t>
+            </w:r>
+          </w:p>
+        </w:tc>
+      </w:tr>
+    </w:tbl>
+    <w:p>
+      <w:pPr>
+        <w:pStyle w:val="Heading1"/>
+      </w:pPr>
+      <w:bookmarkStart w:id="9" w:name="_Toc237169190"/>
+      <w:r>
+        <w:t>4. Build the Studio Manually</w:t>
+      </w:r>
+      <w:bookmarkEnd w:id="9"/>
+    </w:p>
+    <w:p>
+      <w:r>
+        <w:t>Run builds from an elevated PowerShell or Developer Command Prompt. The project file sends executables to bin\&lt;Platform&gt;\&lt;Configuration&gt; and DCUs to dcu\&lt;Platform&gt;\&lt;Configuration&gt;.</w:t>
+      </w:r>
+    </w:p>
+    <w:p>
+      <w:pPr>
+        <w:pStyle w:val="Heading2"/>
+      </w:pPr>
+      <w:bookmarkStart w:id="10" w:name="_Toc237169191"/>
+      <w:r>
+        <w:lastRenderedPageBreak/>
+        <w:t>4.1 RAD Studio method</w:t>
+      </w:r>
+      <w:bookmarkEnd w:id="10"/>
+    </w:p>
+    <w:p>
+      <w:pPr>
+        <w:pStyle w:val="ListNumber"/>
+        <w:numPr>
+          <w:ilvl w:val="0"/>
+          <w:numId w:val="12"/>
+        </w:numPr>
+      </w:pPr>
+      <w:r>
+        <w:t>Open C:\New Delphi Projects\Delphi App Translation\DelphiAppTranslationStudio.dproj.</w:t>
+      </w:r>
+    </w:p>
+    <w:p>
+      <w:pPr>
+        <w:pStyle w:val="ListNumber"/>
+        <w:numPr>
+          <w:ilvl w:val="0"/>
+          <w:numId w:val="12"/>
+        </w:numPr>
+      </w:pPr>
+      <w:r>
+        <w:t>Select Win32 / Debug and choose Project &gt; Build DelphiAppTranslationStudio.</w:t>
+      </w:r>
+    </w:p>
+    <w:p>
+      <w:pPr>
+        <w:pStyle w:val="ListNumber"/>
+        <w:numPr>
+          <w:ilvl w:val="0"/>
+          <w:numId w:val="12"/>
+        </w:numPr>
+      </w:pPr>
+      <w:r>
+        <w:t>Repeat for Win64 / Debug, Win32 / Release, and Win64 / Release.</w:t>
+      </w:r>
+    </w:p>
+    <w:p>
+      <w:pPr>
+        <w:pStyle w:val="ListNumber"/>
+        <w:numPr>
+          <w:ilvl w:val="0"/>
+          <w:numId w:val="12"/>
+        </w:numPr>
+      </w:pPr>
+      <w:r>
+        <w:t>Confirm the four exact executables listed in Section 2.1 have current timestamps and nonzero sizes.</w:t>
+      </w:r>
+    </w:p>
+    <w:p>
+      <w:pPr>
+        <w:pStyle w:val="ListNumber"/>
+        <w:numPr>
+          <w:ilvl w:val="0"/>
+          <w:numId w:val="12"/>
+        </w:numPr>
+      </w:pPr>
+      <w:r>
         <w:t>Return the active platform to Win32 after the matrix unless another immediate test requires Win64.</w:t>
       </w:r>
     </w:p>
@@ -5480,15 +5678,18 @@
       <w:pPr>
         <w:pStyle w:val="Heading2"/>
       </w:pPr>
-      <w:bookmarkStart w:id="10" w:name="_Toc237165444"/>
+      <w:bookmarkStart w:id="11" w:name="_Toc237169192"/>
       <w:r>
         <w:t>4.2 Command-line method</w:t>
       </w:r>
-      <w:bookmarkEnd w:id="10"/>
+      <w:bookmarkEnd w:id="11"/>
     </w:p>
     <w:p>
       <w:pPr>
         <w:pStyle w:val="CodeBlock"/>
+        <w:rPr>
+          <w:rFonts w:hint="eastAsia"/>
+        </w:rPr>
       </w:pPr>
       <w:r>
         <w:t>cd "C:\New Delphi Projects\Delphi App Translation"</w:t>
@@ -5497,6 +5698,9 @@
     <w:p>
       <w:pPr>
         <w:pStyle w:val="CodeBlock"/>
+        <w:rPr>
+          <w:rFonts w:hint="eastAsia"/>
+        </w:rPr>
       </w:pPr>
       <w:r>
         <w:t>cmd /d /c "call ""C:\Program Files (x86)\Embarcadero\Studio\37.0\bin\rsvars.bat"" &amp;&amp; msbuild DelphiAppTranslationStudio.dproj /t:Build /p:Config=Debug /p:Platform=Win32 /v:minimal"</w:t>
@@ -5505,15 +5709,20 @@
     <w:p>
       <w:pPr>
         <w:pStyle w:val="CodeBlock"/>
-      </w:pPr>
-      <w:r>
-        <w:lastRenderedPageBreak/>
+        <w:rPr>
+          <w:rFonts w:hint="eastAsia"/>
+        </w:rPr>
+      </w:pPr>
+      <w:r>
         <w:t>cmd /d /c "call ""C:\Program Files (x86)\Embarcadero\Studio\37.0\bin\rsvars.bat"" &amp;&amp; msbuild DelphiAppTranslationStudio.dproj /t:Build /p:Config=Debug /p:Platform=Win64 /v:minimal"</w:t>
       </w:r>
     </w:p>
     <w:p>
       <w:pPr>
         <w:pStyle w:val="CodeBlock"/>
+        <w:rPr>
+          <w:rFonts w:hint="eastAsia"/>
+        </w:rPr>
       </w:pPr>
       <w:r>
         <w:t>cmd /d /c "call ""C:\Program Files (x86)\Embarcadero\Studio\37.0\bin\rsvars.bat"" &amp;&amp; msbuild DelphiAppTranslationStudio.dproj /t:Build /p:Config=Release /p:Platform=Win32 /v:minimal"</w:t>
@@ -5522,6 +5731,9 @@
     <w:p>
       <w:pPr>
         <w:pStyle w:val="CodeBlock"/>
+        <w:rPr>
+          <w:rFonts w:hint="eastAsia"/>
+        </w:rPr>
       </w:pPr>
       <w:r>
         <w:t>cmd /d /c "call ""C:\Program Files (x86)\Embarcadero\Studio\37.0\bin\rsvars.bat"" &amp;&amp; msbuild DelphiAppTranslationStudio.dproj /t:Build /p:Config=Release /p:Platform=Win64 /v:minimal"</w:t>
@@ -5531,11 +5743,11 @@
       <w:pPr>
         <w:pStyle w:val="Heading1"/>
       </w:pPr>
-      <w:bookmarkStart w:id="11" w:name="_Toc237165445"/>
+      <w:bookmarkStart w:id="12" w:name="_Toc237169193"/>
       <w:r>
         <w:t>5. Automated Release Gate</w:t>
       </w:r>
-      <w:bookmarkEnd w:id="11"/>
+      <w:bookmarkEnd w:id="12"/>
     </w:p>
     <w:p>
       <w:r>
@@ -5545,6 +5757,9 @@
     <w:p>
       <w:pPr>
         <w:pStyle w:val="CodeBlock"/>
+        <w:rPr>
+          <w:rFonts w:hint="eastAsia"/>
+        </w:rPr>
       </w:pPr>
       <w:r>
         <w:t>cd "C:\New Delphi Projects\Delphi App Translation"</w:t>
@@ -5553,6 +5768,9 @@
     <w:p>
       <w:pPr>
         <w:pStyle w:val="CodeBlock"/>
+        <w:rPr>
+          <w:rFonts w:hint="eastAsia"/>
+        </w:rPr>
       </w:pPr>
       <w:r>
         <w:t>powershell.exe -ExecutionPolicy Bypass -File .\tools\tests\RunPhase10ReleaseValidation.ps1</w:t>
@@ -5594,11 +5812,11 @@
       <w:pPr>
         <w:pStyle w:val="Heading2"/>
       </w:pPr>
-      <w:bookmarkStart w:id="12" w:name="_Toc237165446"/>
+      <w:bookmarkStart w:id="13" w:name="_Toc237169194"/>
       <w:r>
         <w:t>5.1 What the gate proves</w:t>
       </w:r>
-      <w:bookmarkEnd w:id="12"/>
+      <w:bookmarkEnd w:id="13"/>
     </w:p>
     <w:tbl>
       <w:tblPr>
@@ -5763,6 +5981,7 @@
                 <w:color w:val="163A63"/>
                 <w:sz w:val="18"/>
               </w:rPr>
+              <w:lastRenderedPageBreak/>
               <w:t>Studio</w:t>
             </w:r>
           </w:p>
@@ -5927,22 +6146,22 @@
       <w:pPr>
         <w:pStyle w:val="Heading1"/>
       </w:pPr>
-      <w:bookmarkStart w:id="13" w:name="_Toc237165447"/>
+      <w:bookmarkStart w:id="14" w:name="_Toc237169195"/>
       <w:r>
         <w:lastRenderedPageBreak/>
         <w:t>6. Manual Studio Acceptance</w:t>
       </w:r>
-      <w:bookmarkEnd w:id="13"/>
+      <w:bookmarkEnd w:id="14"/>
     </w:p>
     <w:p>
       <w:pPr>
         <w:pStyle w:val="Heading2"/>
       </w:pPr>
-      <w:bookmarkStart w:id="14" w:name="_Toc237165448"/>
+      <w:bookmarkStart w:id="15" w:name="_Toc237169196"/>
       <w:r>
         <w:t>TC-01 Launch and navigation</w:t>
       </w:r>
-      <w:bookmarkEnd w:id="14"/>
+      <w:bookmarkEnd w:id="15"/>
     </w:p>
     <w:tbl>
       <w:tblPr>
@@ -5973,6 +6192,9 @@
           <w:p>
             <w:pPr>
               <w:pStyle w:val="Callout"/>
+              <w:rPr>
+                <w:rFonts w:hint="eastAsia"/>
+              </w:rPr>
             </w:pPr>
             <w:r>
               <w:rPr>
@@ -6001,7 +6223,7 @@
         <w:pStyle w:val="ListNumber"/>
         <w:numPr>
           <w:ilvl w:val="0"/>
-          <w:numId w:val="12"/>
+          <w:numId w:val="13"/>
         </w:numPr>
       </w:pPr>
       <w:r>
@@ -6013,7 +6235,7 @@
         <w:pStyle w:val="ListNumber"/>
         <w:numPr>
           <w:ilvl w:val="0"/>
-          <w:numId w:val="12"/>
+          <w:numId w:val="13"/>
         </w:numPr>
       </w:pPr>
       <w:r>
@@ -6025,7 +6247,7 @@
         <w:pStyle w:val="ListNumber"/>
         <w:numPr>
           <w:ilvl w:val="0"/>
-          <w:numId w:val="12"/>
+          <w:numId w:val="13"/>
         </w:numPr>
       </w:pPr>
       <w:r>
@@ -6037,7 +6259,7 @@
         <w:pStyle w:val="ListNumber"/>
         <w:numPr>
           <w:ilvl w:val="0"/>
-          <w:numId w:val="12"/>
+          <w:numId w:val="13"/>
         </w:numPr>
       </w:pPr>
       <w:r>
@@ -6049,7 +6271,7 @@
         <w:pStyle w:val="ListNumber"/>
         <w:numPr>
           <w:ilvl w:val="0"/>
-          <w:numId w:val="12"/>
+          <w:numId w:val="13"/>
         </w:numPr>
       </w:pPr>
       <w:r>
@@ -6244,11 +6466,11 @@
       <w:pPr>
         <w:pStyle w:val="Heading2"/>
       </w:pPr>
-      <w:bookmarkStart w:id="15" w:name="_Toc237165449"/>
+      <w:bookmarkStart w:id="16" w:name="_Toc237169197"/>
       <w:r>
         <w:t>TC-02 Open the disposable GA4 project</w:t>
       </w:r>
-      <w:bookmarkEnd w:id="15"/>
+      <w:bookmarkEnd w:id="16"/>
     </w:p>
     <w:tbl>
       <w:tblPr>
@@ -6279,6 +6501,9 @@
           <w:p>
             <w:pPr>
               <w:pStyle w:val="Callout"/>
+              <w:rPr>
+                <w:rFonts w:hint="eastAsia"/>
+              </w:rPr>
             </w:pPr>
             <w:r>
               <w:rPr>
@@ -6307,7 +6532,7 @@
         <w:pStyle w:val="ListNumber"/>
         <w:numPr>
           <w:ilvl w:val="0"/>
-          <w:numId w:val="13"/>
+          <w:numId w:val="14"/>
         </w:numPr>
       </w:pPr>
       <w:r>
@@ -6319,7 +6544,7 @@
         <w:pStyle w:val="ListNumber"/>
         <w:numPr>
           <w:ilvl w:val="0"/>
-          <w:numId w:val="13"/>
+          <w:numId w:val="14"/>
         </w:numPr>
       </w:pPr>
       <w:r>
@@ -6331,7 +6556,7 @@
         <w:pStyle w:val="ListNumber"/>
         <w:numPr>
           <w:ilvl w:val="0"/>
-          <w:numId w:val="13"/>
+          <w:numId w:val="14"/>
         </w:numPr>
       </w:pPr>
       <w:r>
@@ -6343,7 +6568,7 @@
         <w:pStyle w:val="ListNumber"/>
         <w:numPr>
           <w:ilvl w:val="0"/>
-          <w:numId w:val="13"/>
+          <w:numId w:val="14"/>
         </w:numPr>
       </w:pPr>
       <w:r>
@@ -6531,11 +6756,11 @@
       <w:pPr>
         <w:pStyle w:val="Heading2"/>
       </w:pPr>
-      <w:bookmarkStart w:id="16" w:name="_Toc237165450"/>
+      <w:bookmarkStart w:id="17" w:name="_Toc237169198"/>
       <w:r>
         <w:t>TC-03 Scan the project</w:t>
       </w:r>
-      <w:bookmarkEnd w:id="16"/>
+      <w:bookmarkEnd w:id="17"/>
     </w:p>
     <w:tbl>
       <w:tblPr>
@@ -6566,6 +6791,9 @@
           <w:p>
             <w:pPr>
               <w:pStyle w:val="Callout"/>
+              <w:rPr>
+                <w:rFonts w:hint="eastAsia"/>
+              </w:rPr>
             </w:pPr>
             <w:r>
               <w:rPr>
@@ -6594,7 +6822,7 @@
         <w:pStyle w:val="ListNumber"/>
         <w:numPr>
           <w:ilvl w:val="0"/>
-          <w:numId w:val="14"/>
+          <w:numId w:val="15"/>
         </w:numPr>
       </w:pPr>
       <w:r>
@@ -6606,7 +6834,7 @@
         <w:pStyle w:val="ListNumber"/>
         <w:numPr>
           <w:ilvl w:val="0"/>
-          <w:numId w:val="14"/>
+          <w:numId w:val="15"/>
         </w:numPr>
       </w:pPr>
       <w:r>
@@ -6618,7 +6846,7 @@
         <w:pStyle w:val="ListNumber"/>
         <w:numPr>
           <w:ilvl w:val="0"/>
-          <w:numId w:val="14"/>
+          <w:numId w:val="15"/>
         </w:numPr>
       </w:pPr>
       <w:r>
@@ -6630,7 +6858,7 @@
         <w:pStyle w:val="ListNumber"/>
         <w:numPr>
           <w:ilvl w:val="0"/>
-          <w:numId w:val="14"/>
+          <w:numId w:val="15"/>
         </w:numPr>
       </w:pPr>
       <w:r>
@@ -6642,7 +6870,7 @@
         <w:pStyle w:val="ListNumber"/>
         <w:numPr>
           <w:ilvl w:val="0"/>
-          <w:numId w:val="14"/>
+          <w:numId w:val="15"/>
         </w:numPr>
       </w:pPr>
       <w:r>
@@ -6654,7 +6882,7 @@
         <w:pStyle w:val="ListNumber"/>
         <w:numPr>
           <w:ilvl w:val="0"/>
-          <w:numId w:val="14"/>
+          <w:numId w:val="15"/>
         </w:numPr>
       </w:pPr>
       <w:r>
@@ -6850,11 +7078,11 @@
       <w:pPr>
         <w:pStyle w:val="Heading2"/>
       </w:pPr>
-      <w:bookmarkStart w:id="17" w:name="_Toc237165451"/>
+      <w:bookmarkStart w:id="18" w:name="_Toc237169199"/>
       <w:r>
         <w:t>TC-04 Configure and test a provider</w:t>
       </w:r>
-      <w:bookmarkEnd w:id="17"/>
+      <w:bookmarkEnd w:id="18"/>
     </w:p>
     <w:tbl>
       <w:tblPr>
@@ -6885,6 +7113,9 @@
           <w:p>
             <w:pPr>
               <w:pStyle w:val="Callout"/>
+              <w:rPr>
+                <w:rFonts w:hint="eastAsia"/>
+              </w:rPr>
             </w:pPr>
             <w:r>
               <w:rPr>
@@ -6913,7 +7144,7 @@
         <w:pStyle w:val="ListNumber"/>
         <w:numPr>
           <w:ilvl w:val="0"/>
-          <w:numId w:val="15"/>
+          <w:numId w:val="16"/>
         </w:numPr>
       </w:pPr>
       <w:r>
@@ -6925,7 +7156,7 @@
         <w:pStyle w:val="ListNumber"/>
         <w:numPr>
           <w:ilvl w:val="0"/>
-          <w:numId w:val="15"/>
+          <w:numId w:val="16"/>
         </w:numPr>
       </w:pPr>
       <w:r>
@@ -6937,7 +7168,7 @@
         <w:pStyle w:val="ListNumber"/>
         <w:numPr>
           <w:ilvl w:val="0"/>
-          <w:numId w:val="15"/>
+          <w:numId w:val="16"/>
         </w:numPr>
       </w:pPr>
       <w:r>
@@ -6949,7 +7180,7 @@
         <w:pStyle w:val="ListNumber"/>
         <w:numPr>
           <w:ilvl w:val="0"/>
-          <w:numId w:val="15"/>
+          <w:numId w:val="16"/>
         </w:numPr>
       </w:pPr>
       <w:r>
@@ -6961,7 +7192,7 @@
         <w:pStyle w:val="ListNumber"/>
         <w:numPr>
           <w:ilvl w:val="0"/>
-          <w:numId w:val="15"/>
+          <w:numId w:val="16"/>
         </w:numPr>
       </w:pPr>
       <w:r>
@@ -6973,7 +7204,7 @@
         <w:pStyle w:val="ListNumber"/>
         <w:numPr>
           <w:ilvl w:val="0"/>
-          <w:numId w:val="15"/>
+          <w:numId w:val="16"/>
         </w:numPr>
       </w:pPr>
       <w:r>
@@ -6985,7 +7216,7 @@
         <w:pStyle w:val="ListNumber"/>
         <w:numPr>
           <w:ilvl w:val="0"/>
-          <w:numId w:val="15"/>
+          <w:numId w:val="16"/>
         </w:numPr>
       </w:pPr>
       <w:r>
@@ -7164,11 +7395,11 @@
       <w:pPr>
         <w:pStyle w:val="Heading2"/>
       </w:pPr>
-      <w:bookmarkStart w:id="18" w:name="_Toc237165452"/>
+      <w:bookmarkStart w:id="19" w:name="_Toc237169200"/>
       <w:r>
         <w:t>TC-05 Create the development catalog</w:t>
       </w:r>
-      <w:bookmarkEnd w:id="18"/>
+      <w:bookmarkEnd w:id="19"/>
     </w:p>
     <w:tbl>
       <w:tblPr>
@@ -7199,6 +7430,9 @@
           <w:p>
             <w:pPr>
               <w:pStyle w:val="Callout"/>
+              <w:rPr>
+                <w:rFonts w:hint="eastAsia"/>
+              </w:rPr>
             </w:pPr>
             <w:r>
               <w:rPr>
@@ -7227,7 +7461,7 @@
         <w:pStyle w:val="ListNumber"/>
         <w:numPr>
           <w:ilvl w:val="0"/>
-          <w:numId w:val="16"/>
+          <w:numId w:val="17"/>
         </w:numPr>
       </w:pPr>
       <w:r>
@@ -7239,7 +7473,7 @@
         <w:pStyle w:val="ListNumber"/>
         <w:numPr>
           <w:ilvl w:val="0"/>
-          <w:numId w:val="16"/>
+          <w:numId w:val="17"/>
         </w:numPr>
       </w:pPr>
       <w:r>
@@ -7252,7 +7486,7 @@
         <w:pStyle w:val="ListNumber"/>
         <w:numPr>
           <w:ilvl w:val="0"/>
-          <w:numId w:val="16"/>
+          <w:numId w:val="17"/>
         </w:numPr>
       </w:pPr>
       <w:r>
@@ -7264,7 +7498,7 @@
         <w:pStyle w:val="ListNumber"/>
         <w:numPr>
           <w:ilvl w:val="0"/>
-          <w:numId w:val="16"/>
+          <w:numId w:val="17"/>
         </w:numPr>
       </w:pPr>
       <w:r>
@@ -7276,7 +7510,7 @@
         <w:pStyle w:val="ListNumber"/>
         <w:numPr>
           <w:ilvl w:val="0"/>
-          <w:numId w:val="16"/>
+          <w:numId w:val="17"/>
         </w:numPr>
       </w:pPr>
       <w:r>
@@ -7288,7 +7522,7 @@
         <w:pStyle w:val="ListNumber"/>
         <w:numPr>
           <w:ilvl w:val="0"/>
-          <w:numId w:val="16"/>
+          <w:numId w:val="17"/>
         </w:numPr>
       </w:pPr>
       <w:r>
@@ -7459,11 +7693,11 @@
       <w:pPr>
         <w:pStyle w:val="Heading2"/>
       </w:pPr>
-      <w:bookmarkStart w:id="19" w:name="_Toc237165453"/>
+      <w:bookmarkStart w:id="20" w:name="_Toc237169201"/>
       <w:r>
         <w:t>TC-06 Translate automatically</w:t>
       </w:r>
-      <w:bookmarkEnd w:id="19"/>
+      <w:bookmarkEnd w:id="20"/>
     </w:p>
     <w:tbl>
       <w:tblPr>
@@ -7494,6 +7728,9 @@
           <w:p>
             <w:pPr>
               <w:pStyle w:val="Callout"/>
+              <w:rPr>
+                <w:rFonts w:hint="eastAsia"/>
+              </w:rPr>
             </w:pPr>
             <w:r>
               <w:rPr>
@@ -7522,7 +7759,7 @@
         <w:pStyle w:val="ListNumber"/>
         <w:numPr>
           <w:ilvl w:val="0"/>
-          <w:numId w:val="17"/>
+          <w:numId w:val="18"/>
         </w:numPr>
       </w:pPr>
       <w:r>
@@ -7534,7 +7771,7 @@
         <w:pStyle w:val="ListNumber"/>
         <w:numPr>
           <w:ilvl w:val="0"/>
-          <w:numId w:val="17"/>
+          <w:numId w:val="18"/>
         </w:numPr>
       </w:pPr>
       <w:r>
@@ -7546,7 +7783,7 @@
         <w:pStyle w:val="ListNumber"/>
         <w:numPr>
           <w:ilvl w:val="0"/>
-          <w:numId w:val="17"/>
+          <w:numId w:val="18"/>
         </w:numPr>
       </w:pPr>
       <w:r>
@@ -7558,7 +7795,7 @@
         <w:pStyle w:val="ListNumber"/>
         <w:numPr>
           <w:ilvl w:val="0"/>
-          <w:numId w:val="17"/>
+          <w:numId w:val="18"/>
         </w:numPr>
       </w:pPr>
       <w:r>
@@ -7570,7 +7807,7 @@
         <w:pStyle w:val="ListNumber"/>
         <w:numPr>
           <w:ilvl w:val="0"/>
-          <w:numId w:val="17"/>
+          <w:numId w:val="18"/>
         </w:numPr>
       </w:pPr>
       <w:r>
@@ -7758,11 +7995,11 @@
       <w:pPr>
         <w:pStyle w:val="Heading2"/>
       </w:pPr>
-      <w:bookmarkStart w:id="20" w:name="_Toc237165454"/>
+      <w:bookmarkStart w:id="21" w:name="_Toc237169202"/>
       <w:r>
         <w:t>TC-07 Focused linguistic and structural review</w:t>
       </w:r>
-      <w:bookmarkEnd w:id="20"/>
+      <w:bookmarkEnd w:id="21"/>
     </w:p>
     <w:tbl>
       <w:tblPr>
@@ -7793,6 +8030,9 @@
           <w:p>
             <w:pPr>
               <w:pStyle w:val="Callout"/>
+              <w:rPr>
+                <w:rFonts w:hint="eastAsia"/>
+              </w:rPr>
             </w:pPr>
             <w:r>
               <w:rPr>
@@ -7821,7 +8061,7 @@
         <w:pStyle w:val="ListNumber"/>
         <w:numPr>
           <w:ilvl w:val="0"/>
-          <w:numId w:val="18"/>
+          <w:numId w:val="19"/>
         </w:numPr>
       </w:pPr>
       <w:r>
@@ -7833,7 +8073,7 @@
         <w:pStyle w:val="ListNumber"/>
         <w:numPr>
           <w:ilvl w:val="0"/>
-          <w:numId w:val="18"/>
+          <w:numId w:val="19"/>
         </w:numPr>
       </w:pPr>
       <w:r>
@@ -7845,7 +8085,7 @@
         <w:pStyle w:val="ListNumber"/>
         <w:numPr>
           <w:ilvl w:val="0"/>
-          <w:numId w:val="18"/>
+          <w:numId w:val="19"/>
         </w:numPr>
       </w:pPr>
       <w:r>
@@ -7857,7 +8097,7 @@
         <w:pStyle w:val="ListNumber"/>
         <w:numPr>
           <w:ilvl w:val="0"/>
-          <w:numId w:val="18"/>
+          <w:numId w:val="19"/>
         </w:numPr>
       </w:pPr>
       <w:r>
@@ -7869,7 +8109,7 @@
         <w:pStyle w:val="ListNumber"/>
         <w:numPr>
           <w:ilvl w:val="0"/>
-          <w:numId w:val="18"/>
+          <w:numId w:val="19"/>
         </w:numPr>
       </w:pPr>
       <w:r>
@@ -8056,12 +8296,12 @@
       <w:pPr>
         <w:pStyle w:val="Heading2"/>
       </w:pPr>
-      <w:bookmarkStart w:id="21" w:name="_Toc237165455"/>
+      <w:bookmarkStart w:id="22" w:name="_Toc237169203"/>
       <w:r>
         <w:lastRenderedPageBreak/>
         <w:t>TC-08 Validate and export runtime JSON</w:t>
       </w:r>
-      <w:bookmarkEnd w:id="21"/>
+      <w:bookmarkEnd w:id="22"/>
     </w:p>
     <w:tbl>
       <w:tblPr>
@@ -8092,6 +8332,9 @@
           <w:p>
             <w:pPr>
               <w:pStyle w:val="Callout"/>
+              <w:rPr>
+                <w:rFonts w:hint="eastAsia"/>
+              </w:rPr>
             </w:pPr>
             <w:r>
               <w:rPr>
@@ -8120,7 +8363,7 @@
         <w:pStyle w:val="ListNumber"/>
         <w:numPr>
           <w:ilvl w:val="0"/>
-          <w:numId w:val="19"/>
+          <w:numId w:val="20"/>
         </w:numPr>
       </w:pPr>
       <w:r>
@@ -8132,7 +8375,7 @@
         <w:pStyle w:val="ListNumber"/>
         <w:numPr>
           <w:ilvl w:val="0"/>
-          <w:numId w:val="19"/>
+          <w:numId w:val="20"/>
         </w:numPr>
       </w:pPr>
       <w:r>
@@ -8144,7 +8387,7 @@
         <w:pStyle w:val="ListNumber"/>
         <w:numPr>
           <w:ilvl w:val="0"/>
-          <w:numId w:val="19"/>
+          <w:numId w:val="20"/>
         </w:numPr>
       </w:pPr>
       <w:r>
@@ -8156,7 +8399,7 @@
         <w:pStyle w:val="ListNumber"/>
         <w:numPr>
           <w:ilvl w:val="0"/>
-          <w:numId w:val="19"/>
+          <w:numId w:val="20"/>
         </w:numPr>
       </w:pPr>
       <w:r>
@@ -8168,7 +8411,7 @@
         <w:pStyle w:val="ListNumber"/>
         <w:numPr>
           <w:ilvl w:val="0"/>
-          <w:numId w:val="19"/>
+          <w:numId w:val="20"/>
         </w:numPr>
       </w:pPr>
       <w:r>
@@ -8180,7 +8423,7 @@
         <w:pStyle w:val="ListNumber"/>
         <w:numPr>
           <w:ilvl w:val="0"/>
-          <w:numId w:val="19"/>
+          <w:numId w:val="20"/>
         </w:numPr>
       </w:pPr>
       <w:r>
@@ -8364,22 +8607,22 @@
       <w:pPr>
         <w:pStyle w:val="Heading1"/>
       </w:pPr>
-      <w:bookmarkStart w:id="22" w:name="_Toc237165456"/>
+      <w:bookmarkStart w:id="23" w:name="_Toc237169204"/>
       <w:r>
         <w:lastRenderedPageBreak/>
         <w:t>7. Component Integration Acceptance</w:t>
       </w:r>
-      <w:bookmarkEnd w:id="22"/>
+      <w:bookmarkEnd w:id="23"/>
     </w:p>
     <w:p>
       <w:pPr>
         <w:pStyle w:val="Heading2"/>
       </w:pPr>
-      <w:bookmarkStart w:id="23" w:name="_Toc237165457"/>
+      <w:bookmarkStart w:id="24" w:name="_Toc237169205"/>
       <w:r>
         <w:t>TC-09 Generate the non-mutating component kit</w:t>
       </w:r>
-      <w:bookmarkEnd w:id="23"/>
+      <w:bookmarkEnd w:id="24"/>
     </w:p>
     <w:tbl>
       <w:tblPr>
@@ -8410,6 +8653,9 @@
           <w:p>
             <w:pPr>
               <w:pStyle w:val="Callout"/>
+              <w:rPr>
+                <w:rFonts w:hint="eastAsia"/>
+              </w:rPr>
             </w:pPr>
             <w:r>
               <w:rPr>
@@ -8438,7 +8684,7 @@
         <w:pStyle w:val="ListNumber"/>
         <w:numPr>
           <w:ilvl w:val="0"/>
-          <w:numId w:val="20"/>
+          <w:numId w:val="21"/>
         </w:numPr>
       </w:pPr>
       <w:r>
@@ -8450,7 +8696,7 @@
         <w:pStyle w:val="ListNumber"/>
         <w:numPr>
           <w:ilvl w:val="0"/>
-          <w:numId w:val="20"/>
+          <w:numId w:val="21"/>
         </w:numPr>
       </w:pPr>
       <w:r>
@@ -8462,7 +8708,7 @@
         <w:pStyle w:val="ListNumber"/>
         <w:numPr>
           <w:ilvl w:val="0"/>
-          <w:numId w:val="20"/>
+          <w:numId w:val="21"/>
         </w:numPr>
       </w:pPr>
       <w:r>
@@ -8474,7 +8720,7 @@
         <w:pStyle w:val="ListNumber"/>
         <w:numPr>
           <w:ilvl w:val="0"/>
-          <w:numId w:val="20"/>
+          <w:numId w:val="21"/>
         </w:numPr>
       </w:pPr>
       <w:r>
@@ -8486,7 +8732,7 @@
         <w:pStyle w:val="ListNumber"/>
         <w:numPr>
           <w:ilvl w:val="0"/>
-          <w:numId w:val="20"/>
+          <w:numId w:val="21"/>
         </w:numPr>
       </w:pPr>
       <w:r>
@@ -8498,7 +8744,7 @@
         <w:pStyle w:val="ListNumber"/>
         <w:numPr>
           <w:ilvl w:val="0"/>
-          <w:numId w:val="20"/>
+          <w:numId w:val="21"/>
         </w:numPr>
       </w:pPr>
       <w:r>
@@ -8526,7 +8772,15 @@
         <w:pStyle w:val="ListBullet"/>
       </w:pPr>
       <w:r>
-        <w:t>The kit contains README.txt, component-integration.json, Install-Components.cmd, Install-Components.ps1, DelphiPackages, Deploy-LanguagePacks.ps1, ComponentSource, and Localization\Languages.</w:t>
+        <w:t>The kit contains README.txt, component-integration.json, Deploy-LanguagePacks.ps1, ComponentSource, and Localization\Languages.</w:t>
+      </w:r>
+    </w:p>
+    <w:p>
+      <w:pPr>
+        <w:pStyle w:val="ListBullet"/>
+      </w:pPr>
+      <w:r>
+        <w:t>The replaceable per-project kit contains no DelphiPackages folder, no BPL, and no automatic installer. Delphi's registered package comes from the Studio's stable bin\packages\Win32\Release folder.</w:t>
       </w:r>
     </w:p>
     <w:p>
@@ -8685,11 +8939,12 @@
       <w:pPr>
         <w:pStyle w:val="Heading2"/>
       </w:pPr>
-      <w:bookmarkStart w:id="24" w:name="_Toc237165458"/>
-      <w:r>
+      <w:bookmarkStart w:id="25" w:name="_Toc237169206"/>
+      <w:r>
+        <w:lastRenderedPageBreak/>
         <w:t>7.1 Expected component-kit contents</w:t>
       </w:r>
-      <w:bookmarkEnd w:id="24"/>
+      <w:bookmarkEnd w:id="25"/>
     </w:p>
     <w:tbl>
       <w:tblPr>
@@ -8768,7 +9023,6 @@
                 <w:color w:val="163A63"/>
                 <w:sz w:val="17"/>
               </w:rPr>
-              <w:lastRenderedPageBreak/>
               <w:t>README.txt</w:t>
             </w:r>
           </w:p>
@@ -8812,7 +9066,7 @@
                 <w:color w:val="163A63"/>
                 <w:sz w:val="17"/>
               </w:rPr>
-              <w:t>Install-Components.ps1</w:t>
+              <w:t>component-integration.json</w:t>
             </w:r>
           </w:p>
         </w:tc>
@@ -8831,7 +9085,7 @@
                 <w:color w:val="163A63"/>
                 <w:sz w:val="17"/>
               </w:rPr>
-              <w:t>One-step build/copy/register installer; auto-detects the framework bundled in the kit.</w:t>
+              <w:t>Application identity, FMX framework, manager/selector classes, language metadata, and scanner form roots.</w:t>
             </w:r>
           </w:p>
         </w:tc>
@@ -8855,7 +9109,7 @@
                 <w:color w:val="163A63"/>
                 <w:sz w:val="17"/>
               </w:rPr>
-              <w:t>Install-Components.cmd</w:t>
+              <w:t>Deploy-LanguagePacks.ps1</w:t>
             </w:r>
           </w:p>
         </w:tc>
@@ -8873,7 +9127,7 @@
                 <w:color w:val="163A63"/>
                 <w:sz w:val="17"/>
               </w:rPr>
-              <w:t>Double-click launcher that invokes the installer with ExecutionPolicy Bypass and keeps the result visible.</w:t>
+              <w:t>Copies only JSON packs to a selected executable directory.</w:t>
             </w:r>
           </w:p>
         </w:tc>
@@ -8898,7 +9152,7 @@
                 <w:color w:val="163A63"/>
                 <w:sz w:val="17"/>
               </w:rPr>
-              <w:t>DelphiPackages\*.bpl</w:t>
+              <w:t>Localization\Languages\en-US.json</w:t>
             </w:r>
           </w:p>
         </w:tc>
@@ -8917,7 +9171,7 @@
                 <w:color w:val="163A63"/>
                 <w:sz w:val="17"/>
               </w:rPr>
-              <w:t>Verified Win32 core, framework runtime, and self-contained design packages.</w:t>
+              <w:t>Generated source-language pack for deterministic return to English.</w:t>
             </w:r>
           </w:p>
         </w:tc>
@@ -8941,7 +9195,7 @@
                 <w:color w:val="163A63"/>
                 <w:sz w:val="17"/>
               </w:rPr>
-              <w:t>component-integration.json</w:t>
+              <w:t>Localization\Languages\&lt;locale&gt;.json</w:t>
             </w:r>
           </w:p>
         </w:tc>
@@ -8959,7 +9213,7 @@
                 <w:color w:val="163A63"/>
                 <w:sz w:val="17"/>
               </w:rPr>
-              <w:t>Application identity, FMX framework, manager/selector classes, language metadata, and scanner form roots.</w:t>
+              <w:t>Validated translated runtime pack.</w:t>
             </w:r>
           </w:p>
         </w:tc>
@@ -8984,7 +9238,7 @@
                 <w:color w:val="163A63"/>
                 <w:sz w:val="17"/>
               </w:rPr>
-              <w:t>Deploy-LanguagePacks.ps1</w:t>
+              <w:t>ComponentSource\DAT.Components.Core.pas</w:t>
             </w:r>
           </w:p>
         </w:tc>
@@ -9003,7 +9257,7 @@
                 <w:color w:val="163A63"/>
                 <w:sz w:val="17"/>
               </w:rPr>
-              <w:t>Copies only JSON packs to a selected executable directory.</w:t>
+              <w:t>Framework-neutral manager core.</w:t>
             </w:r>
           </w:p>
         </w:tc>
@@ -9027,7 +9281,7 @@
                 <w:color w:val="163A63"/>
                 <w:sz w:val="17"/>
               </w:rPr>
-              <w:t>Localization\Languages\en-US.json</w:t>
+              <w:t>ComponentSource\DAT.Components.FMX.pas</w:t>
             </w:r>
           </w:p>
         </w:tc>
@@ -9045,7 +9299,7 @@
                 <w:color w:val="163A63"/>
                 <w:sz w:val="17"/>
               </w:rPr>
-              <w:t>Generated source-language pack for deterministic return to English.</w:t>
+              <w:t>FMX lifecycle adapter and manager.</w:t>
             </w:r>
           </w:p>
         </w:tc>
@@ -9070,7 +9324,7 @@
                 <w:color w:val="163A63"/>
                 <w:sz w:val="17"/>
               </w:rPr>
-              <w:t>Localization\Languages\&lt;locale&gt;.json</w:t>
+              <w:t>ComponentSource\DAT.Components.FMX.LanguageSelector.pas</w:t>
             </w:r>
           </w:p>
         </w:tc>
@@ -9089,7 +9343,7 @@
                 <w:color w:val="163A63"/>
                 <w:sz w:val="17"/>
               </w:rPr>
-              <w:t>Validated translated runtime pack.</w:t>
+              <w:t>Optional typed FMX language combo box.</w:t>
             </w:r>
           </w:p>
         </w:tc>
@@ -9113,143 +9367,13 @@
                 <w:color w:val="163A63"/>
                 <w:sz w:val="17"/>
               </w:rPr>
-              <w:t>ComponentSource\DAT.Components.Core.pas</w:t>
+              <w:t>ComponentSource\DAT.Runtime.*.pas</w:t>
             </w:r>
           </w:p>
         </w:tc>
         <w:tc>
           <w:tcPr>
             <w:tcW w:w="5260" w:type="dxa"/>
-            <w:vAlign w:val="center"/>
-          </w:tcPr>
-          <w:p>
-            <w:pPr>
-              <w:spacing w:after="40" w:line="252" w:lineRule="auto"/>
-            </w:pPr>
-            <w:r>
-              <w:rPr>
-                <w:color w:val="163A63"/>
-                <w:sz w:val="17"/>
-              </w:rPr>
-              <w:t>Framework-neutral manager core.</w:t>
-            </w:r>
-          </w:p>
-        </w:tc>
-      </w:tr>
-      <w:tr>
-        <w:trPr>
-          <w:cantSplit/>
-          <w:jc w:val="center"/>
-        </w:trPr>
-        <w:tc>
-          <w:tcPr>
-            <w:tcW w:w="4100" w:type="dxa"/>
-            <w:shd w:val="clear" w:color="auto" w:fill="F6F9FC"/>
-            <w:vAlign w:val="center"/>
-          </w:tcPr>
-          <w:p>
-            <w:pPr>
-              <w:spacing w:after="40" w:line="252" w:lineRule="auto"/>
-            </w:pPr>
-            <w:r>
-              <w:rPr>
-                <w:color w:val="163A63"/>
-                <w:sz w:val="17"/>
-              </w:rPr>
-              <w:t>ComponentSource\DAT.Components.FMX.pas</w:t>
-            </w:r>
-          </w:p>
-        </w:tc>
-        <w:tc>
-          <w:tcPr>
-            <w:tcW w:w="5260" w:type="dxa"/>
-            <w:shd w:val="clear" w:color="auto" w:fill="F6F9FC"/>
-            <w:vAlign w:val="center"/>
-          </w:tcPr>
-          <w:p>
-            <w:pPr>
-              <w:spacing w:after="40" w:line="252" w:lineRule="auto"/>
-            </w:pPr>
-            <w:r>
-              <w:rPr>
-                <w:color w:val="163A63"/>
-                <w:sz w:val="17"/>
-              </w:rPr>
-              <w:t>FMX lifecycle adapter and manager.</w:t>
-            </w:r>
-          </w:p>
-        </w:tc>
-      </w:tr>
-      <w:tr>
-        <w:trPr>
-          <w:cantSplit/>
-          <w:jc w:val="center"/>
-        </w:trPr>
-        <w:tc>
-          <w:tcPr>
-            <w:tcW w:w="4100" w:type="dxa"/>
-            <w:vAlign w:val="center"/>
-          </w:tcPr>
-          <w:p>
-            <w:pPr>
-              <w:spacing w:after="40" w:line="252" w:lineRule="auto"/>
-            </w:pPr>
-            <w:r>
-              <w:rPr>
-                <w:color w:val="163A63"/>
-                <w:sz w:val="17"/>
-              </w:rPr>
-              <w:t>ComponentSource\DAT.Components.FMX.LanguageSelector.pas</w:t>
-            </w:r>
-          </w:p>
-        </w:tc>
-        <w:tc>
-          <w:tcPr>
-            <w:tcW w:w="5260" w:type="dxa"/>
-            <w:vAlign w:val="center"/>
-          </w:tcPr>
-          <w:p>
-            <w:pPr>
-              <w:spacing w:after="40" w:line="252" w:lineRule="auto"/>
-            </w:pPr>
-            <w:r>
-              <w:rPr>
-                <w:color w:val="163A63"/>
-                <w:sz w:val="17"/>
-              </w:rPr>
-              <w:t>Optional typed FMX language combo box.</w:t>
-            </w:r>
-          </w:p>
-        </w:tc>
-      </w:tr>
-      <w:tr>
-        <w:trPr>
-          <w:cantSplit/>
-          <w:jc w:val="center"/>
-        </w:trPr>
-        <w:tc>
-          <w:tcPr>
-            <w:tcW w:w="4100" w:type="dxa"/>
-            <w:shd w:val="clear" w:color="auto" w:fill="F6F9FC"/>
-            <w:vAlign w:val="center"/>
-          </w:tcPr>
-          <w:p>
-            <w:pPr>
-              <w:spacing w:after="40" w:line="252" w:lineRule="auto"/>
-            </w:pPr>
-            <w:r>
-              <w:rPr>
-                <w:color w:val="163A63"/>
-                <w:sz w:val="17"/>
-              </w:rPr>
-              <w:t>ComponentSource\DAT.Runtime.*.pas</w:t>
-            </w:r>
-          </w:p>
-        </w:tc>
-        <w:tc>
-          <w:tcPr>
-            <w:tcW w:w="5260" w:type="dxa"/>
-            <w:shd w:val="clear" w:color="auto" w:fill="F6F9FC"/>
             <w:vAlign w:val="center"/>
           </w:tcPr>
           <w:p>
@@ -9272,11 +9396,11 @@
       <w:pPr>
         <w:pStyle w:val="Heading2"/>
       </w:pPr>
-      <w:bookmarkStart w:id="25" w:name="_Toc237165459"/>
-      <w:r>
-        <w:t>TC-10 Install or repair the FMX components</w:t>
-      </w:r>
-      <w:bookmarkEnd w:id="25"/>
+      <w:bookmarkStart w:id="26" w:name="_Toc237169207"/>
+      <w:r>
+        <w:t>TC-10 Install the FMX design package through Delphi</w:t>
+      </w:r>
+      <w:bookmarkEnd w:id="26"/>
     </w:p>
     <w:tbl>
       <w:tblPr>
@@ -9307,6 +9431,9 @@
           <w:p>
             <w:pPr>
               <w:pStyle w:val="Callout"/>
+              <w:rPr>
+                <w:rFonts w:hint="eastAsia"/>
+              </w:rPr>
             </w:pPr>
             <w:r>
               <w:rPr>
@@ -9316,7 +9443,7 @@
               <w:t xml:space="preserve">Objective. </w:t>
             </w:r>
             <w:r>
-              <w:t>Use the supported one-step setup to make the manager and selector available on DAT Localization without changing the target.</w:t>
+              <w:t>Use RAD Studio's standard package manager to make the manager and selector available without changing the target.</w:t>
             </w:r>
           </w:p>
         </w:tc>
@@ -9335,11 +9462,11 @@
         <w:pStyle w:val="ListNumber"/>
         <w:numPr>
           <w:ilvl w:val="0"/>
-          <w:numId w:val="21"/>
+          <w:numId w:val="22"/>
         </w:numPr>
       </w:pPr>
       <w:r>
-        <w:t>Close every RAD Studio window. Leave Delphi App Translation Studio open.</w:t>
+        <w:t>In the Translation Studio Integration page, choose Show Design BPL. Confirm File Explorer selects C:\New Delphi Projects\Delphi App Translation\bin\packages\Win32\Release\DATLanguageManagerFMXDesign.bpl.</w:t>
       </w:r>
     </w:p>
     <w:p>
@@ -9347,11 +9474,11 @@
         <w:pStyle w:val="ListNumber"/>
         <w:numPr>
           <w:ilvl w:val="0"/>
-          <w:numId w:val="21"/>
+          <w:numId w:val="22"/>
         </w:numPr>
       </w:pPr>
       <w:r>
-        <w:t>On Integration, choose Install / Repair Components and approve the Windows prompt. The equivalent direct command is powershell.exe -ExecutionPolicy Bypass -File .\tools\Install-DATLanguageManagerComponents.ps1 -Framework FMX -Configuration Release -Action Repair.</w:t>
+        <w:t>Start or activate RAD Studio without opening the disposable target project or a target form.</w:t>
       </w:r>
     </w:p>
     <w:p>
@@ -9359,11 +9486,11 @@
         <w:pStyle w:val="ListNumber"/>
         <w:numPr>
           <w:ilvl w:val="0"/>
-          <w:numId w:val="21"/>
+          <w:numId w:val="22"/>
         </w:numPr>
       </w:pPr>
       <w:r>
-        <w:t>Wait for the build, verification, copy, and registration success messages. Restart RAD Studio.</w:t>
+        <w:t>Choose Component &gt; Install Packages, then choose Add.</w:t>
       </w:r>
     </w:p>
     <w:p>
@@ -9371,11 +9498,11 @@
         <w:pStyle w:val="ListNumber"/>
         <w:numPr>
           <w:ilvl w:val="0"/>
-          <w:numId w:val="21"/>
+          <w:numId w:val="22"/>
         </w:numPr>
       </w:pPr>
       <w:r>
-        <w:t>Before opening a project form, choose Component &gt; Install Packages. Confirm the normal Embarcadero package list remains present, Embarcadero FMX Components is listed and checked, and the DAT Language Manager FireMonkey design-time package is listed and checked.</w:t>
+        <w:t>Browse to the exact BPL selected by Show Design BPL, select DATLanguageManagerFMXDesign.bpl, and choose Open. Never use Component &gt; Install Component and never select DATLanguageManagerFMXDesign.dpk.</w:t>
       </w:r>
     </w:p>
     <w:p>
@@ -9383,11 +9510,11 @@
         <w:pStyle w:val="ListNumber"/>
         <w:numPr>
           <w:ilvl w:val="0"/>
-          <w:numId w:val="21"/>
+          <w:numId w:val="22"/>
         </w:numPr>
       </w:pPr>
       <w:r>
-        <w:t>Open an FMX form and confirm DAT Localization appears in the Tool Palette.</w:t>
+        <w:t>Confirm DAT Language Manager FireMonkey design-time package is listed and checked. Confirm the normal Embarcadero package list remains present and Embarcadero FMX Components is listed and checked. Choose OK.</w:t>
       </w:r>
     </w:p>
     <w:p>
@@ -9395,19 +9522,19 @@
         <w:pStyle w:val="ListNumber"/>
         <w:numPr>
           <w:ilvl w:val="0"/>
-          <w:numId w:val="21"/>
+          <w:numId w:val="22"/>
         </w:numPr>
       </w:pPr>
       <w:r>
+        <w:t>Open an FMX form and confirm DAT Localization appears in the Tool Palette.</w:t>
+      </w:r>
+    </w:p>
+    <w:p>
+      <w:pPr>
+        <w:pStyle w:val="Heading3"/>
+      </w:pPr>
+      <w:r>
         <w:lastRenderedPageBreak/>
-        <w:t>For the documented manual fallback only, use Component &gt; Install Packages &gt; Add and select the compiled DATLanguageManagerFMXDesign.bpl. Never use Component &gt; Install Component and never select DATLanguageManagerFMXDesign.dpk.</w:t>
-      </w:r>
-    </w:p>
-    <w:p>
-      <w:pPr>
-        <w:pStyle w:val="Heading3"/>
-      </w:pPr>
-      <w:r>
         <w:t>Expected result</w:t>
       </w:r>
     </w:p>
@@ -9424,7 +9551,7 @@
         <w:pStyle w:val="ListBullet"/>
       </w:pPr>
       <w:r>
-        <w:t>The three FMX-related BPL files are present under C:\Users\Public\Documents\Embarcadero\Studio\37.0\Bpl.</w:t>
+        <w:t>The stable Studio bin\packages path remains the registered package location; the Studio has not copied any BPL into a Delphi system or public Bpl folder.</w:t>
       </w:r>
     </w:p>
     <w:p>
@@ -9448,7 +9575,7 @@
         <w:pStyle w:val="ListBullet"/>
       </w:pPr>
       <w:r>
-        <w:t>Every package left in the effective per-user list has an installed BPL; stale optional registrations do not produce an IDE-startup error.</w:t>
+        <w:t>Closing and reopening RAD Studio produces no package-load error.</w:t>
       </w:r>
     </w:p>
     <w:p>
@@ -9587,16 +9714,6 @@
       </w:tr>
     </w:tbl>
     <w:p/>
-    <w:p>
-      <w:pPr>
-        <w:pStyle w:val="Heading2"/>
-      </w:pPr>
-      <w:bookmarkStart w:id="26" w:name="_Toc237165460"/>
-      <w:r>
-        <w:t>TC-11 Perform the visible Delphi integration</w:t>
-      </w:r>
-      <w:bookmarkEnd w:id="26"/>
-    </w:p>
     <w:tbl>
       <w:tblPr>
         <w:tblW w:w="9360" w:type="dxa"/>
@@ -9626,6 +9743,66 @@
           <w:p>
             <w:pPr>
               <w:pStyle w:val="Callout"/>
+              <w:rPr>
+                <w:rFonts w:hint="eastAsia"/>
+              </w:rPr>
+            </w:pPr>
+            <w:r>
+              <w:rPr>
+                <w:b/>
+                <w:color w:val="234C80"/>
+              </w:rPr>
+              <w:t xml:space="preserve">Do not register a generated-kit path. </w:t>
+            </w:r>
+            <w:r>
+              <w:t>Per-project component kits are replaceable output. Installing a BPL from a kit would make Delphi depend on a volatile path and could prevent clean kit regeneration. Always use Show Design BPL and the stable Studio bin\packages\Win32\Release file.</w:t>
+            </w:r>
+          </w:p>
+        </w:tc>
+      </w:tr>
+    </w:tbl>
+    <w:p>
+      <w:pPr>
+        <w:pStyle w:val="Heading2"/>
+      </w:pPr>
+      <w:bookmarkStart w:id="27" w:name="_Toc237169208"/>
+      <w:r>
+        <w:t>TC-11 Perform the visible Delphi integration</w:t>
+      </w:r>
+      <w:bookmarkEnd w:id="27"/>
+    </w:p>
+    <w:tbl>
+      <w:tblPr>
+        <w:tblW w:w="9360" w:type="dxa"/>
+        <w:jc w:val="center"/>
+        <w:tblLayout w:type="fixed"/>
+        <w:tblCellMar>
+          <w:top w:w="80" w:type="dxa"/>
+          <w:left w:w="120" w:type="dxa"/>
+          <w:bottom w:w="80" w:type="dxa"/>
+          <w:right w:w="120" w:type="dxa"/>
+        </w:tblCellMar>
+        <w:tblLook w:val="04A0" w:firstRow="1" w:lastRow="0" w:firstColumn="1" w:lastColumn="0" w:noHBand="0" w:noVBand="1"/>
+      </w:tblPr>
+      <w:tblGrid>
+        <w:gridCol w:w="9360"/>
+      </w:tblGrid>
+      <w:tr>
+        <w:trPr>
+          <w:jc w:val="center"/>
+        </w:trPr>
+        <w:tc>
+          <w:tcPr>
+            <w:tcW w:w="9360" w:type="dxa"/>
+            <w:shd w:val="clear" w:color="auto" w:fill="EAF3FF"/>
+            <w:vAlign w:val="center"/>
+          </w:tcPr>
+          <w:p>
+            <w:pPr>
+              <w:pStyle w:val="Callout"/>
+              <w:rPr>
+                <w:rFonts w:hint="eastAsia"/>
+              </w:rPr>
             </w:pPr>
             <w:r>
               <w:rPr>
@@ -9654,7 +9831,7 @@
         <w:pStyle w:val="ListNumber"/>
         <w:numPr>
           <w:ilvl w:val="0"/>
-          <w:numId w:val="22"/>
+          <w:numId w:val="23"/>
         </w:numPr>
       </w:pPr>
       <w:r>
@@ -9666,7 +9843,7 @@
         <w:pStyle w:val="ListNumber"/>
         <w:numPr>
           <w:ilvl w:val="0"/>
-          <w:numId w:val="22"/>
+          <w:numId w:val="23"/>
         </w:numPr>
       </w:pPr>
       <w:r>
@@ -9678,7 +9855,7 @@
         <w:pStyle w:val="ListNumber"/>
         <w:numPr>
           <w:ilvl w:val="0"/>
-          <w:numId w:val="22"/>
+          <w:numId w:val="23"/>
         </w:numPr>
       </w:pPr>
       <w:r>
@@ -9690,7 +9867,7 @@
         <w:pStyle w:val="ListNumber"/>
         <w:numPr>
           <w:ilvl w:val="0"/>
-          <w:numId w:val="22"/>
+          <w:numId w:val="23"/>
         </w:numPr>
       </w:pPr>
       <w:r>
@@ -9702,7 +9879,7 @@
         <w:pStyle w:val="ListNumber"/>
         <w:numPr>
           <w:ilvl w:val="0"/>
-          <w:numId w:val="22"/>
+          <w:numId w:val="23"/>
         </w:numPr>
       </w:pPr>
       <w:r>
@@ -9714,7 +9891,7 @@
         <w:pStyle w:val="ListNumber"/>
         <w:numPr>
           <w:ilvl w:val="0"/>
-          <w:numId w:val="22"/>
+          <w:numId w:val="23"/>
         </w:numPr>
       </w:pPr>
       <w:r>
@@ -9726,11 +9903,10 @@
         <w:pStyle w:val="ListNumber"/>
         <w:numPr>
           <w:ilvl w:val="0"/>
-          <w:numId w:val="22"/>
+          <w:numId w:val="23"/>
         </w:numPr>
       </w:pPr>
       <w:r>
-        <w:lastRenderedPageBreak/>
         <w:t>Place one TDATFMXLanguageComboBox in an appropriate visible header/menu area.</w:t>
       </w:r>
     </w:p>
@@ -9739,10 +9915,11 @@
         <w:pStyle w:val="ListNumber"/>
         <w:numPr>
           <w:ilvl w:val="0"/>
-          <w:numId w:val="22"/>
+          <w:numId w:val="23"/>
         </w:numPr>
       </w:pPr>
       <w:r>
+        <w:lastRenderedPageBreak/>
         <w:t>Set its LanguageManager property to the manager. Leave AutoPopulate and ShowLanguageCode True.</w:t>
       </w:r>
     </w:p>
@@ -9751,7 +9928,7 @@
         <w:pStyle w:val="ListNumber"/>
         <w:numPr>
           <w:ilvl w:val="0"/>
-          <w:numId w:val="22"/>
+          <w:numId w:val="23"/>
         </w:numPr>
       </w:pPr>
       <w:r>
@@ -9955,6 +10132,9 @@
           <w:p>
             <w:pPr>
               <w:pStyle w:val="Callout"/>
+              <w:rPr>
+                <w:rFonts w:hint="eastAsia"/>
+              </w:rPr>
             </w:pPr>
             <w:r>
               <w:rPr>
@@ -9974,11 +10154,11 @@
       <w:pPr>
         <w:pStyle w:val="Heading2"/>
       </w:pPr>
-      <w:bookmarkStart w:id="27" w:name="_Toc237165461"/>
+      <w:bookmarkStart w:id="28" w:name="_Toc237169209"/>
       <w:r>
         <w:t>TC-12 Build GA4 Win32 and Win64</w:t>
       </w:r>
-      <w:bookmarkEnd w:id="27"/>
+      <w:bookmarkEnd w:id="28"/>
     </w:p>
     <w:tbl>
       <w:tblPr>
@@ -10009,6 +10189,9 @@
           <w:p>
             <w:pPr>
               <w:pStyle w:val="Callout"/>
+              <w:rPr>
+                <w:rFonts w:hint="eastAsia"/>
+              </w:rPr>
             </w:pPr>
             <w:r>
               <w:rPr>
@@ -10037,7 +10220,7 @@
         <w:pStyle w:val="ListNumber"/>
         <w:numPr>
           <w:ilvl w:val="0"/>
-          <w:numId w:val="23"/>
+          <w:numId w:val="24"/>
         </w:numPr>
       </w:pPr>
       <w:r>
@@ -10049,7 +10232,7 @@
         <w:pStyle w:val="ListNumber"/>
         <w:numPr>
           <w:ilvl w:val="0"/>
-          <w:numId w:val="23"/>
+          <w:numId w:val="24"/>
         </w:numPr>
       </w:pPr>
       <w:r>
@@ -10061,7 +10244,7 @@
         <w:pStyle w:val="ListNumber"/>
         <w:numPr>
           <w:ilvl w:val="0"/>
-          <w:numId w:val="23"/>
+          <w:numId w:val="24"/>
         </w:numPr>
       </w:pPr>
       <w:r>
@@ -10073,7 +10256,7 @@
         <w:pStyle w:val="ListNumber"/>
         <w:numPr>
           <w:ilvl w:val="0"/>
-          <w:numId w:val="23"/>
+          <w:numId w:val="24"/>
         </w:numPr>
       </w:pPr>
       <w:r>
@@ -10085,7 +10268,7 @@
         <w:pStyle w:val="ListNumber"/>
         <w:numPr>
           <w:ilvl w:val="0"/>
-          <w:numId w:val="23"/>
+          <w:numId w:val="24"/>
         </w:numPr>
       </w:pPr>
       <w:r>
@@ -10097,23 +10280,23 @@
         <w:pStyle w:val="Heading3"/>
       </w:pPr>
       <w:r>
+        <w:t>Expected result</w:t>
+      </w:r>
+    </w:p>
+    <w:p>
+      <w:pPr>
+        <w:pStyle w:val="ListBullet"/>
+      </w:pPr>
+      <w:r>
+        <w:t>Both builds finish with no compiler or linker errors.</w:t>
+      </w:r>
+    </w:p>
+    <w:p>
+      <w:pPr>
+        <w:pStyle w:val="ListBullet"/>
+      </w:pPr>
+      <w:r>
         <w:lastRenderedPageBreak/>
-        <w:t>Expected result</w:t>
-      </w:r>
-    </w:p>
-    <w:p>
-      <w:pPr>
-        <w:pStyle w:val="ListBullet"/>
-      </w:pPr>
-      <w:r>
-        <w:t>Both builds finish with no compiler or linker errors.</w:t>
-      </w:r>
-    </w:p>
-    <w:p>
-      <w:pPr>
-        <w:pStyle w:val="ListBullet"/>
-      </w:pPr>
-      <w:r>
         <w:t>The target contains the manager and selector through normal compiled source/designer resources.</w:t>
       </w:r>
     </w:p>
@@ -10257,11 +10440,11 @@
       <w:pPr>
         <w:pStyle w:val="Heading2"/>
       </w:pPr>
-      <w:bookmarkStart w:id="28" w:name="_Toc237165462"/>
+      <w:bookmarkStart w:id="29" w:name="_Toc237169210"/>
       <w:r>
         <w:t>TC-13 Deploy language packs</w:t>
       </w:r>
-      <w:bookmarkEnd w:id="28"/>
+      <w:bookmarkEnd w:id="29"/>
     </w:p>
     <w:tbl>
       <w:tblPr>
@@ -10292,6 +10475,9 @@
           <w:p>
             <w:pPr>
               <w:pStyle w:val="Callout"/>
+              <w:rPr>
+                <w:rFonts w:hint="eastAsia"/>
+              </w:rPr>
             </w:pPr>
             <w:r>
               <w:rPr>
@@ -10320,7 +10506,7 @@
         <w:pStyle w:val="ListNumber"/>
         <w:numPr>
           <w:ilvl w:val="0"/>
-          <w:numId w:val="24"/>
+          <w:numId w:val="25"/>
         </w:numPr>
       </w:pPr>
       <w:r>
@@ -10332,7 +10518,7 @@
         <w:pStyle w:val="ListNumber"/>
         <w:numPr>
           <w:ilvl w:val="0"/>
-          <w:numId w:val="24"/>
+          <w:numId w:val="25"/>
         </w:numPr>
       </w:pPr>
       <w:r>
@@ -10344,7 +10530,7 @@
         <w:pStyle w:val="ListNumber"/>
         <w:numPr>
           <w:ilvl w:val="0"/>
-          <w:numId w:val="24"/>
+          <w:numId w:val="25"/>
         </w:numPr>
       </w:pPr>
       <w:r>
@@ -10356,7 +10542,7 @@
         <w:pStyle w:val="ListNumber"/>
         <w:numPr>
           <w:ilvl w:val="0"/>
-          <w:numId w:val="24"/>
+          <w:numId w:val="25"/>
         </w:numPr>
       </w:pPr>
       <w:r>
@@ -10534,6 +10720,9 @@
     <w:p>
       <w:pPr>
         <w:pStyle w:val="CodeBlock"/>
+        <w:rPr>
+          <w:rFonts w:hint="eastAsia"/>
+        </w:rPr>
       </w:pPr>
       <w:r>
         <w:t>&amp; "C:\New Delphi Projects\Delphi App Translation\export\component-integration\WebsiteAnalytics\Deploy-LanguagePacks.ps1" -ApplicationDirectory "C:\New Delphi Projects\Echurchsite Analytical - Component Test\bin\Win32\Debug"</w:t>
@@ -10542,31 +10731,34 @@
     <w:p>
       <w:pPr>
         <w:pStyle w:val="CodeBlock"/>
-      </w:pPr>
+        <w:rPr>
+          <w:rFonts w:hint="eastAsia"/>
+        </w:rPr>
+      </w:pPr>
+      <w:r>
+        <w:t>&amp; "C:\New Delphi Projects\Delphi App Translation\export\component-integration\WebsiteAnalytics\Deploy-LanguagePacks.ps1" -ApplicationDirectory "C:\New Delphi Projects\Echurchsite Analytical - Component Test\bin\Win64\Debug"</w:t>
+      </w:r>
+    </w:p>
+    <w:p>
+      <w:pPr>
+        <w:pStyle w:val="Heading1"/>
+      </w:pPr>
+      <w:bookmarkStart w:id="30" w:name="_Toc237169211"/>
       <w:r>
         <w:lastRenderedPageBreak/>
-        <w:t>&amp; "C:\New Delphi Projects\Delphi App Translation\export\component-integration\WebsiteAnalytics\Deploy-LanguagePacks.ps1" -ApplicationDirectory "C:\New Delphi Projects\Echurchsite Analytical - Component Test\bin\Win64\Debug"</w:t>
-      </w:r>
-    </w:p>
-    <w:p>
-      <w:pPr>
-        <w:pStyle w:val="Heading1"/>
-      </w:pPr>
-      <w:bookmarkStart w:id="29" w:name="_Toc237165463"/>
-      <w:r>
         <w:t>8. Runtime Acceptance</w:t>
       </w:r>
-      <w:bookmarkEnd w:id="29"/>
+      <w:bookmarkEnd w:id="30"/>
     </w:p>
     <w:p>
       <w:pPr>
         <w:pStyle w:val="Heading2"/>
       </w:pPr>
-      <w:bookmarkStart w:id="30" w:name="_Toc237165464"/>
+      <w:bookmarkStart w:id="31" w:name="_Toc237169212"/>
       <w:r>
         <w:t>TC-14 First launch and source language</w:t>
       </w:r>
-      <w:bookmarkEnd w:id="30"/>
+      <w:bookmarkEnd w:id="31"/>
     </w:p>
     <w:tbl>
       <w:tblPr>
@@ -10597,6 +10789,9 @@
           <w:p>
             <w:pPr>
               <w:pStyle w:val="Callout"/>
+              <w:rPr>
+                <w:rFonts w:hint="eastAsia"/>
+              </w:rPr>
             </w:pPr>
             <w:r>
               <w:rPr>
@@ -10625,7 +10820,7 @@
         <w:pStyle w:val="ListNumber"/>
         <w:numPr>
           <w:ilvl w:val="0"/>
-          <w:numId w:val="25"/>
+          <w:numId w:val="26"/>
         </w:numPr>
       </w:pPr>
       <w:r>
@@ -10637,7 +10832,7 @@
         <w:pStyle w:val="ListNumber"/>
         <w:numPr>
           <w:ilvl w:val="0"/>
-          <w:numId w:val="25"/>
+          <w:numId w:val="26"/>
         </w:numPr>
       </w:pPr>
       <w:r>
@@ -10649,7 +10844,7 @@
         <w:pStyle w:val="ListNumber"/>
         <w:numPr>
           <w:ilvl w:val="0"/>
-          <w:numId w:val="25"/>
+          <w:numId w:val="26"/>
         </w:numPr>
       </w:pPr>
       <w:r>
@@ -10661,7 +10856,7 @@
         <w:pStyle w:val="ListNumber"/>
         <w:numPr>
           <w:ilvl w:val="0"/>
-          <w:numId w:val="25"/>
+          <w:numId w:val="26"/>
         </w:numPr>
       </w:pPr>
       <w:r>
@@ -10840,11 +11035,11 @@
       <w:pPr>
         <w:pStyle w:val="Heading2"/>
       </w:pPr>
-      <w:bookmarkStart w:id="31" w:name="_Toc237165465"/>
+      <w:bookmarkStart w:id="32" w:name="_Toc237169213"/>
       <w:r>
         <w:t>TC-15 Immediate language switching</w:t>
       </w:r>
-      <w:bookmarkEnd w:id="31"/>
+      <w:bookmarkEnd w:id="32"/>
     </w:p>
     <w:tbl>
       <w:tblPr>
@@ -10875,6 +11070,9 @@
           <w:p>
             <w:pPr>
               <w:pStyle w:val="Callout"/>
+              <w:rPr>
+                <w:rFonts w:hint="eastAsia"/>
+              </w:rPr>
             </w:pPr>
             <w:r>
               <w:rPr>
@@ -10903,7 +11101,7 @@
         <w:pStyle w:val="ListNumber"/>
         <w:numPr>
           <w:ilvl w:val="0"/>
-          <w:numId w:val="26"/>
+          <w:numId w:val="27"/>
         </w:numPr>
       </w:pPr>
       <w:r>
@@ -10915,7 +11113,7 @@
         <w:pStyle w:val="ListNumber"/>
         <w:numPr>
           <w:ilvl w:val="0"/>
-          <w:numId w:val="26"/>
+          <w:numId w:val="27"/>
         </w:numPr>
       </w:pPr>
       <w:r>
@@ -10927,11 +11125,10 @@
         <w:pStyle w:val="ListNumber"/>
         <w:numPr>
           <w:ilvl w:val="0"/>
-          <w:numId w:val="26"/>
+          <w:numId w:val="27"/>
         </w:numPr>
       </w:pPr>
       <w:r>
-        <w:lastRenderedPageBreak/>
         <w:t>Observe the application title, headings, labels, buttons, menu/list text, hints where practical, and the already-open secondary form.</w:t>
       </w:r>
     </w:p>
@@ -10940,7 +11137,7 @@
         <w:pStyle w:val="ListNumber"/>
         <w:numPr>
           <w:ilvl w:val="0"/>
-          <w:numId w:val="26"/>
+          <w:numId w:val="27"/>
         </w:numPr>
       </w:pPr>
       <w:r>
@@ -10952,7 +11149,7 @@
         <w:pStyle w:val="ListNumber"/>
         <w:numPr>
           <w:ilvl w:val="0"/>
-          <w:numId w:val="26"/>
+          <w:numId w:val="27"/>
         </w:numPr>
       </w:pPr>
       <w:r>
@@ -10964,6 +11161,7 @@
         <w:pStyle w:val="Heading3"/>
       </w:pPr>
       <w:r>
+        <w:lastRenderedPageBreak/>
         <w:t>Expected result</w:t>
       </w:r>
     </w:p>
@@ -11131,11 +11329,11 @@
       <w:pPr>
         <w:pStyle w:val="Heading2"/>
       </w:pPr>
-      <w:bookmarkStart w:id="32" w:name="_Toc237165466"/>
+      <w:bookmarkStart w:id="33" w:name="_Toc237169214"/>
       <w:r>
         <w:t>TC-16 Preserve control state and date range</w:t>
       </w:r>
-      <w:bookmarkEnd w:id="32"/>
+      <w:bookmarkEnd w:id="33"/>
     </w:p>
     <w:tbl>
       <w:tblPr>
@@ -11166,6 +11364,9 @@
           <w:p>
             <w:pPr>
               <w:pStyle w:val="Callout"/>
+              <w:rPr>
+                <w:rFonts w:hint="eastAsia"/>
+              </w:rPr>
             </w:pPr>
             <w:r>
               <w:rPr>
@@ -11194,7 +11395,7 @@
         <w:pStyle w:val="ListNumber"/>
         <w:numPr>
           <w:ilvl w:val="0"/>
-          <w:numId w:val="27"/>
+          <w:numId w:val="28"/>
         </w:numPr>
       </w:pPr>
       <w:r>
@@ -11206,7 +11407,7 @@
         <w:pStyle w:val="ListNumber"/>
         <w:numPr>
           <w:ilvl w:val="0"/>
-          <w:numId w:val="27"/>
+          <w:numId w:val="28"/>
         </w:numPr>
       </w:pPr>
       <w:r>
@@ -11218,7 +11419,7 @@
         <w:pStyle w:val="ListNumber"/>
         <w:numPr>
           <w:ilvl w:val="0"/>
-          <w:numId w:val="27"/>
+          <w:numId w:val="28"/>
         </w:numPr>
       </w:pPr>
       <w:r>
@@ -11230,7 +11431,7 @@
         <w:pStyle w:val="ListNumber"/>
         <w:numPr>
           <w:ilvl w:val="0"/>
-          <w:numId w:val="27"/>
+          <w:numId w:val="28"/>
         </w:numPr>
       </w:pPr>
       <w:r>
@@ -11409,12 +11610,11 @@
       <w:pPr>
         <w:pStyle w:val="Heading2"/>
       </w:pPr>
-      <w:bookmarkStart w:id="33" w:name="_Toc237165467"/>
-      <w:r>
-        <w:lastRenderedPageBreak/>
+      <w:bookmarkStart w:id="34" w:name="_Toc237169215"/>
+      <w:r>
         <w:t>TC-17 Preference persistence and restart</w:t>
       </w:r>
-      <w:bookmarkEnd w:id="33"/>
+      <w:bookmarkEnd w:id="34"/>
     </w:p>
     <w:tbl>
       <w:tblPr>
@@ -11445,6 +11645,9 @@
           <w:p>
             <w:pPr>
               <w:pStyle w:val="Callout"/>
+              <w:rPr>
+                <w:rFonts w:hint="eastAsia"/>
+              </w:rPr>
             </w:pPr>
             <w:r>
               <w:rPr>
@@ -11465,6 +11668,7 @@
         <w:pStyle w:val="Heading3"/>
       </w:pPr>
       <w:r>
+        <w:lastRenderedPageBreak/>
         <w:t>Procedure</w:t>
       </w:r>
     </w:p>
@@ -11473,7 +11677,7 @@
         <w:pStyle w:val="ListNumber"/>
         <w:numPr>
           <w:ilvl w:val="0"/>
-          <w:numId w:val="28"/>
+          <w:numId w:val="29"/>
         </w:numPr>
       </w:pPr>
       <w:r>
@@ -11485,7 +11689,7 @@
         <w:pStyle w:val="ListNumber"/>
         <w:numPr>
           <w:ilvl w:val="0"/>
-          <w:numId w:val="28"/>
+          <w:numId w:val="29"/>
         </w:numPr>
       </w:pPr>
       <w:r>
@@ -11497,7 +11701,7 @@
         <w:pStyle w:val="ListNumber"/>
         <w:numPr>
           <w:ilvl w:val="0"/>
-          <w:numId w:val="28"/>
+          <w:numId w:val="29"/>
         </w:numPr>
       </w:pPr>
       <w:r>
@@ -11509,7 +11713,7 @@
         <w:pStyle w:val="ListNumber"/>
         <w:numPr>
           <w:ilvl w:val="0"/>
-          <w:numId w:val="28"/>
+          <w:numId w:val="29"/>
         </w:numPr>
       </w:pPr>
       <w:r>
@@ -11688,11 +11892,11 @@
       <w:pPr>
         <w:pStyle w:val="Heading2"/>
       </w:pPr>
-      <w:bookmarkStart w:id="34" w:name="_Toc237165468"/>
+      <w:bookmarkStart w:id="35" w:name="_Toc237169216"/>
       <w:r>
         <w:t>TC-18 Offline runtime</w:t>
       </w:r>
-      <w:bookmarkEnd w:id="34"/>
+      <w:bookmarkEnd w:id="35"/>
     </w:p>
     <w:tbl>
       <w:tblPr>
@@ -11723,6 +11927,9 @@
           <w:p>
             <w:pPr>
               <w:pStyle w:val="Callout"/>
+              <w:rPr>
+                <w:rFonts w:hint="eastAsia"/>
+              </w:rPr>
             </w:pPr>
             <w:r>
               <w:rPr>
@@ -11751,7 +11958,7 @@
         <w:pStyle w:val="ListNumber"/>
         <w:numPr>
           <w:ilvl w:val="0"/>
-          <w:numId w:val="29"/>
+          <w:numId w:val="30"/>
         </w:numPr>
       </w:pPr>
       <w:r>
@@ -11763,7 +11970,7 @@
         <w:pStyle w:val="ListNumber"/>
         <w:numPr>
           <w:ilvl w:val="0"/>
-          <w:numId w:val="29"/>
+          <w:numId w:val="30"/>
         </w:numPr>
       </w:pPr>
       <w:r>
@@ -11775,7 +11982,7 @@
         <w:pStyle w:val="ListNumber"/>
         <w:numPr>
           <w:ilvl w:val="0"/>
-          <w:numId w:val="29"/>
+          <w:numId w:val="30"/>
         </w:numPr>
       </w:pPr>
       <w:r>
@@ -11787,7 +11994,7 @@
         <w:pStyle w:val="ListNumber"/>
         <w:numPr>
           <w:ilvl w:val="0"/>
-          <w:numId w:val="29"/>
+          <w:numId w:val="30"/>
         </w:numPr>
       </w:pPr>
       <w:r>
@@ -11823,7 +12030,6 @@
         <w:pStyle w:val="ListBullet"/>
       </w:pPr>
       <w:r>
-        <w:lastRenderedPageBreak/>
         <w:t>No provider dialog, API-key prompt, network delay, or cloud dependency appears in the target.</w:t>
       </w:r>
     </w:p>
@@ -11920,6 +12126,7 @@
                 <w:color w:val="234C80"/>
                 <w:sz w:val="17"/>
               </w:rPr>
+              <w:lastRenderedPageBreak/>
               <w:t>Date</w:t>
             </w:r>
           </w:p>
@@ -11959,11 +12166,11 @@
       <w:pPr>
         <w:pStyle w:val="Heading2"/>
       </w:pPr>
-      <w:bookmarkStart w:id="35" w:name="_Toc237165469"/>
+      <w:bookmarkStart w:id="36" w:name="_Toc237169217"/>
       <w:r>
         <w:t>TC-19 Missing and malformed pack behavior</w:t>
       </w:r>
-      <w:bookmarkEnd w:id="35"/>
+      <w:bookmarkEnd w:id="36"/>
     </w:p>
     <w:tbl>
       <w:tblPr>
@@ -11994,6 +12201,9 @@
           <w:p>
             <w:pPr>
               <w:pStyle w:val="Callout"/>
+              <w:rPr>
+                <w:rFonts w:hint="eastAsia"/>
+              </w:rPr>
             </w:pPr>
             <w:r>
               <w:rPr>
@@ -12022,7 +12232,7 @@
         <w:pStyle w:val="ListNumber"/>
         <w:numPr>
           <w:ilvl w:val="0"/>
-          <w:numId w:val="30"/>
+          <w:numId w:val="31"/>
         </w:numPr>
       </w:pPr>
       <w:r>
@@ -12034,7 +12244,7 @@
         <w:pStyle w:val="ListNumber"/>
         <w:numPr>
           <w:ilvl w:val="0"/>
-          <w:numId w:val="30"/>
+          <w:numId w:val="31"/>
         </w:numPr>
       </w:pPr>
       <w:r>
@@ -12046,7 +12256,7 @@
         <w:pStyle w:val="ListNumber"/>
         <w:numPr>
           <w:ilvl w:val="0"/>
-          <w:numId w:val="30"/>
+          <w:numId w:val="31"/>
         </w:numPr>
       </w:pPr>
       <w:r>
@@ -12058,7 +12268,7 @@
         <w:pStyle w:val="ListNumber"/>
         <w:numPr>
           <w:ilvl w:val="0"/>
-          <w:numId w:val="30"/>
+          <w:numId w:val="31"/>
         </w:numPr>
       </w:pPr>
       <w:r>
@@ -12070,7 +12280,7 @@
         <w:pStyle w:val="ListNumber"/>
         <w:numPr>
           <w:ilvl w:val="0"/>
-          <w:numId w:val="30"/>
+          <w:numId w:val="31"/>
         </w:numPr>
       </w:pPr>
       <w:r>
@@ -12249,11 +12459,11 @@
       <w:pPr>
         <w:pStyle w:val="Heading2"/>
       </w:pPr>
-      <w:bookmarkStart w:id="36" w:name="_Toc237165470"/>
+      <w:bookmarkStart w:id="37" w:name="_Toc237169218"/>
       <w:r>
         <w:t>8.1 Repeat the runtime matrix</w:t>
       </w:r>
-      <w:bookmarkEnd w:id="36"/>
+      <w:bookmarkEnd w:id="37"/>
     </w:p>
     <w:tbl>
       <w:tblPr>
@@ -12473,7 +12683,6 @@
                 <w:color w:val="163A63"/>
                 <w:sz w:val="17"/>
               </w:rPr>
-              <w:lastRenderedPageBreak/>
               <w:t>bin\Win32\Release\WebsiteAnalytics.exe</w:t>
             </w:r>
           </w:p>
@@ -12584,11 +12793,11 @@
       <w:pPr>
         <w:pStyle w:val="Heading1"/>
       </w:pPr>
-      <w:bookmarkStart w:id="37" w:name="_Toc237165471"/>
+      <w:bookmarkStart w:id="38" w:name="_Toc237169219"/>
       <w:r>
         <w:t>9. VCL Acceptance Delta</w:t>
       </w:r>
-      <w:bookmarkEnd w:id="37"/>
+      <w:bookmarkEnd w:id="38"/>
     </w:p>
     <w:p>
       <w:r>
@@ -12831,11 +13040,11 @@
       <w:pPr>
         <w:pStyle w:val="Heading1"/>
       </w:pPr>
-      <w:bookmarkStart w:id="38" w:name="_Toc237165472"/>
+      <w:bookmarkStart w:id="39" w:name="_Toc237169220"/>
       <w:r>
         <w:t>10. Studio Self-Translation</w:t>
       </w:r>
-      <w:bookmarkEnd w:id="38"/>
+      <w:bookmarkEnd w:id="39"/>
     </w:p>
     <w:p>
       <w:r>
@@ -12845,6 +13054,9 @@
     <w:p>
       <w:pPr>
         <w:pStyle w:val="CodeBlock"/>
+        <w:rPr>
+          <w:rFonts w:hint="eastAsia"/>
+        </w:rPr>
       </w:pPr>
       <w:r>
         <w:t>cd "C:\New Delphi Projects\Delphi App Translation"</w:t>
@@ -12853,6 +13065,9 @@
     <w:p>
       <w:pPr>
         <w:pStyle w:val="CodeBlock"/>
+        <w:rPr>
+          <w:rFonts w:hint="eastAsia"/>
+        </w:rPr>
       </w:pPr>
       <w:r>
         <w:t>powershell.exe -ExecutionPolicy Bypass -File .\tools\tests\RunStudioSelfLocalizationSmokeTest.ps1</w:t>
@@ -12879,37 +13094,37 @@
         <w:pStyle w:val="ListBullet"/>
       </w:pPr>
       <w:r>
+        <w:t>Expected final line: Studio self-localization smoke tests passed.</w:t>
+      </w:r>
+    </w:p>
+    <w:p>
+      <w:pPr>
+        <w:pStyle w:val="ListBullet"/>
+      </w:pPr>
+      <w:r>
+        <w:t>The script must restore the prior Italian pack and language preference or remove its temporary files when none existed.</w:t>
+      </w:r>
+    </w:p>
+    <w:p>
+      <w:pPr>
+        <w:pStyle w:val="Heading1"/>
+      </w:pPr>
+      <w:bookmarkStart w:id="40" w:name="_Toc237169221"/>
+      <w:r>
         <w:lastRenderedPageBreak/>
-        <w:t>Expected final line: Studio self-localization smoke tests passed.</w:t>
-      </w:r>
-    </w:p>
-    <w:p>
-      <w:pPr>
-        <w:pStyle w:val="ListBullet"/>
-      </w:pPr>
-      <w:r>
-        <w:t>The script must restore the prior Italian pack and language preference or remove its temporary files when none existed.</w:t>
-      </w:r>
-    </w:p>
-    <w:p>
-      <w:pPr>
-        <w:pStyle w:val="Heading1"/>
-      </w:pPr>
-      <w:bookmarkStart w:id="39" w:name="_Toc237165473"/>
-      <w:r>
         <w:t>11. Starting Over, Restore, and Reset</w:t>
       </w:r>
-      <w:bookmarkEnd w:id="39"/>
+      <w:bookmarkEnd w:id="40"/>
     </w:p>
     <w:p>
       <w:pPr>
         <w:pStyle w:val="Heading2"/>
       </w:pPr>
-      <w:bookmarkStart w:id="40" w:name="_Toc237165474"/>
+      <w:bookmarkStart w:id="41" w:name="_Toc237169222"/>
       <w:r>
         <w:t>11.1 Recommended component path</w:t>
       </w:r>
-      <w:bookmarkEnd w:id="40"/>
+      <w:bookmarkEnd w:id="41"/>
     </w:p>
     <w:p>
       <w:r>
@@ -12950,6 +13165,9 @@
           <w:p>
             <w:pPr>
               <w:pStyle w:val="Callout"/>
+              <w:rPr>
+                <w:rFonts w:hint="eastAsia"/>
+              </w:rPr>
             </w:pPr>
             <w:r>
               <w:rPr>
@@ -12969,18 +13187,18 @@
       <w:pPr>
         <w:pStyle w:val="Heading2"/>
       </w:pPr>
-      <w:bookmarkStart w:id="41" w:name="_Toc237165475"/>
+      <w:bookmarkStart w:id="42" w:name="_Toc237169223"/>
       <w:r>
         <w:t>11.2 Advanced automatic-source reset test</w:t>
       </w:r>
-      <w:bookmarkEnd w:id="41"/>
+      <w:bookmarkEnd w:id="42"/>
     </w:p>
     <w:p>
       <w:pPr>
         <w:pStyle w:val="ListNumber"/>
         <w:numPr>
           <w:ilvl w:val="0"/>
-          <w:numId w:val="31"/>
+          <w:numId w:val="32"/>
         </w:numPr>
       </w:pPr>
       <w:r>
@@ -12992,7 +13210,7 @@
         <w:pStyle w:val="ListNumber"/>
         <w:numPr>
           <w:ilvl w:val="0"/>
-          <w:numId w:val="31"/>
+          <w:numId w:val="32"/>
         </w:numPr>
       </w:pPr>
       <w:r>
@@ -13004,7 +13222,7 @@
         <w:pStyle w:val="ListNumber"/>
         <w:numPr>
           <w:ilvl w:val="0"/>
-          <w:numId w:val="31"/>
+          <w:numId w:val="32"/>
         </w:numPr>
       </w:pPr>
       <w:r>
@@ -13016,7 +13234,7 @@
         <w:pStyle w:val="ListNumber"/>
         <w:numPr>
           <w:ilvl w:val="0"/>
-          <w:numId w:val="31"/>
+          <w:numId w:val="32"/>
         </w:numPr>
       </w:pPr>
       <w:r>
@@ -13028,7 +13246,7 @@
         <w:pStyle w:val="ListNumber"/>
         <w:numPr>
           <w:ilvl w:val="0"/>
-          <w:numId w:val="31"/>
+          <w:numId w:val="32"/>
         </w:numPr>
       </w:pPr>
       <w:r>
@@ -13040,7 +13258,7 @@
         <w:pStyle w:val="ListNumber"/>
         <w:numPr>
           <w:ilvl w:val="0"/>
-          <w:numId w:val="31"/>
+          <w:numId w:val="32"/>
         </w:numPr>
       </w:pPr>
       <w:r>
@@ -13052,7 +13270,7 @@
         <w:pStyle w:val="ListNumber"/>
         <w:numPr>
           <w:ilvl w:val="0"/>
-          <w:numId w:val="31"/>
+          <w:numId w:val="32"/>
         </w:numPr>
       </w:pPr>
       <w:r>
@@ -13095,12 +13313,12 @@
       <w:pPr>
         <w:pStyle w:val="Heading1"/>
       </w:pPr>
-      <w:bookmarkStart w:id="42" w:name="_Toc237165476"/>
+      <w:bookmarkStart w:id="43" w:name="_Toc237169224"/>
       <w:r>
         <w:lastRenderedPageBreak/>
         <w:t>12. Negative and Recovery Tests</w:t>
       </w:r>
-      <w:bookmarkEnd w:id="42"/>
+      <w:bookmarkEnd w:id="43"/>
     </w:p>
     <w:tbl>
       <w:tblPr>
@@ -13676,11 +13894,11 @@
       <w:pPr>
         <w:pStyle w:val="Heading1"/>
       </w:pPr>
-      <w:bookmarkStart w:id="43" w:name="_Toc237165477"/>
+      <w:bookmarkStart w:id="44" w:name="_Toc237169225"/>
       <w:r>
         <w:t>13. Performance and Large-Project Checks</w:t>
       </w:r>
-      <w:bookmarkEnd w:id="43"/>
+      <w:bookmarkEnd w:id="44"/>
     </w:p>
     <w:p>
       <w:r>
@@ -14234,11 +14452,11 @@
       <w:pPr>
         <w:pStyle w:val="Heading1"/>
       </w:pPr>
-      <w:bookmarkStart w:id="44" w:name="_Toc237165478"/>
+      <w:bookmarkStart w:id="45" w:name="_Toc237169226"/>
       <w:r>
         <w:t>14. Defect Recording</w:t>
       </w:r>
-      <w:bookmarkEnd w:id="44"/>
+      <w:bookmarkEnd w:id="45"/>
     </w:p>
     <w:p>
       <w:pPr>
@@ -14720,11 +14938,11 @@
       <w:pPr>
         <w:pStyle w:val="Heading1"/>
       </w:pPr>
-      <w:bookmarkStart w:id="45" w:name="_Toc237165479"/>
+      <w:bookmarkStart w:id="46" w:name="_Toc237169227"/>
       <w:r>
         <w:t>15. Final Acceptance Checklist</w:t>
       </w:r>
-      <w:bookmarkEnd w:id="45"/>
+      <w:bookmarkEnd w:id="46"/>
     </w:p>
     <w:tbl>
       <w:tblPr>
@@ -16186,12 +16404,12 @@
       <w:pPr>
         <w:pStyle w:val="Heading1"/>
       </w:pPr>
-      <w:bookmarkStart w:id="46" w:name="_Toc237165480"/>
+      <w:bookmarkStart w:id="47" w:name="_Toc237169228"/>
       <w:r>
         <w:lastRenderedPageBreak/>
         <w:t>16. Appendix A - Exact Test Scripts</w:t>
       </w:r>
-      <w:bookmarkEnd w:id="46"/>
+      <w:bookmarkEnd w:id="47"/>
     </w:p>
     <w:tbl>
       <w:tblPr>
@@ -16601,11 +16819,11 @@
       <w:pPr>
         <w:pStyle w:val="Heading1"/>
       </w:pPr>
-      <w:bookmarkStart w:id="47" w:name="_Toc237165481"/>
+      <w:bookmarkStart w:id="48" w:name="_Toc237169229"/>
       <w:r>
         <w:t>17. Appendix B - What Each JSON File Is</w:t>
       </w:r>
-      <w:bookmarkEnd w:id="47"/>
+      <w:bookmarkEnd w:id="48"/>
     </w:p>
     <w:tbl>
       <w:tblPr>
@@ -16960,6 +17178,9 @@
           <w:p>
             <w:pPr>
               <w:pStyle w:val="Callout"/>
+              <w:rPr>
+                <w:rFonts w:hint="eastAsia"/>
+              </w:rPr>
             </w:pPr>
             <w:r>
               <w:rPr>
@@ -16979,16 +17200,16 @@
       <w:pPr>
         <w:pStyle w:val="Heading1"/>
       </w:pPr>
-      <w:bookmarkStart w:id="48" w:name="_Toc237165482"/>
+      <w:bookmarkStart w:id="49" w:name="_Toc237169230"/>
       <w:r>
         <w:lastRenderedPageBreak/>
         <w:t>18. Appendix C - Current Verified Baseline</w:t>
       </w:r>
-      <w:bookmarkEnd w:id="48"/>
-    </w:p>
-    <w:p>
-      <w:r>
-        <w:t xml:space="preserve">As of August 8, 2026, the project had current Studio executables in all four supported build folders, package outputs for Win32/Win64 Debug/Release, passing component/lifecycle/streaming/runtime/Studio launch/self-localization suites, and a clean pristine GA4 reference repository on branch codex/component-manager-pilot. The older C:\New Delphi Projects\Echurchsite Analytical - Test folder contained prior automatic-source-integration changes and was intentionally excluded from the clean component acceptance </w:t>
+      <w:bookmarkEnd w:id="49"/>
+    </w:p>
+    <w:p>
+      <w:r>
+        <w:t xml:space="preserve">As of August 9, 2026, the project had current Studio executables in all four supported build folders, package outputs for Win32/Win64 Debug/Release, passing component/lifecycle/streaming/runtime/Studio launch/self-localization suites, and a clean pristine GA4 reference repository on branch codex/component-manager-pilot. The older C:\New Delphi Projects\Echurchsite Analytical - Test folder contained prior automatic-source-integration changes and was intentionally excluded from the clean component acceptance </w:t>
       </w:r>
       <w:r>
         <w:t>path.</w:t>
@@ -17413,160 +17634,166 @@
       </w:rPr>
     </w:lvl>
   </w:abstractNum>
-  <w:num w:numId="1" w16cid:durableId="1560238857">
+  <w:num w:numId="1" w16cid:durableId="46608483">
     <w:abstractNumId w:val="8"/>
   </w:num>
-  <w:num w:numId="2" w16cid:durableId="593320240">
+  <w:num w:numId="2" w16cid:durableId="407311701">
     <w:abstractNumId w:val="6"/>
   </w:num>
-  <w:num w:numId="3" w16cid:durableId="528955836">
+  <w:num w:numId="3" w16cid:durableId="248775436">
     <w:abstractNumId w:val="5"/>
   </w:num>
-  <w:num w:numId="4" w16cid:durableId="2006668464">
+  <w:num w:numId="4" w16cid:durableId="1374109848">
     <w:abstractNumId w:val="4"/>
   </w:num>
-  <w:num w:numId="5" w16cid:durableId="2008438236">
+  <w:num w:numId="5" w16cid:durableId="897084115">
     <w:abstractNumId w:val="7"/>
   </w:num>
-  <w:num w:numId="6" w16cid:durableId="824250089">
+  <w:num w:numId="6" w16cid:durableId="1007368514">
     <w:abstractNumId w:val="3"/>
   </w:num>
-  <w:num w:numId="7" w16cid:durableId="60561352">
+  <w:num w:numId="7" w16cid:durableId="1382555476">
     <w:abstractNumId w:val="2"/>
   </w:num>
-  <w:num w:numId="8" w16cid:durableId="165707589">
+  <w:num w:numId="8" w16cid:durableId="575407975">
     <w:abstractNumId w:val="1"/>
   </w:num>
-  <w:num w:numId="9" w16cid:durableId="2049791579">
+  <w:num w:numId="9" w16cid:durableId="1282761020">
     <w:abstractNumId w:val="0"/>
   </w:num>
-  <w:num w:numId="10" w16cid:durableId="144708636">
+  <w:num w:numId="10" w16cid:durableId="1754742550">
     <w:abstractNumId w:val="7"/>
     <w:lvlOverride w:ilvl="0">
       <w:startOverride w:val="1"/>
     </w:lvlOverride>
   </w:num>
-  <w:num w:numId="11" w16cid:durableId="1155073669">
+  <w:num w:numId="11" w16cid:durableId="1380863622">
     <w:abstractNumId w:val="7"/>
     <w:lvlOverride w:ilvl="0">
       <w:startOverride w:val="1"/>
     </w:lvlOverride>
   </w:num>
-  <w:num w:numId="12" w16cid:durableId="1743018501">
+  <w:num w:numId="12" w16cid:durableId="659965567">
     <w:abstractNumId w:val="7"/>
     <w:lvlOverride w:ilvl="0">
       <w:startOverride w:val="1"/>
     </w:lvlOverride>
   </w:num>
-  <w:num w:numId="13" w16cid:durableId="152575879">
+  <w:num w:numId="13" w16cid:durableId="753160448">
     <w:abstractNumId w:val="7"/>
     <w:lvlOverride w:ilvl="0">
       <w:startOverride w:val="1"/>
     </w:lvlOverride>
   </w:num>
-  <w:num w:numId="14" w16cid:durableId="658312102">
+  <w:num w:numId="14" w16cid:durableId="1275401301">
     <w:abstractNumId w:val="7"/>
     <w:lvlOverride w:ilvl="0">
       <w:startOverride w:val="1"/>
     </w:lvlOverride>
   </w:num>
-  <w:num w:numId="15" w16cid:durableId="278028978">
+  <w:num w:numId="15" w16cid:durableId="1762332576">
     <w:abstractNumId w:val="7"/>
     <w:lvlOverride w:ilvl="0">
       <w:startOverride w:val="1"/>
     </w:lvlOverride>
   </w:num>
-  <w:num w:numId="16" w16cid:durableId="1976830971">
+  <w:num w:numId="16" w16cid:durableId="729622140">
     <w:abstractNumId w:val="7"/>
     <w:lvlOverride w:ilvl="0">
       <w:startOverride w:val="1"/>
     </w:lvlOverride>
   </w:num>
-  <w:num w:numId="17" w16cid:durableId="2130664594">
+  <w:num w:numId="17" w16cid:durableId="617836190">
     <w:abstractNumId w:val="7"/>
     <w:lvlOverride w:ilvl="0">
       <w:startOverride w:val="1"/>
     </w:lvlOverride>
   </w:num>
-  <w:num w:numId="18" w16cid:durableId="1708721984">
+  <w:num w:numId="18" w16cid:durableId="1192913723">
     <w:abstractNumId w:val="7"/>
     <w:lvlOverride w:ilvl="0">
       <w:startOverride w:val="1"/>
     </w:lvlOverride>
   </w:num>
-  <w:num w:numId="19" w16cid:durableId="919602446">
+  <w:num w:numId="19" w16cid:durableId="1595891764">
     <w:abstractNumId w:val="7"/>
     <w:lvlOverride w:ilvl="0">
       <w:startOverride w:val="1"/>
     </w:lvlOverride>
   </w:num>
-  <w:num w:numId="20" w16cid:durableId="326983595">
+  <w:num w:numId="20" w16cid:durableId="1868905894">
     <w:abstractNumId w:val="7"/>
     <w:lvlOverride w:ilvl="0">
       <w:startOverride w:val="1"/>
     </w:lvlOverride>
   </w:num>
-  <w:num w:numId="21" w16cid:durableId="180554383">
+  <w:num w:numId="21" w16cid:durableId="784930226">
     <w:abstractNumId w:val="7"/>
     <w:lvlOverride w:ilvl="0">
       <w:startOverride w:val="1"/>
     </w:lvlOverride>
   </w:num>
-  <w:num w:numId="22" w16cid:durableId="725496881">
+  <w:num w:numId="22" w16cid:durableId="1714891434">
     <w:abstractNumId w:val="7"/>
     <w:lvlOverride w:ilvl="0">
       <w:startOverride w:val="1"/>
     </w:lvlOverride>
   </w:num>
-  <w:num w:numId="23" w16cid:durableId="511261470">
+  <w:num w:numId="23" w16cid:durableId="875045351">
     <w:abstractNumId w:val="7"/>
     <w:lvlOverride w:ilvl="0">
       <w:startOverride w:val="1"/>
     </w:lvlOverride>
   </w:num>
-  <w:num w:numId="24" w16cid:durableId="1860512110">
+  <w:num w:numId="24" w16cid:durableId="1822499032">
     <w:abstractNumId w:val="7"/>
     <w:lvlOverride w:ilvl="0">
       <w:startOverride w:val="1"/>
     </w:lvlOverride>
   </w:num>
-  <w:num w:numId="25" w16cid:durableId="637104033">
+  <w:num w:numId="25" w16cid:durableId="2028173488">
     <w:abstractNumId w:val="7"/>
     <w:lvlOverride w:ilvl="0">
       <w:startOverride w:val="1"/>
     </w:lvlOverride>
   </w:num>
-  <w:num w:numId="26" w16cid:durableId="289558818">
+  <w:num w:numId="26" w16cid:durableId="2043094687">
     <w:abstractNumId w:val="7"/>
     <w:lvlOverride w:ilvl="0">
       <w:startOverride w:val="1"/>
     </w:lvlOverride>
   </w:num>
-  <w:num w:numId="27" w16cid:durableId="951474447">
+  <w:num w:numId="27" w16cid:durableId="301473049">
     <w:abstractNumId w:val="7"/>
     <w:lvlOverride w:ilvl="0">
       <w:startOverride w:val="1"/>
     </w:lvlOverride>
   </w:num>
-  <w:num w:numId="28" w16cid:durableId="1953629224">
+  <w:num w:numId="28" w16cid:durableId="984551015">
     <w:abstractNumId w:val="7"/>
     <w:lvlOverride w:ilvl="0">
       <w:startOverride w:val="1"/>
     </w:lvlOverride>
   </w:num>
-  <w:num w:numId="29" w16cid:durableId="2032030075">
+  <w:num w:numId="29" w16cid:durableId="570233053">
     <w:abstractNumId w:val="7"/>
     <w:lvlOverride w:ilvl="0">
       <w:startOverride w:val="1"/>
     </w:lvlOverride>
   </w:num>
-  <w:num w:numId="30" w16cid:durableId="246232135">
+  <w:num w:numId="30" w16cid:durableId="724331634">
     <w:abstractNumId w:val="7"/>
     <w:lvlOverride w:ilvl="0">
       <w:startOverride w:val="1"/>
     </w:lvlOverride>
   </w:num>
-  <w:num w:numId="31" w16cid:durableId="2010402076">
+  <w:num w:numId="31" w16cid:durableId="2031713703">
+    <w:abstractNumId w:val="7"/>
+    <w:lvlOverride w:ilvl="0">
+      <w:startOverride w:val="1"/>
+    </w:lvlOverride>
+  </w:num>
+  <w:num w:numId="32" w16cid:durableId="1383947633">
     <w:abstractNumId w:val="7"/>
     <w:lvlOverride w:ilvl="0">
       <w:startOverride w:val="1"/>
@@ -28996,7 +29223,7 @@
     <w:autoRedefine/>
     <w:uiPriority w:val="39"/>
     <w:unhideWhenUsed/>
-    <w:rsid w:val="00DE55FA"/>
+    <w:rsid w:val="00425616"/>
     <w:pPr>
       <w:spacing w:after="100"/>
     </w:pPr>
@@ -29008,7 +29235,7 @@
     <w:autoRedefine/>
     <w:uiPriority w:val="39"/>
     <w:unhideWhenUsed/>
-    <w:rsid w:val="00DE55FA"/>
+    <w:rsid w:val="00425616"/>
     <w:pPr>
       <w:spacing w:after="100"/>
       <w:ind w:left="220"/>
@@ -29019,7 +29246,7 @@
     <w:basedOn w:val="DefaultParagraphFont"/>
     <w:uiPriority w:val="99"/>
     <w:unhideWhenUsed/>
-    <w:rsid w:val="00DE55FA"/>
+    <w:rsid w:val="00425616"/>
     <w:rPr>
       <w:color w:val="0000FF" w:themeColor="hyperlink"/>
       <w:u w:val="single"/>

</xml_diff>

<commit_message>
Add mandatory component save checkpoint
</commit_message>
<xml_diff>
--- a/docs/guides/Delphi App Translation Studio Complete Test Guide.docx
+++ b/docs/guides/Delphi App Translation Studio Complete Test Guide.docx
@@ -13,7 +13,7 @@
           <w:noProof/>
         </w:rPr>
         <w:drawing>
-          <wp:inline distT="0" distB="0" distL="0" distR="0" wp14:anchorId="36584C51" wp14:editId="74748914">
+          <wp:inline distT="0" distB="0" distL="0" distR="0" wp14:anchorId="30A00C35" wp14:editId="070119FC">
             <wp:extent cx="1325880" cy="1325880"/>
             <wp:effectExtent l="0" t="0" r="0" b="0"/>
             <wp:docPr id="1" name="Picture 1"/>
@@ -120,7 +120,7 @@
           <w:color w:val="5D7693"/>
         </w:rPr>
         <w:br/>
-        <w:t>Last changed: August 9, 2026</w:t>
+        <w:t>Last changed: August 10, 2026</w:t>
       </w:r>
       <w:r>
         <w:rPr>
@@ -153,8 +153,12 @@
     <w:p>
       <w:pPr>
         <w:sectPr>
-          <w:headerReference w:type="default" r:id="rId9"/>
-          <w:footerReference w:type="default" r:id="rId10"/>
+          <w:headerReference w:type="even" r:id="rId9"/>
+          <w:headerReference w:type="default" r:id="rId10"/>
+          <w:footerReference w:type="even" r:id="rId11"/>
+          <w:footerReference w:type="default" r:id="rId12"/>
+          <w:headerReference w:type="first" r:id="rId13"/>
+          <w:footerReference w:type="first" r:id="rId14"/>
           <w:pgSz w:w="12240" w:h="15840"/>
           <w:pgMar w:top="1440" w:right="1440" w:bottom="1440" w:left="1440" w:header="708" w:footer="708" w:gutter="0"/>
           <w:cols w:space="720"/>
@@ -190,7 +194,7 @@
       <w:r>
         <w:fldChar w:fldCharType="separate"/>
       </w:r>
-      <w:hyperlink w:anchor="_Toc237169181" w:history="1">
+      <w:hyperlink w:anchor="_Toc237242513" w:history="1">
         <w:r>
           <w:rPr>
             <w:rStyle w:val="Hyperlink"/>
@@ -217,7 +221,7 @@
             <w:noProof/>
             <w:webHidden/>
           </w:rPr>
-          <w:instrText xml:space="preserve"> PAGEREF _Toc237169181 \h </w:instrText>
+          <w:instrText xml:space="preserve"> PAGEREF _Toc237242513 \h </w:instrText>
         </w:r>
         <w:r>
           <w:rPr>
@@ -258,7 +262,7 @@
           <w:noProof/>
         </w:rPr>
       </w:pPr>
-      <w:hyperlink w:anchor="_Toc237169182" w:history="1">
+      <w:hyperlink w:anchor="_Toc237242514" w:history="1">
         <w:r>
           <w:rPr>
             <w:rStyle w:val="Hyperlink"/>
@@ -285,7 +289,7 @@
             <w:noProof/>
             <w:webHidden/>
           </w:rPr>
-          <w:instrText xml:space="preserve"> PAGEREF _Toc237169182 \h </w:instrText>
+          <w:instrText xml:space="preserve"> PAGEREF _Toc237242514 \h </w:instrText>
         </w:r>
         <w:r>
           <w:rPr>
@@ -326,7 +330,7 @@
           <w:noProof/>
         </w:rPr>
       </w:pPr>
-      <w:hyperlink w:anchor="_Toc237169183" w:history="1">
+      <w:hyperlink w:anchor="_Toc237242515" w:history="1">
         <w:r>
           <w:rPr>
             <w:rStyle w:val="Hyperlink"/>
@@ -353,7 +357,7 @@
             <w:noProof/>
             <w:webHidden/>
           </w:rPr>
-          <w:instrText xml:space="preserve"> PAGEREF _Toc237169183 \h </w:instrText>
+          <w:instrText xml:space="preserve"> PAGEREF _Toc237242515 \h </w:instrText>
         </w:r>
         <w:r>
           <w:rPr>
@@ -394,7 +398,7 @@
           <w:noProof/>
         </w:rPr>
       </w:pPr>
-      <w:hyperlink w:anchor="_Toc237169184" w:history="1">
+      <w:hyperlink w:anchor="_Toc237242516" w:history="1">
         <w:r>
           <w:rPr>
             <w:rStyle w:val="Hyperlink"/>
@@ -421,7 +425,7 @@
             <w:noProof/>
             <w:webHidden/>
           </w:rPr>
-          <w:instrText xml:space="preserve"> PAGEREF _Toc237169184 \h </w:instrText>
+          <w:instrText xml:space="preserve"> PAGEREF _Toc237242516 \h </w:instrText>
         </w:r>
         <w:r>
           <w:rPr>
@@ -462,7 +466,7 @@
           <w:noProof/>
         </w:rPr>
       </w:pPr>
-      <w:hyperlink w:anchor="_Toc237169185" w:history="1">
+      <w:hyperlink w:anchor="_Toc237242517" w:history="1">
         <w:r>
           <w:rPr>
             <w:rStyle w:val="Hyperlink"/>
@@ -489,7 +493,7 @@
             <w:noProof/>
             <w:webHidden/>
           </w:rPr>
-          <w:instrText xml:space="preserve"> PAGEREF _Toc237169185 \h </w:instrText>
+          <w:instrText xml:space="preserve"> PAGEREF _Toc237242517 \h </w:instrText>
         </w:r>
         <w:r>
           <w:rPr>
@@ -530,7 +534,7 @@
           <w:noProof/>
         </w:rPr>
       </w:pPr>
-      <w:hyperlink w:anchor="_Toc237169186" w:history="1">
+      <w:hyperlink w:anchor="_Toc237242518" w:history="1">
         <w:r>
           <w:rPr>
             <w:rStyle w:val="Hyperlink"/>
@@ -557,7 +561,7 @@
             <w:noProof/>
             <w:webHidden/>
           </w:rPr>
-          <w:instrText xml:space="preserve"> PAGEREF _Toc237169186 \h </w:instrText>
+          <w:instrText xml:space="preserve"> PAGEREF _Toc237242518 \h </w:instrText>
         </w:r>
         <w:r>
           <w:rPr>
@@ -598,7 +602,7 @@
           <w:noProof/>
         </w:rPr>
       </w:pPr>
-      <w:hyperlink w:anchor="_Toc237169187" w:history="1">
+      <w:hyperlink w:anchor="_Toc237242519" w:history="1">
         <w:r>
           <w:rPr>
             <w:rStyle w:val="Hyperlink"/>
@@ -625,7 +629,7 @@
             <w:noProof/>
             <w:webHidden/>
           </w:rPr>
-          <w:instrText xml:space="preserve"> PAGEREF _Toc237169187 \h </w:instrText>
+          <w:instrText xml:space="preserve"> PAGEREF _Toc237242519 \h </w:instrText>
         </w:r>
         <w:r>
           <w:rPr>
@@ -666,7 +670,7 @@
           <w:noProof/>
         </w:rPr>
       </w:pPr>
-      <w:hyperlink w:anchor="_Toc237169188" w:history="1">
+      <w:hyperlink w:anchor="_Toc237242520" w:history="1">
         <w:r>
           <w:rPr>
             <w:rStyle w:val="Hyperlink"/>
@@ -693,7 +697,7 @@
             <w:noProof/>
             <w:webHidden/>
           </w:rPr>
-          <w:instrText xml:space="preserve"> PAGEREF _Toc237169188 \h </w:instrText>
+          <w:instrText xml:space="preserve"> PAGEREF _Toc237242520 \h </w:instrText>
         </w:r>
         <w:r>
           <w:rPr>
@@ -734,7 +738,7 @@
           <w:noProof/>
         </w:rPr>
       </w:pPr>
-      <w:hyperlink w:anchor="_Toc237169189" w:history="1">
+      <w:hyperlink w:anchor="_Toc237242521" w:history="1">
         <w:r>
           <w:rPr>
             <w:rStyle w:val="Hyperlink"/>
@@ -761,7 +765,7 @@
             <w:noProof/>
             <w:webHidden/>
           </w:rPr>
-          <w:instrText xml:space="preserve"> PAGEREF _Toc237169189 \h </w:instrText>
+          <w:instrText xml:space="preserve"> PAGEREF _Toc237242521 \h </w:instrText>
         </w:r>
         <w:r>
           <w:rPr>
@@ -802,7 +806,7 @@
           <w:noProof/>
         </w:rPr>
       </w:pPr>
-      <w:hyperlink w:anchor="_Toc237169190" w:history="1">
+      <w:hyperlink w:anchor="_Toc237242522" w:history="1">
         <w:r>
           <w:rPr>
             <w:rStyle w:val="Hyperlink"/>
@@ -829,7 +833,7 @@
             <w:noProof/>
             <w:webHidden/>
           </w:rPr>
-          <w:instrText xml:space="preserve"> PAGEREF _Toc237169190 \h </w:instrText>
+          <w:instrText xml:space="preserve"> PAGEREF _Toc237242522 \h </w:instrText>
         </w:r>
         <w:r>
           <w:rPr>
@@ -870,7 +874,7 @@
           <w:noProof/>
         </w:rPr>
       </w:pPr>
-      <w:hyperlink w:anchor="_Toc237169191" w:history="1">
+      <w:hyperlink w:anchor="_Toc237242523" w:history="1">
         <w:r>
           <w:rPr>
             <w:rStyle w:val="Hyperlink"/>
@@ -897,7 +901,7 @@
             <w:noProof/>
             <w:webHidden/>
           </w:rPr>
-          <w:instrText xml:space="preserve"> PAGEREF _Toc237169191 \h </w:instrText>
+          <w:instrText xml:space="preserve"> PAGEREF _Toc237242523 \h </w:instrText>
         </w:r>
         <w:r>
           <w:rPr>
@@ -938,7 +942,7 @@
           <w:noProof/>
         </w:rPr>
       </w:pPr>
-      <w:hyperlink w:anchor="_Toc237169192" w:history="1">
+      <w:hyperlink w:anchor="_Toc237242524" w:history="1">
         <w:r>
           <w:rPr>
             <w:rStyle w:val="Hyperlink"/>
@@ -965,7 +969,7 @@
             <w:noProof/>
             <w:webHidden/>
           </w:rPr>
-          <w:instrText xml:space="preserve"> PAGEREF _Toc237169192 \h </w:instrText>
+          <w:instrText xml:space="preserve"> PAGEREF _Toc237242524 \h </w:instrText>
         </w:r>
         <w:r>
           <w:rPr>
@@ -1006,7 +1010,7 @@
           <w:noProof/>
         </w:rPr>
       </w:pPr>
-      <w:hyperlink w:anchor="_Toc237169193" w:history="1">
+      <w:hyperlink w:anchor="_Toc237242525" w:history="1">
         <w:r>
           <w:rPr>
             <w:rStyle w:val="Hyperlink"/>
@@ -1033,7 +1037,7 @@
             <w:noProof/>
             <w:webHidden/>
           </w:rPr>
-          <w:instrText xml:space="preserve"> PAGEREF _Toc237169193 \h </w:instrText>
+          <w:instrText xml:space="preserve"> PAGEREF _Toc237242525 \h </w:instrText>
         </w:r>
         <w:r>
           <w:rPr>
@@ -1074,7 +1078,7 @@
           <w:noProof/>
         </w:rPr>
       </w:pPr>
-      <w:hyperlink w:anchor="_Toc237169194" w:history="1">
+      <w:hyperlink w:anchor="_Toc237242526" w:history="1">
         <w:r>
           <w:rPr>
             <w:rStyle w:val="Hyperlink"/>
@@ -1101,7 +1105,7 @@
             <w:noProof/>
             <w:webHidden/>
           </w:rPr>
-          <w:instrText xml:space="preserve"> PAGEREF _Toc237169194 \h </w:instrText>
+          <w:instrText xml:space="preserve"> PAGEREF _Toc237242526 \h </w:instrText>
         </w:r>
         <w:r>
           <w:rPr>
@@ -1142,7 +1146,7 @@
           <w:noProof/>
         </w:rPr>
       </w:pPr>
-      <w:hyperlink w:anchor="_Toc237169195" w:history="1">
+      <w:hyperlink w:anchor="_Toc237242527" w:history="1">
         <w:r>
           <w:rPr>
             <w:rStyle w:val="Hyperlink"/>
@@ -1169,7 +1173,7 @@
             <w:noProof/>
             <w:webHidden/>
           </w:rPr>
-          <w:instrText xml:space="preserve"> PAGEREF _Toc237169195 \h </w:instrText>
+          <w:instrText xml:space="preserve"> PAGEREF _Toc237242527 \h </w:instrText>
         </w:r>
         <w:r>
           <w:rPr>
@@ -1210,7 +1214,7 @@
           <w:noProof/>
         </w:rPr>
       </w:pPr>
-      <w:hyperlink w:anchor="_Toc237169196" w:history="1">
+      <w:hyperlink w:anchor="_Toc237242528" w:history="1">
         <w:r>
           <w:rPr>
             <w:rStyle w:val="Hyperlink"/>
@@ -1237,7 +1241,7 @@
             <w:noProof/>
             <w:webHidden/>
           </w:rPr>
-          <w:instrText xml:space="preserve"> PAGEREF _Toc237169196 \h </w:instrText>
+          <w:instrText xml:space="preserve"> PAGEREF _Toc237242528 \h </w:instrText>
         </w:r>
         <w:r>
           <w:rPr>
@@ -1278,7 +1282,7 @@
           <w:noProof/>
         </w:rPr>
       </w:pPr>
-      <w:hyperlink w:anchor="_Toc237169197" w:history="1">
+      <w:hyperlink w:anchor="_Toc237242529" w:history="1">
         <w:r>
           <w:rPr>
             <w:rStyle w:val="Hyperlink"/>
@@ -1305,7 +1309,7 @@
             <w:noProof/>
             <w:webHidden/>
           </w:rPr>
-          <w:instrText xml:space="preserve"> PAGEREF _Toc237169197 \h </w:instrText>
+          <w:instrText xml:space="preserve"> PAGEREF _Toc237242529 \h </w:instrText>
         </w:r>
         <w:r>
           <w:rPr>
@@ -1346,7 +1350,7 @@
           <w:noProof/>
         </w:rPr>
       </w:pPr>
-      <w:hyperlink w:anchor="_Toc237169198" w:history="1">
+      <w:hyperlink w:anchor="_Toc237242530" w:history="1">
         <w:r>
           <w:rPr>
             <w:rStyle w:val="Hyperlink"/>
@@ -1373,7 +1377,7 @@
             <w:noProof/>
             <w:webHidden/>
           </w:rPr>
-          <w:instrText xml:space="preserve"> PAGEREF _Toc237169198 \h </w:instrText>
+          <w:instrText xml:space="preserve"> PAGEREF _Toc237242530 \h </w:instrText>
         </w:r>
         <w:r>
           <w:rPr>
@@ -1414,7 +1418,7 @@
           <w:noProof/>
         </w:rPr>
       </w:pPr>
-      <w:hyperlink w:anchor="_Toc237169199" w:history="1">
+      <w:hyperlink w:anchor="_Toc237242531" w:history="1">
         <w:r>
           <w:rPr>
             <w:rStyle w:val="Hyperlink"/>
@@ -1441,7 +1445,7 @@
             <w:noProof/>
             <w:webHidden/>
           </w:rPr>
-          <w:instrText xml:space="preserve"> PAGEREF _Toc237169199 \h </w:instrText>
+          <w:instrText xml:space="preserve"> PAGEREF _Toc237242531 \h </w:instrText>
         </w:r>
         <w:r>
           <w:rPr>
@@ -1482,7 +1486,7 @@
           <w:noProof/>
         </w:rPr>
       </w:pPr>
-      <w:hyperlink w:anchor="_Toc237169200" w:history="1">
+      <w:hyperlink w:anchor="_Toc237242532" w:history="1">
         <w:r>
           <w:rPr>
             <w:rStyle w:val="Hyperlink"/>
@@ -1509,7 +1513,7 @@
             <w:noProof/>
             <w:webHidden/>
           </w:rPr>
-          <w:instrText xml:space="preserve"> PAGEREF _Toc237169200 \h </w:instrText>
+          <w:instrText xml:space="preserve"> PAGEREF _Toc237242532 \h </w:instrText>
         </w:r>
         <w:r>
           <w:rPr>
@@ -1550,7 +1554,7 @@
           <w:noProof/>
         </w:rPr>
       </w:pPr>
-      <w:hyperlink w:anchor="_Toc237169201" w:history="1">
+      <w:hyperlink w:anchor="_Toc237242533" w:history="1">
         <w:r>
           <w:rPr>
             <w:rStyle w:val="Hyperlink"/>
@@ -1577,7 +1581,7 @@
             <w:noProof/>
             <w:webHidden/>
           </w:rPr>
-          <w:instrText xml:space="preserve"> PAGEREF _Toc237169201 \h </w:instrText>
+          <w:instrText xml:space="preserve"> PAGEREF _Toc237242533 \h </w:instrText>
         </w:r>
         <w:r>
           <w:rPr>
@@ -1618,7 +1622,7 @@
           <w:noProof/>
         </w:rPr>
       </w:pPr>
-      <w:hyperlink w:anchor="_Toc237169202" w:history="1">
+      <w:hyperlink w:anchor="_Toc237242534" w:history="1">
         <w:r>
           <w:rPr>
             <w:rStyle w:val="Hyperlink"/>
@@ -1645,7 +1649,7 @@
             <w:noProof/>
             <w:webHidden/>
           </w:rPr>
-          <w:instrText xml:space="preserve"> PAGEREF _Toc237169202 \h </w:instrText>
+          <w:instrText xml:space="preserve"> PAGEREF _Toc237242534 \h </w:instrText>
         </w:r>
         <w:r>
           <w:rPr>
@@ -1686,7 +1690,7 @@
           <w:noProof/>
         </w:rPr>
       </w:pPr>
-      <w:hyperlink w:anchor="_Toc237169203" w:history="1">
+      <w:hyperlink w:anchor="_Toc237242535" w:history="1">
         <w:r>
           <w:rPr>
             <w:rStyle w:val="Hyperlink"/>
@@ -1713,7 +1717,7 @@
             <w:noProof/>
             <w:webHidden/>
           </w:rPr>
-          <w:instrText xml:space="preserve"> PAGEREF _Toc237169203 \h </w:instrText>
+          <w:instrText xml:space="preserve"> PAGEREF _Toc237242535 \h </w:instrText>
         </w:r>
         <w:r>
           <w:rPr>
@@ -1754,7 +1758,7 @@
           <w:noProof/>
         </w:rPr>
       </w:pPr>
-      <w:hyperlink w:anchor="_Toc237169204" w:history="1">
+      <w:hyperlink w:anchor="_Toc237242536" w:history="1">
         <w:r>
           <w:rPr>
             <w:rStyle w:val="Hyperlink"/>
@@ -1781,7 +1785,7 @@
             <w:noProof/>
             <w:webHidden/>
           </w:rPr>
-          <w:instrText xml:space="preserve"> PAGEREF _Toc237169204 \h </w:instrText>
+          <w:instrText xml:space="preserve"> PAGEREF _Toc237242536 \h </w:instrText>
         </w:r>
         <w:r>
           <w:rPr>
@@ -1822,7 +1826,7 @@
           <w:noProof/>
         </w:rPr>
       </w:pPr>
-      <w:hyperlink w:anchor="_Toc237169205" w:history="1">
+      <w:hyperlink w:anchor="_Toc237242537" w:history="1">
         <w:r>
           <w:rPr>
             <w:rStyle w:val="Hyperlink"/>
@@ -1849,7 +1853,7 @@
             <w:noProof/>
             <w:webHidden/>
           </w:rPr>
-          <w:instrText xml:space="preserve"> PAGEREF _Toc237169205 \h </w:instrText>
+          <w:instrText xml:space="preserve"> PAGEREF _Toc237242537 \h </w:instrText>
         </w:r>
         <w:r>
           <w:rPr>
@@ -1890,7 +1894,7 @@
           <w:noProof/>
         </w:rPr>
       </w:pPr>
-      <w:hyperlink w:anchor="_Toc237169206" w:history="1">
+      <w:hyperlink w:anchor="_Toc237242538" w:history="1">
         <w:r>
           <w:rPr>
             <w:rStyle w:val="Hyperlink"/>
@@ -1917,7 +1921,7 @@
             <w:noProof/>
             <w:webHidden/>
           </w:rPr>
-          <w:instrText xml:space="preserve"> PAGEREF _Toc237169206 \h </w:instrText>
+          <w:instrText xml:space="preserve"> PAGEREF _Toc237242538 \h </w:instrText>
         </w:r>
         <w:r>
           <w:rPr>
@@ -1958,7 +1962,7 @@
           <w:noProof/>
         </w:rPr>
       </w:pPr>
-      <w:hyperlink w:anchor="_Toc237169207" w:history="1">
+      <w:hyperlink w:anchor="_Toc237242539" w:history="1">
         <w:r>
           <w:rPr>
             <w:rStyle w:val="Hyperlink"/>
@@ -1985,7 +1989,7 @@
             <w:noProof/>
             <w:webHidden/>
           </w:rPr>
-          <w:instrText xml:space="preserve"> PAGEREF _Toc237169207 \h </w:instrText>
+          <w:instrText xml:space="preserve"> PAGEREF _Toc237242539 \h </w:instrText>
         </w:r>
         <w:r>
           <w:rPr>
@@ -2026,7 +2030,7 @@
           <w:noProof/>
         </w:rPr>
       </w:pPr>
-      <w:hyperlink w:anchor="_Toc237169208" w:history="1">
+      <w:hyperlink w:anchor="_Toc237242540" w:history="1">
         <w:r>
           <w:rPr>
             <w:rStyle w:val="Hyperlink"/>
@@ -2053,7 +2057,7 @@
             <w:noProof/>
             <w:webHidden/>
           </w:rPr>
-          <w:instrText xml:space="preserve"> PAGEREF _Toc237169208 \h </w:instrText>
+          <w:instrText xml:space="preserve"> PAGEREF _Toc237242540 \h </w:instrText>
         </w:r>
         <w:r>
           <w:rPr>
@@ -2094,7 +2098,7 @@
           <w:noProof/>
         </w:rPr>
       </w:pPr>
-      <w:hyperlink w:anchor="_Toc237169209" w:history="1">
+      <w:hyperlink w:anchor="_Toc237242541" w:history="1">
         <w:r>
           <w:rPr>
             <w:rStyle w:val="Hyperlink"/>
@@ -2121,7 +2125,7 @@
             <w:noProof/>
             <w:webHidden/>
           </w:rPr>
-          <w:instrText xml:space="preserve"> PAGEREF _Toc237169209 \h </w:instrText>
+          <w:instrText xml:space="preserve"> PAGEREF _Toc237242541 \h </w:instrText>
         </w:r>
         <w:r>
           <w:rPr>
@@ -2162,7 +2166,7 @@
           <w:noProof/>
         </w:rPr>
       </w:pPr>
-      <w:hyperlink w:anchor="_Toc237169210" w:history="1">
+      <w:hyperlink w:anchor="_Toc237242542" w:history="1">
         <w:r>
           <w:rPr>
             <w:rStyle w:val="Hyperlink"/>
@@ -2189,7 +2193,7 @@
             <w:noProof/>
             <w:webHidden/>
           </w:rPr>
-          <w:instrText xml:space="preserve"> PAGEREF _Toc237169210 \h </w:instrText>
+          <w:instrText xml:space="preserve"> PAGEREF _Toc237242542 \h </w:instrText>
         </w:r>
         <w:r>
           <w:rPr>
@@ -2230,7 +2234,7 @@
           <w:noProof/>
         </w:rPr>
       </w:pPr>
-      <w:hyperlink w:anchor="_Toc237169211" w:history="1">
+      <w:hyperlink w:anchor="_Toc237242543" w:history="1">
         <w:r>
           <w:rPr>
             <w:rStyle w:val="Hyperlink"/>
@@ -2257,7 +2261,7 @@
             <w:noProof/>
             <w:webHidden/>
           </w:rPr>
-          <w:instrText xml:space="preserve"> PAGEREF _Toc237169211 \h </w:instrText>
+          <w:instrText xml:space="preserve"> PAGEREF _Toc237242543 \h </w:instrText>
         </w:r>
         <w:r>
           <w:rPr>
@@ -2298,7 +2302,7 @@
           <w:noProof/>
         </w:rPr>
       </w:pPr>
-      <w:hyperlink w:anchor="_Toc237169212" w:history="1">
+      <w:hyperlink w:anchor="_Toc237242544" w:history="1">
         <w:r>
           <w:rPr>
             <w:rStyle w:val="Hyperlink"/>
@@ -2325,7 +2329,7 @@
             <w:noProof/>
             <w:webHidden/>
           </w:rPr>
-          <w:instrText xml:space="preserve"> PAGEREF _Toc237169212 \h </w:instrText>
+          <w:instrText xml:space="preserve"> PAGEREF _Toc237242544 \h </w:instrText>
         </w:r>
         <w:r>
           <w:rPr>
@@ -2366,7 +2370,7 @@
           <w:noProof/>
         </w:rPr>
       </w:pPr>
-      <w:hyperlink w:anchor="_Toc237169213" w:history="1">
+      <w:hyperlink w:anchor="_Toc237242545" w:history="1">
         <w:r>
           <w:rPr>
             <w:rStyle w:val="Hyperlink"/>
@@ -2393,7 +2397,7 @@
             <w:noProof/>
             <w:webHidden/>
           </w:rPr>
-          <w:instrText xml:space="preserve"> PAGEREF _Toc237169213 \h </w:instrText>
+          <w:instrText xml:space="preserve"> PAGEREF _Toc237242545 \h </w:instrText>
         </w:r>
         <w:r>
           <w:rPr>
@@ -2413,7 +2417,7 @@
             <w:noProof/>
             <w:webHidden/>
           </w:rPr>
-          <w:t>18</w:t>
+          <w:t>19</w:t>
         </w:r>
         <w:r>
           <w:rPr>
@@ -2434,7 +2438,7 @@
           <w:noProof/>
         </w:rPr>
       </w:pPr>
-      <w:hyperlink w:anchor="_Toc237169214" w:history="1">
+      <w:hyperlink w:anchor="_Toc237242546" w:history="1">
         <w:r>
           <w:rPr>
             <w:rStyle w:val="Hyperlink"/>
@@ -2461,7 +2465,7 @@
             <w:noProof/>
             <w:webHidden/>
           </w:rPr>
-          <w:instrText xml:space="preserve"> PAGEREF _Toc237169214 \h </w:instrText>
+          <w:instrText xml:space="preserve"> PAGEREF _Toc237242546 \h </w:instrText>
         </w:r>
         <w:r>
           <w:rPr>
@@ -2502,7 +2506,7 @@
           <w:noProof/>
         </w:rPr>
       </w:pPr>
-      <w:hyperlink w:anchor="_Toc237169215" w:history="1">
+      <w:hyperlink w:anchor="_Toc237242547" w:history="1">
         <w:r>
           <w:rPr>
             <w:rStyle w:val="Hyperlink"/>
@@ -2529,7 +2533,7 @@
             <w:noProof/>
             <w:webHidden/>
           </w:rPr>
-          <w:instrText xml:space="preserve"> PAGEREF _Toc237169215 \h </w:instrText>
+          <w:instrText xml:space="preserve"> PAGEREF _Toc237242547 \h </w:instrText>
         </w:r>
         <w:r>
           <w:rPr>
@@ -2549,7 +2553,7 @@
             <w:noProof/>
             <w:webHidden/>
           </w:rPr>
-          <w:t>19</w:t>
+          <w:t>20</w:t>
         </w:r>
         <w:r>
           <w:rPr>
@@ -2570,7 +2574,7 @@
           <w:noProof/>
         </w:rPr>
       </w:pPr>
-      <w:hyperlink w:anchor="_Toc237169216" w:history="1">
+      <w:hyperlink w:anchor="_Toc237242548" w:history="1">
         <w:r>
           <w:rPr>
             <w:rStyle w:val="Hyperlink"/>
@@ -2597,7 +2601,7 @@
             <w:noProof/>
             <w:webHidden/>
           </w:rPr>
-          <w:instrText xml:space="preserve"> PAGEREF _Toc237169216 \h </w:instrText>
+          <w:instrText xml:space="preserve"> PAGEREF _Toc237242548 \h </w:instrText>
         </w:r>
         <w:r>
           <w:rPr>
@@ -2638,7 +2642,7 @@
           <w:noProof/>
         </w:rPr>
       </w:pPr>
-      <w:hyperlink w:anchor="_Toc237169217" w:history="1">
+      <w:hyperlink w:anchor="_Toc237242549" w:history="1">
         <w:r>
           <w:rPr>
             <w:rStyle w:val="Hyperlink"/>
@@ -2665,7 +2669,7 @@
             <w:noProof/>
             <w:webHidden/>
           </w:rPr>
-          <w:instrText xml:space="preserve"> PAGEREF _Toc237169217 \h </w:instrText>
+          <w:instrText xml:space="preserve"> PAGEREF _Toc237242549 \h </w:instrText>
         </w:r>
         <w:r>
           <w:rPr>
@@ -2706,7 +2710,7 @@
           <w:noProof/>
         </w:rPr>
       </w:pPr>
-      <w:hyperlink w:anchor="_Toc237169218" w:history="1">
+      <w:hyperlink w:anchor="_Toc237242550" w:history="1">
         <w:r>
           <w:rPr>
             <w:rStyle w:val="Hyperlink"/>
@@ -2733,7 +2737,7 @@
             <w:noProof/>
             <w:webHidden/>
           </w:rPr>
-          <w:instrText xml:space="preserve"> PAGEREF _Toc237169218 \h </w:instrText>
+          <w:instrText xml:space="preserve"> PAGEREF _Toc237242550 \h </w:instrText>
         </w:r>
         <w:r>
           <w:rPr>
@@ -2753,7 +2757,7 @@
             <w:noProof/>
             <w:webHidden/>
           </w:rPr>
-          <w:t>21</w:t>
+          <w:t>22</w:t>
         </w:r>
         <w:r>
           <w:rPr>
@@ -2774,7 +2778,7 @@
           <w:noProof/>
         </w:rPr>
       </w:pPr>
-      <w:hyperlink w:anchor="_Toc237169219" w:history="1">
+      <w:hyperlink w:anchor="_Toc237242551" w:history="1">
         <w:r>
           <w:rPr>
             <w:rStyle w:val="Hyperlink"/>
@@ -2801,7 +2805,7 @@
             <w:noProof/>
             <w:webHidden/>
           </w:rPr>
-          <w:instrText xml:space="preserve"> PAGEREF _Toc237169219 \h </w:instrText>
+          <w:instrText xml:space="preserve"> PAGEREF _Toc237242551 \h </w:instrText>
         </w:r>
         <w:r>
           <w:rPr>
@@ -2842,7 +2846,7 @@
           <w:noProof/>
         </w:rPr>
       </w:pPr>
-      <w:hyperlink w:anchor="_Toc237169220" w:history="1">
+      <w:hyperlink w:anchor="_Toc237242552" w:history="1">
         <w:r>
           <w:rPr>
             <w:rStyle w:val="Hyperlink"/>
@@ -2869,7 +2873,7 @@
             <w:noProof/>
             <w:webHidden/>
           </w:rPr>
-          <w:instrText xml:space="preserve"> PAGEREF _Toc237169220 \h </w:instrText>
+          <w:instrText xml:space="preserve"> PAGEREF _Toc237242552 \h </w:instrText>
         </w:r>
         <w:r>
           <w:rPr>
@@ -2889,7 +2893,7 @@
             <w:noProof/>
             <w:webHidden/>
           </w:rPr>
-          <w:t>22</w:t>
+          <w:t>23</w:t>
         </w:r>
         <w:r>
           <w:rPr>
@@ -2910,7 +2914,7 @@
           <w:noProof/>
         </w:rPr>
       </w:pPr>
-      <w:hyperlink w:anchor="_Toc237169221" w:history="1">
+      <w:hyperlink w:anchor="_Toc237242553" w:history="1">
         <w:r>
           <w:rPr>
             <w:rStyle w:val="Hyperlink"/>
@@ -2937,7 +2941,7 @@
             <w:noProof/>
             <w:webHidden/>
           </w:rPr>
-          <w:instrText xml:space="preserve"> PAGEREF _Toc237169221 \h </w:instrText>
+          <w:instrText xml:space="preserve"> PAGEREF _Toc237242553 \h </w:instrText>
         </w:r>
         <w:r>
           <w:rPr>
@@ -2978,7 +2982,7 @@
           <w:noProof/>
         </w:rPr>
       </w:pPr>
-      <w:hyperlink w:anchor="_Toc237169222" w:history="1">
+      <w:hyperlink w:anchor="_Toc237242554" w:history="1">
         <w:r>
           <w:rPr>
             <w:rStyle w:val="Hyperlink"/>
@@ -3005,7 +3009,7 @@
             <w:noProof/>
             <w:webHidden/>
           </w:rPr>
-          <w:instrText xml:space="preserve"> PAGEREF _Toc237169222 \h </w:instrText>
+          <w:instrText xml:space="preserve"> PAGEREF _Toc237242554 \h </w:instrText>
         </w:r>
         <w:r>
           <w:rPr>
@@ -3046,7 +3050,7 @@
           <w:noProof/>
         </w:rPr>
       </w:pPr>
-      <w:hyperlink w:anchor="_Toc237169223" w:history="1">
+      <w:hyperlink w:anchor="_Toc237242555" w:history="1">
         <w:r>
           <w:rPr>
             <w:rStyle w:val="Hyperlink"/>
@@ -3073,7 +3077,7 @@
             <w:noProof/>
             <w:webHidden/>
           </w:rPr>
-          <w:instrText xml:space="preserve"> PAGEREF _Toc237169223 \h </w:instrText>
+          <w:instrText xml:space="preserve"> PAGEREF _Toc237242555 \h </w:instrText>
         </w:r>
         <w:r>
           <w:rPr>
@@ -3114,7 +3118,7 @@
           <w:noProof/>
         </w:rPr>
       </w:pPr>
-      <w:hyperlink w:anchor="_Toc237169224" w:history="1">
+      <w:hyperlink w:anchor="_Toc237242556" w:history="1">
         <w:r>
           <w:rPr>
             <w:rStyle w:val="Hyperlink"/>
@@ -3141,7 +3145,7 @@
             <w:noProof/>
             <w:webHidden/>
           </w:rPr>
-          <w:instrText xml:space="preserve"> PAGEREF _Toc237169224 \h </w:instrText>
+          <w:instrText xml:space="preserve"> PAGEREF _Toc237242556 \h </w:instrText>
         </w:r>
         <w:r>
           <w:rPr>
@@ -3182,7 +3186,7 @@
           <w:noProof/>
         </w:rPr>
       </w:pPr>
-      <w:hyperlink w:anchor="_Toc237169225" w:history="1">
+      <w:hyperlink w:anchor="_Toc237242557" w:history="1">
         <w:r>
           <w:rPr>
             <w:rStyle w:val="Hyperlink"/>
@@ -3209,7 +3213,7 @@
             <w:noProof/>
             <w:webHidden/>
           </w:rPr>
-          <w:instrText xml:space="preserve"> PAGEREF _Toc237169225 \h </w:instrText>
+          <w:instrText xml:space="preserve"> PAGEREF _Toc237242557 \h </w:instrText>
         </w:r>
         <w:r>
           <w:rPr>
@@ -3229,7 +3233,7 @@
             <w:noProof/>
             <w:webHidden/>
           </w:rPr>
-          <w:t>24</w:t>
+          <w:t>25</w:t>
         </w:r>
         <w:r>
           <w:rPr>
@@ -3250,7 +3254,7 @@
           <w:noProof/>
         </w:rPr>
       </w:pPr>
-      <w:hyperlink w:anchor="_Toc237169226" w:history="1">
+      <w:hyperlink w:anchor="_Toc237242558" w:history="1">
         <w:r>
           <w:rPr>
             <w:rStyle w:val="Hyperlink"/>
@@ -3277,7 +3281,7 @@
             <w:noProof/>
             <w:webHidden/>
           </w:rPr>
-          <w:instrText xml:space="preserve"> PAGEREF _Toc237169226 \h </w:instrText>
+          <w:instrText xml:space="preserve"> PAGEREF _Toc237242558 \h </w:instrText>
         </w:r>
         <w:r>
           <w:rPr>
@@ -3318,7 +3322,7 @@
           <w:noProof/>
         </w:rPr>
       </w:pPr>
-      <w:hyperlink w:anchor="_Toc237169227" w:history="1">
+      <w:hyperlink w:anchor="_Toc237242559" w:history="1">
         <w:r>
           <w:rPr>
             <w:rStyle w:val="Hyperlink"/>
@@ -3345,7 +3349,7 @@
             <w:noProof/>
             <w:webHidden/>
           </w:rPr>
-          <w:instrText xml:space="preserve"> PAGEREF _Toc237169227 \h </w:instrText>
+          <w:instrText xml:space="preserve"> PAGEREF _Toc237242559 \h </w:instrText>
         </w:r>
         <w:r>
           <w:rPr>
@@ -3386,7 +3390,7 @@
           <w:noProof/>
         </w:rPr>
       </w:pPr>
-      <w:hyperlink w:anchor="_Toc237169228" w:history="1">
+      <w:hyperlink w:anchor="_Toc237242560" w:history="1">
         <w:r>
           <w:rPr>
             <w:rStyle w:val="Hyperlink"/>
@@ -3413,7 +3417,7 @@
             <w:noProof/>
             <w:webHidden/>
           </w:rPr>
-          <w:instrText xml:space="preserve"> PAGEREF _Toc237169228 \h </w:instrText>
+          <w:instrText xml:space="preserve"> PAGEREF _Toc237242560 \h </w:instrText>
         </w:r>
         <w:r>
           <w:rPr>
@@ -3454,7 +3458,7 @@
           <w:noProof/>
         </w:rPr>
       </w:pPr>
-      <w:hyperlink w:anchor="_Toc237169229" w:history="1">
+      <w:hyperlink w:anchor="_Toc237242561" w:history="1">
         <w:r>
           <w:rPr>
             <w:rStyle w:val="Hyperlink"/>
@@ -3481,7 +3485,7 @@
             <w:noProof/>
             <w:webHidden/>
           </w:rPr>
-          <w:instrText xml:space="preserve"> PAGEREF _Toc237169229 \h </w:instrText>
+          <w:instrText xml:space="preserve"> PAGEREF _Toc237242561 \h </w:instrText>
         </w:r>
         <w:r>
           <w:rPr>
@@ -3501,7 +3505,7 @@
             <w:noProof/>
             <w:webHidden/>
           </w:rPr>
-          <w:t>27</w:t>
+          <w:t>28</w:t>
         </w:r>
         <w:r>
           <w:rPr>
@@ -3522,7 +3526,7 @@
           <w:noProof/>
         </w:rPr>
       </w:pPr>
-      <w:hyperlink w:anchor="_Toc237169230" w:history="1">
+      <w:hyperlink w:anchor="_Toc237242562" w:history="1">
         <w:r>
           <w:rPr>
             <w:rStyle w:val="Hyperlink"/>
@@ -3549,7 +3553,7 @@
             <w:noProof/>
             <w:webHidden/>
           </w:rPr>
-          <w:instrText xml:space="preserve"> PAGEREF _Toc237169230 \h </w:instrText>
+          <w:instrText xml:space="preserve"> PAGEREF _Toc237242562 \h </w:instrText>
         </w:r>
         <w:r>
           <w:rPr>
@@ -3588,8 +3592,8 @@
     <w:p>
       <w:pPr>
         <w:sectPr>
-          <w:headerReference w:type="default" r:id="rId11"/>
-          <w:footerReference w:type="default" r:id="rId12"/>
+          <w:headerReference w:type="default" r:id="rId15"/>
+          <w:footerReference w:type="default" r:id="rId16"/>
           <w:pgSz w:w="12240" w:h="15840"/>
           <w:pgMar w:top="1440" w:right="1440" w:bottom="1440" w:left="1440" w:header="708" w:footer="708" w:gutter="0"/>
           <w:pgNumType w:fmt="lowerRoman" w:start="1"/>
@@ -3602,7 +3606,7 @@
       <w:pPr>
         <w:pStyle w:val="Heading1"/>
       </w:pPr>
-      <w:bookmarkStart w:id="0" w:name="_Toc237169181"/>
+      <w:bookmarkStart w:id="0" w:name="_Toc237242513"/>
       <w:r>
         <w:lastRenderedPageBreak/>
         <w:t>1. Purpose and Test Philosophy</w:t>
@@ -3675,7 +3679,7 @@
       <w:pPr>
         <w:pStyle w:val="Heading2"/>
       </w:pPr>
-      <w:bookmarkStart w:id="1" w:name="_Toc237169182"/>
+      <w:bookmarkStart w:id="1" w:name="_Toc237242514"/>
       <w:r>
         <w:t>1.1 Scope</w:t>
       </w:r>
@@ -3733,7 +3737,7 @@
       <w:pPr>
         <w:pStyle w:val="Heading2"/>
       </w:pPr>
-      <w:bookmarkStart w:id="2" w:name="_Toc237169183"/>
+      <w:bookmarkStart w:id="2" w:name="_Toc237242515"/>
       <w:r>
         <w:t>1.2 Stop conditions</w:t>
       </w:r>
@@ -3792,7 +3796,7 @@
       <w:pPr>
         <w:pStyle w:val="Heading1"/>
       </w:pPr>
-      <w:bookmarkStart w:id="3" w:name="_Toc237169184"/>
+      <w:bookmarkStart w:id="3" w:name="_Toc237242516"/>
       <w:r>
         <w:t>2. Exact Folders and Files</w:t>
       </w:r>
@@ -4555,7 +4559,7 @@
       <w:pPr>
         <w:pStyle w:val="Heading2"/>
       </w:pPr>
-      <w:bookmarkStart w:id="4" w:name="_Toc237169185"/>
+      <w:bookmarkStart w:id="4" w:name="_Toc237242517"/>
       <w:r>
         <w:t>2.1 Studio executable matrix</w:t>
       </w:r>
@@ -4845,7 +4849,7 @@
       <w:pPr>
         <w:pStyle w:val="Heading2"/>
       </w:pPr>
-      <w:bookmarkStart w:id="5" w:name="_Toc237169186"/>
+      <w:bookmarkStart w:id="5" w:name="_Toc237242518"/>
       <w:r>
         <w:t>2.2 Package source and build outputs</w:t>
       </w:r>
@@ -5244,7 +5248,7 @@
       <w:pPr>
         <w:pStyle w:val="Heading1"/>
       </w:pPr>
-      <w:bookmarkStart w:id="6" w:name="_Toc237169187"/>
+      <w:bookmarkStart w:id="6" w:name="_Toc237242519"/>
       <w:r>
         <w:t>3. Prerequisites and Test Data</w:t>
       </w:r>
@@ -5358,7 +5362,7 @@
       <w:pPr>
         <w:pStyle w:val="Heading2"/>
       </w:pPr>
-      <w:bookmarkStart w:id="7" w:name="_Toc237169188"/>
+      <w:bookmarkStart w:id="7" w:name="_Toc237242520"/>
       <w:r>
         <w:t>3.1 Create the disposable GA4 test copy</w:t>
       </w:r>
@@ -5475,7 +5479,7 @@
       <w:pPr>
         <w:pStyle w:val="Heading2"/>
       </w:pPr>
-      <w:bookmarkStart w:id="8" w:name="_Toc237169189"/>
+      <w:bookmarkStart w:id="8" w:name="_Toc237242521"/>
       <w:r>
         <w:t>3.2 Establish a clean Delphi package baseline</w:t>
       </w:r>
@@ -5592,7 +5596,7 @@
       <w:pPr>
         <w:pStyle w:val="Heading1"/>
       </w:pPr>
-      <w:bookmarkStart w:id="9" w:name="_Toc237169190"/>
+      <w:bookmarkStart w:id="9" w:name="_Toc237242522"/>
       <w:r>
         <w:t>4. Build the Studio Manually</w:t>
       </w:r>
@@ -5607,7 +5611,7 @@
       <w:pPr>
         <w:pStyle w:val="Heading2"/>
       </w:pPr>
-      <w:bookmarkStart w:id="10" w:name="_Toc237169191"/>
+      <w:bookmarkStart w:id="10" w:name="_Toc237242523"/>
       <w:r>
         <w:lastRenderedPageBreak/>
         <w:t>4.1 RAD Studio method</w:t>
@@ -5678,7 +5682,7 @@
       <w:pPr>
         <w:pStyle w:val="Heading2"/>
       </w:pPr>
-      <w:bookmarkStart w:id="11" w:name="_Toc237169192"/>
+      <w:bookmarkStart w:id="11" w:name="_Toc237242524"/>
       <w:r>
         <w:t>4.2 Command-line method</w:t>
       </w:r>
@@ -5743,7 +5747,7 @@
       <w:pPr>
         <w:pStyle w:val="Heading1"/>
       </w:pPr>
-      <w:bookmarkStart w:id="12" w:name="_Toc237169193"/>
+      <w:bookmarkStart w:id="12" w:name="_Toc237242525"/>
       <w:r>
         <w:t>5. Automated Release Gate</w:t>
       </w:r>
@@ -5812,7 +5816,7 @@
       <w:pPr>
         <w:pStyle w:val="Heading2"/>
       </w:pPr>
-      <w:bookmarkStart w:id="13" w:name="_Toc237169194"/>
+      <w:bookmarkStart w:id="13" w:name="_Toc237242526"/>
       <w:r>
         <w:t>5.1 What the gate proves</w:t>
       </w:r>
@@ -6146,7 +6150,7 @@
       <w:pPr>
         <w:pStyle w:val="Heading1"/>
       </w:pPr>
-      <w:bookmarkStart w:id="14" w:name="_Toc237169195"/>
+      <w:bookmarkStart w:id="14" w:name="_Toc237242527"/>
       <w:r>
         <w:lastRenderedPageBreak/>
         <w:t>6. Manual Studio Acceptance</w:t>
@@ -6157,7 +6161,7 @@
       <w:pPr>
         <w:pStyle w:val="Heading2"/>
       </w:pPr>
-      <w:bookmarkStart w:id="15" w:name="_Toc237169196"/>
+      <w:bookmarkStart w:id="15" w:name="_Toc237242528"/>
       <w:r>
         <w:t>TC-01 Launch and navigation</w:t>
       </w:r>
@@ -6466,7 +6470,7 @@
       <w:pPr>
         <w:pStyle w:val="Heading2"/>
       </w:pPr>
-      <w:bookmarkStart w:id="16" w:name="_Toc237169197"/>
+      <w:bookmarkStart w:id="16" w:name="_Toc237242529"/>
       <w:r>
         <w:t>TC-02 Open the disposable GA4 project</w:t>
       </w:r>
@@ -6756,7 +6760,7 @@
       <w:pPr>
         <w:pStyle w:val="Heading2"/>
       </w:pPr>
-      <w:bookmarkStart w:id="17" w:name="_Toc237169198"/>
+      <w:bookmarkStart w:id="17" w:name="_Toc237242530"/>
       <w:r>
         <w:t>TC-03 Scan the project</w:t>
       </w:r>
@@ -7078,7 +7082,7 @@
       <w:pPr>
         <w:pStyle w:val="Heading2"/>
       </w:pPr>
-      <w:bookmarkStart w:id="18" w:name="_Toc237169199"/>
+      <w:bookmarkStart w:id="18" w:name="_Toc237242531"/>
       <w:r>
         <w:t>TC-04 Configure and test a provider</w:t>
       </w:r>
@@ -7395,7 +7399,7 @@
       <w:pPr>
         <w:pStyle w:val="Heading2"/>
       </w:pPr>
-      <w:bookmarkStart w:id="19" w:name="_Toc237169200"/>
+      <w:bookmarkStart w:id="19" w:name="_Toc237242532"/>
       <w:r>
         <w:t>TC-05 Create the development catalog</w:t>
       </w:r>
@@ -7693,7 +7697,7 @@
       <w:pPr>
         <w:pStyle w:val="Heading2"/>
       </w:pPr>
-      <w:bookmarkStart w:id="20" w:name="_Toc237169201"/>
+      <w:bookmarkStart w:id="20" w:name="_Toc237242533"/>
       <w:r>
         <w:t>TC-06 Translate automatically</w:t>
       </w:r>
@@ -7995,7 +7999,7 @@
       <w:pPr>
         <w:pStyle w:val="Heading2"/>
       </w:pPr>
-      <w:bookmarkStart w:id="21" w:name="_Toc237169202"/>
+      <w:bookmarkStart w:id="21" w:name="_Toc237242534"/>
       <w:r>
         <w:t>TC-07 Focused linguistic and structural review</w:t>
       </w:r>
@@ -8296,7 +8300,7 @@
       <w:pPr>
         <w:pStyle w:val="Heading2"/>
       </w:pPr>
-      <w:bookmarkStart w:id="22" w:name="_Toc237169203"/>
+      <w:bookmarkStart w:id="22" w:name="_Toc237242535"/>
       <w:r>
         <w:lastRenderedPageBreak/>
         <w:t>TC-08 Validate and export runtime JSON</w:t>
@@ -8607,7 +8611,7 @@
       <w:pPr>
         <w:pStyle w:val="Heading1"/>
       </w:pPr>
-      <w:bookmarkStart w:id="23" w:name="_Toc237169204"/>
+      <w:bookmarkStart w:id="23" w:name="_Toc237242536"/>
       <w:r>
         <w:lastRenderedPageBreak/>
         <w:t>7. Component Integration Acceptance</w:t>
@@ -8618,7 +8622,7 @@
       <w:pPr>
         <w:pStyle w:val="Heading2"/>
       </w:pPr>
-      <w:bookmarkStart w:id="24" w:name="_Toc237169205"/>
+      <w:bookmarkStart w:id="24" w:name="_Toc237242537"/>
       <w:r>
         <w:t>TC-09 Generate the non-mutating component kit</w:t>
       </w:r>
@@ -8939,7 +8943,7 @@
       <w:pPr>
         <w:pStyle w:val="Heading2"/>
       </w:pPr>
-      <w:bookmarkStart w:id="25" w:name="_Toc237169206"/>
+      <w:bookmarkStart w:id="25" w:name="_Toc237242538"/>
       <w:r>
         <w:lastRenderedPageBreak/>
         <w:t>7.1 Expected component-kit contents</w:t>
@@ -9396,7 +9400,7 @@
       <w:pPr>
         <w:pStyle w:val="Heading2"/>
       </w:pPr>
-      <w:bookmarkStart w:id="26" w:name="_Toc237169207"/>
+      <w:bookmarkStart w:id="26" w:name="_Toc237242539"/>
       <w:r>
         <w:t>TC-10 Install the FMX design package through Delphi</w:t>
       </w:r>
@@ -9765,7 +9769,7 @@
       <w:pPr>
         <w:pStyle w:val="Heading2"/>
       </w:pPr>
-      <w:bookmarkStart w:id="27" w:name="_Toc237169208"/>
+      <w:bookmarkStart w:id="27" w:name="_Toc237242540"/>
       <w:r>
         <w:t>TC-11 Perform the visible Delphi integration</w:t>
       </w:r>
@@ -9932,7 +9936,31 @@
         </w:numPr>
       </w:pPr>
       <w:r>
-        <w:t>Save the project and inspect Git diff before building.</w:t>
+        <w:t>Choose File &gt; Save All. Do not rely on Build to preserve unsaved Form Designer changes.</w:t>
+      </w:r>
+    </w:p>
+    <w:p>
+      <w:pPr>
+        <w:pStyle w:val="ListNumber"/>
+        <w:numPr>
+          <w:ilvl w:val="0"/>
+          <w:numId w:val="23"/>
+        </w:numPr>
+      </w:pPr>
+      <w:r>
+        <w:t>Close and reopen WebsiteAnalytics.MainForm.fmx in the Form Designer. Confirm the manager, selector, label, and all Object Inspector properties are still present.</w:t>
+      </w:r>
+    </w:p>
+    <w:p>
+      <w:pPr>
+        <w:pStyle w:val="ListNumber"/>
+        <w:numPr>
+          <w:ilvl w:val="0"/>
+          <w:numId w:val="23"/>
+        </w:numPr>
+      </w:pPr>
+      <w:r>
+        <w:t>Run git -C "C:\New Delphi Projects\Echurchsite Analytical - Component Test" status --short and inspect the exact diff before building.</w:t>
       </w:r>
     </w:p>
     <w:p>
@@ -9949,6 +9977,14 @@
       </w:pPr>
       <w:r>
         <w:t>Only normal developer-authored integration changes appear: project search-path metadata if saved there, the primary form resource/component field, applicable uses entries, and the visible selector layout.</w:t>
+      </w:r>
+    </w:p>
+    <w:p>
+      <w:pPr>
+        <w:pStyle w:val="ListBullet"/>
+      </w:pPr>
+      <w:r>
+        <w:t>WebsiteAnalytics.MainForm.fmx, WebsiteAnalytics.MainForm.pas, and WebsiteAnalytics.dproj are saved on disk. The form resource contains TDATFMXLanguageManager and TDATFMXLanguageComboBox.</w:t>
       </w:r>
     </w:p>
     <w:p>
@@ -10149,12 +10185,42 @@
           </w:p>
         </w:tc>
       </w:tr>
+      <w:tr>
+        <w:trPr>
+          <w:jc w:val="center"/>
+        </w:trPr>
+        <w:tc>
+          <w:tcPr>
+            <w:tcW w:w="9360" w:type="dxa"/>
+            <w:shd w:val="clear" w:color="auto" w:fill="EAF3FF"/>
+            <w:vAlign w:val="center"/>
+          </w:tcPr>
+          <w:p>
+            <w:pPr>
+              <w:pStyle w:val="Callout"/>
+              <w:rPr>
+                <w:rFonts w:hint="eastAsia"/>
+              </w:rPr>
+            </w:pPr>
+            <w:r>
+              <w:rPr>
+                <w:b/>
+                <w:color w:val="234C80"/>
+              </w:rPr>
+              <w:t xml:space="preserve">Mandatory save checkpoint. </w:t>
+            </w:r>
+            <w:r>
+              <w:t>Do not continue to TC-12 until File &gt; Save All has completed and reopening the form proves that the manager and selector persisted. A successful compile of an older saved form is not evidence that unsaved designer components were included.</w:t>
+            </w:r>
+          </w:p>
+        </w:tc>
+      </w:tr>
     </w:tbl>
     <w:p>
       <w:pPr>
         <w:pStyle w:val="Heading2"/>
       </w:pPr>
-      <w:bookmarkStart w:id="28" w:name="_Toc237169209"/>
+      <w:bookmarkStart w:id="28" w:name="_Toc237242541"/>
       <w:r>
         <w:t>TC-12 Build GA4 Win32 and Win64</w:t>
       </w:r>
@@ -10224,7 +10290,7 @@
         </w:numPr>
       </w:pPr>
       <w:r>
-        <w:t>In RAD Studio select Win32 / Debug and build WebsiteAnalytics.</w:t>
+        <w:t>Choose File &gt; Save All once more before changing platforms or building.</w:t>
       </w:r>
     </w:p>
     <w:p>
@@ -10236,7 +10302,8 @@
         </w:numPr>
       </w:pPr>
       <w:r>
-        <w:t>Select Win64 / Debug and build WebsiteAnalytics.</w:t>
+        <w:lastRenderedPageBreak/>
+        <w:t>In RAD Studio select Win32 / Debug and build WebsiteAnalytics.</w:t>
       </w:r>
     </w:p>
     <w:p>
@@ -10248,7 +10315,7 @@
         </w:numPr>
       </w:pPr>
       <w:r>
-        <w:t>Confirm C:\New Delphi Projects\Echurchsite Analytical - Component Test\bin\Win32\Debug\WebsiteAnalytics.exe exists.</w:t>
+        <w:t>Select Win64 / Debug and build WebsiteAnalytics.</w:t>
       </w:r>
     </w:p>
     <w:p>
@@ -10260,7 +10327,7 @@
         </w:numPr>
       </w:pPr>
       <w:r>
-        <w:t>Confirm C:\New Delphi Projects\Echurchsite Analytical - Component Test\bin\Win64\Debug\WebsiteAnalytics.exe exists.</w:t>
+        <w:t>Confirm C:\New Delphi Projects\Echurchsite Analytical - Component Test\bin\Win32\Debug\WebsiteAnalytics.exe exists.</w:t>
       </w:r>
     </w:p>
     <w:p>
@@ -10272,6 +10339,18 @@
         </w:numPr>
       </w:pPr>
       <w:r>
+        <w:t>Confirm C:\New Delphi Projects\Echurchsite Analytical - Component Test\bin\Win64\Debug\WebsiteAnalytics.exe exists.</w:t>
+      </w:r>
+    </w:p>
+    <w:p>
+      <w:pPr>
+        <w:pStyle w:val="ListNumber"/>
+        <w:numPr>
+          <w:ilvl w:val="0"/>
+          <w:numId w:val="24"/>
+        </w:numPr>
+      </w:pPr>
+      <w:r>
         <w:t>Resolve any search-path problem by checking the ComponentSource path for the affected platform/configuration; do not copy random DCUs into the target.</w:t>
       </w:r>
     </w:p>
@@ -10296,7 +10375,6 @@
         <w:pStyle w:val="ListBullet"/>
       </w:pPr>
       <w:r>
-        <w:lastRenderedPageBreak/>
         <w:t>The target contains the manager and selector through normal compiled source/designer resources.</w:t>
       </w:r>
     </w:p>
@@ -10440,7 +10518,7 @@
       <w:pPr>
         <w:pStyle w:val="Heading2"/>
       </w:pPr>
-      <w:bookmarkStart w:id="29" w:name="_Toc237169210"/>
+      <w:bookmarkStart w:id="29" w:name="_Toc237242542"/>
       <w:r>
         <w:t>TC-13 Deploy language packs</w:t>
       </w:r>
@@ -10510,7 +10588,7 @@
         </w:numPr>
       </w:pPr>
       <w:r>
-        <w:t>Open PowerShell.</w:t>
+        <w:t>Open PowerShell. Use the explicit ExecutionPolicy Bypass commands printed immediately below this test case.</w:t>
       </w:r>
     </w:p>
     <w:p>
@@ -10522,7 +10600,7 @@
         </w:numPr>
       </w:pPr>
       <w:r>
-        <w:t>Run the kit deployment script for C:\New Delphi Projects\Echurchsite Analytical - Component Test\bin\Win32\Debug.</w:t>
+        <w:t>Run the bypass command for C:\New Delphi Projects\Echurchsite Analytical - Component Test\bin\Win32\Debug.</w:t>
       </w:r>
     </w:p>
     <w:p>
@@ -10534,7 +10612,7 @@
         </w:numPr>
       </w:pPr>
       <w:r>
-        <w:t>Run the same script for C:\New Delphi Projects\Echurchsite Analytical - Component Test\bin\Win64\Debug.</w:t>
+        <w:t>Run the bypass command for C:\New Delphi Projects\Echurchsite Analytical - Component Test\bin\Win64\Debug.</w:t>
       </w:r>
     </w:p>
     <w:p>
@@ -10578,6 +10656,7 @@
         <w:pStyle w:val="ListBullet"/>
       </w:pPr>
       <w:r>
+        <w:lastRenderedPageBreak/>
         <w:t>No API key, provider settings JSON, or credential artifact is deployed.</w:t>
       </w:r>
     </w:p>
@@ -10725,7 +10804,7 @@
         </w:rPr>
       </w:pPr>
       <w:r>
-        <w:t>&amp; "C:\New Delphi Projects\Delphi App Translation\export\component-integration\WebsiteAnalytics\Deploy-LanguagePacks.ps1" -ApplicationDirectory "C:\New Delphi Projects\Echurchsite Analytical - Component Test\bin\Win32\Debug"</w:t>
+        <w:t>&amp; "C:\Windows\System32\WindowsPowerShell\v1.0\powershell.exe" -NoProfile -ExecutionPolicy Bypass -File "C:\New Delphi Projects\Delphi App Translation\export\component-integration\WebsiteAnalytics\Deploy-LanguagePacks.ps1" -ApplicationDirectory "C:\New Delphi Projects\Echurchsite Analytical - Component Test\bin\Win32\Debug"</w:t>
       </w:r>
     </w:p>
     <w:p>
@@ -10736,16 +10815,15 @@
         </w:rPr>
       </w:pPr>
       <w:r>
-        <w:t>&amp; "C:\New Delphi Projects\Delphi App Translation\export\component-integration\WebsiteAnalytics\Deploy-LanguagePacks.ps1" -ApplicationDirectory "C:\New Delphi Projects\Echurchsite Analytical - Component Test\bin\Win64\Debug"</w:t>
+        <w:t>&amp; "C:\Windows\System32\WindowsPowerShell\v1.0\powershell.exe" -NoProfile -ExecutionPolicy Bypass -File "C:\New Delphi Projects\Delphi App Translation\export\component-integration\WebsiteAnalytics\Deploy-LanguagePacks.ps1" -ApplicationDirectory "C:\New Delphi Projects\Echurchsite Analytical - Component Test\bin\Win64\Debug"</w:t>
       </w:r>
     </w:p>
     <w:p>
       <w:pPr>
         <w:pStyle w:val="Heading1"/>
       </w:pPr>
-      <w:bookmarkStart w:id="30" w:name="_Toc237169211"/>
-      <w:r>
-        <w:lastRenderedPageBreak/>
+      <w:bookmarkStart w:id="30" w:name="_Toc237242543"/>
+      <w:r>
         <w:t>8. Runtime Acceptance</w:t>
       </w:r>
       <w:bookmarkEnd w:id="30"/>
@@ -10754,7 +10832,7 @@
       <w:pPr>
         <w:pStyle w:val="Heading2"/>
       </w:pPr>
-      <w:bookmarkStart w:id="31" w:name="_Toc237169212"/>
+      <w:bookmarkStart w:id="31" w:name="_Toc237242544"/>
       <w:r>
         <w:t>TC-14 First launch and source language</w:t>
       </w:r>
@@ -10996,6 +11074,7 @@
                 <w:color w:val="234C80"/>
                 <w:sz w:val="17"/>
               </w:rPr>
+              <w:lastRenderedPageBreak/>
               <w:t>Date</w:t>
             </w:r>
           </w:p>
@@ -11035,7 +11114,7 @@
       <w:pPr>
         <w:pStyle w:val="Heading2"/>
       </w:pPr>
-      <w:bookmarkStart w:id="32" w:name="_Toc237169213"/>
+      <w:bookmarkStart w:id="32" w:name="_Toc237242545"/>
       <w:r>
         <w:t>TC-15 Immediate language switching</w:t>
       </w:r>
@@ -11161,7 +11240,6 @@
         <w:pStyle w:val="Heading3"/>
       </w:pPr>
       <w:r>
-        <w:lastRenderedPageBreak/>
         <w:t>Expected result</w:t>
       </w:r>
     </w:p>
@@ -11329,7 +11407,7 @@
       <w:pPr>
         <w:pStyle w:val="Heading2"/>
       </w:pPr>
-      <w:bookmarkStart w:id="33" w:name="_Toc237169214"/>
+      <w:bookmarkStart w:id="33" w:name="_Toc237242546"/>
       <w:r>
         <w:t>TC-16 Preserve control state and date range</w:t>
       </w:r>
@@ -11443,6 +11521,7 @@
         <w:pStyle w:val="Heading3"/>
       </w:pPr>
       <w:r>
+        <w:lastRenderedPageBreak/>
         <w:t>Expected result</w:t>
       </w:r>
     </w:p>
@@ -11610,7 +11689,7 @@
       <w:pPr>
         <w:pStyle w:val="Heading2"/>
       </w:pPr>
-      <w:bookmarkStart w:id="34" w:name="_Toc237169215"/>
+      <w:bookmarkStart w:id="34" w:name="_Toc237242547"/>
       <w:r>
         <w:t>TC-17 Preference persistence and restart</w:t>
       </w:r>
@@ -11668,7 +11747,6 @@
         <w:pStyle w:val="Heading3"/>
       </w:pPr>
       <w:r>
-        <w:lastRenderedPageBreak/>
         <w:t>Procedure</w:t>
       </w:r>
     </w:p>
@@ -11892,7 +11970,7 @@
       <w:pPr>
         <w:pStyle w:val="Heading2"/>
       </w:pPr>
-      <w:bookmarkStart w:id="35" w:name="_Toc237169216"/>
+      <w:bookmarkStart w:id="35" w:name="_Toc237242548"/>
       <w:r>
         <w:t>TC-18 Offline runtime</w:t>
       </w:r>
@@ -11950,6 +12028,7 @@
         <w:pStyle w:val="Heading3"/>
       </w:pPr>
       <w:r>
+        <w:lastRenderedPageBreak/>
         <w:t>Procedure</w:t>
       </w:r>
     </w:p>
@@ -12126,7 +12205,6 @@
                 <w:color w:val="234C80"/>
                 <w:sz w:val="17"/>
               </w:rPr>
-              <w:lastRenderedPageBreak/>
               <w:t>Date</w:t>
             </w:r>
           </w:p>
@@ -12166,7 +12244,7 @@
       <w:pPr>
         <w:pStyle w:val="Heading2"/>
       </w:pPr>
-      <w:bookmarkStart w:id="36" w:name="_Toc237169217"/>
+      <w:bookmarkStart w:id="36" w:name="_Toc237242549"/>
       <w:r>
         <w:t>TC-19 Missing and malformed pack behavior</w:t>
       </w:r>
@@ -12363,6 +12441,7 @@
                 <w:color w:val="234C80"/>
                 <w:sz w:val="17"/>
               </w:rPr>
+              <w:lastRenderedPageBreak/>
               <w:t>Result</w:t>
             </w:r>
           </w:p>
@@ -12459,7 +12538,7 @@
       <w:pPr>
         <w:pStyle w:val="Heading2"/>
       </w:pPr>
-      <w:bookmarkStart w:id="37" w:name="_Toc237169218"/>
+      <w:bookmarkStart w:id="37" w:name="_Toc237242550"/>
       <w:r>
         <w:t>8.1 Repeat the runtime matrix</w:t>
       </w:r>
@@ -12793,7 +12872,7 @@
       <w:pPr>
         <w:pStyle w:val="Heading1"/>
       </w:pPr>
-      <w:bookmarkStart w:id="38" w:name="_Toc237169219"/>
+      <w:bookmarkStart w:id="38" w:name="_Toc237242551"/>
       <w:r>
         <w:t>9. VCL Acceptance Delta</w:t>
       </w:r>
@@ -13040,8 +13119,9 @@
       <w:pPr>
         <w:pStyle w:val="Heading1"/>
       </w:pPr>
-      <w:bookmarkStart w:id="39" w:name="_Toc237169220"/>
-      <w:r>
+      <w:bookmarkStart w:id="39" w:name="_Toc237242552"/>
+      <w:r>
+        <w:lastRenderedPageBreak/>
         <w:t>10. Studio Self-Translation</w:t>
       </w:r>
       <w:bookmarkEnd w:id="39"/>
@@ -13109,9 +13189,8 @@
       <w:pPr>
         <w:pStyle w:val="Heading1"/>
       </w:pPr>
-      <w:bookmarkStart w:id="40" w:name="_Toc237169221"/>
-      <w:r>
-        <w:lastRenderedPageBreak/>
+      <w:bookmarkStart w:id="40" w:name="_Toc237242553"/>
+      <w:r>
         <w:t>11. Starting Over, Restore, and Reset</w:t>
       </w:r>
       <w:bookmarkEnd w:id="40"/>
@@ -13120,7 +13199,7 @@
       <w:pPr>
         <w:pStyle w:val="Heading2"/>
       </w:pPr>
-      <w:bookmarkStart w:id="41" w:name="_Toc237169222"/>
+      <w:bookmarkStart w:id="41" w:name="_Toc237242554"/>
       <w:r>
         <w:t>11.1 Recommended component path</w:t>
       </w:r>
@@ -13187,7 +13266,7 @@
       <w:pPr>
         <w:pStyle w:val="Heading2"/>
       </w:pPr>
-      <w:bookmarkStart w:id="42" w:name="_Toc237169223"/>
+      <w:bookmarkStart w:id="42" w:name="_Toc237242555"/>
       <w:r>
         <w:t>11.2 Advanced automatic-source reset test</w:t>
       </w:r>
@@ -13226,6 +13305,7 @@
         </w:numPr>
       </w:pPr>
       <w:r>
+        <w:lastRenderedPageBreak/>
         <w:t>Choose Prepare Complete Reset. Confirm the preview is read-only and identifies the original baseline.</w:t>
       </w:r>
     </w:p>
@@ -13313,9 +13393,8 @@
       <w:pPr>
         <w:pStyle w:val="Heading1"/>
       </w:pPr>
-      <w:bookmarkStart w:id="43" w:name="_Toc237169224"/>
-      <w:r>
-        <w:lastRenderedPageBreak/>
+      <w:bookmarkStart w:id="43" w:name="_Toc237242556"/>
+      <w:r>
         <w:t>12. Negative and Recovery Tests</w:t>
       </w:r>
       <w:bookmarkEnd w:id="43"/>
@@ -13894,8 +13973,9 @@
       <w:pPr>
         <w:pStyle w:val="Heading1"/>
       </w:pPr>
-      <w:bookmarkStart w:id="44" w:name="_Toc237169225"/>
-      <w:r>
+      <w:bookmarkStart w:id="44" w:name="_Toc237242557"/>
+      <w:r>
+        <w:lastRenderedPageBreak/>
         <w:t>13. Performance and Large-Project Checks</w:t>
       </w:r>
       <w:bookmarkEnd w:id="44"/>
@@ -14182,7 +14262,6 @@
                 <w:color w:val="163A63"/>
                 <w:sz w:val="17"/>
               </w:rPr>
-              <w:lastRenderedPageBreak/>
               <w:t>Scan milliseconds</w:t>
             </w:r>
           </w:p>
@@ -14452,7 +14531,7 @@
       <w:pPr>
         <w:pStyle w:val="Heading1"/>
       </w:pPr>
-      <w:bookmarkStart w:id="45" w:name="_Toc237169226"/>
+      <w:bookmarkStart w:id="45" w:name="_Toc237242558"/>
       <w:r>
         <w:t>14. Defect Recording</w:t>
       </w:r>
@@ -14591,6 +14670,7 @@
                 <w:color w:val="163A63"/>
                 <w:sz w:val="18"/>
               </w:rPr>
+              <w:lastRenderedPageBreak/>
               <w:t>Defect ID / title</w:t>
             </w:r>
           </w:p>
@@ -14938,7 +15018,7 @@
       <w:pPr>
         <w:pStyle w:val="Heading1"/>
       </w:pPr>
-      <w:bookmarkStart w:id="46" w:name="_Toc237169227"/>
+      <w:bookmarkStart w:id="46" w:name="_Toc237242559"/>
       <w:r>
         <w:t>15. Final Acceptance Checklist</w:t>
       </w:r>
@@ -15777,6 +15857,7 @@
                 <w:color w:val="163A63"/>
                 <w:sz w:val="17"/>
               </w:rPr>
+              <w:lastRenderedPageBreak/>
               <w:t>Instant switching</w:t>
             </w:r>
           </w:p>
@@ -16404,9 +16485,8 @@
       <w:pPr>
         <w:pStyle w:val="Heading1"/>
       </w:pPr>
-      <w:bookmarkStart w:id="47" w:name="_Toc237169228"/>
-      <w:r>
-        <w:lastRenderedPageBreak/>
+      <w:bookmarkStart w:id="47" w:name="_Toc237242560"/>
+      <w:r>
         <w:t>16. Appendix A - Exact Test Scripts</w:t>
       </w:r>
       <w:bookmarkEnd w:id="47"/>
@@ -16819,8 +16899,9 @@
       <w:pPr>
         <w:pStyle w:val="Heading1"/>
       </w:pPr>
-      <w:bookmarkStart w:id="48" w:name="_Toc237169229"/>
-      <w:r>
+      <w:bookmarkStart w:id="48" w:name="_Toc237242561"/>
+      <w:r>
+        <w:lastRenderedPageBreak/>
         <w:t>17. Appendix B - What Each JSON File Is</w:t>
       </w:r>
       <w:bookmarkEnd w:id="48"/>
@@ -17200,9 +17281,8 @@
       <w:pPr>
         <w:pStyle w:val="Heading1"/>
       </w:pPr>
-      <w:bookmarkStart w:id="49" w:name="_Toc237169230"/>
-      <w:r>
-        <w:lastRenderedPageBreak/>
+      <w:bookmarkStart w:id="49" w:name="_Toc237242562"/>
+      <w:r>
         <w:t>18. Appendix C - Current Verified Baseline</w:t>
       </w:r>
       <w:bookmarkEnd w:id="49"/>
@@ -17221,8 +17301,8 @@
       </w:r>
     </w:p>
     <w:sectPr>
-      <w:headerReference w:type="default" r:id="rId13"/>
-      <w:footerReference w:type="default" r:id="rId14"/>
+      <w:headerReference w:type="default" r:id="rId17"/>
+      <w:footerReference w:type="default" r:id="rId18"/>
       <w:pgSz w:w="12240" w:h="15840"/>
       <w:pgMar w:top="1440" w:right="1440" w:bottom="1440" w:left="1440" w:header="708" w:footer="708" w:gutter="0"/>
       <w:pgNumType w:start="1"/>
@@ -17263,7 +17343,6 @@
   <w:p>
     <w:pPr>
       <w:pStyle w:val="Footer"/>
-      <w:jc w:val="center"/>
     </w:pPr>
   </w:p>
 </w:ftr>
@@ -17276,54 +17355,6 @@
       <w:pStyle w:val="Footer"/>
       <w:jc w:val="center"/>
     </w:pPr>
-    <w:r>
-      <w:rPr>
-        <w:rFonts w:ascii="Aptos" w:hAnsi="Aptos"/>
-        <w:color w:val="5D7693"/>
-        <w:sz w:val="16"/>
-      </w:rPr>
-      <w:t xml:space="preserve">Page </w:t>
-    </w:r>
-    <w:r>
-      <w:rPr>
-        <w:rFonts w:ascii="Aptos" w:hAnsi="Aptos"/>
-        <w:color w:val="5D7693"/>
-        <w:sz w:val="16"/>
-      </w:rPr>
-      <w:fldChar w:fldCharType="begin"/>
-    </w:r>
-    <w:r>
-      <w:rPr>
-        <w:rFonts w:ascii="Aptos" w:hAnsi="Aptos"/>
-        <w:color w:val="5D7693"/>
-        <w:sz w:val="16"/>
-      </w:rPr>
-      <w:instrText>PAGE</w:instrText>
-    </w:r>
-    <w:r>
-      <w:rPr>
-        <w:rFonts w:ascii="Aptos" w:hAnsi="Aptos"/>
-        <w:color w:val="5D7693"/>
-        <w:sz w:val="16"/>
-      </w:rPr>
-      <w:fldChar w:fldCharType="separate"/>
-    </w:r>
-    <w:r>
-      <w:rPr>
-        <w:rFonts w:ascii="Aptos" w:hAnsi="Aptos"/>
-        <w:color w:val="5D7693"/>
-        <w:sz w:val="16"/>
-      </w:rPr>
-      <w:t>Update this field in Microsoft Word.</w:t>
-    </w:r>
-    <w:r>
-      <w:rPr>
-        <w:rFonts w:ascii="Aptos" w:hAnsi="Aptos"/>
-        <w:color w:val="5D7693"/>
-        <w:sz w:val="16"/>
-      </w:rPr>
-      <w:fldChar w:fldCharType="end"/>
-    </w:r>
   </w:p>
 </w:ftr>
 </file>
@@ -17333,6 +17364,75 @@
   <w:p>
     <w:pPr>
       <w:pStyle w:val="Footer"/>
+    </w:pPr>
+  </w:p>
+</w:ftr>
+</file>
+
+<file path=word/footer4.xml><?xml version="1.0" encoding="utf-8"?>
+<w:ftr xmlns:wpc="http://schemas.microsoft.com/office/word/2010/wordprocessingCanvas" xmlns:cx="http://schemas.microsoft.com/office/drawing/2014/chartex" xmlns:cx1="http://schemas.microsoft.com/office/drawing/2015/9/8/chartex" xmlns:cx2="http://schemas.microsoft.com/office/drawing/2015/10/21/chartex" xmlns:cx3="http://schemas.microsoft.com/office/drawing/2016/5/9/chartex" xmlns:cx4="http://schemas.microsoft.com/office/drawing/2016/5/10/chartex" xmlns:cx5="http://schemas.microsoft.com/office/drawing/2016/5/11/chartex" xmlns:cx6="http://schemas.microsoft.com/office/drawing/2016/5/12/chartex" xmlns:cx7="http://schemas.microsoft.com/office/drawing/2016/5/13/chartex" xmlns:cx8="http://schemas.microsoft.com/office/drawing/2016/5/14/chartex" xmlns:mc="http://schemas.openxmlformats.org/markup-compatibility/2006" xmlns:aink="http://schemas.microsoft.com/office/drawing/2016/ink" xmlns:am3d="http://schemas.microsoft.com/office/drawing/2017/model3d" xmlns:o="urn:schemas-microsoft-com:office:office" xmlns:oel="http://schemas.microsoft.com/office/2019/extlst" xmlns:r="http://schemas.openxmlformats.org/officeDocument/2006/relationships" xmlns:m="http://schemas.openxmlformats.org/officeDocument/2006/math" xmlns:v="urn:schemas-microsoft-com:vml" xmlns:wp14="http://schemas.microsoft.com/office/word/2010/wordprocessingDrawing" xmlns:wp="http://schemas.openxmlformats.org/drawingml/2006/wordprocessingDrawing" xmlns:w10="urn:schemas-microsoft-com:office:word" xmlns:w="http://schemas.openxmlformats.org/wordprocessingml/2006/main" xmlns:w14="http://schemas.microsoft.com/office/word/2010/wordml" xmlns:w15="http://schemas.microsoft.com/office/word/2012/wordml" xmlns:w16cei="http://schemas.microsoft.com/office/word/2026/wordml/cei" xmlns:w16cex="http://schemas.microsoft.com/office/word/2018/wordml/cex" xmlns:w16cid="http://schemas.microsoft.com/office/word/2016/wordml/cid" xmlns:w16="http://schemas.microsoft.com/office/word/2018/wordml" xmlns:w16du="http://schemas.microsoft.com/office/word/2023/wordml/word16du" xmlns:w16sdtdh="http://schemas.microsoft.com/office/word/2020/wordml/sdtdatahash" xmlns:w16sdtfl="http://schemas.microsoft.com/office/word/2024/wordml/sdtformatlock" xmlns:w16se="http://schemas.microsoft.com/office/word/2015/wordml/symex" xmlns:wpg="http://schemas.microsoft.com/office/word/2010/wordprocessingGroup" xmlns:wpi="http://schemas.microsoft.com/office/word/2010/wordprocessingInk" xmlns:wne="http://schemas.microsoft.com/office/word/2006/wordml" xmlns:wps="http://schemas.microsoft.com/office/word/2010/wordprocessingShape" mc:Ignorable="w14 w15 w16se w16cid w16 w16cex w16sdtdh w16sdtfl w16du wp14">
+  <w:p>
+    <w:pPr>
+      <w:pStyle w:val="Footer"/>
+      <w:jc w:val="center"/>
+    </w:pPr>
+    <w:r>
+      <w:rPr>
+        <w:rFonts w:ascii="Aptos" w:hAnsi="Aptos"/>
+        <w:color w:val="5D7693"/>
+        <w:sz w:val="16"/>
+      </w:rPr>
+      <w:t xml:space="preserve">Page </w:t>
+    </w:r>
+    <w:r>
+      <w:rPr>
+        <w:rFonts w:ascii="Aptos" w:hAnsi="Aptos"/>
+        <w:color w:val="5D7693"/>
+        <w:sz w:val="16"/>
+      </w:rPr>
+      <w:fldChar w:fldCharType="begin"/>
+    </w:r>
+    <w:r>
+      <w:rPr>
+        <w:rFonts w:ascii="Aptos" w:hAnsi="Aptos"/>
+        <w:color w:val="5D7693"/>
+        <w:sz w:val="16"/>
+      </w:rPr>
+      <w:instrText>PAGE</w:instrText>
+    </w:r>
+    <w:r>
+      <w:rPr>
+        <w:rFonts w:ascii="Aptos" w:hAnsi="Aptos"/>
+        <w:color w:val="5D7693"/>
+        <w:sz w:val="16"/>
+      </w:rPr>
+      <w:fldChar w:fldCharType="separate"/>
+    </w:r>
+    <w:r>
+      <w:rPr>
+        <w:rFonts w:ascii="Aptos" w:hAnsi="Aptos"/>
+        <w:color w:val="5D7693"/>
+        <w:sz w:val="16"/>
+      </w:rPr>
+      <w:t>Update this field in Microsoft Word.</w:t>
+    </w:r>
+    <w:r>
+      <w:rPr>
+        <w:rFonts w:ascii="Aptos" w:hAnsi="Aptos"/>
+        <w:color w:val="5D7693"/>
+        <w:sz w:val="16"/>
+      </w:rPr>
+      <w:fldChar w:fldCharType="end"/>
+    </w:r>
+  </w:p>
+</w:ftr>
+</file>
+
+<file path=word/footer5.xml><?xml version="1.0" encoding="utf-8"?>
+<w:ftr xmlns:wpc="http://schemas.microsoft.com/office/word/2010/wordprocessingCanvas" xmlns:cx="http://schemas.microsoft.com/office/drawing/2014/chartex" xmlns:cx1="http://schemas.microsoft.com/office/drawing/2015/9/8/chartex" xmlns:cx2="http://schemas.microsoft.com/office/drawing/2015/10/21/chartex" xmlns:cx3="http://schemas.microsoft.com/office/drawing/2016/5/9/chartex" xmlns:cx4="http://schemas.microsoft.com/office/drawing/2016/5/10/chartex" xmlns:cx5="http://schemas.microsoft.com/office/drawing/2016/5/11/chartex" xmlns:cx6="http://schemas.microsoft.com/office/drawing/2016/5/12/chartex" xmlns:cx7="http://schemas.microsoft.com/office/drawing/2016/5/13/chartex" xmlns:cx8="http://schemas.microsoft.com/office/drawing/2016/5/14/chartex" xmlns:mc="http://schemas.openxmlformats.org/markup-compatibility/2006" xmlns:aink="http://schemas.microsoft.com/office/drawing/2016/ink" xmlns:am3d="http://schemas.microsoft.com/office/drawing/2017/model3d" xmlns:o="urn:schemas-microsoft-com:office:office" xmlns:oel="http://schemas.microsoft.com/office/2019/extlst" xmlns:r="http://schemas.openxmlformats.org/officeDocument/2006/relationships" xmlns:m="http://schemas.openxmlformats.org/officeDocument/2006/math" xmlns:v="urn:schemas-microsoft-com:vml" xmlns:wp14="http://schemas.microsoft.com/office/word/2010/wordprocessingDrawing" xmlns:wp="http://schemas.openxmlformats.org/drawingml/2006/wordprocessingDrawing" xmlns:w10="urn:schemas-microsoft-com:office:word" xmlns:w="http://schemas.openxmlformats.org/wordprocessingml/2006/main" xmlns:w14="http://schemas.microsoft.com/office/word/2010/wordml" xmlns:w15="http://schemas.microsoft.com/office/word/2012/wordml" xmlns:w16cei="http://schemas.microsoft.com/office/word/2026/wordml/cei" xmlns:w16cex="http://schemas.microsoft.com/office/word/2018/wordml/cex" xmlns:w16cid="http://schemas.microsoft.com/office/word/2016/wordml/cid" xmlns:w16="http://schemas.microsoft.com/office/word/2018/wordml" xmlns:w16du="http://schemas.microsoft.com/office/word/2023/wordml/word16du" xmlns:w16sdtdh="http://schemas.microsoft.com/office/word/2020/wordml/sdtdatahash" xmlns:w16sdtfl="http://schemas.microsoft.com/office/word/2024/wordml/sdtformatlock" xmlns:w16se="http://schemas.microsoft.com/office/word/2015/wordml/symex" xmlns:wpg="http://schemas.microsoft.com/office/word/2010/wordprocessingGroup" xmlns:wpi="http://schemas.microsoft.com/office/word/2010/wordprocessingInk" xmlns:wne="http://schemas.microsoft.com/office/word/2006/wordml" xmlns:wps="http://schemas.microsoft.com/office/word/2010/wordprocessingShape" mc:Ignorable="w14 w15 w16se w16cid w16 w16cex w16sdtdh w16sdtfl w16du wp14">
+  <w:p>
+    <w:pPr>
+      <w:pStyle w:val="Footer"/>
       <w:jc w:val="center"/>
     </w:pPr>
     <w:r>
@@ -17417,7 +17517,6 @@
   <w:p>
     <w:pPr>
       <w:pStyle w:val="Header"/>
-      <w:jc w:val="right"/>
     </w:pPr>
   </w:p>
 </w:hdr>
@@ -17430,6 +17529,27 @@
       <w:pStyle w:val="Header"/>
       <w:jc w:val="right"/>
     </w:pPr>
+  </w:p>
+</w:hdr>
+</file>
+
+<file path=word/header3.xml><?xml version="1.0" encoding="utf-8"?>
+<w:hdr xmlns:wpc="http://schemas.microsoft.com/office/word/2010/wordprocessingCanvas" xmlns:cx="http://schemas.microsoft.com/office/drawing/2014/chartex" xmlns:cx1="http://schemas.microsoft.com/office/drawing/2015/9/8/chartex" xmlns:cx2="http://schemas.microsoft.com/office/drawing/2015/10/21/chartex" xmlns:cx3="http://schemas.microsoft.com/office/drawing/2016/5/9/chartex" xmlns:cx4="http://schemas.microsoft.com/office/drawing/2016/5/10/chartex" xmlns:cx5="http://schemas.microsoft.com/office/drawing/2016/5/11/chartex" xmlns:cx6="http://schemas.microsoft.com/office/drawing/2016/5/12/chartex" xmlns:cx7="http://schemas.microsoft.com/office/drawing/2016/5/13/chartex" xmlns:cx8="http://schemas.microsoft.com/office/drawing/2016/5/14/chartex" xmlns:mc="http://schemas.openxmlformats.org/markup-compatibility/2006" xmlns:aink="http://schemas.microsoft.com/office/drawing/2016/ink" xmlns:am3d="http://schemas.microsoft.com/office/drawing/2017/model3d" xmlns:o="urn:schemas-microsoft-com:office:office" xmlns:oel="http://schemas.microsoft.com/office/2019/extlst" xmlns:r="http://schemas.openxmlformats.org/officeDocument/2006/relationships" xmlns:m="http://schemas.openxmlformats.org/officeDocument/2006/math" xmlns:v="urn:schemas-microsoft-com:vml" xmlns:wp14="http://schemas.microsoft.com/office/word/2010/wordprocessingDrawing" xmlns:wp="http://schemas.openxmlformats.org/drawingml/2006/wordprocessingDrawing" xmlns:w10="urn:schemas-microsoft-com:office:word" xmlns:w="http://schemas.openxmlformats.org/wordprocessingml/2006/main" xmlns:w14="http://schemas.microsoft.com/office/word/2010/wordml" xmlns:w15="http://schemas.microsoft.com/office/word/2012/wordml" xmlns:w16cei="http://schemas.microsoft.com/office/word/2026/wordml/cei" xmlns:w16cex="http://schemas.microsoft.com/office/word/2018/wordml/cex" xmlns:w16cid="http://schemas.microsoft.com/office/word/2016/wordml/cid" xmlns:w16="http://schemas.microsoft.com/office/word/2018/wordml" xmlns:w16du="http://schemas.microsoft.com/office/word/2023/wordml/word16du" xmlns:w16sdtdh="http://schemas.microsoft.com/office/word/2020/wordml/sdtdatahash" xmlns:w16sdtfl="http://schemas.microsoft.com/office/word/2024/wordml/sdtformatlock" xmlns:w16se="http://schemas.microsoft.com/office/word/2015/wordml/symex" xmlns:wpg="http://schemas.microsoft.com/office/word/2010/wordprocessingGroup" xmlns:wpi="http://schemas.microsoft.com/office/word/2010/wordprocessingInk" xmlns:wne="http://schemas.microsoft.com/office/word/2006/wordml" xmlns:wps="http://schemas.microsoft.com/office/word/2010/wordprocessingShape" mc:Ignorable="w14 w15 w16se w16cid w16 w16cex w16sdtdh w16sdtfl w16du wp14">
+  <w:p>
+    <w:pPr>
+      <w:pStyle w:val="Header"/>
+    </w:pPr>
+  </w:p>
+</w:hdr>
+</file>
+
+<file path=word/header4.xml><?xml version="1.0" encoding="utf-8"?>
+<w:hdr xmlns:wpc="http://schemas.microsoft.com/office/word/2010/wordprocessingCanvas" xmlns:cx="http://schemas.microsoft.com/office/drawing/2014/chartex" xmlns:cx1="http://schemas.microsoft.com/office/drawing/2015/9/8/chartex" xmlns:cx2="http://schemas.microsoft.com/office/drawing/2015/10/21/chartex" xmlns:cx3="http://schemas.microsoft.com/office/drawing/2016/5/9/chartex" xmlns:cx4="http://schemas.microsoft.com/office/drawing/2016/5/10/chartex" xmlns:cx5="http://schemas.microsoft.com/office/drawing/2016/5/11/chartex" xmlns:cx6="http://schemas.microsoft.com/office/drawing/2016/5/12/chartex" xmlns:cx7="http://schemas.microsoft.com/office/drawing/2016/5/13/chartex" xmlns:cx8="http://schemas.microsoft.com/office/drawing/2016/5/14/chartex" xmlns:mc="http://schemas.openxmlformats.org/markup-compatibility/2006" xmlns:aink="http://schemas.microsoft.com/office/drawing/2016/ink" xmlns:am3d="http://schemas.microsoft.com/office/drawing/2017/model3d" xmlns:o="urn:schemas-microsoft-com:office:office" xmlns:oel="http://schemas.microsoft.com/office/2019/extlst" xmlns:r="http://schemas.openxmlformats.org/officeDocument/2006/relationships" xmlns:m="http://schemas.openxmlformats.org/officeDocument/2006/math" xmlns:v="urn:schemas-microsoft-com:vml" xmlns:wp14="http://schemas.microsoft.com/office/word/2010/wordprocessingDrawing" xmlns:wp="http://schemas.openxmlformats.org/drawingml/2006/wordprocessingDrawing" xmlns:w10="urn:schemas-microsoft-com:office:word" xmlns:w="http://schemas.openxmlformats.org/wordprocessingml/2006/main" xmlns:w14="http://schemas.microsoft.com/office/word/2010/wordml" xmlns:w15="http://schemas.microsoft.com/office/word/2012/wordml" xmlns:w16cei="http://schemas.microsoft.com/office/word/2026/wordml/cei" xmlns:w16cex="http://schemas.microsoft.com/office/word/2018/wordml/cex" xmlns:w16cid="http://schemas.microsoft.com/office/word/2016/wordml/cid" xmlns:w16="http://schemas.microsoft.com/office/word/2018/wordml" xmlns:w16du="http://schemas.microsoft.com/office/word/2023/wordml/word16du" xmlns:w16sdtdh="http://schemas.microsoft.com/office/word/2020/wordml/sdtdatahash" xmlns:w16sdtfl="http://schemas.microsoft.com/office/word/2024/wordml/sdtformatlock" xmlns:w16se="http://schemas.microsoft.com/office/word/2015/wordml/symex" xmlns:wpg="http://schemas.microsoft.com/office/word/2010/wordprocessingGroup" xmlns:wpi="http://schemas.microsoft.com/office/word/2010/wordprocessingInk" xmlns:wne="http://schemas.microsoft.com/office/word/2006/wordml" xmlns:wps="http://schemas.microsoft.com/office/word/2010/wordprocessingShape" mc:Ignorable="w14 w15 w16se w16cid w16 w16cex w16sdtdh w16sdtfl w16du wp14">
+  <w:p>
+    <w:pPr>
+      <w:pStyle w:val="Header"/>
+      <w:jc w:val="right"/>
+    </w:pPr>
     <w:r>
       <w:rPr>
         <w:rFonts w:ascii="Aptos" w:hAnsi="Aptos"/>
@@ -17442,7 +17562,7 @@
 </w:hdr>
 </file>
 
-<file path=word/header3.xml><?xml version="1.0" encoding="utf-8"?>
+<file path=word/header5.xml><?xml version="1.0" encoding="utf-8"?>
 <w:hdr xmlns:wpc="http://schemas.microsoft.com/office/word/2010/wordprocessingCanvas" xmlns:cx="http://schemas.microsoft.com/office/drawing/2014/chartex" xmlns:cx1="http://schemas.microsoft.com/office/drawing/2015/9/8/chartex" xmlns:cx2="http://schemas.microsoft.com/office/drawing/2015/10/21/chartex" xmlns:cx3="http://schemas.microsoft.com/office/drawing/2016/5/9/chartex" xmlns:cx4="http://schemas.microsoft.com/office/drawing/2016/5/10/chartex" xmlns:cx5="http://schemas.microsoft.com/office/drawing/2016/5/11/chartex" xmlns:cx6="http://schemas.microsoft.com/office/drawing/2016/5/12/chartex" xmlns:cx7="http://schemas.microsoft.com/office/drawing/2016/5/13/chartex" xmlns:cx8="http://schemas.microsoft.com/office/drawing/2016/5/14/chartex" xmlns:mc="http://schemas.openxmlformats.org/markup-compatibility/2006" xmlns:aink="http://schemas.microsoft.com/office/drawing/2016/ink" xmlns:am3d="http://schemas.microsoft.com/office/drawing/2017/model3d" xmlns:o="urn:schemas-microsoft-com:office:office" xmlns:oel="http://schemas.microsoft.com/office/2019/extlst" xmlns:r="http://schemas.openxmlformats.org/officeDocument/2006/relationships" xmlns:m="http://schemas.openxmlformats.org/officeDocument/2006/math" xmlns:v="urn:schemas-microsoft-com:vml" xmlns:wp14="http://schemas.microsoft.com/office/word/2010/wordprocessingDrawing" xmlns:wp="http://schemas.openxmlformats.org/drawingml/2006/wordprocessingDrawing" xmlns:w10="urn:schemas-microsoft-com:office:word" xmlns:w="http://schemas.openxmlformats.org/wordprocessingml/2006/main" xmlns:w14="http://schemas.microsoft.com/office/word/2010/wordml" xmlns:w15="http://schemas.microsoft.com/office/word/2012/wordml" xmlns:w16cei="http://schemas.microsoft.com/office/word/2026/wordml/cei" xmlns:w16cex="http://schemas.microsoft.com/office/word/2018/wordml/cex" xmlns:w16cid="http://schemas.microsoft.com/office/word/2016/wordml/cid" xmlns:w16="http://schemas.microsoft.com/office/word/2018/wordml" xmlns:w16du="http://schemas.microsoft.com/office/word/2023/wordml/word16du" xmlns:w16sdtdh="http://schemas.microsoft.com/office/word/2020/wordml/sdtdatahash" xmlns:w16sdtfl="http://schemas.microsoft.com/office/word/2024/wordml/sdtformatlock" xmlns:w16se="http://schemas.microsoft.com/office/word/2015/wordml/symex" xmlns:wpg="http://schemas.microsoft.com/office/word/2010/wordprocessingGroup" xmlns:wpi="http://schemas.microsoft.com/office/word/2010/wordprocessingInk" xmlns:wne="http://schemas.microsoft.com/office/word/2006/wordml" xmlns:wps="http://schemas.microsoft.com/office/word/2010/wordprocessingShape" mc:Ignorable="w14 w15 w16se w16cid w16 w16cex w16sdtdh w16sdtfl w16du wp14">
   <w:p>
     <w:pPr>
@@ -17634,166 +17754,166 @@
       </w:rPr>
     </w:lvl>
   </w:abstractNum>
-  <w:num w:numId="1" w16cid:durableId="46608483">
+  <w:num w:numId="1" w16cid:durableId="739207445">
     <w:abstractNumId w:val="8"/>
   </w:num>
-  <w:num w:numId="2" w16cid:durableId="407311701">
+  <w:num w:numId="2" w16cid:durableId="1146244848">
     <w:abstractNumId w:val="6"/>
   </w:num>
-  <w:num w:numId="3" w16cid:durableId="248775436">
+  <w:num w:numId="3" w16cid:durableId="21825608">
     <w:abstractNumId w:val="5"/>
   </w:num>
-  <w:num w:numId="4" w16cid:durableId="1374109848">
+  <w:num w:numId="4" w16cid:durableId="982081786">
     <w:abstractNumId w:val="4"/>
   </w:num>
-  <w:num w:numId="5" w16cid:durableId="897084115">
+  <w:num w:numId="5" w16cid:durableId="324672463">
     <w:abstractNumId w:val="7"/>
   </w:num>
-  <w:num w:numId="6" w16cid:durableId="1007368514">
+  <w:num w:numId="6" w16cid:durableId="293098673">
     <w:abstractNumId w:val="3"/>
   </w:num>
-  <w:num w:numId="7" w16cid:durableId="1382555476">
+  <w:num w:numId="7" w16cid:durableId="514925419">
     <w:abstractNumId w:val="2"/>
   </w:num>
-  <w:num w:numId="8" w16cid:durableId="575407975">
+  <w:num w:numId="8" w16cid:durableId="2100171196">
     <w:abstractNumId w:val="1"/>
   </w:num>
-  <w:num w:numId="9" w16cid:durableId="1282761020">
+  <w:num w:numId="9" w16cid:durableId="1548373677">
     <w:abstractNumId w:val="0"/>
   </w:num>
-  <w:num w:numId="10" w16cid:durableId="1754742550">
+  <w:num w:numId="10" w16cid:durableId="1844319575">
     <w:abstractNumId w:val="7"/>
     <w:lvlOverride w:ilvl="0">
       <w:startOverride w:val="1"/>
     </w:lvlOverride>
   </w:num>
-  <w:num w:numId="11" w16cid:durableId="1380863622">
+  <w:num w:numId="11" w16cid:durableId="1451901468">
     <w:abstractNumId w:val="7"/>
     <w:lvlOverride w:ilvl="0">
       <w:startOverride w:val="1"/>
     </w:lvlOverride>
   </w:num>
-  <w:num w:numId="12" w16cid:durableId="659965567">
+  <w:num w:numId="12" w16cid:durableId="1931574470">
     <w:abstractNumId w:val="7"/>
     <w:lvlOverride w:ilvl="0">
       <w:startOverride w:val="1"/>
     </w:lvlOverride>
   </w:num>
-  <w:num w:numId="13" w16cid:durableId="753160448">
+  <w:num w:numId="13" w16cid:durableId="70544295">
     <w:abstractNumId w:val="7"/>
     <w:lvlOverride w:ilvl="0">
       <w:startOverride w:val="1"/>
     </w:lvlOverride>
   </w:num>
-  <w:num w:numId="14" w16cid:durableId="1275401301">
+  <w:num w:numId="14" w16cid:durableId="1549417653">
     <w:abstractNumId w:val="7"/>
     <w:lvlOverride w:ilvl="0">
       <w:startOverride w:val="1"/>
     </w:lvlOverride>
   </w:num>
-  <w:num w:numId="15" w16cid:durableId="1762332576">
+  <w:num w:numId="15" w16cid:durableId="1681467529">
     <w:abstractNumId w:val="7"/>
     <w:lvlOverride w:ilvl="0">
       <w:startOverride w:val="1"/>
     </w:lvlOverride>
   </w:num>
-  <w:num w:numId="16" w16cid:durableId="729622140">
+  <w:num w:numId="16" w16cid:durableId="1052728828">
     <w:abstractNumId w:val="7"/>
     <w:lvlOverride w:ilvl="0">
       <w:startOverride w:val="1"/>
     </w:lvlOverride>
   </w:num>
-  <w:num w:numId="17" w16cid:durableId="617836190">
+  <w:num w:numId="17" w16cid:durableId="573666245">
     <w:abstractNumId w:val="7"/>
     <w:lvlOverride w:ilvl="0">
       <w:startOverride w:val="1"/>
     </w:lvlOverride>
   </w:num>
-  <w:num w:numId="18" w16cid:durableId="1192913723">
+  <w:num w:numId="18" w16cid:durableId="2083525587">
     <w:abstractNumId w:val="7"/>
     <w:lvlOverride w:ilvl="0">
       <w:startOverride w:val="1"/>
     </w:lvlOverride>
   </w:num>
-  <w:num w:numId="19" w16cid:durableId="1595891764">
+  <w:num w:numId="19" w16cid:durableId="496383983">
     <w:abstractNumId w:val="7"/>
     <w:lvlOverride w:ilvl="0">
       <w:startOverride w:val="1"/>
     </w:lvlOverride>
   </w:num>
-  <w:num w:numId="20" w16cid:durableId="1868905894">
+  <w:num w:numId="20" w16cid:durableId="718288892">
     <w:abstractNumId w:val="7"/>
     <w:lvlOverride w:ilvl="0">
       <w:startOverride w:val="1"/>
     </w:lvlOverride>
   </w:num>
-  <w:num w:numId="21" w16cid:durableId="784930226">
+  <w:num w:numId="21" w16cid:durableId="861212585">
     <w:abstractNumId w:val="7"/>
     <w:lvlOverride w:ilvl="0">
       <w:startOverride w:val="1"/>
     </w:lvlOverride>
   </w:num>
-  <w:num w:numId="22" w16cid:durableId="1714891434">
+  <w:num w:numId="22" w16cid:durableId="1916435636">
     <w:abstractNumId w:val="7"/>
     <w:lvlOverride w:ilvl="0">
       <w:startOverride w:val="1"/>
     </w:lvlOverride>
   </w:num>
-  <w:num w:numId="23" w16cid:durableId="875045351">
+  <w:num w:numId="23" w16cid:durableId="1421757188">
     <w:abstractNumId w:val="7"/>
     <w:lvlOverride w:ilvl="0">
       <w:startOverride w:val="1"/>
     </w:lvlOverride>
   </w:num>
-  <w:num w:numId="24" w16cid:durableId="1822499032">
+  <w:num w:numId="24" w16cid:durableId="262610512">
     <w:abstractNumId w:val="7"/>
     <w:lvlOverride w:ilvl="0">
       <w:startOverride w:val="1"/>
     </w:lvlOverride>
   </w:num>
-  <w:num w:numId="25" w16cid:durableId="2028173488">
+  <w:num w:numId="25" w16cid:durableId="1613247253">
     <w:abstractNumId w:val="7"/>
     <w:lvlOverride w:ilvl="0">
       <w:startOverride w:val="1"/>
     </w:lvlOverride>
   </w:num>
-  <w:num w:numId="26" w16cid:durableId="2043094687">
+  <w:num w:numId="26" w16cid:durableId="1279525158">
     <w:abstractNumId w:val="7"/>
     <w:lvlOverride w:ilvl="0">
       <w:startOverride w:val="1"/>
     </w:lvlOverride>
   </w:num>
-  <w:num w:numId="27" w16cid:durableId="301473049">
+  <w:num w:numId="27" w16cid:durableId="429273965">
     <w:abstractNumId w:val="7"/>
     <w:lvlOverride w:ilvl="0">
       <w:startOverride w:val="1"/>
     </w:lvlOverride>
   </w:num>
-  <w:num w:numId="28" w16cid:durableId="984551015">
+  <w:num w:numId="28" w16cid:durableId="1931280524">
     <w:abstractNumId w:val="7"/>
     <w:lvlOverride w:ilvl="0">
       <w:startOverride w:val="1"/>
     </w:lvlOverride>
   </w:num>
-  <w:num w:numId="29" w16cid:durableId="570233053">
+  <w:num w:numId="29" w16cid:durableId="485169413">
     <w:abstractNumId w:val="7"/>
     <w:lvlOverride w:ilvl="0">
       <w:startOverride w:val="1"/>
     </w:lvlOverride>
   </w:num>
-  <w:num w:numId="30" w16cid:durableId="724331634">
+  <w:num w:numId="30" w16cid:durableId="2135370931">
     <w:abstractNumId w:val="7"/>
     <w:lvlOverride w:ilvl="0">
       <w:startOverride w:val="1"/>
     </w:lvlOverride>
   </w:num>
-  <w:num w:numId="31" w16cid:durableId="2031713703">
+  <w:num w:numId="31" w16cid:durableId="1489706753">
     <w:abstractNumId w:val="7"/>
     <w:lvlOverride w:ilvl="0">
       <w:startOverride w:val="1"/>
     </w:lvlOverride>
   </w:num>
-  <w:num w:numId="32" w16cid:durableId="1383947633">
+  <w:num w:numId="32" w16cid:durableId="312147984">
     <w:abstractNumId w:val="7"/>
     <w:lvlOverride w:ilvl="0">
       <w:startOverride w:val="1"/>
@@ -29223,7 +29343,7 @@
     <w:autoRedefine/>
     <w:uiPriority w:val="39"/>
     <w:unhideWhenUsed/>
-    <w:rsid w:val="00425616"/>
+    <w:rsid w:val="00413128"/>
     <w:pPr>
       <w:spacing w:after="100"/>
     </w:pPr>
@@ -29235,7 +29355,7 @@
     <w:autoRedefine/>
     <w:uiPriority w:val="39"/>
     <w:unhideWhenUsed/>
-    <w:rsid w:val="00425616"/>
+    <w:rsid w:val="00413128"/>
     <w:pPr>
       <w:spacing w:after="100"/>
       <w:ind w:left="220"/>
@@ -29246,7 +29366,7 @@
     <w:basedOn w:val="DefaultParagraphFont"/>
     <w:uiPriority w:val="99"/>
     <w:unhideWhenUsed/>
-    <w:rsid w:val="00425616"/>
+    <w:rsid w:val="00413128"/>
     <w:rPr>
       <w:color w:val="0000FF" w:themeColor="hyperlink"/>
       <w:u w:val="single"/>

</xml_diff>

<commit_message>
Add Apache 2.0 license appendices to all guides
</commit_message>
<xml_diff>
--- a/docs/guides/Delphi App Translation Studio Complete Test Guide.docx
+++ b/docs/guides/Delphi App Translation Studio Complete Test Guide.docx
@@ -160,6 +160,29 @@
         <w:fldChar w:fldCharType="separate"/>
         <w:t>The table of contents is refreshed during document finalization.</w:t>
         <w:fldChar w:fldCharType="end"/>
+      </w:r>
+    </w:p>
+    <w:p>
+      <w:pPr>
+        <w:spacing w:after="0"/>
+      </w:pPr>
+      <w:r>
+        <w:rPr>
+          <w:rFonts w:ascii="Aptos" w:hAnsi="Aptos"/>
+          <w:b w:val="0"/>
+          <w:color w:val="203864"/>
+          <w:sz w:val="18"/>
+        </w:rPr>
+        <w:t>19. Appendix D - License Information</w:t>
+      </w:r>
+      <w:r>
+        <w:rPr>
+          <w:rFonts w:ascii="Aptos" w:hAnsi="Aptos"/>
+          <w:b w:val="0"/>
+          <w:color w:val="5D6D7E"/>
+          <w:sz w:val="18"/>
+        </w:rPr>
+        <w:t xml:space="preserve"> .................................. 30</w:t>
       </w:r>
     </w:p>
     <w:p>
@@ -15845,6 +15868,202 @@
     <w:p>
       <w:r>
         <w:t>This baseline is evidence, not a substitute for rerunning the tests. Record new executable timestamps, release-gate output, provider results, and target Git diffs for each acceptance session.</w:t>
+      </w:r>
+    </w:p>
+    <w:p>
+      <w:r>
+        <w:br w:type="page"/>
+      </w:r>
+    </w:p>
+    <w:p>
+      <w:pPr>
+        <w:pStyle w:val="Heading1"/>
+        <w:keepNext/>
+        <w:spacing w:before="0" w:after="140"/>
+      </w:pPr>
+      <w:r>
+        <w:t>19. Appendix D - License Information</w:t>
+      </w:r>
+    </w:p>
+    <w:p>
+      <w:pPr>
+        <w:spacing w:before="0" w:after="40" w:line="240" w:lineRule="auto"/>
+      </w:pPr>
+      <w:r>
+        <w:rPr>
+          <w:sz w:val="17"/>
+        </w:rPr>
+        <w:t>Unless a particular file or third-party component states otherwise, Delphi App Translation Studio and its project documentation are licensed under the Apache License, Version 2.0. The license permits broad use while preserving attribution, notices, and the stated warranty limitations.</w:t>
+      </w:r>
+    </w:p>
+    <w:p>
+      <w:pPr>
+        <w:pStyle w:val="Heading2"/>
+        <w:keepNext/>
+        <w:spacing w:before="100" w:after="40"/>
+      </w:pPr>
+      <w:r>
+        <w:rPr>
+          <w:sz w:val="21"/>
+        </w:rPr>
+        <w:t>License grant</w:t>
+      </w:r>
+    </w:p>
+    <w:p>
+      <w:pPr>
+        <w:spacing w:before="0" w:after="40" w:line="240" w:lineRule="auto"/>
+      </w:pPr>
+      <w:r>
+        <w:rPr>
+          <w:sz w:val="17"/>
+        </w:rPr>
+        <w:t>Subject to the complete license terms, you may use, reproduce, modify, prepare derivative works from, publicly display, publicly perform, sublicense, and distribute the licensed material. The Apache License 2.0 also includes an express patent license from contributors for their applicable contributions.</w:t>
+      </w:r>
+    </w:p>
+    <w:p>
+      <w:pPr>
+        <w:pStyle w:val="Heading2"/>
+        <w:keepNext/>
+        <w:spacing w:before="100" w:after="40"/>
+      </w:pPr>
+      <w:r>
+        <w:rPr>
+          <w:sz w:val="21"/>
+        </w:rPr>
+        <w:t>Important conditions</w:t>
+      </w:r>
+    </w:p>
+    <w:p>
+      <w:pPr>
+        <w:pStyle w:val="ListBullet"/>
+        <w:spacing w:before="0" w:after="40" w:line="240" w:lineRule="auto"/>
+      </w:pPr>
+      <w:r>
+        <w:rPr>
+          <w:sz w:val="17"/>
+        </w:rPr>
+        <w:t>Give recipients a copy of the Apache License 2.0 when distributing covered material.</w:t>
+      </w:r>
+    </w:p>
+    <w:p>
+      <w:pPr>
+        <w:pStyle w:val="ListBullet"/>
+        <w:spacing w:before="0" w:after="40" w:line="240" w:lineRule="auto"/>
+      </w:pPr>
+      <w:r>
+        <w:rPr>
+          <w:sz w:val="17"/>
+        </w:rPr>
+        <w:t>State significant changes made to modified files.</w:t>
+      </w:r>
+    </w:p>
+    <w:p>
+      <w:pPr>
+        <w:pStyle w:val="ListBullet"/>
+        <w:spacing w:before="0" w:after="40" w:line="240" w:lineRule="auto"/>
+      </w:pPr>
+      <w:r>
+        <w:rPr>
+          <w:sz w:val="17"/>
+        </w:rPr>
+        <w:t>Retain applicable copyright, patent, trademark, attribution, and NOTICE information.</w:t>
+      </w:r>
+    </w:p>
+    <w:p>
+      <w:pPr>
+        <w:pStyle w:val="ListBullet"/>
+        <w:spacing w:before="0" w:after="40" w:line="240" w:lineRule="auto"/>
+      </w:pPr>
+      <w:r>
+        <w:rPr>
+          <w:sz w:val="17"/>
+        </w:rPr>
+        <w:t>Do not use project or contributor names and trademarks as an endorsement except as the license permits.</w:t>
+      </w:r>
+    </w:p>
+    <w:p>
+      <w:pPr>
+        <w:pStyle w:val="Heading2"/>
+        <w:keepNext/>
+        <w:spacing w:before="100" w:after="40"/>
+      </w:pPr>
+      <w:r>
+        <w:rPr>
+          <w:sz w:val="21"/>
+        </w:rPr>
+        <w:t>Warranty and liability</w:t>
+      </w:r>
+    </w:p>
+    <w:p>
+      <w:pPr>
+        <w:spacing w:before="0" w:after="40" w:line="240" w:lineRule="auto"/>
+      </w:pPr>
+      <w:r>
+        <w:rPr>
+          <w:sz w:val="17"/>
+        </w:rPr>
+        <w:t>The licensed material is provided on an AS IS basis, without warranties or conditions of any kind. The complete Apache License 2.0 controls the warranty, liability, contribution, redistribution, and patent provisions.</w:t>
+      </w:r>
+    </w:p>
+    <w:p>
+      <w:pPr>
+        <w:pStyle w:val="Heading2"/>
+        <w:keepNext/>
+        <w:spacing w:before="100" w:after="40"/>
+      </w:pPr>
+      <w:r>
+        <w:rPr>
+          <w:sz w:val="21"/>
+        </w:rPr>
+        <w:t>Your applications and generated output</w:t>
+      </w:r>
+    </w:p>
+    <w:p>
+      <w:pPr>
+        <w:spacing w:before="0" w:after="40" w:line="240" w:lineRule="auto"/>
+      </w:pPr>
+      <w:r>
+        <w:rPr>
+          <w:sz w:val="17"/>
+        </w:rPr>
+        <w:t>Using the Studio does not transfer ownership of the Delphi application being translated. The application developer remains responsible for the license and distribution terms of the target application, translated content, generated language packs, and any third-party components. Studio runtime or component source included with a project remains subject to the Apache License 2.0 unless its file states different terms. Third-party software retains its own license.</w:t>
+      </w:r>
+    </w:p>
+    <w:p>
+      <w:pPr>
+        <w:pStyle w:val="Heading2"/>
+        <w:keepNext/>
+        <w:spacing w:before="100" w:after="40"/>
+      </w:pPr>
+      <w:r>
+        <w:rPr>
+          <w:sz w:val="21"/>
+        </w:rPr>
+        <w:t>Full legal text</w:t>
+      </w:r>
+    </w:p>
+    <w:p>
+      <w:pPr>
+        <w:spacing w:before="0" w:after="40" w:line="240" w:lineRule="auto"/>
+      </w:pPr>
+      <w:r>
+        <w:rPr>
+          <w:sz w:val="17"/>
+        </w:rPr>
+        <w:t>The complete controlling license is the LICENSE file in the repository and source distribution root. An official reference copy is available at https://www.apache.org/licenses/LICENSE-2.0. If this summary and the complete license differ, the complete Apache License 2.0 text controls.</w:t>
+      </w:r>
+    </w:p>
+    <w:p>
+      <w:pPr>
+        <w:spacing w:before="0" w:after="40" w:line="240" w:lineRule="auto"/>
+        <w:ind w:left="360" w:right="360"/>
+      </w:pPr>
+      <w:r>
+        <w:rPr>
+          <w:i/>
+          <w:sz w:val="17"/>
+        </w:rPr>
+        <w:t>Licensed under the Apache License, Version 2.0 (the "License"); you may not use this work except in compliance with the License. Unless required by applicable law or agreed to in writing, software distributed under the License is distributed on an AS IS BASIS, WITHOUT WARRANTIES OR CONDITIONS OF ANY KIND, either express or implied.</w:t>
       </w:r>
     </w:p>
     <w:sectPr>

</xml_diff>

<commit_message>
Restore read-only target dependency integration
</commit_message>
<xml_diff>
--- a/docs/guides/Delphi App Translation Studio Complete Test Guide.docx
+++ b/docs/guides/Delphi App Translation Studio Complete Test Guide.docx
@@ -12,7 +12,7 @@
         <w:drawing>
           <wp:inline xmlns:a="http://schemas.openxmlformats.org/drawingml/2006/main" xmlns:pic="http://schemas.openxmlformats.org/drawingml/2006/picture">
             <wp:extent cx="1325880" cy="1325880"/>
-            <wp:docPr id="1" name="Picture 1"/>
+            <wp:docPr id="1" name="Picture 1" descr="Delphi App Translation Studio application icon" title="Delphi App Translation Studio"/>
             <wp:cNvGraphicFramePr>
               <a:graphicFrameLocks noChangeAspect="1"/>
             </wp:cNvGraphicFramePr>
@@ -80,6 +80,9 @@
         <w:gridCol w:w="4680"/>
       </w:tblGrid>
       <w:tr>
+        <w:trPr>
+          <w:tblHeader w:val="false"/>
+        </w:trPr>
         <w:tc>
           <w:tcPr>
             <w:tcW w:type="dxa" w:w="4680"/>
@@ -111,7 +114,7 @@
         </w:rPr>
         <w:t>Version 1.0</w:t>
         <w:br/>
-        <w:t>Last changed: August 11, 2026</w:t>
+        <w:t>Last changed: September 1, 2026</w:t>
         <w:br/>
         <w:t>User acceptance, component integration, regression, and release testing</w:t>
         <w:br/>
@@ -153,38 +156,838 @@
         <w:t>Table of Contents</w:t>
       </w:r>
     </w:p>
-    <w:p>
-      <w:r>
-        <w:fldChar w:fldCharType="begin"/>
-        <w:instrText xml:space="preserve">TOC \o "1-2" \h \z \u</w:instrText>
-        <w:fldChar w:fldCharType="separate"/>
-        <w:t>The table of contents is refreshed during document finalization.</w:t>
-        <w:fldChar w:fldCharType="end"/>
-      </w:r>
-    </w:p>
-    <w:p>
-      <w:pPr>
-        <w:spacing w:after="0"/>
-      </w:pPr>
-      <w:r>
-        <w:rPr>
-          <w:rFonts w:ascii="Aptos" w:hAnsi="Aptos"/>
-          <w:b w:val="0"/>
-          <w:color w:val="203864"/>
-          <w:sz w:val="18"/>
-        </w:rPr>
-        <w:t>19. Appendix D - License Information</w:t>
-      </w:r>
-      <w:r>
-        <w:rPr>
-          <w:rFonts w:ascii="Aptos" w:hAnsi="Aptos"/>
-          <w:b w:val="0"/>
-          <w:color w:val="5D6D7E"/>
-          <w:sz w:val="18"/>
-        </w:rPr>
-        <w:t xml:space="preserve"> .................................. 30</w:t>
-      </w:r>
-    </w:p>
+    <w:tbl>
+      <w:tblPr>
+        <w:jc w:val="center"/>
+        <w:tblLook w:firstColumn="1" w:firstRow="1" w:lastColumn="0" w:lastRow="0" w:noHBand="0" w:noVBand="1" w:val="04A0"/>
+        <w:tblW w:w="9360" w:type="dxa"/>
+        <w:tblInd w:w="0" w:type="dxa"/>
+        <w:tblLayout w:type="fixed"/>
+        <w:tblCellMar>
+          <w:top w:w="80" w:type="dxa"/>
+          <w:bottom w:w="80" w:type="dxa"/>
+          <w:start w:w="120" w:type="dxa"/>
+          <w:end w:w="120" w:type="dxa"/>
+        </w:tblCellMar>
+      </w:tblPr>
+      <w:tblGrid>
+        <w:gridCol w:w="8200"/>
+        <w:gridCol w:w="1160"/>
+      </w:tblGrid>
+      <w:tr>
+        <w:trPr>
+          <w:tblHeader w:val="false"/>
+        </w:trPr>
+        <w:tc>
+          <w:tcPr>
+            <w:tcW w:type="dxa" w:w="8200"/>
+          </w:tcPr>
+          <w:p>
+            <w:pPr>
+              <w:keepLines/>
+              <w:spacing w:after="20"/>
+            </w:pPr>
+            <w:r>
+              <w:rPr>
+                <w:rFonts w:ascii="Calibri" w:hAnsi="Calibri"/>
+                <w:b w:val="0"/>
+                <w:i w:val="0"/>
+                <w:color w:val="234C80"/>
+                <w:sz w:val="18"/>
+              </w:rPr>
+              <w:t>1. Purpose and Test Philosophy</w:t>
+            </w:r>
+          </w:p>
+        </w:tc>
+        <w:tc>
+          <w:tcPr>
+            <w:tcW w:type="dxa" w:w="1160"/>
+          </w:tcPr>
+          <w:p>
+            <w:pPr>
+              <w:keepLines/>
+              <w:spacing w:after="20"/>
+              <w:jc w:val="right"/>
+            </w:pPr>
+            <w:r>
+              <w:rPr>
+                <w:rFonts w:ascii="Calibri" w:hAnsi="Calibri"/>
+                <w:b/>
+                <w:i w:val="0"/>
+                <w:color w:val="5D7693"/>
+                <w:sz w:val="18"/>
+              </w:rPr>
+              <w:t>1</w:t>
+            </w:r>
+          </w:p>
+        </w:tc>
+      </w:tr>
+      <w:tr>
+        <w:tc>
+          <w:tcPr>
+            <w:tcW w:type="dxa" w:w="8200"/>
+          </w:tcPr>
+          <w:p>
+            <w:pPr>
+              <w:keepLines/>
+              <w:spacing w:after="20"/>
+            </w:pPr>
+            <w:r>
+              <w:rPr>
+                <w:rFonts w:ascii="Calibri" w:hAnsi="Calibri"/>
+                <w:b w:val="0"/>
+                <w:i w:val="0"/>
+                <w:color w:val="234C80"/>
+                <w:sz w:val="18"/>
+              </w:rPr>
+              <w:t>2. Exact Folders and Files</w:t>
+            </w:r>
+          </w:p>
+        </w:tc>
+        <w:tc>
+          <w:tcPr>
+            <w:tcW w:type="dxa" w:w="1160"/>
+          </w:tcPr>
+          <w:p>
+            <w:pPr>
+              <w:keepLines/>
+              <w:spacing w:after="20"/>
+              <w:jc w:val="right"/>
+            </w:pPr>
+            <w:r>
+              <w:rPr>
+                <w:rFonts w:ascii="Calibri" w:hAnsi="Calibri"/>
+                <w:b/>
+                <w:i w:val="0"/>
+                <w:color w:val="5D7693"/>
+                <w:sz w:val="18"/>
+              </w:rPr>
+              <w:t>2</w:t>
+            </w:r>
+          </w:p>
+        </w:tc>
+      </w:tr>
+      <w:tr>
+        <w:tc>
+          <w:tcPr>
+            <w:tcW w:type="dxa" w:w="8200"/>
+          </w:tcPr>
+          <w:p>
+            <w:pPr>
+              <w:keepLines/>
+              <w:spacing w:after="20"/>
+            </w:pPr>
+            <w:r>
+              <w:rPr>
+                <w:rFonts w:ascii="Calibri" w:hAnsi="Calibri"/>
+                <w:b w:val="0"/>
+                <w:i w:val="0"/>
+                <w:color w:val="234C80"/>
+                <w:sz w:val="18"/>
+              </w:rPr>
+              <w:t>3. Prerequisites and Test Data</w:t>
+            </w:r>
+          </w:p>
+        </w:tc>
+        <w:tc>
+          <w:tcPr>
+            <w:tcW w:type="dxa" w:w="1160"/>
+          </w:tcPr>
+          <w:p>
+            <w:pPr>
+              <w:keepLines/>
+              <w:spacing w:after="20"/>
+              <w:jc w:val="right"/>
+            </w:pPr>
+            <w:r>
+              <w:rPr>
+                <w:rFonts w:ascii="Calibri" w:hAnsi="Calibri"/>
+                <w:b/>
+                <w:i w:val="0"/>
+                <w:color w:val="5D7693"/>
+                <w:sz w:val="18"/>
+              </w:rPr>
+              <w:t>3</w:t>
+            </w:r>
+          </w:p>
+        </w:tc>
+      </w:tr>
+      <w:tr>
+        <w:tc>
+          <w:tcPr>
+            <w:tcW w:type="dxa" w:w="8200"/>
+          </w:tcPr>
+          <w:p>
+            <w:pPr>
+              <w:keepLines/>
+              <w:spacing w:after="20"/>
+            </w:pPr>
+            <w:r>
+              <w:rPr>
+                <w:rFonts w:ascii="Calibri" w:hAnsi="Calibri"/>
+                <w:b w:val="0"/>
+                <w:i w:val="0"/>
+                <w:color w:val="234C80"/>
+                <w:sz w:val="18"/>
+              </w:rPr>
+              <w:t>4. Build the Studio Manually</w:t>
+            </w:r>
+          </w:p>
+        </w:tc>
+        <w:tc>
+          <w:tcPr>
+            <w:tcW w:type="dxa" w:w="1160"/>
+          </w:tcPr>
+          <w:p>
+            <w:pPr>
+              <w:keepLines/>
+              <w:spacing w:after="20"/>
+              <w:jc w:val="right"/>
+            </w:pPr>
+            <w:r>
+              <w:rPr>
+                <w:rFonts w:ascii="Calibri" w:hAnsi="Calibri"/>
+                <w:b/>
+                <w:i w:val="0"/>
+                <w:color w:val="5D7693"/>
+                <w:sz w:val="18"/>
+              </w:rPr>
+              <w:t>4</w:t>
+            </w:r>
+          </w:p>
+        </w:tc>
+      </w:tr>
+      <w:tr>
+        <w:tc>
+          <w:tcPr>
+            <w:tcW w:type="dxa" w:w="8200"/>
+          </w:tcPr>
+          <w:p>
+            <w:pPr>
+              <w:keepLines/>
+              <w:spacing w:after="20"/>
+            </w:pPr>
+            <w:r>
+              <w:rPr>
+                <w:rFonts w:ascii="Calibri" w:hAnsi="Calibri"/>
+                <w:b w:val="0"/>
+                <w:i w:val="0"/>
+                <w:color w:val="234C80"/>
+                <w:sz w:val="18"/>
+              </w:rPr>
+              <w:t>5. Automated Release Gate</w:t>
+            </w:r>
+          </w:p>
+        </w:tc>
+        <w:tc>
+          <w:tcPr>
+            <w:tcW w:type="dxa" w:w="1160"/>
+          </w:tcPr>
+          <w:p>
+            <w:pPr>
+              <w:keepLines/>
+              <w:spacing w:after="20"/>
+              <w:jc w:val="right"/>
+            </w:pPr>
+            <w:r>
+              <w:rPr>
+                <w:rFonts w:ascii="Calibri" w:hAnsi="Calibri"/>
+                <w:b/>
+                <w:i w:val="0"/>
+                <w:color w:val="5D7693"/>
+                <w:sz w:val="18"/>
+              </w:rPr>
+              <w:t>5</w:t>
+            </w:r>
+          </w:p>
+        </w:tc>
+      </w:tr>
+      <w:tr>
+        <w:tc>
+          <w:tcPr>
+            <w:tcW w:type="dxa" w:w="8200"/>
+          </w:tcPr>
+          <w:p>
+            <w:pPr>
+              <w:keepLines/>
+              <w:spacing w:after="20"/>
+            </w:pPr>
+            <w:r>
+              <w:rPr>
+                <w:rFonts w:ascii="Calibri" w:hAnsi="Calibri"/>
+                <w:b w:val="0"/>
+                <w:i w:val="0"/>
+                <w:color w:val="234C80"/>
+                <w:sz w:val="18"/>
+              </w:rPr>
+              <w:t>6. Manual Studio Acceptance</w:t>
+            </w:r>
+          </w:p>
+        </w:tc>
+        <w:tc>
+          <w:tcPr>
+            <w:tcW w:type="dxa" w:w="1160"/>
+          </w:tcPr>
+          <w:p>
+            <w:pPr>
+              <w:keepLines/>
+              <w:spacing w:after="20"/>
+              <w:jc w:val="right"/>
+            </w:pPr>
+            <w:r>
+              <w:rPr>
+                <w:rFonts w:ascii="Calibri" w:hAnsi="Calibri"/>
+                <w:b/>
+                <w:i w:val="0"/>
+                <w:color w:val="5D7693"/>
+                <w:sz w:val="18"/>
+              </w:rPr>
+              <w:t>7</w:t>
+            </w:r>
+          </w:p>
+        </w:tc>
+      </w:tr>
+      <w:tr>
+        <w:tc>
+          <w:tcPr>
+            <w:tcW w:type="dxa" w:w="8200"/>
+          </w:tcPr>
+          <w:p>
+            <w:pPr>
+              <w:keepLines/>
+              <w:spacing w:after="20"/>
+            </w:pPr>
+            <w:r>
+              <w:rPr>
+                <w:rFonts w:ascii="Calibri" w:hAnsi="Calibri"/>
+                <w:b w:val="0"/>
+                <w:i w:val="0"/>
+                <w:color w:val="234C80"/>
+                <w:sz w:val="18"/>
+              </w:rPr>
+              <w:t>7. Component Integration Acceptance</w:t>
+            </w:r>
+          </w:p>
+        </w:tc>
+        <w:tc>
+          <w:tcPr>
+            <w:tcW w:type="dxa" w:w="1160"/>
+          </w:tcPr>
+          <w:p>
+            <w:pPr>
+              <w:keepLines/>
+              <w:spacing w:after="20"/>
+              <w:jc w:val="right"/>
+            </w:pPr>
+            <w:r>
+              <w:rPr>
+                <w:rFonts w:ascii="Calibri" w:hAnsi="Calibri"/>
+                <w:b/>
+                <w:i w:val="0"/>
+                <w:color w:val="5D7693"/>
+                <w:sz w:val="18"/>
+              </w:rPr>
+              <w:t>14</w:t>
+            </w:r>
+          </w:p>
+        </w:tc>
+      </w:tr>
+      <w:tr>
+        <w:tc>
+          <w:tcPr>
+            <w:tcW w:type="dxa" w:w="8200"/>
+          </w:tcPr>
+          <w:p>
+            <w:pPr>
+              <w:keepLines/>
+              <w:spacing w:after="20"/>
+            </w:pPr>
+            <w:r>
+              <w:rPr>
+                <w:rFonts w:ascii="Calibri" w:hAnsi="Calibri"/>
+                <w:b w:val="0"/>
+                <w:i w:val="0"/>
+                <w:color w:val="234C80"/>
+                <w:sz w:val="18"/>
+              </w:rPr>
+              <w:t>8. Runtime Acceptance</w:t>
+            </w:r>
+          </w:p>
+        </w:tc>
+        <w:tc>
+          <w:tcPr>
+            <w:tcW w:type="dxa" w:w="1160"/>
+          </w:tcPr>
+          <w:p>
+            <w:pPr>
+              <w:keepLines/>
+              <w:spacing w:after="20"/>
+              <w:jc w:val="right"/>
+            </w:pPr>
+            <w:r>
+              <w:rPr>
+                <w:rFonts w:ascii="Calibri" w:hAnsi="Calibri"/>
+                <w:b/>
+                <w:i w:val="0"/>
+                <w:color w:val="5D7693"/>
+                <w:sz w:val="18"/>
+              </w:rPr>
+              <w:t>19</w:t>
+            </w:r>
+          </w:p>
+        </w:tc>
+      </w:tr>
+      <w:tr>
+        <w:tc>
+          <w:tcPr>
+            <w:tcW w:type="dxa" w:w="8200"/>
+          </w:tcPr>
+          <w:p>
+            <w:pPr>
+              <w:keepLines/>
+              <w:spacing w:after="20"/>
+            </w:pPr>
+            <w:r>
+              <w:rPr>
+                <w:rFonts w:ascii="Calibri" w:hAnsi="Calibri"/>
+                <w:b w:val="0"/>
+                <w:i w:val="0"/>
+                <w:color w:val="234C80"/>
+                <w:sz w:val="18"/>
+              </w:rPr>
+              <w:t>9. VCL Acceptance Delta</w:t>
+            </w:r>
+          </w:p>
+        </w:tc>
+        <w:tc>
+          <w:tcPr>
+            <w:tcW w:type="dxa" w:w="1160"/>
+          </w:tcPr>
+          <w:p>
+            <w:pPr>
+              <w:keepLines/>
+              <w:spacing w:after="20"/>
+              <w:jc w:val="right"/>
+            </w:pPr>
+            <w:r>
+              <w:rPr>
+                <w:rFonts w:ascii="Calibri" w:hAnsi="Calibri"/>
+                <w:b/>
+                <w:i w:val="0"/>
+                <w:color w:val="5D7693"/>
+                <w:sz w:val="18"/>
+              </w:rPr>
+              <w:t>23</w:t>
+            </w:r>
+          </w:p>
+        </w:tc>
+      </w:tr>
+      <w:tr>
+        <w:tc>
+          <w:tcPr>
+            <w:tcW w:type="dxa" w:w="8200"/>
+          </w:tcPr>
+          <w:p>
+            <w:pPr>
+              <w:keepLines/>
+              <w:spacing w:after="20"/>
+            </w:pPr>
+            <w:r>
+              <w:rPr>
+                <w:rFonts w:ascii="Calibri" w:hAnsi="Calibri"/>
+                <w:b w:val="0"/>
+                <w:i w:val="0"/>
+                <w:color w:val="234C80"/>
+                <w:sz w:val="18"/>
+              </w:rPr>
+              <w:t>10. Studio Self-Translation</w:t>
+            </w:r>
+          </w:p>
+        </w:tc>
+        <w:tc>
+          <w:tcPr>
+            <w:tcW w:type="dxa" w:w="1160"/>
+          </w:tcPr>
+          <w:p>
+            <w:pPr>
+              <w:keepLines/>
+              <w:spacing w:after="20"/>
+              <w:jc w:val="right"/>
+            </w:pPr>
+            <w:r>
+              <w:rPr>
+                <w:rFonts w:ascii="Calibri" w:hAnsi="Calibri"/>
+                <w:b/>
+                <w:i w:val="0"/>
+                <w:color w:val="5D7693"/>
+                <w:sz w:val="18"/>
+              </w:rPr>
+              <w:t>24</w:t>
+            </w:r>
+          </w:p>
+        </w:tc>
+      </w:tr>
+      <w:tr>
+        <w:tc>
+          <w:tcPr>
+            <w:tcW w:type="dxa" w:w="8200"/>
+          </w:tcPr>
+          <w:p>
+            <w:pPr>
+              <w:keepLines/>
+              <w:spacing w:after="20"/>
+            </w:pPr>
+            <w:r>
+              <w:rPr>
+                <w:rFonts w:ascii="Calibri" w:hAnsi="Calibri"/>
+                <w:b w:val="0"/>
+                <w:i w:val="0"/>
+                <w:color w:val="234C80"/>
+                <w:sz w:val="18"/>
+              </w:rPr>
+              <w:t>11. Starting Over and Dependency Recovery</w:t>
+            </w:r>
+          </w:p>
+        </w:tc>
+        <w:tc>
+          <w:tcPr>
+            <w:tcW w:type="dxa" w:w="1160"/>
+          </w:tcPr>
+          <w:p>
+            <w:pPr>
+              <w:keepLines/>
+              <w:spacing w:after="20"/>
+              <w:jc w:val="right"/>
+            </w:pPr>
+            <w:r>
+              <w:rPr>
+                <w:rFonts w:ascii="Calibri" w:hAnsi="Calibri"/>
+                <w:b/>
+                <w:i w:val="0"/>
+                <w:color w:val="5D7693"/>
+                <w:sz w:val="18"/>
+              </w:rPr>
+              <w:t>24</w:t>
+            </w:r>
+          </w:p>
+        </w:tc>
+      </w:tr>
+      <w:tr>
+        <w:tc>
+          <w:tcPr>
+            <w:tcW w:type="dxa" w:w="8200"/>
+          </w:tcPr>
+          <w:p>
+            <w:pPr>
+              <w:keepLines/>
+              <w:spacing w:after="20"/>
+            </w:pPr>
+            <w:r>
+              <w:rPr>
+                <w:rFonts w:ascii="Calibri" w:hAnsi="Calibri"/>
+                <w:b w:val="0"/>
+                <w:i w:val="0"/>
+                <w:color w:val="234C80"/>
+                <w:sz w:val="18"/>
+              </w:rPr>
+              <w:t>12. Negative and Recovery Tests</w:t>
+            </w:r>
+          </w:p>
+        </w:tc>
+        <w:tc>
+          <w:tcPr>
+            <w:tcW w:type="dxa" w:w="1160"/>
+          </w:tcPr>
+          <w:p>
+            <w:pPr>
+              <w:keepLines/>
+              <w:spacing w:after="20"/>
+              <w:jc w:val="right"/>
+            </w:pPr>
+            <w:r>
+              <w:rPr>
+                <w:rFonts w:ascii="Calibri" w:hAnsi="Calibri"/>
+                <w:b/>
+                <w:i w:val="0"/>
+                <w:color w:val="5D7693"/>
+                <w:sz w:val="18"/>
+              </w:rPr>
+              <w:t>25</w:t>
+            </w:r>
+          </w:p>
+        </w:tc>
+      </w:tr>
+      <w:tr>
+        <w:tc>
+          <w:tcPr>
+            <w:tcW w:type="dxa" w:w="8200"/>
+          </w:tcPr>
+          <w:p>
+            <w:pPr>
+              <w:keepLines/>
+              <w:spacing w:after="20"/>
+            </w:pPr>
+            <w:r>
+              <w:rPr>
+                <w:rFonts w:ascii="Calibri" w:hAnsi="Calibri"/>
+                <w:b w:val="0"/>
+                <w:i w:val="0"/>
+                <w:color w:val="234C80"/>
+                <w:sz w:val="18"/>
+              </w:rPr>
+              <w:t>13. Performance and Large-Project Checks</w:t>
+            </w:r>
+          </w:p>
+        </w:tc>
+        <w:tc>
+          <w:tcPr>
+            <w:tcW w:type="dxa" w:w="1160"/>
+          </w:tcPr>
+          <w:p>
+            <w:pPr>
+              <w:keepLines/>
+              <w:spacing w:after="20"/>
+              <w:jc w:val="right"/>
+            </w:pPr>
+            <w:r>
+              <w:rPr>
+                <w:rFonts w:ascii="Calibri" w:hAnsi="Calibri"/>
+                <w:b/>
+                <w:i w:val="0"/>
+                <w:color w:val="5D7693"/>
+                <w:sz w:val="18"/>
+              </w:rPr>
+              <w:t>26</w:t>
+            </w:r>
+          </w:p>
+        </w:tc>
+      </w:tr>
+      <w:tr>
+        <w:tc>
+          <w:tcPr>
+            <w:tcW w:type="dxa" w:w="8200"/>
+          </w:tcPr>
+          <w:p>
+            <w:pPr>
+              <w:keepLines/>
+              <w:spacing w:after="20"/>
+            </w:pPr>
+            <w:r>
+              <w:rPr>
+                <w:rFonts w:ascii="Calibri" w:hAnsi="Calibri"/>
+                <w:b w:val="0"/>
+                <w:i w:val="0"/>
+                <w:color w:val="234C80"/>
+                <w:sz w:val="18"/>
+              </w:rPr>
+              <w:t>14. Defect Recording</w:t>
+            </w:r>
+          </w:p>
+        </w:tc>
+        <w:tc>
+          <w:tcPr>
+            <w:tcW w:type="dxa" w:w="1160"/>
+          </w:tcPr>
+          <w:p>
+            <w:pPr>
+              <w:keepLines/>
+              <w:spacing w:after="20"/>
+              <w:jc w:val="right"/>
+            </w:pPr>
+            <w:r>
+              <w:rPr>
+                <w:rFonts w:ascii="Calibri" w:hAnsi="Calibri"/>
+                <w:b/>
+                <w:i w:val="0"/>
+                <w:color w:val="5D7693"/>
+                <w:sz w:val="18"/>
+              </w:rPr>
+              <w:t>27</w:t>
+            </w:r>
+          </w:p>
+        </w:tc>
+      </w:tr>
+      <w:tr>
+        <w:tc>
+          <w:tcPr>
+            <w:tcW w:type="dxa" w:w="8200"/>
+          </w:tcPr>
+          <w:p>
+            <w:pPr>
+              <w:keepLines/>
+              <w:spacing w:after="20"/>
+            </w:pPr>
+            <w:r>
+              <w:rPr>
+                <w:rFonts w:ascii="Calibri" w:hAnsi="Calibri"/>
+                <w:b w:val="0"/>
+                <w:i w:val="0"/>
+                <w:color w:val="234C80"/>
+                <w:sz w:val="18"/>
+              </w:rPr>
+              <w:t>15. Final Acceptance Checklist</w:t>
+            </w:r>
+          </w:p>
+        </w:tc>
+        <w:tc>
+          <w:tcPr>
+            <w:tcW w:type="dxa" w:w="1160"/>
+          </w:tcPr>
+          <w:p>
+            <w:pPr>
+              <w:keepLines/>
+              <w:spacing w:after="20"/>
+              <w:jc w:val="right"/>
+            </w:pPr>
+            <w:r>
+              <w:rPr>
+                <w:rFonts w:ascii="Calibri" w:hAnsi="Calibri"/>
+                <w:b/>
+                <w:i w:val="0"/>
+                <w:color w:val="5D7693"/>
+                <w:sz w:val="18"/>
+              </w:rPr>
+              <w:t>27</w:t>
+            </w:r>
+          </w:p>
+        </w:tc>
+      </w:tr>
+      <w:tr>
+        <w:tc>
+          <w:tcPr>
+            <w:tcW w:type="dxa" w:w="8200"/>
+          </w:tcPr>
+          <w:p>
+            <w:pPr>
+              <w:keepLines/>
+              <w:spacing w:after="20"/>
+            </w:pPr>
+            <w:r>
+              <w:rPr>
+                <w:rFonts w:ascii="Calibri" w:hAnsi="Calibri"/>
+                <w:b w:val="0"/>
+                <w:i w:val="0"/>
+                <w:color w:val="234C80"/>
+                <w:sz w:val="18"/>
+              </w:rPr>
+              <w:t>16. Appendix A - Exact Test Scripts</w:t>
+            </w:r>
+          </w:p>
+        </w:tc>
+        <w:tc>
+          <w:tcPr>
+            <w:tcW w:type="dxa" w:w="1160"/>
+          </w:tcPr>
+          <w:p>
+            <w:pPr>
+              <w:keepLines/>
+              <w:spacing w:after="20"/>
+              <w:jc w:val="right"/>
+            </w:pPr>
+            <w:r>
+              <w:rPr>
+                <w:rFonts w:ascii="Calibri" w:hAnsi="Calibri"/>
+                <w:b/>
+                <w:i w:val="0"/>
+                <w:color w:val="5D7693"/>
+                <w:sz w:val="18"/>
+              </w:rPr>
+              <w:t>28</w:t>
+            </w:r>
+          </w:p>
+        </w:tc>
+      </w:tr>
+      <w:tr>
+        <w:tc>
+          <w:tcPr>
+            <w:tcW w:type="dxa" w:w="8200"/>
+          </w:tcPr>
+          <w:p>
+            <w:pPr>
+              <w:keepLines/>
+              <w:spacing w:after="20"/>
+            </w:pPr>
+            <w:r>
+              <w:rPr>
+                <w:rFonts w:ascii="Calibri" w:hAnsi="Calibri"/>
+                <w:b w:val="0"/>
+                <w:i w:val="0"/>
+                <w:color w:val="234C80"/>
+                <w:sz w:val="18"/>
+              </w:rPr>
+              <w:t>17. Appendix B - What Each JSON File Is</w:t>
+            </w:r>
+          </w:p>
+        </w:tc>
+        <w:tc>
+          <w:tcPr>
+            <w:tcW w:type="dxa" w:w="1160"/>
+          </w:tcPr>
+          <w:p>
+            <w:pPr>
+              <w:keepLines/>
+              <w:spacing w:after="20"/>
+              <w:jc w:val="right"/>
+            </w:pPr>
+            <w:r>
+              <w:rPr>
+                <w:rFonts w:ascii="Calibri" w:hAnsi="Calibri"/>
+                <w:b/>
+                <w:i w:val="0"/>
+                <w:color w:val="5D7693"/>
+                <w:sz w:val="18"/>
+              </w:rPr>
+              <w:t>29</w:t>
+            </w:r>
+          </w:p>
+        </w:tc>
+      </w:tr>
+      <w:tr>
+        <w:tc>
+          <w:tcPr>
+            <w:tcW w:type="dxa" w:w="8200"/>
+          </w:tcPr>
+          <w:p>
+            <w:pPr>
+              <w:keepLines/>
+              <w:spacing w:after="20"/>
+            </w:pPr>
+            <w:r>
+              <w:rPr>
+                <w:rFonts w:ascii="Calibri" w:hAnsi="Calibri"/>
+                <w:b w:val="0"/>
+                <w:i w:val="0"/>
+                <w:color w:val="234C80"/>
+                <w:sz w:val="18"/>
+              </w:rPr>
+              <w:t>18. Appendix C - Current Verified Baseline</w:t>
+            </w:r>
+          </w:p>
+        </w:tc>
+        <w:tc>
+          <w:tcPr>
+            <w:tcW w:type="dxa" w:w="1160"/>
+          </w:tcPr>
+          <w:p>
+            <w:pPr>
+              <w:keepLines/>
+              <w:spacing w:after="20"/>
+              <w:jc w:val="right"/>
+            </w:pPr>
+            <w:r>
+              <w:rPr>
+                <w:rFonts w:ascii="Calibri" w:hAnsi="Calibri"/>
+                <w:b/>
+                <w:i w:val="0"/>
+                <w:color w:val="5D7693"/>
+                <w:sz w:val="18"/>
+              </w:rPr>
+              <w:t>29</w:t>
+            </w:r>
+          </w:p>
+        </w:tc>
+      </w:tr>
+    </w:tbl>
     <w:p>
       <w:pPr>
         <w:sectPr>
@@ -241,6 +1044,7 @@
       <w:tr>
         <w:trPr>
           <w:cantSplit/>
+          <w:tblHeader w:val="true"/>
         </w:trPr>
         <w:tc>
           <w:tcPr>
@@ -1517,6 +2321,7 @@
       <w:tr>
         <w:trPr>
           <w:cantSplit/>
+          <w:tblHeader w:val="true"/>
         </w:trPr>
         <w:tc>
           <w:tcPr>
@@ -2069,6 +2874,7 @@
       <w:tr>
         <w:trPr>
           <w:cantSplit/>
+          <w:tblHeader w:val="true"/>
         </w:trPr>
         <w:tc>
           <w:tcPr>
@@ -2182,6 +2988,7 @@
       <w:tr>
         <w:trPr>
           <w:cantSplit/>
+          <w:tblHeader w:val="true"/>
         </w:trPr>
         <w:tc>
           <w:tcPr>
@@ -2272,7 +3079,7 @@
         </w:numPr>
       </w:pPr>
       <w:r>
-        <w:t>Leave the target project closed until TC-10 installs the freshly generated design package.</w:t>
+        <w:t>Keep target files saved and leave the target application closed until TC-10 installs the freshly generated design package. The RAD Studio project may remain open.</w:t>
       </w:r>
     </w:p>
     <w:tbl>
@@ -2295,6 +3102,7 @@
       <w:tr>
         <w:trPr>
           <w:cantSplit/>
+          <w:tblHeader w:val="true"/>
         </w:trPr>
         <w:tc>
           <w:tcPr>
@@ -2841,7 +3649,7 @@
                 <w:color w:val="163A63"/>
                 <w:sz w:val="18"/>
               </w:rPr>
-              <w:t>Advanced fallback</w:t>
+              <w:t>Project-file safety</w:t>
             </w:r>
           </w:p>
         </w:tc>
@@ -2863,7 +3671,7 @@
                 <w:color w:val="163A63"/>
                 <w:sz w:val="18"/>
               </w:rPr>
-              <w:t>Preview, backup, transactional apply/rollback, deployment, restore, and complete-reset regression coverage.</w:t>
+              <w:t>Dependency preparation, repeated-run idempotence, temporary build Search Path, direct deployment, and byte-for-byte target-file preservation.</w:t>
             </w:r>
           </w:p>
         </w:tc>
@@ -2911,6 +3719,7 @@
       <w:tr>
         <w:trPr>
           <w:cantSplit/>
+          <w:tblHeader w:val="true"/>
         </w:trPr>
         <w:tc>
           <w:tcPr>
@@ -3082,6 +3891,9 @@
         <w:gridCol w:w="4260"/>
       </w:tblGrid>
       <w:tr>
+        <w:trPr>
+          <w:tblHeader w:val="true"/>
+        </w:trPr>
         <w:tc>
           <w:tcPr>
             <w:tcW w:type="dxa" w:w="1200"/>
@@ -3252,6 +4064,7 @@
       <w:tr>
         <w:trPr>
           <w:cantSplit/>
+          <w:tblHeader w:val="true"/>
         </w:trPr>
         <w:tc>
           <w:tcPr>
@@ -3403,6 +4216,9 @@
         <w:gridCol w:w="4260"/>
       </w:tblGrid>
       <w:tr>
+        <w:trPr>
+          <w:tblHeader w:val="true"/>
+        </w:trPr>
         <w:tc>
           <w:tcPr>
             <w:tcW w:type="dxa" w:w="1200"/>
@@ -3573,6 +4389,7 @@
       <w:tr>
         <w:trPr>
           <w:cantSplit/>
+          <w:tblHeader w:val="true"/>
         </w:trPr>
         <w:tc>
           <w:tcPr>
@@ -3756,6 +4573,9 @@
         <w:gridCol w:w="4260"/>
       </w:tblGrid>
       <w:tr>
+        <w:trPr>
+          <w:tblHeader w:val="true"/>
+        </w:trPr>
         <w:tc>
           <w:tcPr>
             <w:tcW w:type="dxa" w:w="1200"/>
@@ -3926,6 +4746,7 @@
       <w:tr>
         <w:trPr>
           <w:cantSplit/>
+          <w:tblHeader w:val="true"/>
         </w:trPr>
         <w:tc>
           <w:tcPr>
@@ -4105,6 +4926,9 @@
         <w:gridCol w:w="4260"/>
       </w:tblGrid>
       <w:tr>
+        <w:trPr>
+          <w:tblHeader w:val="true"/>
+        </w:trPr>
         <w:tc>
           <w:tcPr>
             <w:tcW w:type="dxa" w:w="1200"/>
@@ -4275,6 +5099,7 @@
       <w:tr>
         <w:trPr>
           <w:cantSplit/>
+          <w:tblHeader w:val="true"/>
         </w:trPr>
         <w:tc>
           <w:tcPr>
@@ -4434,6 +5259,9 @@
         <w:gridCol w:w="4260"/>
       </w:tblGrid>
       <w:tr>
+        <w:trPr>
+          <w:tblHeader w:val="true"/>
+        </w:trPr>
         <w:tc>
           <w:tcPr>
             <w:tcW w:type="dxa" w:w="1200"/>
@@ -4604,6 +5432,7 @@
       <w:tr>
         <w:trPr>
           <w:cantSplit/>
+          <w:tblHeader w:val="true"/>
         </w:trPr>
         <w:tc>
           <w:tcPr>
@@ -4767,6 +5596,9 @@
         <w:gridCol w:w="4260"/>
       </w:tblGrid>
       <w:tr>
+        <w:trPr>
+          <w:tblHeader w:val="true"/>
+        </w:trPr>
         <w:tc>
           <w:tcPr>
             <w:tcW w:type="dxa" w:w="1200"/>
@@ -4937,6 +5769,7 @@
       <w:tr>
         <w:trPr>
           <w:cantSplit/>
+          <w:tblHeader w:val="true"/>
         </w:trPr>
         <w:tc>
           <w:tcPr>
@@ -5100,6 +5933,9 @@
         <w:gridCol w:w="4260"/>
       </w:tblGrid>
       <w:tr>
+        <w:trPr>
+          <w:tblHeader w:val="true"/>
+        </w:trPr>
         <w:tc>
           <w:tcPr>
             <w:tcW w:type="dxa" w:w="1200"/>
@@ -5270,6 +6106,7 @@
       <w:tr>
         <w:trPr>
           <w:cantSplit/>
+          <w:tblHeader w:val="true"/>
         </w:trPr>
         <w:tc>
           <w:tcPr>
@@ -5437,6 +6274,9 @@
         <w:gridCol w:w="4260"/>
       </w:tblGrid>
       <w:tr>
+        <w:trPr>
+          <w:tblHeader w:val="true"/>
+        </w:trPr>
         <w:tc>
           <w:tcPr>
             <w:tcW w:type="dxa" w:w="1200"/>
@@ -5607,6 +6447,7 @@
       <w:tr>
         <w:trPr>
           <w:cantSplit/>
+          <w:tblHeader w:val="true"/>
         </w:trPr>
         <w:tc>
           <w:tcPr>
@@ -5806,6 +6647,9 @@
         <w:gridCol w:w="4260"/>
       </w:tblGrid>
       <w:tr>
+        <w:trPr>
+          <w:tblHeader w:val="true"/>
+        </w:trPr>
         <w:tc>
           <w:tcPr>
             <w:tcW w:type="dxa" w:w="1200"/>
@@ -5966,7 +6810,7 @@
         <w:pStyle w:val="Heading2"/>
       </w:pPr>
       <w:r>
-        <w:t>TC-09 Generate the non-mutating component kit</w:t>
+        <w:t>TC-09 Prepare the verified project-local dependencies</w:t>
       </w:r>
     </w:p>
     <w:tbl>
@@ -5989,6 +6833,7 @@
       <w:tr>
         <w:trPr>
           <w:cantSplit/>
+          <w:tblHeader w:val="true"/>
         </w:trPr>
         <w:tc>
           <w:tcPr>
@@ -6008,7 +6853,7 @@
               <w:t xml:space="preserve">Objective. </w:t>
             </w:r>
             <w:r>
-              <w:t>Verify the recommended mode creates a complete kit under the Studio export folder and performs zero target writes.</w:t>
+              <w:t>Verify the recommended mode creates the component kit, atomically installs one managed dependency tree, performs the baseline build/deployment, and leaves every target project/source/form file unchanged.</w:t>
             </w:r>
           </w:p>
         </w:tc>
@@ -6031,7 +6876,7 @@
         </w:numPr>
       </w:pPr>
       <w:r>
-        <w:t>Before generation, run git -C "C:\DelphiProjects\FMXPilot - Component Test" status --short and record the expected Localization files only.</w:t>
+        <w:t>Before preparation, run git -C "C:\DelphiProjects\FMXPilot - Component Test" status --short and record the expected Localization files. Also record the SHA-256 hash of FMXPilot.dproj.</w:t>
       </w:r>
     </w:p>
     <w:p>
@@ -6067,7 +6912,7 @@
         </w:numPr>
       </w:pPr>
       <w:r>
-        <w:t>Read the setup plan and choose Generate Component Kit.</w:t>
+        <w:t>Read the setup plan and choose Prepare / Update Dependencies.</w:t>
       </w:r>
     </w:p>
     <w:p>
@@ -6091,7 +6936,55 @@
         </w:numPr>
       </w:pPr>
       <w:r>
-        <w:t>Run git -C "C:\DelphiProjects\FMXPilot - Component Test" status --short again and compare it with the pre-generation result.</w:t>
+        <w:t>Confirm dependencies\DelphiAppTranslation contains source, deployment\Languages, integration-manifest.json, and integrity-sha256.json.</w:t>
+      </w:r>
+    </w:p>
+    <w:p>
+      <w:pPr>
+        <w:pStyle w:val="ListNumber"/>
+        <w:numPr>
+          <w:ilvl w:val="0"/>
+          <w:numId w:val="22"/>
+        </w:numPr>
+      </w:pPr>
+      <w:r>
+        <w:t>Confirm the status reports a baseline Release build using a temporary DAT dependency Search Path and direct pack deployment, or records a specific build error without undoing the valid dependency preparation.</w:t>
+      </w:r>
+    </w:p>
+    <w:p>
+      <w:pPr>
+        <w:pStyle w:val="ListNumber"/>
+        <w:numPr>
+          <w:ilvl w:val="0"/>
+          <w:numId w:val="22"/>
+        </w:numPr>
+      </w:pPr>
+      <w:r>
+        <w:t>Run git -C "C:\DelphiProjects\FMXPilot - Component Test" status --short again. Confirm the only new integration area is dependencies\DelphiAppTranslation, plus expected generated Localization data.</w:t>
+      </w:r>
+    </w:p>
+    <w:p>
+      <w:pPr>
+        <w:pStyle w:val="ListNumber"/>
+        <w:numPr>
+          <w:ilvl w:val="0"/>
+          <w:numId w:val="22"/>
+        </w:numPr>
+      </w:pPr>
+      <w:r>
+        <w:t>Recalculate the FMXPilot.dproj hash and confirm it is identical to the pre-preparation value.</w:t>
+      </w:r>
+    </w:p>
+    <w:p>
+      <w:pPr>
+        <w:pStyle w:val="ListNumber"/>
+        <w:numPr>
+          <w:ilvl w:val="0"/>
+          <w:numId w:val="22"/>
+        </w:numPr>
+      </w:pPr>
+      <w:r>
+        <w:t>Choose Prepare / Update Dependencies a second time. Confirm it refreshes the same managed folder and does not create a second dependency tree or duplicate Search Path entry.</w:t>
       </w:r>
     </w:p>
     <w:p>
@@ -6139,7 +7032,7 @@
         <w:pStyle w:val="ListBullet"/>
       </w:pPr>
       <w:r>
-        <w:t>Target Git status is unchanged by Build Integration Plan and Generate Component Kit.</w:t>
+        <w:t>Managed dependency root: &lt;Target&gt;\dependencies\DelphiAppTranslation. It contains the complete verified unit closure and canonical language packs.</w:t>
       </w:r>
     </w:p>
     <w:p>
@@ -6147,7 +7040,23 @@
         <w:pStyle w:val="ListBullet"/>
       </w:pPr>
       <w:r>
-        <w:t>Apply, Restore, Complete Reset, automatic target build, and source-authorization controls are hidden in recommended mode.</w:t>
+        <w:t>Target Pascal, DPR, DPROJ, DFM, and FMX hashes are unchanged. No .targets file or project import is created.</w:t>
+      </w:r>
+    </w:p>
+    <w:p>
+      <w:pPr>
+        <w:pStyle w:val="ListBullet"/>
+      </w:pPr>
+      <w:r>
+        <w:t>The second run replaces the one managed dependency set atomically rather than nesting or duplicating it.</w:t>
+      </w:r>
+    </w:p>
+    <w:p>
+      <w:pPr>
+        <w:pStyle w:val="ListBullet"/>
+      </w:pPr>
+      <w:r>
+        <w:t>Apply, Restore, Complete Reset, and source-authorization controls remain unavailable in recommended mode.</w:t>
       </w:r>
     </w:p>
     <w:tbl>
@@ -6172,6 +7081,9 @@
         <w:gridCol w:w="4260"/>
       </w:tblGrid>
       <w:tr>
+        <w:trPr>
+          <w:tblHeader w:val="true"/>
+        </w:trPr>
         <w:tc>
           <w:tcPr>
             <w:tcW w:type="dxa" w:w="1200"/>
@@ -6845,6 +7757,7 @@
       <w:tr>
         <w:trPr>
           <w:cantSplit/>
+          <w:tblHeader w:val="true"/>
         </w:trPr>
         <w:tc>
           <w:tcPr>
@@ -7028,6 +7941,9 @@
         <w:gridCol w:w="4260"/>
       </w:tblGrid>
       <w:tr>
+        <w:trPr>
+          <w:tblHeader w:val="true"/>
+        </w:trPr>
         <w:tc>
           <w:tcPr>
             <w:tcW w:type="dxa" w:w="1200"/>
@@ -7190,6 +8106,7 @@
       <w:tr>
         <w:trPr>
           <w:cantSplit/>
+          <w:tblHeader w:val="true"/>
         </w:trPr>
         <w:tc>
           <w:tcPr>
@@ -7243,6 +8160,7 @@
       <w:tr>
         <w:trPr>
           <w:cantSplit/>
+          <w:tblHeader w:val="true"/>
         </w:trPr>
         <w:tc>
           <w:tcPr>
@@ -7297,7 +8215,7 @@
         </w:numPr>
       </w:pPr>
       <w:r>
-        <w:t>In Project Options, add C:\DelphiProjects\Delphi App Translation\export\component-integration\FMXPilot\ComponentSource to the Delphi Search Path for all configurations and both Windows platforms.</w:t>
+        <w:t>In Project Options, add $(PROJECTDIR)\dependencies\DelphiAppTranslation\source to the Delphi Search Path exactly once for all configurations and both Windows platforms. Retain every existing entry.</w:t>
       </w:r>
     </w:p>
     <w:p>
@@ -7421,7 +8339,7 @@
         <w:pStyle w:val="ListBullet"/>
       </w:pPr>
       <w:r>
-        <w:t>Only normal developer-authored integration changes appear: project search-path metadata if saved there, the primary form resource/component field, applicable uses entries, and the visible selector layout.</w:t>
+        <w:t>Only normal developer-authored Form Designer changes appear in the target diff. The Studio leaves target Pascal, DPR, DPROJ, DFM, and FMX files unchanged.</w:t>
       </w:r>
     </w:p>
     <w:p>
@@ -7429,7 +8347,7 @@
         <w:pStyle w:val="ListBullet"/>
       </w:pPr>
       <w:r>
-        <w:t>FMXPilot.MainForm.fmx, FMXPilot.MainForm.pas, and FMXPilot.dproj are saved on disk. The form resource contains TDATFMXLanguageManager and TDATFMXLanguageComboBox.</w:t>
+        <w:t>FMXPilot.MainForm.fmx contains the developer-placed TDATFMXLanguageManager and TDATFMXLanguageComboBox. The target Pascal and DPROJ files contain no Studio-written integration changes.</w:t>
       </w:r>
     </w:p>
     <w:p>
@@ -7478,6 +8396,9 @@
         <w:gridCol w:w="4260"/>
       </w:tblGrid>
       <w:tr>
+        <w:trPr>
+          <w:tblHeader w:val="true"/>
+        </w:trPr>
         <w:tc>
           <w:tcPr>
             <w:tcW w:type="dxa" w:w="1200"/>
@@ -7640,6 +8561,7 @@
       <w:tr>
         <w:trPr>
           <w:cantSplit/>
+          <w:tblHeader w:val="true"/>
         </w:trPr>
         <w:tc>
           <w:tcPr>
@@ -7685,6 +8607,7 @@
       <w:tr>
         <w:trPr>
           <w:cantSplit/>
+          <w:tblHeader w:val="true"/>
         </w:trPr>
         <w:tc>
           <w:tcPr>
@@ -7738,6 +8661,7 @@
       <w:tr>
         <w:trPr>
           <w:cantSplit/>
+          <w:tblHeader w:val="true"/>
         </w:trPr>
         <w:tc>
           <w:tcPr>
@@ -7897,6 +8821,9 @@
         <w:gridCol w:w="4260"/>
       </w:tblGrid>
       <w:tr>
+        <w:trPr>
+          <w:tblHeader w:val="true"/>
+        </w:trPr>
         <w:tc>
           <w:tcPr>
             <w:tcW w:type="dxa" w:w="1200"/>
@@ -8067,6 +8994,7 @@
       <w:tr>
         <w:trPr>
           <w:cantSplit/>
+          <w:tblHeader w:val="true"/>
         </w:trPr>
         <w:tc>
           <w:tcPr>
@@ -8202,6 +9130,9 @@
         <w:gridCol w:w="4260"/>
       </w:tblGrid>
       <w:tr>
+        <w:trPr>
+          <w:tblHeader w:val="true"/>
+        </w:trPr>
         <w:tc>
           <w:tcPr>
             <w:tcW w:type="dxa" w:w="1200"/>
@@ -8404,6 +9335,7 @@
       <w:tr>
         <w:trPr>
           <w:cantSplit/>
+          <w:tblHeader w:val="true"/>
         </w:trPr>
         <w:tc>
           <w:tcPr>
@@ -8547,6 +9479,9 @@
         <w:gridCol w:w="4260"/>
       </w:tblGrid>
       <w:tr>
+        <w:trPr>
+          <w:tblHeader w:val="true"/>
+        </w:trPr>
         <w:tc>
           <w:tcPr>
             <w:tcW w:type="dxa" w:w="1200"/>
@@ -8717,6 +9652,7 @@
       <w:tr>
         <w:trPr>
           <w:cantSplit/>
+          <w:tblHeader w:val="true"/>
         </w:trPr>
         <w:tc>
           <w:tcPr>
@@ -8872,6 +9808,9 @@
         <w:gridCol w:w="4260"/>
       </w:tblGrid>
       <w:tr>
+        <w:trPr>
+          <w:tblHeader w:val="true"/>
+        </w:trPr>
         <w:tc>
           <w:tcPr>
             <w:tcW w:type="dxa" w:w="1200"/>
@@ -9042,6 +9981,7 @@
       <w:tr>
         <w:trPr>
           <w:cantSplit/>
+          <w:tblHeader w:val="true"/>
         </w:trPr>
         <w:tc>
           <w:tcPr>
@@ -9185,6 +10125,9 @@
         <w:gridCol w:w="4260"/>
       </w:tblGrid>
       <w:tr>
+        <w:trPr>
+          <w:tblHeader w:val="true"/>
+        </w:trPr>
         <w:tc>
           <w:tcPr>
             <w:tcW w:type="dxa" w:w="1200"/>
@@ -9355,6 +10298,7 @@
       <w:tr>
         <w:trPr>
           <w:cantSplit/>
+          <w:tblHeader w:val="true"/>
         </w:trPr>
         <w:tc>
           <w:tcPr>
@@ -9498,6 +10442,9 @@
         <w:gridCol w:w="4260"/>
       </w:tblGrid>
       <w:tr>
+        <w:trPr>
+          <w:tblHeader w:val="true"/>
+        </w:trPr>
         <w:tc>
           <w:tcPr>
             <w:tcW w:type="dxa" w:w="1200"/>
@@ -9668,6 +10615,7 @@
       <w:tr>
         <w:trPr>
           <w:cantSplit/>
+          <w:tblHeader w:val="true"/>
         </w:trPr>
         <w:tc>
           <w:tcPr>
@@ -9803,6 +10751,9 @@
         <w:gridCol w:w="4260"/>
       </w:tblGrid>
       <w:tr>
+        <w:trPr>
+          <w:tblHeader w:val="true"/>
+        </w:trPr>
         <w:tc>
           <w:tcPr>
             <w:tcW w:type="dxa" w:w="1200"/>
@@ -9973,6 +10924,7 @@
       <w:tr>
         <w:trPr>
           <w:cantSplit/>
+          <w:tblHeader w:val="true"/>
         </w:trPr>
         <w:tc>
           <w:tcPr>
@@ -10128,6 +11080,9 @@
         <w:gridCol w:w="4260"/>
       </w:tblGrid>
       <w:tr>
+        <w:trPr>
+          <w:tblHeader w:val="true"/>
+        </w:trPr>
         <w:tc>
           <w:tcPr>
             <w:tcW w:type="dxa" w:w="1200"/>
@@ -10975,7 +11930,7 @@
         <w:pStyle w:val="Heading1"/>
       </w:pPr>
       <w:r>
-        <w:t>11. Starting Over, Restore, and Reset</w:t>
+        <w:t>11. Starting Over and Dependency Recovery</w:t>
       </w:r>
     </w:p>
     <w:p>
@@ -10988,12 +11943,12 @@
     </w:p>
     <w:p>
       <w:r>
-        <w:t>Component Integration performs no automatic target write, so its clean restart procedure is deliberately ordinary and transparent. In the disposable target, close the application, use Git to inspect/revert the manually added manager, selector, uses entries, and search-path change, then remove only the generated Localization data and regenerated kit after confirming the exact paths. Keep the pristine GA4 reference untouched.</w:t>
+        <w:t>Component Integration writes only generated localization data and the managed dependencies folder, so its clean restart procedure is deliberately ordinary and transparent. In the disposable target, close the application, use Git or the Form Designer to inspect/revert the manually added manager and selector, remove the one developer-owned Project Options Search Path entry when it is no longer needed, and remove only generated Localization and dependency data after confirming the exact paths.</w:t>
       </w:r>
     </w:p>
     <w:p>
       <w:r>
-        <w:t>Regenerating a component kit replaces generated files under the Studio export root but does not clean or modify a previously integrated target. Deployment copies the current kit JSON to each executable folder; remove obsolete locale JSON files explicitly when a language is retired.</w:t>
+        <w:t>Regenerating a component kit replaces generated files under the Studio export root. Preparing dependencies atomically refreshes the single project-local dependencies\DelphiAppTranslation tree, and direct deployment replaces the canonical JSON set beside each selected executable so retired locale packs are not left stale.</w:t>
       </w:r>
     </w:p>
     <w:tbl>
@@ -11016,6 +11971,7 @@
       <w:tr>
         <w:trPr>
           <w:cantSplit/>
+          <w:tblHeader w:val="true"/>
         </w:trPr>
         <w:tc>
           <w:tcPr>
@@ -11032,10 +11988,10 @@
                 <w:b/>
                 <w:color w:val="234C80"/>
               </w:rPr>
-              <w:t xml:space="preserve">Do not use Complete Reset for the recommended component path. </w:t>
-            </w:r>
-            <w:r>
-              <w:t>The Studio's Complete Reset control belongs to Automatic Source Integration (Advanced), because only that mode created an automatic baseline and transaction manifest. Component-mode changes are developer-authored IDE changes and should be reverted through Git or the Form Designer.</w:t>
+              <w:t xml:space="preserve">Target-source reset is intentionally unavailable. </w:t>
+            </w:r>
+            <w:r>
+              <w:t>Apply, Restore, and Complete Reset remain disabled because the Studio does not own target Pascal, form, DPR, or DPROJ files. Revert developer-authored IDE changes through Git or the Form Designer. Refresh or remove only the clearly named managed dependency and generated Localization areas after reviewing their exact paths.</w:t>
             </w:r>
           </w:p>
         </w:tc>
@@ -11046,7 +12002,7 @@
         <w:pStyle w:val="Heading2"/>
       </w:pPr>
       <w:r>
-        <w:t>11.2 Advanced automatic-source reset test</w:t>
+        <w:t>11.2 Managed dependency recovery test</w:t>
       </w:r>
     </w:p>
     <w:p>
@@ -11058,7 +12014,7 @@
         </w:numPr>
       </w:pPr>
       <w:r>
-        <w:t>Use only a disposable target that previously completed Automatic Source Integration (Advanced).</w:t>
+        <w:t>Use only a disposable target that has completed Prepare / Update Dependencies.</w:t>
       </w:r>
     </w:p>
     <w:p>
@@ -11070,7 +12026,7 @@
         </w:numPr>
       </w:pPr>
       <w:r>
-        <w:t>Open and scan it in the Studio, choose Integration, then select Automatic Source Integration (Advanced).</w:t>
+        <w:t>Record the SHA-256 hash of the target DPROJ and one DAT unit under dependencies\DelphiAppTranslation\source.</w:t>
       </w:r>
     </w:p>
     <w:p>
@@ -11082,7 +12038,7 @@
         </w:numPr>
       </w:pPr>
       <w:r>
-        <w:t>Choose Prepare Complete Reset. Confirm the preview is read-only and identifies the original baseline.</w:t>
+        <w:t>Make a clearly disposable change to that dependency copy so it no longer matches the generated kit. Do not edit target source or project files.</w:t>
       </w:r>
     </w:p>
     <w:p>
@@ -11094,7 +12050,7 @@
         </w:numPr>
       </w:pPr>
       <w:r>
-        <w:t>Review the listed project/source restoration and Localization cleanup actions.</w:t>
+        <w:t>Choose Prepare / Update Dependencies again.</w:t>
       </w:r>
     </w:p>
     <w:p>
@@ -11106,7 +12062,7 @@
         </w:numPr>
       </w:pPr>
       <w:r>
-        <w:t>Check I reviewed this reset plan and authorize Complete Reset, then choose Reset Project.</w:t>
+        <w:t>Confirm the Studio reports the previous dependency snapshot and atomically restores the canonical DAT unit from the current kit.</w:t>
       </w:r>
     </w:p>
     <w:p>
@@ -11118,7 +12074,7 @@
         </w:numPr>
       </w:pPr>
       <w:r>
-        <w:t>Confirm the Studio creates a separate SHA-256-verified Complete Reset Safety backup before mutation.</w:t>
+        <w:t>Confirm the target DPROJ hash is unchanged, the dependency tree is present exactly once, and no DelphiAppTranslation.targets file exists.</w:t>
       </w:r>
     </w:p>
     <w:p>
@@ -11130,7 +12086,7 @@
         </w:numPr>
       </w:pPr>
       <w:r>
-        <w:t>Build and run the restored target, and compare Git status/diff with the expected original baseline.</w:t>
+        <w:t>Build and run the disposable target, then compare Git status/diff with the expected dependency-only refresh.</w:t>
       </w:r>
     </w:p>
     <w:p>
@@ -11138,7 +12094,7 @@
         <w:pStyle w:val="ListBullet"/>
       </w:pPr>
       <w:r>
-        <w:t>The operation refuses to guess when the automatic-integration baseline is absent.</w:t>
+        <w:t>The stale dependency copy is replaced by the verified current kit version.</w:t>
       </w:r>
     </w:p>
     <w:p>
@@ -11146,7 +12102,7 @@
         <w:pStyle w:val="ListBullet"/>
       </w:pPr>
       <w:r>
-        <w:t>On success, original pre-integration source is restored and project-local Localization development/runtime data is removed according to the preview.</w:t>
+        <w:t>The one managed dependency location is refreshed rather than duplicated or nested.</w:t>
       </w:r>
     </w:p>
     <w:p>
@@ -11154,7 +12110,7 @@
         <w:pStyle w:val="ListBullet"/>
       </w:pPr>
       <w:r>
-        <w:t>The safety backup is retained.</w:t>
+        <w:t>The prior dependency snapshot is retained in the reported backup location.</w:t>
       </w:r>
     </w:p>
     <w:p>
@@ -11162,7 +12118,15 @@
         <w:pStyle w:val="ListBullet"/>
       </w:pPr>
       <w:r>
-        <w:t>On failure, the current project is restored from the safety backup and the failure is reported.</w:t>
+        <w:t>Target Pascal, DPR, DPROJ, DFM, and FMX files remain byte-for-byte unchanged.</w:t>
+      </w:r>
+    </w:p>
+    <w:p>
+      <w:pPr>
+        <w:pStyle w:val="ListBullet"/>
+      </w:pPr>
+      <w:r>
+        <w:t>A failed staged copy or promotion restores the previous managed dependency tree and reports the failure.</w:t>
       </w:r>
     </w:p>
     <w:p>
@@ -15827,6 +16791,7 @@
       <w:tr>
         <w:trPr>
           <w:cantSplit/>
+          <w:tblHeader w:val="true"/>
         </w:trPr>
         <w:tc>
           <w:tcPr>
@@ -15868,202 +16833,6 @@
     <w:p>
       <w:r>
         <w:t>This baseline is evidence, not a substitute for rerunning the tests. Record new executable timestamps, release-gate output, provider results, and target Git diffs for each acceptance session.</w:t>
-      </w:r>
-    </w:p>
-    <w:p>
-      <w:r>
-        <w:br w:type="page"/>
-      </w:r>
-    </w:p>
-    <w:p>
-      <w:pPr>
-        <w:pStyle w:val="Heading1"/>
-        <w:keepNext/>
-        <w:spacing w:before="0" w:after="140"/>
-      </w:pPr>
-      <w:r>
-        <w:t>19. Appendix D - License Information</w:t>
-      </w:r>
-    </w:p>
-    <w:p>
-      <w:pPr>
-        <w:spacing w:before="0" w:after="40" w:line="240" w:lineRule="auto"/>
-      </w:pPr>
-      <w:r>
-        <w:rPr>
-          <w:sz w:val="17"/>
-        </w:rPr>
-        <w:t>Unless a particular file or third-party component states otherwise, Delphi App Translation Studio and its project documentation are licensed under the Apache License, Version 2.0. The license permits broad use while preserving attribution, notices, and the stated warranty limitations.</w:t>
-      </w:r>
-    </w:p>
-    <w:p>
-      <w:pPr>
-        <w:pStyle w:val="Heading2"/>
-        <w:keepNext/>
-        <w:spacing w:before="100" w:after="40"/>
-      </w:pPr>
-      <w:r>
-        <w:rPr>
-          <w:sz w:val="21"/>
-        </w:rPr>
-        <w:t>License grant</w:t>
-      </w:r>
-    </w:p>
-    <w:p>
-      <w:pPr>
-        <w:spacing w:before="0" w:after="40" w:line="240" w:lineRule="auto"/>
-      </w:pPr>
-      <w:r>
-        <w:rPr>
-          <w:sz w:val="17"/>
-        </w:rPr>
-        <w:t>Subject to the complete license terms, you may use, reproduce, modify, prepare derivative works from, publicly display, publicly perform, sublicense, and distribute the licensed material. The Apache License 2.0 also includes an express patent license from contributors for their applicable contributions.</w:t>
-      </w:r>
-    </w:p>
-    <w:p>
-      <w:pPr>
-        <w:pStyle w:val="Heading2"/>
-        <w:keepNext/>
-        <w:spacing w:before="100" w:after="40"/>
-      </w:pPr>
-      <w:r>
-        <w:rPr>
-          <w:sz w:val="21"/>
-        </w:rPr>
-        <w:t>Important conditions</w:t>
-      </w:r>
-    </w:p>
-    <w:p>
-      <w:pPr>
-        <w:pStyle w:val="ListBullet"/>
-        <w:spacing w:before="0" w:after="40" w:line="240" w:lineRule="auto"/>
-      </w:pPr>
-      <w:r>
-        <w:rPr>
-          <w:sz w:val="17"/>
-        </w:rPr>
-        <w:t>Give recipients a copy of the Apache License 2.0 when distributing covered material.</w:t>
-      </w:r>
-    </w:p>
-    <w:p>
-      <w:pPr>
-        <w:pStyle w:val="ListBullet"/>
-        <w:spacing w:before="0" w:after="40" w:line="240" w:lineRule="auto"/>
-      </w:pPr>
-      <w:r>
-        <w:rPr>
-          <w:sz w:val="17"/>
-        </w:rPr>
-        <w:t>State significant changes made to modified files.</w:t>
-      </w:r>
-    </w:p>
-    <w:p>
-      <w:pPr>
-        <w:pStyle w:val="ListBullet"/>
-        <w:spacing w:before="0" w:after="40" w:line="240" w:lineRule="auto"/>
-      </w:pPr>
-      <w:r>
-        <w:rPr>
-          <w:sz w:val="17"/>
-        </w:rPr>
-        <w:t>Retain applicable copyright, patent, trademark, attribution, and NOTICE information.</w:t>
-      </w:r>
-    </w:p>
-    <w:p>
-      <w:pPr>
-        <w:pStyle w:val="ListBullet"/>
-        <w:spacing w:before="0" w:after="40" w:line="240" w:lineRule="auto"/>
-      </w:pPr>
-      <w:r>
-        <w:rPr>
-          <w:sz w:val="17"/>
-        </w:rPr>
-        <w:t>Do not use project or contributor names and trademarks as an endorsement except as the license permits.</w:t>
-      </w:r>
-    </w:p>
-    <w:p>
-      <w:pPr>
-        <w:pStyle w:val="Heading2"/>
-        <w:keepNext/>
-        <w:spacing w:before="100" w:after="40"/>
-      </w:pPr>
-      <w:r>
-        <w:rPr>
-          <w:sz w:val="21"/>
-        </w:rPr>
-        <w:t>Warranty and liability</w:t>
-      </w:r>
-    </w:p>
-    <w:p>
-      <w:pPr>
-        <w:spacing w:before="0" w:after="40" w:line="240" w:lineRule="auto"/>
-      </w:pPr>
-      <w:r>
-        <w:rPr>
-          <w:sz w:val="17"/>
-        </w:rPr>
-        <w:t>The licensed material is provided on an AS IS basis, without warranties or conditions of any kind. The complete Apache License 2.0 controls the warranty, liability, contribution, redistribution, and patent provisions.</w:t>
-      </w:r>
-    </w:p>
-    <w:p>
-      <w:pPr>
-        <w:pStyle w:val="Heading2"/>
-        <w:keepNext/>
-        <w:spacing w:before="100" w:after="40"/>
-      </w:pPr>
-      <w:r>
-        <w:rPr>
-          <w:sz w:val="21"/>
-        </w:rPr>
-        <w:t>Your applications and generated output</w:t>
-      </w:r>
-    </w:p>
-    <w:p>
-      <w:pPr>
-        <w:spacing w:before="0" w:after="40" w:line="240" w:lineRule="auto"/>
-      </w:pPr>
-      <w:r>
-        <w:rPr>
-          <w:sz w:val="17"/>
-        </w:rPr>
-        <w:t>Using the Studio does not transfer ownership of the Delphi application being translated. The application developer remains responsible for the license and distribution terms of the target application, translated content, generated language packs, and any third-party components. Studio runtime or component source included with a project remains subject to the Apache License 2.0 unless its file states different terms. Third-party software retains its own license.</w:t>
-      </w:r>
-    </w:p>
-    <w:p>
-      <w:pPr>
-        <w:pStyle w:val="Heading2"/>
-        <w:keepNext/>
-        <w:spacing w:before="100" w:after="40"/>
-      </w:pPr>
-      <w:r>
-        <w:rPr>
-          <w:sz w:val="21"/>
-        </w:rPr>
-        <w:t>Full legal text</w:t>
-      </w:r>
-    </w:p>
-    <w:p>
-      <w:pPr>
-        <w:spacing w:before="0" w:after="40" w:line="240" w:lineRule="auto"/>
-      </w:pPr>
-      <w:r>
-        <w:rPr>
-          <w:sz w:val="17"/>
-        </w:rPr>
-        <w:t>The complete controlling license is the LICENSE file in the repository and source distribution root. An official reference copy is available at https://www.apache.org/licenses/LICENSE-2.0. If this summary and the complete license differ, the complete Apache License 2.0 text controls.</w:t>
-      </w:r>
-    </w:p>
-    <w:p>
-      <w:pPr>
-        <w:spacing w:before="0" w:after="40" w:line="240" w:lineRule="auto"/>
-        <w:ind w:left="360" w:right="360"/>
-      </w:pPr>
-      <w:r>
-        <w:rPr>
-          <w:i/>
-          <w:sz w:val="17"/>
-        </w:rPr>
-        <w:t>Licensed under the Apache License, Version 2.0 (the "License"); you may not use this work except in compliance with the License. Unless required by applicable law or agreed to in writing, software distributed under the License is distributed on an AS IS BASIS, WITHOUT WARRANTIES OR CONDITIONS OF ANY KIND, either express or implied.</w:t>
       </w:r>
     </w:p>
     <w:sectPr>

</xml_diff>

<commit_message>
Document the exact Delphi dependency search path
</commit_message>
<xml_diff>
--- a/docs/guides/Delphi App Translation Studio Complete Test Guide.docx
+++ b/docs/guides/Delphi App Translation Studio Complete Test Guide.docx
@@ -8132,6 +8132,52 @@
         </w:tc>
       </w:tr>
     </w:tbl>
+    <w:tbl>
+      <w:tblPr>
+        <w:jc w:val="center"/>
+        <w:tblLook w:firstColumn="1" w:firstRow="1" w:lastColumn="0" w:lastRow="0" w:noHBand="0" w:noVBand="1" w:val="04A0"/>
+        <w:tblW w:w="9360" w:type="dxa"/>
+        <w:tblInd w:w="120" w:type="dxa"/>
+        <w:tblLayout w:type="fixed"/>
+        <w:tblCellMar>
+          <w:top w:w="80" w:type="dxa"/>
+          <w:bottom w:w="80" w:type="dxa"/>
+          <w:start w:w="120" w:type="dxa"/>
+          <w:end w:w="120" w:type="dxa"/>
+        </w:tblCellMar>
+      </w:tblPr>
+      <w:tblGrid>
+        <w:gridCol w:w="9360"/>
+      </w:tblGrid>
+      <w:tr>
+        <w:trPr>
+          <w:cantSplit/>
+          <w:tblHeader w:val="true"/>
+        </w:trPr>
+        <w:tc>
+          <w:tcPr>
+            <w:tcW w:type="dxa" w:w="9360"/>
+            <w:shd w:fill="EAF3FF"/>
+            <w:vAlign w:val="center"/>
+          </w:tcPr>
+          <w:p>
+            <w:pPr>
+              <w:pStyle w:val="Callout"/>
+            </w:pPr>
+            <w:r>
+              <w:rPr>
+                <w:b/>
+                <w:color w:val="234C80"/>
+              </w:rPr>
+              <w:t xml:space="preserve">Exact compiler Search Path for the target project. </w:t>
+            </w:r>
+            <w:r>
+              <w:t>In RAD Studio, open Project &gt; Options &gt; Building &gt; Delphi Compiler, select All configurations and All platforms, and append $(PROJECTDIR)\dependencies\DelphiAppTranslation\source to Search path exactly once. Preserve every existing entry and use a semicolon between entries when necessary.</w:t>
+            </w:r>
+          </w:p>
+        </w:tc>
+      </w:tr>
+    </w:tbl>
     <w:p>
       <w:pPr>
         <w:pStyle w:val="Heading2"/>
@@ -8215,7 +8261,7 @@
         </w:numPr>
       </w:pPr>
       <w:r>
-        <w:t>In Project Options, add $(PROJECTDIR)\dependencies\DelphiAppTranslation\source to the Delphi Search Path exactly once for all configurations and both Windows platforms. Retain every existing entry.</w:t>
+        <w:t>Verify that Project Options contains $(PROJECTDIR)\dependencies\DelphiAppTranslation\source exactly once in the Delphi Compiler Search path for all configurations and both Windows platforms. Retain every existing entry.</w:t>
       </w:r>
     </w:p>
     <w:p>

</xml_diff>